<commit_message>
Agrega estructura del equipo y programa de capacitación a la propuesta CLT
Nuevo apartado con vendedor especializado textil, atención al cliente y
técnico textil, más el programa de capacitación en máquinas y productos.
Actualiza gastos de operación y la proyección financiera (ES/EN).

Co-Authored-By: Claude Opus 5.5 <noreply@anthropic.com>
Claude-Session: https://claude.ai/code/session_012axCVDM5kAgj1VFnxhpsuM
</commit_message>
<xml_diff>
--- a/propuesta-clt/CLT_Distribution_Proposal_Mexico_EN.docx
+++ b/propuesta-clt/CLT_Distribution_Proposal_Mexico_EN.docx
@@ -6709,7 +6709,7 @@
                 <w:sz w:val="19"/>
                 <w:szCs w:val="19"/>
               </w:rPr>
-              <w:t xml:space="preserve">Agreement signed, training in China, initial inventory, silicone and paste sales to shops, launch at FESPA México</w:t>
+              <w:t xml:space="preserve">Agreement signed, hiring of sales specialist, customer service and technician, training in China, initial inventory, silicone and paste sales to shops, launch at FESPA México</w:t>
             </w:r>
           </w:p>
         </w:tc>
@@ -7069,6 +7069,1292 @@
       </w:r>
     </w:p>
     <w:p>
+      <w:pPr>
+        <w:pStyle w:val="Heading1"/>
+      </w:pPr>
+      <w:r>
+        <w:t xml:space="preserve">12. Team structure and training</w:t>
+      </w:r>
+    </w:p>
+    <w:p>
+      <w:pPr>
+        <w:spacing w:after="160"/>
+      </w:pPr>
+      <w:r>
+        <w:t xml:space="preserve">The textile division will run with a dedicated team, backed by the existing structure of TID (2 technicians), VSP (1 technician) and CEB (import and logistics).</w:t>
+      </w:r>
+    </w:p>
+    <w:tbl>
+      <w:tblPr>
+        <w:tblW w:type="dxa" w:w="9360"/>
+        <w:tblBorders>
+          <w:top w:val="single" w:color="auto" w:sz="4"/>
+          <w:left w:val="single" w:color="auto" w:sz="4"/>
+          <w:bottom w:val="single" w:color="auto" w:sz="4"/>
+          <w:right w:val="single" w:color="auto" w:sz="4"/>
+          <w:insideH w:val="single" w:color="auto" w:sz="4"/>
+          <w:insideV w:val="single" w:color="auto" w:sz="4"/>
+        </w:tblBorders>
+      </w:tblPr>
+      <w:tblGrid>
+        <w:gridCol w:w="2000"/>
+        <w:gridCol w:w="4260"/>
+        <w:gridCol w:w="1300"/>
+        <w:gridCol w:w="1800"/>
+      </w:tblGrid>
+      <w:tr>
+        <w:trPr>
+          <w:cantSplit/>
+          <w:tblHeader/>
+        </w:trPr>
+        <w:tc>
+          <w:tcPr>
+            <w:tcW w:type="dxa" w:w="2000"/>
+            <w:tcBorders>
+              <w:top w:val="single" w:color="C9D1DC" w:sz="4"/>
+              <w:left w:val="single" w:color="C9D1DC" w:sz="4"/>
+              <w:bottom w:val="single" w:color="C9D1DC" w:sz="4"/>
+              <w:right w:val="single" w:color="C9D1DC" w:sz="4"/>
+            </w:tcBorders>
+            <w:shd w:fill="1B1F3B" w:color="auto" w:val="clear"/>
+            <w:tcMar>
+              <w:top w:type="dxa" w:w="80"/>
+              <w:left w:type="dxa" w:w="110"/>
+              <w:bottom w:type="dxa" w:w="80"/>
+              <w:right w:type="dxa" w:w="110"/>
+            </w:tcMar>
+          </w:tcPr>
+          <w:p>
+            <w:pPr>
+              <w:keepNext/>
+            </w:pPr>
+            <w:r>
+              <w:rPr>
+                <w:rFonts w:ascii="Calibri" w:cs="Calibri" w:eastAsia="Calibri" w:hAnsi="Calibri"/>
+                <w:b/>
+                <w:bCs/>
+                <w:color w:val="FFFFFF"/>
+                <w:sz w:val="19"/>
+                <w:szCs w:val="19"/>
+              </w:rPr>
+              <w:t xml:space="preserve">Role</w:t>
+            </w:r>
+          </w:p>
+        </w:tc>
+        <w:tc>
+          <w:tcPr>
+            <w:tcW w:type="dxa" w:w="4260"/>
+            <w:tcBorders>
+              <w:top w:val="single" w:color="C9D1DC" w:sz="4"/>
+              <w:left w:val="single" w:color="C9D1DC" w:sz="4"/>
+              <w:bottom w:val="single" w:color="C9D1DC" w:sz="4"/>
+              <w:right w:val="single" w:color="C9D1DC" w:sz="4"/>
+            </w:tcBorders>
+            <w:shd w:fill="1B1F3B" w:color="auto" w:val="clear"/>
+            <w:tcMar>
+              <w:top w:type="dxa" w:w="80"/>
+              <w:left w:type="dxa" w:w="110"/>
+              <w:bottom w:type="dxa" w:w="80"/>
+              <w:right w:type="dxa" w:w="110"/>
+            </w:tcMar>
+          </w:tcPr>
+          <w:p>
+            <w:pPr>
+              <w:keepNext/>
+            </w:pPr>
+            <w:r>
+              <w:rPr>
+                <w:rFonts w:ascii="Calibri" w:cs="Calibri" w:eastAsia="Calibri" w:hAnsi="Calibri"/>
+                <w:b/>
+                <w:bCs/>
+                <w:color w:val="FFFFFF"/>
+                <w:sz w:val="19"/>
+                <w:szCs w:val="19"/>
+              </w:rPr>
+              <w:t xml:space="preserve">Responsibilities</w:t>
+            </w:r>
+          </w:p>
+        </w:tc>
+        <w:tc>
+          <w:tcPr>
+            <w:tcW w:type="dxa" w:w="1300"/>
+            <w:tcBorders>
+              <w:top w:val="single" w:color="C9D1DC" w:sz="4"/>
+              <w:left w:val="single" w:color="C9D1DC" w:sz="4"/>
+              <w:bottom w:val="single" w:color="C9D1DC" w:sz="4"/>
+              <w:right w:val="single" w:color="C9D1DC" w:sz="4"/>
+            </w:tcBorders>
+            <w:shd w:fill="1B1F3B" w:color="auto" w:val="clear"/>
+            <w:tcMar>
+              <w:top w:type="dxa" w:w="80"/>
+              <w:left w:type="dxa" w:w="110"/>
+              <w:bottom w:type="dxa" w:w="80"/>
+              <w:right w:type="dxa" w:w="110"/>
+            </w:tcMar>
+          </w:tcPr>
+          <w:p>
+            <w:pPr>
+              <w:keepNext/>
+            </w:pPr>
+            <w:r>
+              <w:rPr>
+                <w:rFonts w:ascii="Calibri" w:cs="Calibri" w:eastAsia="Calibri" w:hAnsi="Calibri"/>
+                <w:b/>
+                <w:bCs/>
+                <w:color w:val="FFFFFF"/>
+                <w:sz w:val="19"/>
+                <w:szCs w:val="19"/>
+              </w:rPr>
+              <w:t xml:space="preserve">When</w:t>
+            </w:r>
+          </w:p>
+        </w:tc>
+        <w:tc>
+          <w:tcPr>
+            <w:tcW w:type="dxa" w:w="1800"/>
+            <w:tcBorders>
+              <w:top w:val="single" w:color="C9D1DC" w:sz="4"/>
+              <w:left w:val="single" w:color="C9D1DC" w:sz="4"/>
+              <w:bottom w:val="single" w:color="C9D1DC" w:sz="4"/>
+              <w:right w:val="single" w:color="C9D1DC" w:sz="4"/>
+            </w:tcBorders>
+            <w:shd w:fill="1B1F3B" w:color="auto" w:val="clear"/>
+            <w:tcMar>
+              <w:top w:type="dxa" w:w="80"/>
+              <w:left w:type="dxa" w:w="110"/>
+              <w:bottom w:type="dxa" w:w="80"/>
+              <w:right w:type="dxa" w:w="110"/>
+            </w:tcMar>
+          </w:tcPr>
+          <w:p>
+            <w:pPr>
+              <w:keepNext/>
+            </w:pPr>
+            <w:r>
+              <w:rPr>
+                <w:rFonts w:ascii="Calibri" w:cs="Calibri" w:eastAsia="Calibri" w:hAnsi="Calibri"/>
+                <w:b/>
+                <w:bCs/>
+                <w:color w:val="FFFFFF"/>
+                <w:sz w:val="19"/>
+                <w:szCs w:val="19"/>
+              </w:rPr>
+              <w:t xml:space="preserve">Approx. monthly cost</w:t>
+            </w:r>
+          </w:p>
+        </w:tc>
+      </w:tr>
+      <w:tr>
+        <w:trPr>
+          <w:cantSplit/>
+        </w:trPr>
+        <w:tc>
+          <w:tcPr>
+            <w:tcW w:type="dxa" w:w="2000"/>
+            <w:tcBorders>
+              <w:top w:val="single" w:color="C9D1DC" w:sz="4"/>
+              <w:left w:val="single" w:color="C9D1DC" w:sz="4"/>
+              <w:bottom w:val="single" w:color="C9D1DC" w:sz="4"/>
+              <w:right w:val="single" w:color="C9D1DC" w:sz="4"/>
+            </w:tcBorders>
+            <w:tcMar>
+              <w:top w:type="dxa" w:w="80"/>
+              <w:left w:type="dxa" w:w="110"/>
+              <w:bottom w:type="dxa" w:w="80"/>
+              <w:right w:type="dxa" w:w="110"/>
+            </w:tcMar>
+          </w:tcPr>
+          <w:p>
+            <w:pPr>
+              <w:keepNext/>
+            </w:pPr>
+            <w:r>
+              <w:rPr>
+                <w:rFonts w:ascii="Calibri" w:cs="Calibri" w:eastAsia="Calibri" w:hAnsi="Calibri"/>
+                <w:b/>
+                <w:bCs/>
+                <w:sz w:val="19"/>
+                <w:szCs w:val="19"/>
+              </w:rPr>
+              <w:t xml:space="preserve">Textile sales specialist</w:t>
+            </w:r>
+          </w:p>
+        </w:tc>
+        <w:tc>
+          <w:tcPr>
+            <w:tcW w:type="dxa" w:w="4260"/>
+            <w:tcBorders>
+              <w:top w:val="single" w:color="C9D1DC" w:sz="4"/>
+              <w:left w:val="single" w:color="C9D1DC" w:sz="4"/>
+              <w:bottom w:val="single" w:color="C9D1DC" w:sz="4"/>
+              <w:right w:val="single" w:color="C9D1DC" w:sz="4"/>
+            </w:tcBorders>
+            <w:tcMar>
+              <w:top w:type="dxa" w:w="80"/>
+              <w:left w:type="dxa" w:w="110"/>
+              <w:bottom w:type="dxa" w:w="80"/>
+              <w:right w:type="dxa" w:w="110"/>
+            </w:tcMar>
+          </w:tcPr>
+          <w:p>
+            <w:pPr>
+              <w:keepNext/>
+            </w:pPr>
+            <w:r>
+              <w:rPr>
+                <w:rFonts w:ascii="Calibri" w:cs="Calibri" w:eastAsia="Calibri" w:hAnsi="Calibri"/>
+                <w:b w:val="false"/>
+                <w:bCs w:val="false"/>
+                <w:sz w:val="19"/>
+                <w:szCs w:val="19"/>
+              </w:rPr>
+              <w:t xml:space="preserve">Prospecting by region, visits and demos, turnkey quotes, customer ROI calculation and closing</w:t>
+            </w:r>
+          </w:p>
+        </w:tc>
+        <w:tc>
+          <w:tcPr>
+            <w:tcW w:type="dxa" w:w="1300"/>
+            <w:tcBorders>
+              <w:top w:val="single" w:color="C9D1DC" w:sz="4"/>
+              <w:left w:val="single" w:color="C9D1DC" w:sz="4"/>
+              <w:bottom w:val="single" w:color="C9D1DC" w:sz="4"/>
+              <w:right w:val="single" w:color="C9D1DC" w:sz="4"/>
+            </w:tcBorders>
+            <w:tcMar>
+              <w:top w:type="dxa" w:w="80"/>
+              <w:left w:type="dxa" w:w="110"/>
+              <w:bottom w:type="dxa" w:w="80"/>
+              <w:right w:type="dxa" w:w="110"/>
+            </w:tcMar>
+          </w:tcPr>
+          <w:p>
+            <w:pPr>
+              <w:keepNext/>
+            </w:pPr>
+            <w:r>
+              <w:rPr>
+                <w:rFonts w:ascii="Calibri" w:cs="Calibri" w:eastAsia="Calibri" w:hAnsi="Calibri"/>
+                <w:b w:val="false"/>
+                <w:bCs w:val="false"/>
+                <w:sz w:val="19"/>
+                <w:szCs w:val="19"/>
+              </w:rPr>
+              <w:t xml:space="preserve">Year 1</w:t>
+            </w:r>
+          </w:p>
+        </w:tc>
+        <w:tc>
+          <w:tcPr>
+            <w:tcW w:type="dxa" w:w="1800"/>
+            <w:tcBorders>
+              <w:top w:val="single" w:color="C9D1DC" w:sz="4"/>
+              <w:left w:val="single" w:color="C9D1DC" w:sz="4"/>
+              <w:bottom w:val="single" w:color="C9D1DC" w:sz="4"/>
+              <w:right w:val="single" w:color="C9D1DC" w:sz="4"/>
+            </w:tcBorders>
+            <w:tcMar>
+              <w:top w:type="dxa" w:w="80"/>
+              <w:left w:type="dxa" w:w="110"/>
+              <w:bottom w:type="dxa" w:w="80"/>
+              <w:right w:type="dxa" w:w="110"/>
+            </w:tcMar>
+          </w:tcPr>
+          <w:p>
+            <w:pPr>
+              <w:keepNext/>
+            </w:pPr>
+            <w:r>
+              <w:rPr>
+                <w:rFonts w:ascii="Calibri" w:cs="Calibri" w:eastAsia="Calibri" w:hAnsi="Calibri"/>
+                <w:b w:val="false"/>
+                <w:bCs w:val="false"/>
+                <w:sz w:val="19"/>
+                <w:szCs w:val="19"/>
+              </w:rPr>
+              <w:t xml:space="preserve">~MXN 40,000 + commission</w:t>
+            </w:r>
+          </w:p>
+        </w:tc>
+      </w:tr>
+      <w:tr>
+        <w:trPr>
+          <w:cantSplit/>
+        </w:trPr>
+        <w:tc>
+          <w:tcPr>
+            <w:tcW w:type="dxa" w:w="2000"/>
+            <w:tcBorders>
+              <w:top w:val="single" w:color="C9D1DC" w:sz="4"/>
+              <w:left w:val="single" w:color="C9D1DC" w:sz="4"/>
+              <w:bottom w:val="single" w:color="C9D1DC" w:sz="4"/>
+              <w:right w:val="single" w:color="C9D1DC" w:sz="4"/>
+            </w:tcBorders>
+            <w:shd w:fill="EEF2F7" w:color="auto" w:val="clear"/>
+            <w:tcMar>
+              <w:top w:type="dxa" w:w="80"/>
+              <w:left w:type="dxa" w:w="110"/>
+              <w:bottom w:type="dxa" w:w="80"/>
+              <w:right w:type="dxa" w:w="110"/>
+            </w:tcMar>
+          </w:tcPr>
+          <w:p>
+            <w:pPr>
+              <w:keepNext/>
+            </w:pPr>
+            <w:r>
+              <w:rPr>
+                <w:rFonts w:ascii="Calibri" w:cs="Calibri" w:eastAsia="Calibri" w:hAnsi="Calibri"/>
+                <w:b/>
+                <w:bCs/>
+                <w:sz w:val="19"/>
+                <w:szCs w:val="19"/>
+              </w:rPr>
+              <w:t xml:space="preserve">Customer service</w:t>
+            </w:r>
+          </w:p>
+        </w:tc>
+        <w:tc>
+          <w:tcPr>
+            <w:tcW w:type="dxa" w:w="4260"/>
+            <w:tcBorders>
+              <w:top w:val="single" w:color="C9D1DC" w:sz="4"/>
+              <w:left w:val="single" w:color="C9D1DC" w:sz="4"/>
+              <w:bottom w:val="single" w:color="C9D1DC" w:sz="4"/>
+              <w:right w:val="single" w:color="C9D1DC" w:sz="4"/>
+            </w:tcBorders>
+            <w:shd w:fill="EEF2F7" w:color="auto" w:val="clear"/>
+            <w:tcMar>
+              <w:top w:type="dxa" w:w="80"/>
+              <w:left w:type="dxa" w:w="110"/>
+              <w:bottom w:type="dxa" w:w="80"/>
+              <w:right w:type="dxa" w:w="110"/>
+            </w:tcMar>
+          </w:tcPr>
+          <w:p>
+            <w:pPr>
+              <w:keepNext/>
+            </w:pPr>
+            <w:r>
+              <w:rPr>
+                <w:rFonts w:ascii="Calibri" w:cs="Calibri" w:eastAsia="Calibri" w:hAnsi="Calibri"/>
+                <w:b w:val="false"/>
+                <w:bCs w:val="false"/>
+                <w:sz w:val="19"/>
+                <w:szCs w:val="19"/>
+              </w:rPr>
+              <w:t xml:space="preserve">Consumables orders and replenishment, after-sales follow-up, warranties, scheduling of service and training, satisfaction surveys</w:t>
+            </w:r>
+          </w:p>
+        </w:tc>
+        <w:tc>
+          <w:tcPr>
+            <w:tcW w:type="dxa" w:w="1300"/>
+            <w:tcBorders>
+              <w:top w:val="single" w:color="C9D1DC" w:sz="4"/>
+              <w:left w:val="single" w:color="C9D1DC" w:sz="4"/>
+              <w:bottom w:val="single" w:color="C9D1DC" w:sz="4"/>
+              <w:right w:val="single" w:color="C9D1DC" w:sz="4"/>
+            </w:tcBorders>
+            <w:shd w:fill="EEF2F7" w:color="auto" w:val="clear"/>
+            <w:tcMar>
+              <w:top w:type="dxa" w:w="80"/>
+              <w:left w:type="dxa" w:w="110"/>
+              <w:bottom w:type="dxa" w:w="80"/>
+              <w:right w:type="dxa" w:w="110"/>
+            </w:tcMar>
+          </w:tcPr>
+          <w:p>
+            <w:pPr>
+              <w:keepNext/>
+            </w:pPr>
+            <w:r>
+              <w:rPr>
+                <w:rFonts w:ascii="Calibri" w:cs="Calibri" w:eastAsia="Calibri" w:hAnsi="Calibri"/>
+                <w:b w:val="false"/>
+                <w:bCs w:val="false"/>
+                <w:sz w:val="19"/>
+                <w:szCs w:val="19"/>
+              </w:rPr>
+              <w:t xml:space="preserve">Year 1</w:t>
+            </w:r>
+          </w:p>
+        </w:tc>
+        <w:tc>
+          <w:tcPr>
+            <w:tcW w:type="dxa" w:w="1800"/>
+            <w:tcBorders>
+              <w:top w:val="single" w:color="C9D1DC" w:sz="4"/>
+              <w:left w:val="single" w:color="C9D1DC" w:sz="4"/>
+              <w:bottom w:val="single" w:color="C9D1DC" w:sz="4"/>
+              <w:right w:val="single" w:color="C9D1DC" w:sz="4"/>
+            </w:tcBorders>
+            <w:shd w:fill="EEF2F7" w:color="auto" w:val="clear"/>
+            <w:tcMar>
+              <w:top w:type="dxa" w:w="80"/>
+              <w:left w:type="dxa" w:w="110"/>
+              <w:bottom w:type="dxa" w:w="80"/>
+              <w:right w:type="dxa" w:w="110"/>
+            </w:tcMar>
+          </w:tcPr>
+          <w:p>
+            <w:pPr>
+              <w:keepNext/>
+            </w:pPr>
+            <w:r>
+              <w:rPr>
+                <w:rFonts w:ascii="Calibri" w:cs="Calibri" w:eastAsia="Calibri" w:hAnsi="Calibri"/>
+                <w:b w:val="false"/>
+                <w:bCs w:val="false"/>
+                <w:sz w:val="19"/>
+                <w:szCs w:val="19"/>
+              </w:rPr>
+              <w:t xml:space="preserve">~MXN 20,000</w:t>
+            </w:r>
+          </w:p>
+        </w:tc>
+      </w:tr>
+      <w:tr>
+        <w:trPr>
+          <w:cantSplit/>
+        </w:trPr>
+        <w:tc>
+          <w:tcPr>
+            <w:tcW w:type="dxa" w:w="2000"/>
+            <w:tcBorders>
+              <w:top w:val="single" w:color="C9D1DC" w:sz="4"/>
+              <w:left w:val="single" w:color="C9D1DC" w:sz="4"/>
+              <w:bottom w:val="single" w:color="C9D1DC" w:sz="4"/>
+              <w:right w:val="single" w:color="C9D1DC" w:sz="4"/>
+            </w:tcBorders>
+            <w:tcMar>
+              <w:top w:type="dxa" w:w="80"/>
+              <w:left w:type="dxa" w:w="110"/>
+              <w:bottom w:type="dxa" w:w="80"/>
+              <w:right w:type="dxa" w:w="110"/>
+            </w:tcMar>
+          </w:tcPr>
+          <w:p>
+            <w:pPr>
+              <w:keepNext/>
+            </w:pPr>
+            <w:r>
+              <w:rPr>
+                <w:rFonts w:ascii="Calibri" w:cs="Calibri" w:eastAsia="Calibri" w:hAnsi="Calibri"/>
+                <w:b/>
+                <w:bCs/>
+                <w:sz w:val="19"/>
+                <w:szCs w:val="19"/>
+              </w:rPr>
+              <w:t xml:space="preserve">Textile technician</w:t>
+            </w:r>
+          </w:p>
+        </w:tc>
+        <w:tc>
+          <w:tcPr>
+            <w:tcW w:type="dxa" w:w="4260"/>
+            <w:tcBorders>
+              <w:top w:val="single" w:color="C9D1DC" w:sz="4"/>
+              <w:left w:val="single" w:color="C9D1DC" w:sz="4"/>
+              <w:bottom w:val="single" w:color="C9D1DC" w:sz="4"/>
+              <w:right w:val="single" w:color="C9D1DC" w:sz="4"/>
+            </w:tcBorders>
+            <w:tcMar>
+              <w:top w:type="dxa" w:w="80"/>
+              <w:left w:type="dxa" w:w="110"/>
+              <w:bottom w:type="dxa" w:w="80"/>
+              <w:right w:type="dxa" w:w="110"/>
+            </w:tcMar>
+          </w:tcPr>
+          <w:p>
+            <w:pPr>
+              <w:keepNext/>
+            </w:pPr>
+            <w:r>
+              <w:rPr>
+                <w:rFonts w:ascii="Calibri" w:cs="Calibri" w:eastAsia="Calibri" w:hAnsi="Calibri"/>
+                <w:b w:val="false"/>
+                <w:bCs w:val="false"/>
+                <w:sz w:val="19"/>
+                <w:szCs w:val="19"/>
+              </w:rPr>
+              <w:t xml:space="preserve">Installation, commissioning, preventive and corrective maintenance, production-trial support</w:t>
+            </w:r>
+          </w:p>
+        </w:tc>
+        <w:tc>
+          <w:tcPr>
+            <w:tcW w:type="dxa" w:w="1300"/>
+            <w:tcBorders>
+              <w:top w:val="single" w:color="C9D1DC" w:sz="4"/>
+              <w:left w:val="single" w:color="C9D1DC" w:sz="4"/>
+              <w:bottom w:val="single" w:color="C9D1DC" w:sz="4"/>
+              <w:right w:val="single" w:color="C9D1DC" w:sz="4"/>
+            </w:tcBorders>
+            <w:tcMar>
+              <w:top w:type="dxa" w:w="80"/>
+              <w:left w:type="dxa" w:w="110"/>
+              <w:bottom w:type="dxa" w:w="80"/>
+              <w:right w:type="dxa" w:w="110"/>
+            </w:tcMar>
+          </w:tcPr>
+          <w:p>
+            <w:pPr>
+              <w:keepNext/>
+            </w:pPr>
+            <w:r>
+              <w:rPr>
+                <w:rFonts w:ascii="Calibri" w:cs="Calibri" w:eastAsia="Calibri" w:hAnsi="Calibri"/>
+                <w:b w:val="false"/>
+                <w:bCs w:val="false"/>
+                <w:sz w:val="19"/>
+                <w:szCs w:val="19"/>
+              </w:rPr>
+              <w:t xml:space="preserve">Year 1 (+1 in year 2)</w:t>
+            </w:r>
+          </w:p>
+        </w:tc>
+        <w:tc>
+          <w:tcPr>
+            <w:tcW w:type="dxa" w:w="1800"/>
+            <w:tcBorders>
+              <w:top w:val="single" w:color="C9D1DC" w:sz="4"/>
+              <w:left w:val="single" w:color="C9D1DC" w:sz="4"/>
+              <w:bottom w:val="single" w:color="C9D1DC" w:sz="4"/>
+              <w:right w:val="single" w:color="C9D1DC" w:sz="4"/>
+            </w:tcBorders>
+            <w:tcMar>
+              <w:top w:type="dxa" w:w="80"/>
+              <w:left w:type="dxa" w:w="110"/>
+              <w:bottom w:type="dxa" w:w="80"/>
+              <w:right w:type="dxa" w:w="110"/>
+            </w:tcMar>
+          </w:tcPr>
+          <w:p>
+            <w:pPr>
+              <w:keepNext/>
+            </w:pPr>
+            <w:r>
+              <w:rPr>
+                <w:rFonts w:ascii="Calibri" w:cs="Calibri" w:eastAsia="Calibri" w:hAnsi="Calibri"/>
+                <w:b w:val="false"/>
+                <w:bCs w:val="false"/>
+                <w:sz w:val="19"/>
+                <w:szCs w:val="19"/>
+              </w:rPr>
+              <w:t xml:space="preserve">~MXN 30,000</w:t>
+            </w:r>
+          </w:p>
+        </w:tc>
+      </w:tr>
+      <w:tr>
+        <w:trPr>
+          <w:cantSplit/>
+        </w:trPr>
+        <w:tc>
+          <w:tcPr>
+            <w:tcW w:type="dxa" w:w="2000"/>
+            <w:tcBorders>
+              <w:top w:val="single" w:color="C9D1DC" w:sz="4"/>
+              <w:left w:val="single" w:color="C9D1DC" w:sz="4"/>
+              <w:bottom w:val="single" w:color="C9D1DC" w:sz="4"/>
+              <w:right w:val="single" w:color="C9D1DC" w:sz="4"/>
+            </w:tcBorders>
+            <w:shd w:fill="EEF2F7" w:color="auto" w:val="clear"/>
+            <w:tcMar>
+              <w:top w:type="dxa" w:w="80"/>
+              <w:left w:type="dxa" w:w="110"/>
+              <w:bottom w:type="dxa" w:w="80"/>
+              <w:right w:type="dxa" w:w="110"/>
+            </w:tcMar>
+          </w:tcPr>
+          <w:p>
+            <w:pPr>
+              <w:keepNext w:val="false"/>
+            </w:pPr>
+            <w:r>
+              <w:rPr>
+                <w:rFonts w:ascii="Calibri" w:cs="Calibri" w:eastAsia="Calibri" w:hAnsi="Calibri"/>
+                <w:b/>
+                <w:bCs/>
+                <w:sz w:val="19"/>
+                <w:szCs w:val="19"/>
+              </w:rPr>
+              <w:t xml:space="preserve">Group support</w:t>
+            </w:r>
+          </w:p>
+        </w:tc>
+        <w:tc>
+          <w:tcPr>
+            <w:tcW w:type="dxa" w:w="4260"/>
+            <w:tcBorders>
+              <w:top w:val="single" w:color="C9D1DC" w:sz="4"/>
+              <w:left w:val="single" w:color="C9D1DC" w:sz="4"/>
+              <w:bottom w:val="single" w:color="C9D1DC" w:sz="4"/>
+              <w:right w:val="single" w:color="C9D1DC" w:sz="4"/>
+            </w:tcBorders>
+            <w:shd w:fill="EEF2F7" w:color="auto" w:val="clear"/>
+            <w:tcMar>
+              <w:top w:type="dxa" w:w="80"/>
+              <w:left w:type="dxa" w:w="110"/>
+              <w:bottom w:type="dxa" w:w="80"/>
+              <w:right w:type="dxa" w:w="110"/>
+            </w:tcMar>
+          </w:tcPr>
+          <w:p>
+            <w:pPr>
+              <w:keepNext w:val="false"/>
+            </w:pPr>
+            <w:r>
+              <w:rPr>
+                <w:rFonts w:ascii="Calibri" w:cs="Calibri" w:eastAsia="Calibri" w:hAnsi="Calibri"/>
+                <w:b w:val="false"/>
+                <w:bCs w:val="false"/>
+                <w:sz w:val="19"/>
+                <w:szCs w:val="19"/>
+              </w:rPr>
+              <w:t xml:space="preserve">TID (2) and VSP (1) technicians, import and logistics (CEB), administration</w:t>
+            </w:r>
+          </w:p>
+        </w:tc>
+        <w:tc>
+          <w:tcPr>
+            <w:tcW w:type="dxa" w:w="1300"/>
+            <w:tcBorders>
+              <w:top w:val="single" w:color="C9D1DC" w:sz="4"/>
+              <w:left w:val="single" w:color="C9D1DC" w:sz="4"/>
+              <w:bottom w:val="single" w:color="C9D1DC" w:sz="4"/>
+              <w:right w:val="single" w:color="C9D1DC" w:sz="4"/>
+            </w:tcBorders>
+            <w:shd w:fill="EEF2F7" w:color="auto" w:val="clear"/>
+            <w:tcMar>
+              <w:top w:type="dxa" w:w="80"/>
+              <w:left w:type="dxa" w:w="110"/>
+              <w:bottom w:type="dxa" w:w="80"/>
+              <w:right w:type="dxa" w:w="110"/>
+            </w:tcMar>
+          </w:tcPr>
+          <w:p>
+            <w:pPr>
+              <w:keepNext w:val="false"/>
+            </w:pPr>
+            <w:r>
+              <w:rPr>
+                <w:rFonts w:ascii="Calibri" w:cs="Calibri" w:eastAsia="Calibri" w:hAnsi="Calibri"/>
+                <w:b w:val="false"/>
+                <w:bCs w:val="false"/>
+                <w:sz w:val="19"/>
+                <w:szCs w:val="19"/>
+              </w:rPr>
+              <w:t xml:space="preserve">Existing</w:t>
+            </w:r>
+          </w:p>
+        </w:tc>
+        <w:tc>
+          <w:tcPr>
+            <w:tcW w:type="dxa" w:w="1800"/>
+            <w:tcBorders>
+              <w:top w:val="single" w:color="C9D1DC" w:sz="4"/>
+              <w:left w:val="single" w:color="C9D1DC" w:sz="4"/>
+              <w:bottom w:val="single" w:color="C9D1DC" w:sz="4"/>
+              <w:right w:val="single" w:color="C9D1DC" w:sz="4"/>
+            </w:tcBorders>
+            <w:shd w:fill="EEF2F7" w:color="auto" w:val="clear"/>
+            <w:tcMar>
+              <w:top w:type="dxa" w:w="80"/>
+              <w:left w:type="dxa" w:w="110"/>
+              <w:bottom w:type="dxa" w:w="80"/>
+              <w:right w:type="dxa" w:w="110"/>
+            </w:tcMar>
+          </w:tcPr>
+          <w:p>
+            <w:pPr>
+              <w:keepNext w:val="false"/>
+            </w:pPr>
+            <w:r>
+              <w:rPr>
+                <w:rFonts w:ascii="Calibri" w:cs="Calibri" w:eastAsia="Calibri" w:hAnsi="Calibri"/>
+                <w:b w:val="false"/>
+                <w:bCs w:val="false"/>
+                <w:sz w:val="19"/>
+                <w:szCs w:val="19"/>
+              </w:rPr>
+              <w:t xml:space="preserve">—</w:t>
+            </w:r>
+          </w:p>
+        </w:tc>
+      </w:tr>
+    </w:tbl>
+    <w:p>
+      <w:pPr>
+        <w:spacing w:after="120"/>
+      </w:pPr>
+    </w:p>
+    <w:p>
+      <w:pPr>
+        <w:pStyle w:val="Heading2"/>
+      </w:pPr>
+      <w:r>
+        <w:t xml:space="preserve">Machine and product training program</w:t>
+      </w:r>
+    </w:p>
+    <w:tbl>
+      <w:tblPr>
+        <w:tblW w:type="dxa" w:w="9360"/>
+        <w:tblBorders>
+          <w:top w:val="single" w:color="auto" w:sz="4"/>
+          <w:left w:val="single" w:color="auto" w:sz="4"/>
+          <w:bottom w:val="single" w:color="auto" w:sz="4"/>
+          <w:right w:val="single" w:color="auto" w:sz="4"/>
+          <w:insideH w:val="single" w:color="auto" w:sz="4"/>
+          <w:insideV w:val="single" w:color="auto" w:sz="4"/>
+        </w:tblBorders>
+      </w:tblPr>
+      <w:tblGrid>
+        <w:gridCol w:w="2200"/>
+        <w:gridCol w:w="2300"/>
+        <w:gridCol w:w="4860"/>
+      </w:tblGrid>
+      <w:tr>
+        <w:trPr>
+          <w:cantSplit/>
+          <w:tblHeader/>
+        </w:trPr>
+        <w:tc>
+          <w:tcPr>
+            <w:tcW w:type="dxa" w:w="2200"/>
+            <w:tcBorders>
+              <w:top w:val="single" w:color="C9D1DC" w:sz="4"/>
+              <w:left w:val="single" w:color="C9D1DC" w:sz="4"/>
+              <w:bottom w:val="single" w:color="C9D1DC" w:sz="4"/>
+              <w:right w:val="single" w:color="C9D1DC" w:sz="4"/>
+            </w:tcBorders>
+            <w:shd w:fill="1B1F3B" w:color="auto" w:val="clear"/>
+            <w:tcMar>
+              <w:top w:type="dxa" w:w="80"/>
+              <w:left w:type="dxa" w:w="110"/>
+              <w:bottom w:type="dxa" w:w="80"/>
+              <w:right w:type="dxa" w:w="110"/>
+            </w:tcMar>
+          </w:tcPr>
+          <w:p>
+            <w:pPr>
+              <w:keepNext/>
+            </w:pPr>
+            <w:r>
+              <w:rPr>
+                <w:rFonts w:ascii="Calibri" w:cs="Calibri" w:eastAsia="Calibri" w:hAnsi="Calibri"/>
+                <w:b/>
+                <w:bCs/>
+                <w:color w:val="FFFFFF"/>
+                <w:sz w:val="19"/>
+                <w:szCs w:val="19"/>
+              </w:rPr>
+              <w:t xml:space="preserve">Training</w:t>
+            </w:r>
+          </w:p>
+        </w:tc>
+        <w:tc>
+          <w:tcPr>
+            <w:tcW w:type="dxa" w:w="2300"/>
+            <w:tcBorders>
+              <w:top w:val="single" w:color="C9D1DC" w:sz="4"/>
+              <w:left w:val="single" w:color="C9D1DC" w:sz="4"/>
+              <w:bottom w:val="single" w:color="C9D1DC" w:sz="4"/>
+              <w:right w:val="single" w:color="C9D1DC" w:sz="4"/>
+            </w:tcBorders>
+            <w:shd w:fill="1B1F3B" w:color="auto" w:val="clear"/>
+            <w:tcMar>
+              <w:top w:type="dxa" w:w="80"/>
+              <w:left w:type="dxa" w:w="110"/>
+              <w:bottom w:type="dxa" w:w="80"/>
+              <w:right w:type="dxa" w:w="110"/>
+            </w:tcMar>
+          </w:tcPr>
+          <w:p>
+            <w:pPr>
+              <w:keepNext/>
+            </w:pPr>
+            <w:r>
+              <w:rPr>
+                <w:rFonts w:ascii="Calibri" w:cs="Calibri" w:eastAsia="Calibri" w:hAnsi="Calibri"/>
+                <w:b/>
+                <w:bCs/>
+                <w:color w:val="FFFFFF"/>
+                <w:sz w:val="19"/>
+                <w:szCs w:val="19"/>
+              </w:rPr>
+              <w:t xml:space="preserve">Audience</w:t>
+            </w:r>
+          </w:p>
+        </w:tc>
+        <w:tc>
+          <w:tcPr>
+            <w:tcW w:type="dxa" w:w="4860"/>
+            <w:tcBorders>
+              <w:top w:val="single" w:color="C9D1DC" w:sz="4"/>
+              <w:left w:val="single" w:color="C9D1DC" w:sz="4"/>
+              <w:bottom w:val="single" w:color="C9D1DC" w:sz="4"/>
+              <w:right w:val="single" w:color="C9D1DC" w:sz="4"/>
+            </w:tcBorders>
+            <w:shd w:fill="1B1F3B" w:color="auto" w:val="clear"/>
+            <w:tcMar>
+              <w:top w:type="dxa" w:w="80"/>
+              <w:left w:type="dxa" w:w="110"/>
+              <w:bottom w:type="dxa" w:w="80"/>
+              <w:right w:type="dxa" w:w="110"/>
+            </w:tcMar>
+          </w:tcPr>
+          <w:p>
+            <w:pPr>
+              <w:keepNext/>
+            </w:pPr>
+            <w:r>
+              <w:rPr>
+                <w:rFonts w:ascii="Calibri" w:cs="Calibri" w:eastAsia="Calibri" w:hAnsi="Calibri"/>
+                <w:b/>
+                <w:bCs/>
+                <w:color w:val="FFFFFF"/>
+                <w:sz w:val="19"/>
+                <w:szCs w:val="19"/>
+              </w:rPr>
+              <w:t xml:space="preserve">Content</w:t>
+            </w:r>
+          </w:p>
+        </w:tc>
+      </w:tr>
+      <w:tr>
+        <w:trPr>
+          <w:cantSplit/>
+        </w:trPr>
+        <w:tc>
+          <w:tcPr>
+            <w:tcW w:type="dxa" w:w="2200"/>
+            <w:tcBorders>
+              <w:top w:val="single" w:color="C9D1DC" w:sz="4"/>
+              <w:left w:val="single" w:color="C9D1DC" w:sz="4"/>
+              <w:bottom w:val="single" w:color="C9D1DC" w:sz="4"/>
+              <w:right w:val="single" w:color="C9D1DC" w:sz="4"/>
+            </w:tcBorders>
+            <w:tcMar>
+              <w:top w:type="dxa" w:w="80"/>
+              <w:left w:type="dxa" w:w="110"/>
+              <w:bottom w:type="dxa" w:w="80"/>
+              <w:right w:type="dxa" w:w="110"/>
+            </w:tcMar>
+          </w:tcPr>
+          <w:p>
+            <w:pPr>
+              <w:keepNext/>
+            </w:pPr>
+            <w:r>
+              <w:rPr>
+                <w:rFonts w:ascii="Calibri" w:cs="Calibri" w:eastAsia="Calibri" w:hAnsi="Calibri"/>
+                <w:b/>
+                <w:bCs/>
+                <w:sz w:val="19"/>
+                <w:szCs w:val="19"/>
+              </w:rPr>
+              <w:t xml:space="preserve">Initial, at CLT’s plant</w:t>
+            </w:r>
+          </w:p>
+        </w:tc>
+        <w:tc>
+          <w:tcPr>
+            <w:tcW w:type="dxa" w:w="2300"/>
+            <w:tcBorders>
+              <w:top w:val="single" w:color="C9D1DC" w:sz="4"/>
+              <w:left w:val="single" w:color="C9D1DC" w:sz="4"/>
+              <w:bottom w:val="single" w:color="C9D1DC" w:sz="4"/>
+              <w:right w:val="single" w:color="C9D1DC" w:sz="4"/>
+            </w:tcBorders>
+            <w:tcMar>
+              <w:top w:type="dxa" w:w="80"/>
+              <w:left w:type="dxa" w:w="110"/>
+              <w:bottom w:type="dxa" w:w="80"/>
+              <w:right w:type="dxa" w:w="110"/>
+            </w:tcMar>
+          </w:tcPr>
+          <w:p>
+            <w:pPr>
+              <w:keepNext/>
+            </w:pPr>
+            <w:r>
+              <w:rPr>
+                <w:rFonts w:ascii="Calibri" w:cs="Calibri" w:eastAsia="Calibri" w:hAnsi="Calibri"/>
+                <w:b w:val="false"/>
+                <w:bCs w:val="false"/>
+                <w:sz w:val="19"/>
+                <w:szCs w:val="19"/>
+              </w:rPr>
+              <w:t xml:space="preserve">Sales, technicians and customer service</w:t>
+            </w:r>
+          </w:p>
+        </w:tc>
+        <w:tc>
+          <w:tcPr>
+            <w:tcW w:type="dxa" w:w="4860"/>
+            <w:tcBorders>
+              <w:top w:val="single" w:color="C9D1DC" w:sz="4"/>
+              <w:left w:val="single" w:color="C9D1DC" w:sz="4"/>
+              <w:bottom w:val="single" w:color="C9D1DC" w:sz="4"/>
+              <w:right w:val="single" w:color="C9D1DC" w:sz="4"/>
+            </w:tcBorders>
+            <w:tcMar>
+              <w:top w:type="dxa" w:w="80"/>
+              <w:left w:type="dxa" w:w="110"/>
+              <w:bottom w:type="dxa" w:w="80"/>
+              <w:right w:type="dxa" w:w="110"/>
+            </w:tcMar>
+          </w:tcPr>
+          <w:p>
+            <w:pPr>
+              <w:keepNext/>
+            </w:pPr>
+            <w:r>
+              <w:rPr>
+                <w:rFonts w:ascii="Calibri" w:cs="Calibri" w:eastAsia="Calibri" w:hAnsi="Calibri"/>
+                <w:b w:val="false"/>
+                <w:bCs w:val="false"/>
+                <w:sz w:val="19"/>
+                <w:szCs w:val="19"/>
+              </w:rPr>
+              <w:t xml:space="preserve">Operation and maintenance of hybrids, presses and DTG; textile chemistry (silicones, pastes, inks); special effects; technical certification</w:t>
+            </w:r>
+          </w:p>
+        </w:tc>
+      </w:tr>
+      <w:tr>
+        <w:trPr>
+          <w:cantSplit/>
+        </w:trPr>
+        <w:tc>
+          <w:tcPr>
+            <w:tcW w:type="dxa" w:w="2200"/>
+            <w:tcBorders>
+              <w:top w:val="single" w:color="C9D1DC" w:sz="4"/>
+              <w:left w:val="single" w:color="C9D1DC" w:sz="4"/>
+              <w:bottom w:val="single" w:color="C9D1DC" w:sz="4"/>
+              <w:right w:val="single" w:color="C9D1DC" w:sz="4"/>
+            </w:tcBorders>
+            <w:shd w:fill="EEF2F7" w:color="auto" w:val="clear"/>
+            <w:tcMar>
+              <w:top w:type="dxa" w:w="80"/>
+              <w:left w:type="dxa" w:w="110"/>
+              <w:bottom w:type="dxa" w:w="80"/>
+              <w:right w:type="dxa" w:w="110"/>
+            </w:tcMar>
+          </w:tcPr>
+          <w:p>
+            <w:pPr>
+              <w:keepNext/>
+            </w:pPr>
+            <w:r>
+              <w:rPr>
+                <w:rFonts w:ascii="Calibri" w:cs="Calibri" w:eastAsia="Calibri" w:hAnsi="Calibri"/>
+                <w:b/>
+                <w:bCs/>
+                <w:sz w:val="19"/>
+                <w:szCs w:val="19"/>
+              </w:rPr>
+              <w:t xml:space="preserve">Machine training for customers</w:t>
+            </w:r>
+          </w:p>
+        </w:tc>
+        <w:tc>
+          <w:tcPr>
+            <w:tcW w:type="dxa" w:w="2300"/>
+            <w:tcBorders>
+              <w:top w:val="single" w:color="C9D1DC" w:sz="4"/>
+              <w:left w:val="single" w:color="C9D1DC" w:sz="4"/>
+              <w:bottom w:val="single" w:color="C9D1DC" w:sz="4"/>
+              <w:right w:val="single" w:color="C9D1DC" w:sz="4"/>
+            </w:tcBorders>
+            <w:shd w:fill="EEF2F7" w:color="auto" w:val="clear"/>
+            <w:tcMar>
+              <w:top w:type="dxa" w:w="80"/>
+              <w:left w:type="dxa" w:w="110"/>
+              <w:bottom w:type="dxa" w:w="80"/>
+              <w:right w:type="dxa" w:w="110"/>
+            </w:tcMar>
+          </w:tcPr>
+          <w:p>
+            <w:pPr>
+              <w:keepNext/>
+            </w:pPr>
+            <w:r>
+              <w:rPr>
+                <w:rFonts w:ascii="Calibri" w:cs="Calibri" w:eastAsia="Calibri" w:hAnsi="Calibri"/>
+                <w:b w:val="false"/>
+                <w:bCs w:val="false"/>
+                <w:sz w:val="19"/>
+                <w:szCs w:val="19"/>
+              </w:rPr>
+              <w:t xml:space="preserve">Customer operators and supervisors</w:t>
+            </w:r>
+          </w:p>
+        </w:tc>
+        <w:tc>
+          <w:tcPr>
+            <w:tcW w:type="dxa" w:w="4860"/>
+            <w:tcBorders>
+              <w:top w:val="single" w:color="C9D1DC" w:sz="4"/>
+              <w:left w:val="single" w:color="C9D1DC" w:sz="4"/>
+              <w:bottom w:val="single" w:color="C9D1DC" w:sz="4"/>
+              <w:right w:val="single" w:color="C9D1DC" w:sz="4"/>
+            </w:tcBorders>
+            <w:shd w:fill="EEF2F7" w:color="auto" w:val="clear"/>
+            <w:tcMar>
+              <w:top w:type="dxa" w:w="80"/>
+              <w:left w:type="dxa" w:w="110"/>
+              <w:bottom w:type="dxa" w:w="80"/>
+              <w:right w:type="dxa" w:w="110"/>
+            </w:tcMar>
+          </w:tcPr>
+          <w:p>
+            <w:pPr>
+              <w:keepNext/>
+            </w:pPr>
+            <w:r>
+              <w:rPr>
+                <w:rFonts w:ascii="Calibri" w:cs="Calibri" w:eastAsia="Calibri" w:hAnsi="Calibri"/>
+                <w:b w:val="false"/>
+                <w:bCs w:val="false"/>
+                <w:sz w:val="19"/>
+                <w:szCs w:val="19"/>
+              </w:rPr>
+              <w:t xml:space="preserve">Installation, operation, calibration, head cleaning, preventive maintenance and troubleshooting; included in the turnkey package</w:t>
+            </w:r>
+          </w:p>
+        </w:tc>
+      </w:tr>
+      <w:tr>
+        <w:trPr>
+          <w:cantSplit/>
+        </w:trPr>
+        <w:tc>
+          <w:tcPr>
+            <w:tcW w:type="dxa" w:w="2200"/>
+            <w:tcBorders>
+              <w:top w:val="single" w:color="C9D1DC" w:sz="4"/>
+              <w:left w:val="single" w:color="C9D1DC" w:sz="4"/>
+              <w:bottom w:val="single" w:color="C9D1DC" w:sz="4"/>
+              <w:right w:val="single" w:color="C9D1DC" w:sz="4"/>
+            </w:tcBorders>
+            <w:tcMar>
+              <w:top w:type="dxa" w:w="80"/>
+              <w:left w:type="dxa" w:w="110"/>
+              <w:bottom w:type="dxa" w:w="80"/>
+              <w:right w:type="dxa" w:w="110"/>
+            </w:tcMar>
+          </w:tcPr>
+          <w:p>
+            <w:pPr>
+              <w:keepNext/>
+            </w:pPr>
+            <w:r>
+              <w:rPr>
+                <w:rFonts w:ascii="Calibri" w:cs="Calibri" w:eastAsia="Calibri" w:hAnsi="Calibri"/>
+                <w:b/>
+                <w:bCs/>
+                <w:sz w:val="19"/>
+                <w:szCs w:val="19"/>
+              </w:rPr>
+              <w:t xml:space="preserve">Product (consumables) training</w:t>
+            </w:r>
+          </w:p>
+        </w:tc>
+        <w:tc>
+          <w:tcPr>
+            <w:tcW w:type="dxa" w:w="2300"/>
+            <w:tcBorders>
+              <w:top w:val="single" w:color="C9D1DC" w:sz="4"/>
+              <w:left w:val="single" w:color="C9D1DC" w:sz="4"/>
+              <w:bottom w:val="single" w:color="C9D1DC" w:sz="4"/>
+              <w:right w:val="single" w:color="C9D1DC" w:sz="4"/>
+            </w:tcBorders>
+            <w:tcMar>
+              <w:top w:type="dxa" w:w="80"/>
+              <w:left w:type="dxa" w:w="110"/>
+              <w:bottom w:type="dxa" w:w="80"/>
+              <w:right w:type="dxa" w:w="110"/>
+            </w:tcMar>
+          </w:tcPr>
+          <w:p>
+            <w:pPr>
+              <w:keepNext/>
+            </w:pPr>
+            <w:r>
+              <w:rPr>
+                <w:rFonts w:ascii="Calibri" w:cs="Calibri" w:eastAsia="Calibri" w:hAnsi="Calibri"/>
+                <w:b w:val="false"/>
+                <w:bCs w:val="false"/>
+                <w:sz w:val="19"/>
+                <w:szCs w:val="19"/>
+              </w:rPr>
+              <w:t xml:space="preserve">Customers and prospects</w:t>
+            </w:r>
+          </w:p>
+        </w:tc>
+        <w:tc>
+          <w:tcPr>
+            <w:tcW w:type="dxa" w:w="4860"/>
+            <w:tcBorders>
+              <w:top w:val="single" w:color="C9D1DC" w:sz="4"/>
+              <w:left w:val="single" w:color="C9D1DC" w:sz="4"/>
+              <w:bottom w:val="single" w:color="C9D1DC" w:sz="4"/>
+              <w:right w:val="single" w:color="C9D1DC" w:sz="4"/>
+            </w:tcBorders>
+            <w:tcMar>
+              <w:top w:type="dxa" w:w="80"/>
+              <w:left w:type="dxa" w:w="110"/>
+              <w:bottom w:type="dxa" w:w="80"/>
+              <w:right w:type="dxa" w:w="110"/>
+            </w:tcMar>
+          </w:tcPr>
+          <w:p>
+            <w:pPr>
+              <w:keepNext/>
+            </w:pPr>
+            <w:r>
+              <w:rPr>
+                <w:rFonts w:ascii="Calibri" w:cs="Calibri" w:eastAsia="Calibri" w:hAnsi="Calibri"/>
+                <w:b w:val="false"/>
+                <w:bCs w:val="false"/>
+                <w:sz w:val="19"/>
+                <w:szCs w:val="19"/>
+              </w:rPr>
+              <w:t xml:space="preserve">Use of silicones (3D, glass-like, embroidery-like), water-based pastes, curing, wash tests and effect recipes; workshops in the demo showroom</w:t>
+            </w:r>
+          </w:p>
+        </w:tc>
+      </w:tr>
+      <w:tr>
+        <w:trPr>
+          <w:cantSplit/>
+        </w:trPr>
+        <w:tc>
+          <w:tcPr>
+            <w:tcW w:type="dxa" w:w="2200"/>
+            <w:tcBorders>
+              <w:top w:val="single" w:color="C9D1DC" w:sz="4"/>
+              <w:left w:val="single" w:color="C9D1DC" w:sz="4"/>
+              <w:bottom w:val="single" w:color="C9D1DC" w:sz="4"/>
+              <w:right w:val="single" w:color="C9D1DC" w:sz="4"/>
+            </w:tcBorders>
+            <w:shd w:fill="EEF2F7" w:color="auto" w:val="clear"/>
+            <w:tcMar>
+              <w:top w:type="dxa" w:w="80"/>
+              <w:left w:type="dxa" w:w="110"/>
+              <w:bottom w:type="dxa" w:w="80"/>
+              <w:right w:type="dxa" w:w="110"/>
+            </w:tcMar>
+          </w:tcPr>
+          <w:p>
+            <w:pPr>
+              <w:keepNext w:val="false"/>
+            </w:pPr>
+            <w:r>
+              <w:rPr>
+                <w:rFonts w:ascii="Calibri" w:cs="Calibri" w:eastAsia="Calibri" w:hAnsi="Calibri"/>
+                <w:b/>
+                <w:bCs/>
+                <w:sz w:val="19"/>
+                <w:szCs w:val="19"/>
+              </w:rPr>
+              <w:t xml:space="preserve">Ongoing updates</w:t>
+            </w:r>
+          </w:p>
+        </w:tc>
+        <w:tc>
+          <w:tcPr>
+            <w:tcW w:type="dxa" w:w="2300"/>
+            <w:tcBorders>
+              <w:top w:val="single" w:color="C9D1DC" w:sz="4"/>
+              <w:left w:val="single" w:color="C9D1DC" w:sz="4"/>
+              <w:bottom w:val="single" w:color="C9D1DC" w:sz="4"/>
+              <w:right w:val="single" w:color="C9D1DC" w:sz="4"/>
+            </w:tcBorders>
+            <w:shd w:fill="EEF2F7" w:color="auto" w:val="clear"/>
+            <w:tcMar>
+              <w:top w:type="dxa" w:w="80"/>
+              <w:left w:type="dxa" w:w="110"/>
+              <w:bottom w:type="dxa" w:w="80"/>
+              <w:right w:type="dxa" w:w="110"/>
+            </w:tcMar>
+          </w:tcPr>
+          <w:p>
+            <w:pPr>
+              <w:keepNext w:val="false"/>
+            </w:pPr>
+            <w:r>
+              <w:rPr>
+                <w:rFonts w:ascii="Calibri" w:cs="Calibri" w:eastAsia="Calibri" w:hAnsi="Calibri"/>
+                <w:b w:val="false"/>
+                <w:bCs w:val="false"/>
+                <w:sz w:val="19"/>
+                <w:szCs w:val="19"/>
+              </w:rPr>
+              <w:t xml:space="preserve">Internal team and customers</w:t>
+            </w:r>
+          </w:p>
+        </w:tc>
+        <w:tc>
+          <w:tcPr>
+            <w:tcW w:type="dxa" w:w="4860"/>
+            <w:tcBorders>
+              <w:top w:val="single" w:color="C9D1DC" w:sz="4"/>
+              <w:left w:val="single" w:color="C9D1DC" w:sz="4"/>
+              <w:bottom w:val="single" w:color="C9D1DC" w:sz="4"/>
+              <w:right w:val="single" w:color="C9D1DC" w:sz="4"/>
+            </w:tcBorders>
+            <w:shd w:fill="EEF2F7" w:color="auto" w:val="clear"/>
+            <w:tcMar>
+              <w:top w:type="dxa" w:w="80"/>
+              <w:left w:type="dxa" w:w="110"/>
+              <w:bottom w:type="dxa" w:w="80"/>
+              <w:right w:type="dxa" w:w="110"/>
+            </w:tcMar>
+          </w:tcPr>
+          <w:p>
+            <w:pPr>
+              <w:keepNext w:val="false"/>
+            </w:pPr>
+            <w:r>
+              <w:rPr>
+                <w:rFonts w:ascii="Calibri" w:cs="Calibri" w:eastAsia="Calibri" w:hAnsi="Calibri"/>
+                <w:b w:val="false"/>
+                <w:bCs w:val="false"/>
+                <w:sz w:val="19"/>
+                <w:szCs w:val="19"/>
+              </w:rPr>
+              <w:t xml:space="preserve">New CLT products and models, remote sessions with CLT engineers, annual refresher</w:t>
+            </w:r>
+          </w:p>
+        </w:tc>
+      </w:tr>
+    </w:tbl>
+    <w:p>
+      <w:pPr>
+        <w:spacing w:after="120"/>
+      </w:pPr>
+    </w:p>
+    <w:p>
+      <w:pPr>
+        <w:spacing w:after="200" w:before="80"/>
+      </w:pPr>
+      <w:r>
+        <w:rPr>
+          <w:i/>
+          <w:iCs/>
+          <w:color w:val="555555"/>
+          <w:sz w:val="18"/>
+          <w:szCs w:val="18"/>
+        </w:rPr>
+        <w:t xml:space="preserve">Monthly salaries before benefits (~35%). Training can be offered for a fee to customers whose machines were not purchased through the group.</w:t>
+      </w:r>
+    </w:p>
+    <w:p>
       <w:r>
         <w:br w:type="page"/>
       </w:r>
@@ -7078,7 +8364,7 @@
         <w:pStyle w:val="Heading1"/>
       </w:pPr>
       <w:r>
-        <w:t xml:space="preserve">12. Initial investment (estimate)</w:t>
+        <w:t xml:space="preserve">13. Initial investment (estimate)</w:t>
       </w:r>
     </w:p>
     <w:tbl>
@@ -8332,7 +9618,7 @@
         <w:spacing w:after="160"/>
       </w:pPr>
       <w:r>
-        <w:t xml:space="preserve">Year-1 operating expenses (base case): ~US$120k, including a textile sales manager (~MXN 50,000/month), a textile technician (~MXN 30,000/month), benefits, trade shows, space and travel. Import VAT is creditable but affects cash flow.</w:t>
+        <w:t xml:space="preserve">Year-1 operating expenses (base case): ~US$131k, including a textile sales specialist (~MXN 40,000/month plus commission), customer service (~MXN 20,000/month), a textile technician (~MXN 30,000/month), benefits, ongoing training, trade shows, space and travel. Import VAT is creditable but affects cash flow.</w:t>
       </w:r>
     </w:p>
     <w:p>
@@ -8340,7 +9626,7 @@
         <w:pStyle w:val="Heading1"/>
       </w:pPr>
       <w:r>
-        <w:t xml:space="preserve">13. Financial projection (base case, estimate)</w:t>
+        <w:t xml:space="preserve">14. Financial projection (base case, estimate)</w:t>
       </w:r>
     </w:p>
     <w:tbl>
@@ -8972,7 +10258,7 @@
                 <w:sz w:val="19"/>
                 <w:szCs w:val="19"/>
               </w:rPr>
-              <w:t xml:space="preserve">-US$122k</w:t>
+              <w:t xml:space="preserve">-US$131k</w:t>
             </w:r>
           </w:p>
         </w:tc>
@@ -9005,7 +10291,7 @@
                 <w:sz w:val="19"/>
                 <w:szCs w:val="19"/>
               </w:rPr>
-              <w:t xml:space="preserve">-US$140k</w:t>
+              <w:t xml:space="preserve">-US$160k</w:t>
             </w:r>
           </w:p>
         </w:tc>
@@ -9038,7 +10324,7 @@
                 <w:sz w:val="19"/>
                 <w:szCs w:val="19"/>
               </w:rPr>
-              <w:t xml:space="preserve">-US$160k</w:t>
+              <w:t xml:space="preserve">-US$180k</w:t>
             </w:r>
           </w:p>
         </w:tc>
@@ -9109,7 +10395,7 @@
                 <w:sz w:val="19"/>
                 <w:szCs w:val="19"/>
               </w:rPr>
-              <w:t xml:space="preserve">-US$28k</w:t>
+              <w:t xml:space="preserve">-US$37k</w:t>
             </w:r>
           </w:p>
         </w:tc>
@@ -9142,7 +10428,7 @@
                 <w:sz w:val="19"/>
                 <w:szCs w:val="19"/>
               </w:rPr>
-              <w:t xml:space="preserve">+US$109k</w:t>
+              <w:t xml:space="preserve">+US$89k</w:t>
             </w:r>
           </w:p>
         </w:tc>
@@ -9175,7 +10461,7 @@
                 <w:sz w:val="19"/>
                 <w:szCs w:val="19"/>
               </w:rPr>
-              <w:t xml:space="preserve">+US$289k</w:t>
+              <w:t xml:space="preserve">+US$269k</w:t>
             </w:r>
           </w:p>
         </w:tc>
@@ -9246,7 +10532,7 @@
                 <w:sz w:val="19"/>
                 <w:szCs w:val="19"/>
               </w:rPr>
-              <w:t xml:space="preserve">-US$28k</w:t>
+              <w:t xml:space="preserve">-US$37k</w:t>
             </w:r>
           </w:p>
         </w:tc>
@@ -9279,7 +10565,7 @@
                 <w:sz w:val="19"/>
                 <w:szCs w:val="19"/>
               </w:rPr>
-              <w:t xml:space="preserve">+US$81k</w:t>
+              <w:t xml:space="preserve">+US$52k</w:t>
             </w:r>
           </w:p>
         </w:tc>
@@ -9312,7 +10598,7 @@
                 <w:sz w:val="19"/>
                 <w:szCs w:val="19"/>
               </w:rPr>
-              <w:t xml:space="preserve">+US$370k</w:t>
+              <w:t xml:space="preserve">+US$321k</w:t>
             </w:r>
           </w:p>
         </w:tc>
@@ -9367,7 +10653,7 @@
         <w:pStyle w:val="Heading1"/>
       </w:pPr>
       <w:r>
-        <w:t xml:space="preserve">14. Proposed terms with CLT</w:t>
+        <w:t xml:space="preserve">15. Proposed terms with CLT</w:t>
       </w:r>
     </w:p>
     <w:p>
@@ -9513,7 +10799,7 @@
         <w:spacing w:after="80"/>
       </w:pPr>
       <w:r>
-        <w:t xml:space="preserve">A textile division with dedicated staff.</w:t>
+        <w:t xml:space="preserve">A dedicated textile team: sales specialist, customer service and technician.</w:t>
       </w:r>
     </w:p>
     <w:p>
@@ -9526,7 +10812,7 @@
         <w:spacing w:after="80"/>
       </w:pPr>
       <w:r>
-        <w:t xml:space="preserve">Proposed minimum sales targets: 2 lines in year 1, 5 in year 2 and 8 in year 3, plus consumables volume to be agreed.</w:t>
+        <w:t xml:space="preserve">A machine and product training program for customers.</w:t>
       </w:r>
     </w:p>
     <w:p>
@@ -9539,6 +10825,19 @@
         <w:spacing w:after="80"/>
       </w:pPr>
       <w:r>
+        <w:t xml:space="preserve">Proposed minimum sales targets: 2 lines in year 1, 5 in year 2 and 8 in year 3, plus consumables volume to be agreed.</w:t>
+      </w:r>
+    </w:p>
+    <w:p>
+      <w:pPr>
+        <w:pStyle w:val="ListParagraph"/>
+        <w:numPr>
+          <w:ilvl w:val="0"/>
+          <w:numId w:val="2"/>
+        </w:numPr>
+        <w:spacing w:after="80"/>
+      </w:pPr>
+      <w:r>
         <w:t xml:space="preserve">Quarterly reports on market, pipeline and customer satisfaction.</w:t>
       </w:r>
     </w:p>
@@ -9547,7 +10846,7 @@
         <w:pStyle w:val="Heading1"/>
       </w:pPr>
       <w:r>
-        <w:t xml:space="preserve">15. Risks and mitigation</w:t>
+        <w:t xml:space="preserve">16. Risks and mitigation</w:t>
       </w:r>
     </w:p>
     <w:tbl>
@@ -10071,7 +11370,7 @@
         <w:pStyle w:val="Heading1"/>
       </w:pPr>
       <w:r>
-        <w:t xml:space="preserve">16. Expansion: United States and Latin America</w:t>
+        <w:t xml:space="preserve">17. Expansion: United States and Latin America</w:t>
       </w:r>
     </w:p>
     <w:p>
@@ -10105,7 +11404,7 @@
         <w:pStyle w:val="Heading1"/>
       </w:pPr>
       <w:r>
-        <w:t xml:space="preserve">17. Next steps</w:t>
+        <w:t xml:space="preserve">18. Next steps</w:t>
       </w:r>
     </w:p>
     <w:p>

</xml_diff>

<commit_message>
Agrega galería de muestras CLT y fotos del stand a la propuesta
Dos diapositivas de muestras y una del stand de PRINTING United 2026 en la
presentación, y un anexo con 10 fotos en el documento (ES/EN).

Co-Authored-By: Claude Opus 5.5 <noreply@anthropic.com>
Claude-Session: https://claude.ai/code/session_012axCVDM5kAgj1VFnxhpsuM
</commit_message>
<xml_diff>
--- a/propuesta-clt/CLT_Distribution_Proposal_Mexico_EN.docx
+++ b/propuesta-clt/CLT_Distribution_Proposal_Mexico_EN.docx
@@ -11470,6 +11470,844 @@
       </w:pPr>
       <w:r>
         <w:t xml:space="preserve">Sign a letter of intent and define the 6-month launch plan.</w:t>
+      </w:r>
+    </w:p>
+    <w:p>
+      <w:r>
+        <w:br w:type="page"/>
+      </w:r>
+    </w:p>
+    <w:p>
+      <w:pPr>
+        <w:pStyle w:val="Heading1"/>
+      </w:pPr>
+      <w:r>
+        <w:t xml:space="preserve">Appendix: CLT samples</w:t>
+      </w:r>
+    </w:p>
+    <w:p>
+      <w:pPr>
+        <w:spacing w:after="160"/>
+      </w:pPr>
+      <w:r>
+        <w:t xml:space="preserve">Photos taken by the TID / VSP team at CLT’s PRINTING United 2026 booth (Las Vegas) and of CLT production samples.</w:t>
+      </w:r>
+    </w:p>
+    <w:tbl>
+      <w:tblPr>
+        <w:tblW w:type="dxa" w:w="9360"/>
+        <w:tblBorders>
+          <w:top w:val="single" w:color="auto" w:sz="4"/>
+          <w:left w:val="single" w:color="auto" w:sz="4"/>
+          <w:bottom w:val="single" w:color="auto" w:sz="4"/>
+          <w:right w:val="single" w:color="auto" w:sz="4"/>
+          <w:insideH w:val="single" w:color="auto" w:sz="4"/>
+          <w:insideV w:val="single" w:color="auto" w:sz="4"/>
+        </w:tblBorders>
+      </w:tblPr>
+      <w:tblGrid>
+        <w:gridCol w:w="4680"/>
+        <w:gridCol w:w="4680"/>
+      </w:tblGrid>
+      <w:tr>
+        <w:trPr>
+          <w:cantSplit/>
+        </w:trPr>
+        <w:tc>
+          <w:tcPr>
+            <w:tcW w:type="dxa" w:w="4680"/>
+            <w:tcBorders>
+              <w:top w:val="none"/>
+              <w:left w:val="none"/>
+              <w:bottom w:val="none"/>
+              <w:right w:val="none"/>
+            </w:tcBorders>
+            <w:tcMar>
+              <w:top w:type="dxa" w:w="80"/>
+              <w:left w:type="dxa" w:w="80"/>
+              <w:bottom w:type="dxa" w:w="160"/>
+              <w:right w:type="dxa" w:w="80"/>
+            </w:tcMar>
+          </w:tcPr>
+          <w:p>
+            <w:pPr>
+              <w:jc w:val="center"/>
+            </w:pPr>
+            <w:r>
+              <w:drawing>
+                <wp:inline distT="0" distB="0" distL="0" distR="0">
+                  <wp:extent cx="2667000" cy="2667000"/>
+                  <wp:effectExtent t="0" r="0" b="0" l="0"/>
+                  <wp:docPr id="11" name="06-stand-printing-united.jpg" descr="Booth C3397: automatic carousel with a digital station running" title="Booth C3397: automatic carousel with a digital station running"/>
+                  <wp:cNvGraphicFramePr>
+                    <a:graphicFrameLocks xmlns:a="http://schemas.openxmlformats.org/drawingml/2006/main" noChangeAspect="1"/>
+                  </wp:cNvGraphicFramePr>
+                  <a:graphic xmlns:a="http://schemas.openxmlformats.org/drawingml/2006/main">
+                    <a:graphicData uri="http://schemas.openxmlformats.org/drawingml/2006/picture">
+                      <pic:pic xmlns:pic="http://schemas.openxmlformats.org/drawingml/2006/picture">
+                        <pic:nvPicPr>
+                          <pic:cNvPr id="0" name="" descr=""/>
+                          <pic:cNvPicPr>
+                            <a:picLocks noChangeAspect="1" noChangeArrowheads="1"/>
+                          </pic:cNvPicPr>
+                        </pic:nvPicPr>
+                        <pic:blipFill>
+                          <a:blip r:embed="rId9" cstate="none"/>
+                          <a:srcRect/>
+                          <a:stretch>
+                            <a:fillRect/>
+                          </a:stretch>
+                        </pic:blipFill>
+                        <pic:spPr bwMode="auto">
+                          <a:xfrm>
+                            <a:off x="0" y="0"/>
+                            <a:ext cx="2667000" cy="2667000"/>
+                          </a:xfrm>
+                          <a:prstGeom prst="rect">
+                            <a:avLst/>
+                          </a:prstGeom>
+                        </pic:spPr>
+                      </pic:pic>
+                    </a:graphicData>
+                  </a:graphic>
+                </wp:inline>
+              </w:drawing>
+            </w:r>
+          </w:p>
+          <w:p>
+            <w:pPr>
+              <w:spacing w:before="60"/>
+              <w:jc w:val="center"/>
+            </w:pPr>
+            <w:r>
+              <w:rPr>
+                <w:color w:val="555555"/>
+                <w:sz w:val="18"/>
+                <w:szCs w:val="18"/>
+              </w:rPr>
+              <w:t xml:space="preserve">Booth C3397: automatic carousel with a digital station running</w:t>
+            </w:r>
+          </w:p>
+        </w:tc>
+        <w:tc>
+          <w:tcPr>
+            <w:tcW w:type="dxa" w:w="4680"/>
+            <w:tcBorders>
+              <w:top w:val="none"/>
+              <w:left w:val="none"/>
+              <w:bottom w:val="none"/>
+              <w:right w:val="none"/>
+            </w:tcBorders>
+            <w:tcMar>
+              <w:top w:type="dxa" w:w="80"/>
+              <w:left w:type="dxa" w:w="80"/>
+              <w:bottom w:type="dxa" w:w="160"/>
+              <w:right w:type="dxa" w:w="80"/>
+            </w:tcMar>
+          </w:tcPr>
+          <w:p>
+            <w:pPr>
+              <w:jc w:val="center"/>
+            </w:pPr>
+            <w:r>
+              <w:drawing>
+                <wp:inline distT="0" distB="0" distL="0" distR="0">
+                  <wp:extent cx="2667000" cy="2667000"/>
+                  <wp:effectExtent t="0" r="0" b="0" l="0"/>
+                  <wp:docPr id="12" name="08-folleto-clt.jpg" descr="CLT corporate brochure (code 301618)" title="CLT corporate brochure (code 301618)"/>
+                  <wp:cNvGraphicFramePr>
+                    <a:graphicFrameLocks xmlns:a="http://schemas.openxmlformats.org/drawingml/2006/main" noChangeAspect="1"/>
+                  </wp:cNvGraphicFramePr>
+                  <a:graphic xmlns:a="http://schemas.openxmlformats.org/drawingml/2006/main">
+                    <a:graphicData uri="http://schemas.openxmlformats.org/drawingml/2006/picture">
+                      <pic:pic xmlns:pic="http://schemas.openxmlformats.org/drawingml/2006/picture">
+                        <pic:nvPicPr>
+                          <pic:cNvPr id="0" name="" descr=""/>
+                          <pic:cNvPicPr>
+                            <a:picLocks noChangeAspect="1" noChangeArrowheads="1"/>
+                          </pic:cNvPicPr>
+                        </pic:nvPicPr>
+                        <pic:blipFill>
+                          <a:blip r:embed="rId10" cstate="none"/>
+                          <a:srcRect/>
+                          <a:stretch>
+                            <a:fillRect/>
+                          </a:stretch>
+                        </pic:blipFill>
+                        <pic:spPr bwMode="auto">
+                          <a:xfrm>
+                            <a:off x="0" y="0"/>
+                            <a:ext cx="2667000" cy="2667000"/>
+                          </a:xfrm>
+                          <a:prstGeom prst="rect">
+                            <a:avLst/>
+                          </a:prstGeom>
+                        </pic:spPr>
+                      </pic:pic>
+                    </a:graphicData>
+                  </a:graphic>
+                </wp:inline>
+              </w:drawing>
+            </w:r>
+          </w:p>
+          <w:p>
+            <w:pPr>
+              <w:spacing w:before="60"/>
+              <w:jc w:val="center"/>
+            </w:pPr>
+            <w:r>
+              <w:rPr>
+                <w:color w:val="555555"/>
+                <w:sz w:val="18"/>
+                <w:szCs w:val="18"/>
+              </w:rPr>
+              <w:t xml:space="preserve">CLT corporate brochure (code 301618)</w:t>
+            </w:r>
+          </w:p>
+        </w:tc>
+      </w:tr>
+      <w:tr>
+        <w:trPr>
+          <w:cantSplit/>
+        </w:trPr>
+        <w:tc>
+          <w:tcPr>
+            <w:tcW w:type="dxa" w:w="4680"/>
+            <w:tcBorders>
+              <w:top w:val="none"/>
+              <w:left w:val="none"/>
+              <w:bottom w:val="none"/>
+              <w:right w:val="none"/>
+            </w:tcBorders>
+            <w:tcMar>
+              <w:top w:type="dxa" w:w="80"/>
+              <w:left w:type="dxa" w:w="80"/>
+              <w:bottom w:type="dxa" w:w="160"/>
+              <w:right w:type="dxa" w:w="80"/>
+            </w:tcMar>
+          </w:tcPr>
+          <w:p>
+            <w:pPr>
+              <w:jc w:val="center"/>
+            </w:pPr>
+            <w:r>
+              <w:drawing>
+                <wp:inline distT="0" distB="0" distL="0" distR="0">
+                  <wp:extent cx="2667000" cy="2667000"/>
+                  <wp:effectExtent t="0" r="0" b="0" l="0"/>
+                  <wp:docPr id="13" name="01-vineyard.jpg" descr="Digital watercolor over white base on a colored garment" title="Digital watercolor over white base on a colored garment"/>
+                  <wp:cNvGraphicFramePr>
+                    <a:graphicFrameLocks xmlns:a="http://schemas.openxmlformats.org/drawingml/2006/main" noChangeAspect="1"/>
+                  </wp:cNvGraphicFramePr>
+                  <a:graphic xmlns:a="http://schemas.openxmlformats.org/drawingml/2006/main">
+                    <a:graphicData uri="http://schemas.openxmlformats.org/drawingml/2006/picture">
+                      <pic:pic xmlns:pic="http://schemas.openxmlformats.org/drawingml/2006/picture">
+                        <pic:nvPicPr>
+                          <pic:cNvPr id="0" name="" descr=""/>
+                          <pic:cNvPicPr>
+                            <a:picLocks noChangeAspect="1" noChangeArrowheads="1"/>
+                          </pic:cNvPicPr>
+                        </pic:nvPicPr>
+                        <pic:blipFill>
+                          <a:blip r:embed="rId11" cstate="none"/>
+                          <a:srcRect/>
+                          <a:stretch>
+                            <a:fillRect/>
+                          </a:stretch>
+                        </pic:blipFill>
+                        <pic:spPr bwMode="auto">
+                          <a:xfrm>
+                            <a:off x="0" y="0"/>
+                            <a:ext cx="2667000" cy="2667000"/>
+                          </a:xfrm>
+                          <a:prstGeom prst="rect">
+                            <a:avLst/>
+                          </a:prstGeom>
+                        </pic:spPr>
+                      </pic:pic>
+                    </a:graphicData>
+                  </a:graphic>
+                </wp:inline>
+              </w:drawing>
+            </w:r>
+          </w:p>
+          <w:p>
+            <w:pPr>
+              <w:spacing w:before="60"/>
+              <w:jc w:val="center"/>
+            </w:pPr>
+            <w:r>
+              <w:rPr>
+                <w:color w:val="555555"/>
+                <w:sz w:val="18"/>
+                <w:szCs w:val="18"/>
+              </w:rPr>
+              <w:t xml:space="preserve">Digital watercolor over white base on a colored garment</w:t>
+            </w:r>
+          </w:p>
+        </w:tc>
+        <w:tc>
+          <w:tcPr>
+            <w:tcW w:type="dxa" w:w="4680"/>
+            <w:tcBorders>
+              <w:top w:val="none"/>
+              <w:left w:val="none"/>
+              <w:bottom w:val="none"/>
+              <w:right w:val="none"/>
+            </w:tcBorders>
+            <w:tcMar>
+              <w:top w:type="dxa" w:w="80"/>
+              <w:left w:type="dxa" w:w="80"/>
+              <w:bottom w:type="dxa" w:w="160"/>
+              <w:right w:type="dxa" w:w="80"/>
+            </w:tcMar>
+          </w:tcPr>
+          <w:p>
+            <w:pPr>
+              <w:jc w:val="center"/>
+            </w:pPr>
+            <w:r>
+              <w:drawing>
+                <wp:inline distT="0" distB="0" distL="0" distR="0">
+                  <wp:extent cx="2667000" cy="2667000"/>
+                  <wp:effectExtent t="0" r="0" b="0" l="0"/>
+                  <wp:docPr id="14" name="02-perro.jpg" descr="Digital photorealism on a dark garment" title="Digital photorealism on a dark garment"/>
+                  <wp:cNvGraphicFramePr>
+                    <a:graphicFrameLocks xmlns:a="http://schemas.openxmlformats.org/drawingml/2006/main" noChangeAspect="1"/>
+                  </wp:cNvGraphicFramePr>
+                  <a:graphic xmlns:a="http://schemas.openxmlformats.org/drawingml/2006/main">
+                    <a:graphicData uri="http://schemas.openxmlformats.org/drawingml/2006/picture">
+                      <pic:pic xmlns:pic="http://schemas.openxmlformats.org/drawingml/2006/picture">
+                        <pic:nvPicPr>
+                          <pic:cNvPr id="0" name="" descr=""/>
+                          <pic:cNvPicPr>
+                            <a:picLocks noChangeAspect="1" noChangeArrowheads="1"/>
+                          </pic:cNvPicPr>
+                        </pic:nvPicPr>
+                        <pic:blipFill>
+                          <a:blip r:embed="rId12" cstate="none"/>
+                          <a:srcRect/>
+                          <a:stretch>
+                            <a:fillRect/>
+                          </a:stretch>
+                        </pic:blipFill>
+                        <pic:spPr bwMode="auto">
+                          <a:xfrm>
+                            <a:off x="0" y="0"/>
+                            <a:ext cx="2667000" cy="2667000"/>
+                          </a:xfrm>
+                          <a:prstGeom prst="rect">
+                            <a:avLst/>
+                          </a:prstGeom>
+                        </pic:spPr>
+                      </pic:pic>
+                    </a:graphicData>
+                  </a:graphic>
+                </wp:inline>
+              </w:drawing>
+            </w:r>
+          </w:p>
+          <w:p>
+            <w:pPr>
+              <w:spacing w:before="60"/>
+              <w:jc w:val="center"/>
+            </w:pPr>
+            <w:r>
+              <w:rPr>
+                <w:color w:val="555555"/>
+                <w:sz w:val="18"/>
+                <w:szCs w:val="18"/>
+              </w:rPr>
+              <w:t xml:space="preserve">Digital photorealism on a dark garment</w:t>
+            </w:r>
+          </w:p>
+        </w:tc>
+      </w:tr>
+      <w:tr>
+        <w:trPr>
+          <w:cantSplit/>
+        </w:trPr>
+        <w:tc>
+          <w:tcPr>
+            <w:tcW w:type="dxa" w:w="4680"/>
+            <w:tcBorders>
+              <w:top w:val="none"/>
+              <w:left w:val="none"/>
+              <w:bottom w:val="none"/>
+              <w:right w:val="none"/>
+            </w:tcBorders>
+            <w:tcMar>
+              <w:top w:type="dxa" w:w="80"/>
+              <w:left w:type="dxa" w:w="80"/>
+              <w:bottom w:type="dxa" w:w="160"/>
+              <w:right w:type="dxa" w:w="80"/>
+            </w:tcMar>
+          </w:tcPr>
+          <w:p>
+            <w:pPr>
+              <w:jc w:val="center"/>
+            </w:pPr>
+            <w:r>
+              <w:drawing>
+                <wp:inline distT="0" distB="0" distL="0" distR="0">
+                  <wp:extent cx="2667000" cy="2667000"/>
+                  <wp:effectExtent t="0" r="0" b="0" l="0"/>
+                  <wp:docPr id="15" name="03-living.jpg" descr="Full-color photographic collage" title="Full-color photographic collage"/>
+                  <wp:cNvGraphicFramePr>
+                    <a:graphicFrameLocks xmlns:a="http://schemas.openxmlformats.org/drawingml/2006/main" noChangeAspect="1"/>
+                  </wp:cNvGraphicFramePr>
+                  <a:graphic xmlns:a="http://schemas.openxmlformats.org/drawingml/2006/main">
+                    <a:graphicData uri="http://schemas.openxmlformats.org/drawingml/2006/picture">
+                      <pic:pic xmlns:pic="http://schemas.openxmlformats.org/drawingml/2006/picture">
+                        <pic:nvPicPr>
+                          <pic:cNvPr id="0" name="" descr=""/>
+                          <pic:cNvPicPr>
+                            <a:picLocks noChangeAspect="1" noChangeArrowheads="1"/>
+                          </pic:cNvPicPr>
+                        </pic:nvPicPr>
+                        <pic:blipFill>
+                          <a:blip r:embed="rId13" cstate="none"/>
+                          <a:srcRect/>
+                          <a:stretch>
+                            <a:fillRect/>
+                          </a:stretch>
+                        </pic:blipFill>
+                        <pic:spPr bwMode="auto">
+                          <a:xfrm>
+                            <a:off x="0" y="0"/>
+                            <a:ext cx="2667000" cy="2667000"/>
+                          </a:xfrm>
+                          <a:prstGeom prst="rect">
+                            <a:avLst/>
+                          </a:prstGeom>
+                        </pic:spPr>
+                      </pic:pic>
+                    </a:graphicData>
+                  </a:graphic>
+                </wp:inline>
+              </w:drawing>
+            </w:r>
+          </w:p>
+          <w:p>
+            <w:pPr>
+              <w:spacing w:before="60"/>
+              <w:jc w:val="center"/>
+            </w:pPr>
+            <w:r>
+              <w:rPr>
+                <w:color w:val="555555"/>
+                <w:sz w:val="18"/>
+                <w:szCs w:val="18"/>
+              </w:rPr>
+              <w:t xml:space="preserve">Full-color photographic collage</w:t>
+            </w:r>
+          </w:p>
+        </w:tc>
+        <w:tc>
+          <w:tcPr>
+            <w:tcW w:type="dxa" w:w="4680"/>
+            <w:tcBorders>
+              <w:top w:val="none"/>
+              <w:left w:val="none"/>
+              <w:bottom w:val="none"/>
+              <w:right w:val="none"/>
+            </w:tcBorders>
+            <w:tcMar>
+              <w:top w:type="dxa" w:w="80"/>
+              <w:left w:type="dxa" w:w="80"/>
+              <w:bottom w:type="dxa" w:w="160"/>
+              <w:right w:type="dxa" w:w="80"/>
+            </w:tcMar>
+          </w:tcPr>
+          <w:p>
+            <w:pPr>
+              <w:jc w:val="center"/>
+            </w:pPr>
+            <w:r>
+              <w:drawing>
+                <wp:inline distT="0" distB="0" distL="0" distR="0">
+                  <wp:extent cx="2667000" cy="2667000"/>
+                  <wp:effectExtent t="0" r="0" b="0" l="0"/>
+                  <wp:docPr id="16" name="10-aguila.jpg" descr="Breathable digital print on a dark garment" title="Breathable digital print on a dark garment"/>
+                  <wp:cNvGraphicFramePr>
+                    <a:graphicFrameLocks xmlns:a="http://schemas.openxmlformats.org/drawingml/2006/main" noChangeAspect="1"/>
+                  </wp:cNvGraphicFramePr>
+                  <a:graphic xmlns:a="http://schemas.openxmlformats.org/drawingml/2006/main">
+                    <a:graphicData uri="http://schemas.openxmlformats.org/drawingml/2006/picture">
+                      <pic:pic xmlns:pic="http://schemas.openxmlformats.org/drawingml/2006/picture">
+                        <pic:nvPicPr>
+                          <pic:cNvPr id="0" name="" descr=""/>
+                          <pic:cNvPicPr>
+                            <a:picLocks noChangeAspect="1" noChangeArrowheads="1"/>
+                          </pic:cNvPicPr>
+                        </pic:nvPicPr>
+                        <pic:blipFill>
+                          <a:blip r:embed="rId14" cstate="none"/>
+                          <a:srcRect/>
+                          <a:stretch>
+                            <a:fillRect/>
+                          </a:stretch>
+                        </pic:blipFill>
+                        <pic:spPr bwMode="auto">
+                          <a:xfrm>
+                            <a:off x="0" y="0"/>
+                            <a:ext cx="2667000" cy="2667000"/>
+                          </a:xfrm>
+                          <a:prstGeom prst="rect">
+                            <a:avLst/>
+                          </a:prstGeom>
+                        </pic:spPr>
+                      </pic:pic>
+                    </a:graphicData>
+                  </a:graphic>
+                </wp:inline>
+              </w:drawing>
+            </w:r>
+          </w:p>
+          <w:p>
+            <w:pPr>
+              <w:spacing w:before="60"/>
+              <w:jc w:val="center"/>
+            </w:pPr>
+            <w:r>
+              <w:rPr>
+                <w:color w:val="555555"/>
+                <w:sz w:val="18"/>
+                <w:szCs w:val="18"/>
+              </w:rPr>
+              <w:t xml:space="preserve">Breathable digital print on a dark garment</w:t>
+            </w:r>
+          </w:p>
+        </w:tc>
+      </w:tr>
+      <w:tr>
+        <w:trPr>
+          <w:cantSplit/>
+        </w:trPr>
+        <w:tc>
+          <w:tcPr>
+            <w:tcW w:type="dxa" w:w="4680"/>
+            <w:tcBorders>
+              <w:top w:val="none"/>
+              <w:left w:val="none"/>
+              <w:bottom w:val="none"/>
+              <w:right w:val="none"/>
+            </w:tcBorders>
+            <w:tcMar>
+              <w:top w:type="dxa" w:w="80"/>
+              <w:left w:type="dxa" w:w="80"/>
+              <w:bottom w:type="dxa" w:w="160"/>
+              <w:right w:type="dxa" w:w="80"/>
+            </w:tcMar>
+          </w:tcPr>
+          <w:p>
+            <w:pPr>
+              <w:jc w:val="center"/>
+            </w:pPr>
+            <w:r>
+              <w:drawing>
+                <wp:inline distT="0" distB="0" distL="0" distR="0">
+                  <wp:extent cx="2667000" cy="2667000"/>
+                  <wp:effectExtent t="0" r="0" b="0" l="0"/>
+                  <wp:docPr id="17" name="04-clt-pastas.jpg" descr="CLT pastes: high build 511-1, puff MP399, cold foil 105-3" title="CLT pastes: high build 511-1, puff MP399, cold foil 105-3"/>
+                  <wp:cNvGraphicFramePr>
+                    <a:graphicFrameLocks xmlns:a="http://schemas.openxmlformats.org/drawingml/2006/main" noChangeAspect="1"/>
+                  </wp:cNvGraphicFramePr>
+                  <a:graphic xmlns:a="http://schemas.openxmlformats.org/drawingml/2006/main">
+                    <a:graphicData uri="http://schemas.openxmlformats.org/drawingml/2006/picture">
+                      <pic:pic xmlns:pic="http://schemas.openxmlformats.org/drawingml/2006/picture">
+                        <pic:nvPicPr>
+                          <pic:cNvPr id="0" name="" descr=""/>
+                          <pic:cNvPicPr>
+                            <a:picLocks noChangeAspect="1" noChangeArrowheads="1"/>
+                          </pic:cNvPicPr>
+                        </pic:nvPicPr>
+                        <pic:blipFill>
+                          <a:blip r:embed="rId15" cstate="none"/>
+                          <a:srcRect/>
+                          <a:stretch>
+                            <a:fillRect/>
+                          </a:stretch>
+                        </pic:blipFill>
+                        <pic:spPr bwMode="auto">
+                          <a:xfrm>
+                            <a:off x="0" y="0"/>
+                            <a:ext cx="2667000" cy="2667000"/>
+                          </a:xfrm>
+                          <a:prstGeom prst="rect">
+                            <a:avLst/>
+                          </a:prstGeom>
+                        </pic:spPr>
+                      </pic:pic>
+                    </a:graphicData>
+                  </a:graphic>
+                </wp:inline>
+              </w:drawing>
+            </w:r>
+          </w:p>
+          <w:p>
+            <w:pPr>
+              <w:spacing w:before="60"/>
+              <w:jc w:val="center"/>
+            </w:pPr>
+            <w:r>
+              <w:rPr>
+                <w:color w:val="555555"/>
+                <w:sz w:val="18"/>
+                <w:szCs w:val="18"/>
+              </w:rPr>
+              <w:t xml:space="preserve">CLT pastes: high build 511-1, puff MP399, cold foil 105-3</w:t>
+            </w:r>
+          </w:p>
+        </w:tc>
+        <w:tc>
+          <w:tcPr>
+            <w:tcW w:type="dxa" w:w="4680"/>
+            <w:tcBorders>
+              <w:top w:val="none"/>
+              <w:left w:val="none"/>
+              <w:bottom w:val="none"/>
+              <w:right w:val="none"/>
+            </w:tcBorders>
+            <w:tcMar>
+              <w:top w:type="dxa" w:w="80"/>
+              <w:left w:type="dxa" w:w="80"/>
+              <w:bottom w:type="dxa" w:w="160"/>
+              <w:right w:type="dxa" w:w="80"/>
+            </w:tcMar>
+          </w:tcPr>
+          <w:p>
+            <w:pPr>
+              <w:jc w:val="center"/>
+            </w:pPr>
+            <w:r>
+              <w:drawing>
+                <wp:inline distT="0" distB="0" distL="0" distR="0">
+                  <wp:extent cx="2667000" cy="2667000"/>
+                  <wp:effectExtent t="0" r="0" b="0" l="0"/>
+                  <wp:docPr id="18" name="05-escudo.jpg" descr="Sports crest with relief and shimmer on polyester" title="Sports crest with relief and shimmer on polyester"/>
+                  <wp:cNvGraphicFramePr>
+                    <a:graphicFrameLocks xmlns:a="http://schemas.openxmlformats.org/drawingml/2006/main" noChangeAspect="1"/>
+                  </wp:cNvGraphicFramePr>
+                  <a:graphic xmlns:a="http://schemas.openxmlformats.org/drawingml/2006/main">
+                    <a:graphicData uri="http://schemas.openxmlformats.org/drawingml/2006/picture">
+                      <pic:pic xmlns:pic="http://schemas.openxmlformats.org/drawingml/2006/picture">
+                        <pic:nvPicPr>
+                          <pic:cNvPr id="0" name="" descr=""/>
+                          <pic:cNvPicPr>
+                            <a:picLocks noChangeAspect="1" noChangeArrowheads="1"/>
+                          </pic:cNvPicPr>
+                        </pic:nvPicPr>
+                        <pic:blipFill>
+                          <a:blip r:embed="rId16" cstate="none"/>
+                          <a:srcRect/>
+                          <a:stretch>
+                            <a:fillRect/>
+                          </a:stretch>
+                        </pic:blipFill>
+                        <pic:spPr bwMode="auto">
+                          <a:xfrm>
+                            <a:off x="0" y="0"/>
+                            <a:ext cx="2667000" cy="2667000"/>
+                          </a:xfrm>
+                          <a:prstGeom prst="rect">
+                            <a:avLst/>
+                          </a:prstGeom>
+                        </pic:spPr>
+                      </pic:pic>
+                    </a:graphicData>
+                  </a:graphic>
+                </wp:inline>
+              </w:drawing>
+            </w:r>
+          </w:p>
+          <w:p>
+            <w:pPr>
+              <w:spacing w:before="60"/>
+              <w:jc w:val="center"/>
+            </w:pPr>
+            <w:r>
+              <w:rPr>
+                <w:color w:val="555555"/>
+                <w:sz w:val="18"/>
+                <w:szCs w:val="18"/>
+              </w:rPr>
+              <w:t xml:space="preserve">Sports crest with relief and shimmer on polyester</w:t>
+            </w:r>
+          </w:p>
+        </w:tc>
+      </w:tr>
+      <w:tr>
+        <w:trPr>
+          <w:cantSplit/>
+        </w:trPr>
+        <w:tc>
+          <w:tcPr>
+            <w:tcW w:type="dxa" w:w="4680"/>
+            <w:tcBorders>
+              <w:top w:val="none"/>
+              <w:left w:val="none"/>
+              <w:bottom w:val="none"/>
+              <w:right w:val="none"/>
+            </w:tcBorders>
+            <w:tcMar>
+              <w:top w:type="dxa" w:w="80"/>
+              <w:left w:type="dxa" w:w="80"/>
+              <w:bottom w:type="dxa" w:w="160"/>
+              <w:right w:type="dxa" w:w="80"/>
+            </w:tcMar>
+          </w:tcPr>
+          <w:p>
+            <w:pPr>
+              <w:jc w:val="center"/>
+            </w:pPr>
+            <w:r>
+              <w:drawing>
+                <wp:inline distT="0" distB="0" distL="0" distR="0">
+                  <wp:extent cx="2667000" cy="2667000"/>
+                  <wp:effectExtent t="0" r="0" b="0" l="0"/>
+                  <wp:docPr id="19" name="07-tigre.jpg" descr="Spot-color screen print on a colored garment" title="Spot-color screen print on a colored garment"/>
+                  <wp:cNvGraphicFramePr>
+                    <a:graphicFrameLocks xmlns:a="http://schemas.openxmlformats.org/drawingml/2006/main" noChangeAspect="1"/>
+                  </wp:cNvGraphicFramePr>
+                  <a:graphic xmlns:a="http://schemas.openxmlformats.org/drawingml/2006/main">
+                    <a:graphicData uri="http://schemas.openxmlformats.org/drawingml/2006/picture">
+                      <pic:pic xmlns:pic="http://schemas.openxmlformats.org/drawingml/2006/picture">
+                        <pic:nvPicPr>
+                          <pic:cNvPr id="0" name="" descr=""/>
+                          <pic:cNvPicPr>
+                            <a:picLocks noChangeAspect="1" noChangeArrowheads="1"/>
+                          </pic:cNvPicPr>
+                        </pic:nvPicPr>
+                        <pic:blipFill>
+                          <a:blip r:embed="rId17" cstate="none"/>
+                          <a:srcRect/>
+                          <a:stretch>
+                            <a:fillRect/>
+                          </a:stretch>
+                        </pic:blipFill>
+                        <pic:spPr bwMode="auto">
+                          <a:xfrm>
+                            <a:off x="0" y="0"/>
+                            <a:ext cx="2667000" cy="2667000"/>
+                          </a:xfrm>
+                          <a:prstGeom prst="rect">
+                            <a:avLst/>
+                          </a:prstGeom>
+                        </pic:spPr>
+                      </pic:pic>
+                    </a:graphicData>
+                  </a:graphic>
+                </wp:inline>
+              </w:drawing>
+            </w:r>
+          </w:p>
+          <w:p>
+            <w:pPr>
+              <w:spacing w:before="60"/>
+              <w:jc w:val="center"/>
+            </w:pPr>
+            <w:r>
+              <w:rPr>
+                <w:color w:val="555555"/>
+                <w:sz w:val="18"/>
+                <w:szCs w:val="18"/>
+              </w:rPr>
+              <w:t xml:space="preserve">Spot-color screen print on a colored garment</w:t>
+            </w:r>
+          </w:p>
+        </w:tc>
+        <w:tc>
+          <w:tcPr>
+            <w:tcW w:type="dxa" w:w="4680"/>
+            <w:tcBorders>
+              <w:top w:val="none"/>
+              <w:left w:val="none"/>
+              <w:bottom w:val="none"/>
+              <w:right w:val="none"/>
+            </w:tcBorders>
+            <w:tcMar>
+              <w:top w:type="dxa" w:w="80"/>
+              <w:left w:type="dxa" w:w="80"/>
+              <w:bottom w:type="dxa" w:w="160"/>
+              <w:right w:type="dxa" w:w="80"/>
+            </w:tcMar>
+          </w:tcPr>
+          <w:p>
+            <w:pPr>
+              <w:jc w:val="center"/>
+            </w:pPr>
+            <w:r>
+              <w:drawing>
+                <wp:inline distT="0" distB="0" distL="0" distR="0">
+                  <wp:extent cx="2667000" cy="2667000"/>
+                  <wp:effectExtent t="0" r="0" b="0" l="0"/>
+                  <wp:docPr id="20" name="09-huskies.jpg" descr="Relief, gold foil and metallic sparkle combined" title="Relief, gold foil and metallic sparkle combined"/>
+                  <wp:cNvGraphicFramePr>
+                    <a:graphicFrameLocks xmlns:a="http://schemas.openxmlformats.org/drawingml/2006/main" noChangeAspect="1"/>
+                  </wp:cNvGraphicFramePr>
+                  <a:graphic xmlns:a="http://schemas.openxmlformats.org/drawingml/2006/main">
+                    <a:graphicData uri="http://schemas.openxmlformats.org/drawingml/2006/picture">
+                      <pic:pic xmlns:pic="http://schemas.openxmlformats.org/drawingml/2006/picture">
+                        <pic:nvPicPr>
+                          <pic:cNvPr id="0" name="" descr=""/>
+                          <pic:cNvPicPr>
+                            <a:picLocks noChangeAspect="1" noChangeArrowheads="1"/>
+                          </pic:cNvPicPr>
+                        </pic:nvPicPr>
+                        <pic:blipFill>
+                          <a:blip r:embed="rId18" cstate="none"/>
+                          <a:srcRect/>
+                          <a:stretch>
+                            <a:fillRect/>
+                          </a:stretch>
+                        </pic:blipFill>
+                        <pic:spPr bwMode="auto">
+                          <a:xfrm>
+                            <a:off x="0" y="0"/>
+                            <a:ext cx="2667000" cy="2667000"/>
+                          </a:xfrm>
+                          <a:prstGeom prst="rect">
+                            <a:avLst/>
+                          </a:prstGeom>
+                        </pic:spPr>
+                      </pic:pic>
+                    </a:graphicData>
+                  </a:graphic>
+                </wp:inline>
+              </w:drawing>
+            </w:r>
+          </w:p>
+          <w:p>
+            <w:pPr>
+              <w:spacing w:before="60"/>
+              <w:jc w:val="center"/>
+            </w:pPr>
+            <w:r>
+              <w:rPr>
+                <w:color w:val="555555"/>
+                <w:sz w:val="18"/>
+                <w:szCs w:val="18"/>
+              </w:rPr>
+              <w:t xml:space="preserve">Relief, gold foil and metallic sparkle combined</w:t>
+            </w:r>
+          </w:p>
+        </w:tc>
+      </w:tr>
+    </w:tbl>
+    <w:p>
+      <w:pPr>
+        <w:spacing w:after="200" w:before="80"/>
+      </w:pPr>
+      <w:r>
+        <w:rPr>
+          <w:i/>
+          <w:iCs/>
+          <w:color w:val="555555"/>
+          <w:sz w:val="18"/>
+          <w:szCs w:val="18"/>
+        </w:rPr>
+        <w:t xml:space="preserve">Techniques were identified visually and should be confirmed with CLT.</w:t>
       </w:r>
     </w:p>
     <w:p>

</xml_diff>

<commit_message>
Agrega cuentas prioritarias 80/20 y Baja California a la propuesta
- Nueva subsección 7 con 9 prospectos y 8 OEM prioritarios (nombre, ciudad y giro) en Word/PDF y PowerPoint ES/EN
- Baja California como zona prioritaria 1 (cobertura conjunta TID + VSP)
- Crédito de fotos del stand: VSP Printing, reunión con CLT
- Hoja 80-20 en el Excel interno de prospectos

Co-Authored-By: Claude Opus 5.5 <noreply@anthropic.com>
Claude-Session: https://claude.ai/code/session_012axCVDM5kAgj1VFnxhpsuM
</commit_message>
<xml_diff>
--- a/propuesta-clt/CLT_Distribution_Proposal_Mexico_EN.docx
+++ b/propuesta-clt/CLT_Distribution_Proposal_Mexico_EN.docx
@@ -600,7 +600,7 @@
                 <w:sz w:val="19"/>
                 <w:szCs w:val="19"/>
               </w:rPr>
-              <w:t xml:space="preserve">Clusters: State of Mexico/Mexico City, Jalisco, Puebla/Tlaxcala, Guanajuato, La Laguna, Aguascalientes, Nuevo León, Yucatán</w:t>
+              <w:t xml:space="preserve">Clusters: State of Mexico/Mexico City, Jalisco, Puebla/Tlaxcala, Guanajuato, Baja California, La Laguna, Aguascalientes, Nuevo León, Yucatán</w:t>
             </w:r>
           </w:p>
         </w:tc>
@@ -4341,7 +4341,7 @@
                 <w:sz w:val="19"/>
                 <w:szCs w:val="19"/>
               </w:rPr>
-              <w:t xml:space="preserve">2</w:t>
+              <w:t xml:space="preserve">1</w:t>
             </w:r>
           </w:p>
         </w:tc>
@@ -4373,7 +4373,7 @@
                 <w:sz w:val="19"/>
                 <w:szCs w:val="19"/>
               </w:rPr>
-              <w:t xml:space="preserve">Puebla and Tlaxcala</w:t>
+              <w:t xml:space="preserve">Baja California (Tijuana, Ensenada, Tecate)</w:t>
             </w:r>
           </w:p>
         </w:tc>
@@ -4405,7 +4405,7 @@
                 <w:sz w:val="19"/>
                 <w:szCs w:val="19"/>
               </w:rPr>
-              <w:t xml:space="preserve">Export maquila and knitwear</w:t>
+              <w:t xml:space="preserve">Export screen printing for U.S. brands (Disney, Fanatics, Columbia); joint TID + VSP coverage from the border</w:t>
             </w:r>
           </w:p>
         </w:tc>
@@ -4476,7 +4476,7 @@
                 <w:sz w:val="19"/>
                 <w:szCs w:val="19"/>
               </w:rPr>
-              <w:t xml:space="preserve">Guanajuato (Moroleón, Uriangato, León)</w:t>
+              <w:t xml:space="preserve">Puebla and Tlaxcala</w:t>
             </w:r>
           </w:p>
         </w:tc>
@@ -4509,7 +4509,7 @@
                 <w:sz w:val="19"/>
                 <w:szCs w:val="19"/>
               </w:rPr>
-              <w:t xml:space="preserve">Knitwear and wholesale; 1–2 hours from TID in Querétaro</w:t>
+              <w:t xml:space="preserve">Export maquila and knitwear</w:t>
             </w:r>
           </w:p>
         </w:tc>
@@ -4536,6 +4536,108 @@
           </w:tcPr>
           <w:p>
             <w:pPr>
+              <w:keepNext/>
+            </w:pPr>
+            <w:r>
+              <w:rPr>
+                <w:rFonts w:ascii="Calibri" w:cs="Calibri" w:eastAsia="Calibri" w:hAnsi="Calibri"/>
+                <w:b/>
+                <w:bCs/>
+                <w:sz w:val="19"/>
+                <w:szCs w:val="19"/>
+              </w:rPr>
+              <w:t xml:space="preserve">2</w:t>
+            </w:r>
+          </w:p>
+        </w:tc>
+        <w:tc>
+          <w:tcPr>
+            <w:tcW w:type="dxa" w:w="3000"/>
+            <w:tcBorders>
+              <w:top w:val="single" w:color="C9D1DC" w:sz="4"/>
+              <w:left w:val="single" w:color="C9D1DC" w:sz="4"/>
+              <w:bottom w:val="single" w:color="C9D1DC" w:sz="4"/>
+              <w:right w:val="single" w:color="C9D1DC" w:sz="4"/>
+            </w:tcBorders>
+            <w:tcMar>
+              <w:top w:type="dxa" w:w="80"/>
+              <w:left w:type="dxa" w:w="110"/>
+              <w:bottom w:type="dxa" w:w="80"/>
+              <w:right w:type="dxa" w:w="110"/>
+            </w:tcMar>
+          </w:tcPr>
+          <w:p>
+            <w:pPr>
+              <w:keepNext/>
+            </w:pPr>
+            <w:r>
+              <w:rPr>
+                <w:rFonts w:ascii="Calibri" w:cs="Calibri" w:eastAsia="Calibri" w:hAnsi="Calibri"/>
+                <w:b w:val="false"/>
+                <w:bCs w:val="false"/>
+                <w:sz w:val="19"/>
+                <w:szCs w:val="19"/>
+              </w:rPr>
+              <w:t xml:space="preserve">Guanajuato (Moroleón, Uriangato, León)</w:t>
+            </w:r>
+          </w:p>
+        </w:tc>
+        <w:tc>
+          <w:tcPr>
+            <w:tcW w:type="dxa" w:w="5060"/>
+            <w:tcBorders>
+              <w:top w:val="single" w:color="C9D1DC" w:sz="4"/>
+              <w:left w:val="single" w:color="C9D1DC" w:sz="4"/>
+              <w:bottom w:val="single" w:color="C9D1DC" w:sz="4"/>
+              <w:right w:val="single" w:color="C9D1DC" w:sz="4"/>
+            </w:tcBorders>
+            <w:tcMar>
+              <w:top w:type="dxa" w:w="80"/>
+              <w:left w:type="dxa" w:w="110"/>
+              <w:bottom w:type="dxa" w:w="80"/>
+              <w:right w:type="dxa" w:w="110"/>
+            </w:tcMar>
+          </w:tcPr>
+          <w:p>
+            <w:pPr>
+              <w:keepNext/>
+            </w:pPr>
+            <w:r>
+              <w:rPr>
+                <w:rFonts w:ascii="Calibri" w:cs="Calibri" w:eastAsia="Calibri" w:hAnsi="Calibri"/>
+                <w:b w:val="false"/>
+                <w:bCs w:val="false"/>
+                <w:sz w:val="19"/>
+                <w:szCs w:val="19"/>
+              </w:rPr>
+              <w:t xml:space="preserve">Knitwear and wholesale; 1–2 hours from TID in Querétaro</w:t>
+            </w:r>
+          </w:p>
+        </w:tc>
+      </w:tr>
+      <w:tr>
+        <w:trPr>
+          <w:cantSplit/>
+        </w:trPr>
+        <w:tc>
+          <w:tcPr>
+            <w:tcW w:type="dxa" w:w="1300"/>
+            <w:tcBorders>
+              <w:top w:val="single" w:color="C9D1DC" w:sz="4"/>
+              <w:left w:val="single" w:color="C9D1DC" w:sz="4"/>
+              <w:bottom w:val="single" w:color="C9D1DC" w:sz="4"/>
+              <w:right w:val="single" w:color="C9D1DC" w:sz="4"/>
+            </w:tcBorders>
+            <w:shd w:fill="EEF2F7" w:color="auto" w:val="clear"/>
+            <w:tcMar>
+              <w:top w:type="dxa" w:w="80"/>
+              <w:left w:type="dxa" w:w="110"/>
+              <w:bottom w:type="dxa" w:w="80"/>
+              <w:right w:type="dxa" w:w="110"/>
+            </w:tcMar>
+          </w:tcPr>
+          <w:p>
+            <w:pPr>
               <w:keepNext w:val="false"/>
             </w:pPr>
             <w:r>
@@ -4559,6 +4661,7 @@
               <w:bottom w:val="single" w:color="C9D1DC" w:sz="4"/>
               <w:right w:val="single" w:color="C9D1DC" w:sz="4"/>
             </w:tcBorders>
+            <w:shd w:fill="EEF2F7" w:color="auto" w:val="clear"/>
             <w:tcMar>
               <w:top w:type="dxa" w:w="80"/>
               <w:left w:type="dxa" w:w="110"/>
@@ -4591,6 +4694,7 @@
               <w:bottom w:val="single" w:color="C9D1DC" w:sz="4"/>
               <w:right w:val="single" w:color="C9D1DC" w:sz="4"/>
             </w:tcBorders>
+            <w:shd w:fill="EEF2F7" w:color="auto" w:val="clear"/>
             <w:tcMar>
               <w:top w:type="dxa" w:w="80"/>
               <w:left w:type="dxa" w:w="110"/>
@@ -4634,6 +4738,2686 @@
           <w:szCs w:val="18"/>
         </w:rPr>
         <w:t xml:space="preserve">Preliminary ranking by concentration of medium and large industry; to be validated with INEGI’s DENUE business directory.</w:t>
+      </w:r>
+    </w:p>
+    <w:p>
+      <w:pPr>
+        <w:pStyle w:val="Heading2"/>
+      </w:pPr>
+      <w:r>
+        <w:t xml:space="preserve">Priority accounts: the 80/20 rule</w:t>
+      </w:r>
+    </w:p>
+    <w:p>
+      <w:pPr>
+        <w:spacing w:after="160"/>
+      </w:pPr>
+      <w:r>
+        <w:t xml:space="preserve">Out of the 82 prospects identified in Mexico (47 printers and manufacturers, and 35 OEMs and contract manufacturers), we selected the top 20% by potential: production volume, in-house decoration, exports and fit with the hybrid line. These 17 accounts will receive 80% of the first-year sales effort (visits, demos and tests on their own fabric).</w:t>
+      </w:r>
+    </w:p>
+    <w:p>
+      <w:pPr>
+        <w:pStyle w:val="Heading2"/>
+      </w:pPr>
+      <w:r>
+        <w:t xml:space="preserve">Priority prospects: printers and manufacturers (9 of 47)</w:t>
+      </w:r>
+    </w:p>
+    <w:tbl>
+      <w:tblPr>
+        <w:tblW w:type="dxa" w:w="9360"/>
+        <w:tblBorders>
+          <w:top w:val="single" w:color="auto" w:sz="4"/>
+          <w:left w:val="single" w:color="auto" w:sz="4"/>
+          <w:bottom w:val="single" w:color="auto" w:sz="4"/>
+          <w:right w:val="single" w:color="auto" w:sz="4"/>
+          <w:insideH w:val="single" w:color="auto" w:sz="4"/>
+          <w:insideV w:val="single" w:color="auto" w:sz="4"/>
+        </w:tblBorders>
+      </w:tblPr>
+      <w:tblGrid>
+        <w:gridCol w:w="2200"/>
+        <w:gridCol w:w="1500"/>
+        <w:gridCol w:w="3860"/>
+        <w:gridCol w:w="1800"/>
+      </w:tblGrid>
+      <w:tr>
+        <w:trPr>
+          <w:cantSplit/>
+          <w:tblHeader/>
+        </w:trPr>
+        <w:tc>
+          <w:tcPr>
+            <w:tcW w:type="dxa" w:w="2200"/>
+            <w:tcBorders>
+              <w:top w:val="single" w:color="C9D1DC" w:sz="4"/>
+              <w:left w:val="single" w:color="C9D1DC" w:sz="4"/>
+              <w:bottom w:val="single" w:color="C9D1DC" w:sz="4"/>
+              <w:right w:val="single" w:color="C9D1DC" w:sz="4"/>
+            </w:tcBorders>
+            <w:shd w:fill="1B1F3B" w:color="auto" w:val="clear"/>
+            <w:tcMar>
+              <w:top w:type="dxa" w:w="80"/>
+              <w:left w:type="dxa" w:w="110"/>
+              <w:bottom w:type="dxa" w:w="80"/>
+              <w:right w:type="dxa" w:w="110"/>
+            </w:tcMar>
+          </w:tcPr>
+          <w:p>
+            <w:pPr>
+              <w:keepNext/>
+            </w:pPr>
+            <w:r>
+              <w:rPr>
+                <w:rFonts w:ascii="Calibri" w:cs="Calibri" w:eastAsia="Calibri" w:hAnsi="Calibri"/>
+                <w:b/>
+                <w:bCs/>
+                <w:color w:val="FFFFFF"/>
+                <w:sz w:val="19"/>
+                <w:szCs w:val="19"/>
+              </w:rPr>
+              <w:t xml:space="preserve">Company</w:t>
+            </w:r>
+          </w:p>
+        </w:tc>
+        <w:tc>
+          <w:tcPr>
+            <w:tcW w:type="dxa" w:w="1500"/>
+            <w:tcBorders>
+              <w:top w:val="single" w:color="C9D1DC" w:sz="4"/>
+              <w:left w:val="single" w:color="C9D1DC" w:sz="4"/>
+              <w:bottom w:val="single" w:color="C9D1DC" w:sz="4"/>
+              <w:right w:val="single" w:color="C9D1DC" w:sz="4"/>
+            </w:tcBorders>
+            <w:shd w:fill="1B1F3B" w:color="auto" w:val="clear"/>
+            <w:tcMar>
+              <w:top w:type="dxa" w:w="80"/>
+              <w:left w:type="dxa" w:w="110"/>
+              <w:bottom w:type="dxa" w:w="80"/>
+              <w:right w:type="dxa" w:w="110"/>
+            </w:tcMar>
+          </w:tcPr>
+          <w:p>
+            <w:pPr>
+              <w:keepNext/>
+            </w:pPr>
+            <w:r>
+              <w:rPr>
+                <w:rFonts w:ascii="Calibri" w:cs="Calibri" w:eastAsia="Calibri" w:hAnsi="Calibri"/>
+                <w:b/>
+                <w:bCs/>
+                <w:color w:val="FFFFFF"/>
+                <w:sz w:val="19"/>
+                <w:szCs w:val="19"/>
+              </w:rPr>
+              <w:t xml:space="preserve">City</w:t>
+            </w:r>
+          </w:p>
+        </w:tc>
+        <w:tc>
+          <w:tcPr>
+            <w:tcW w:type="dxa" w:w="3860"/>
+            <w:tcBorders>
+              <w:top w:val="single" w:color="C9D1DC" w:sz="4"/>
+              <w:left w:val="single" w:color="C9D1DC" w:sz="4"/>
+              <w:bottom w:val="single" w:color="C9D1DC" w:sz="4"/>
+              <w:right w:val="single" w:color="C9D1DC" w:sz="4"/>
+            </w:tcBorders>
+            <w:shd w:fill="1B1F3B" w:color="auto" w:val="clear"/>
+            <w:tcMar>
+              <w:top w:type="dxa" w:w="80"/>
+              <w:left w:type="dxa" w:w="110"/>
+              <w:bottom w:type="dxa" w:w="80"/>
+              <w:right w:type="dxa" w:w="110"/>
+            </w:tcMar>
+          </w:tcPr>
+          <w:p>
+            <w:pPr>
+              <w:keepNext/>
+            </w:pPr>
+            <w:r>
+              <w:rPr>
+                <w:rFonts w:ascii="Calibri" w:cs="Calibri" w:eastAsia="Calibri" w:hAnsi="Calibri"/>
+                <w:b/>
+                <w:bCs/>
+                <w:color w:val="FFFFFF"/>
+                <w:sz w:val="19"/>
+                <w:szCs w:val="19"/>
+              </w:rPr>
+              <w:t xml:space="preserve">What they do</w:t>
+            </w:r>
+          </w:p>
+        </w:tc>
+        <w:tc>
+          <w:tcPr>
+            <w:tcW w:type="dxa" w:w="1800"/>
+            <w:tcBorders>
+              <w:top w:val="single" w:color="C9D1DC" w:sz="4"/>
+              <w:left w:val="single" w:color="C9D1DC" w:sz="4"/>
+              <w:bottom w:val="single" w:color="C9D1DC" w:sz="4"/>
+              <w:right w:val="single" w:color="C9D1DC" w:sz="4"/>
+            </w:tcBorders>
+            <w:shd w:fill="1B1F3B" w:color="auto" w:val="clear"/>
+            <w:tcMar>
+              <w:top w:type="dxa" w:w="80"/>
+              <w:left w:type="dxa" w:w="110"/>
+              <w:bottom w:type="dxa" w:w="80"/>
+              <w:right w:type="dxa" w:w="110"/>
+            </w:tcMar>
+          </w:tcPr>
+          <w:p>
+            <w:pPr>
+              <w:keepNext/>
+            </w:pPr>
+            <w:r>
+              <w:rPr>
+                <w:rFonts w:ascii="Calibri" w:cs="Calibri" w:eastAsia="Calibri" w:hAnsi="Calibri"/>
+                <w:b/>
+                <w:bCs/>
+                <w:color w:val="FFFFFF"/>
+                <w:sz w:val="19"/>
+                <w:szCs w:val="19"/>
+              </w:rPr>
+              <w:t xml:space="preserve">Subsector</w:t>
+            </w:r>
+          </w:p>
+        </w:tc>
+      </w:tr>
+      <w:tr>
+        <w:trPr>
+          <w:cantSplit/>
+        </w:trPr>
+        <w:tc>
+          <w:tcPr>
+            <w:tcW w:type="dxa" w:w="2200"/>
+            <w:tcBorders>
+              <w:top w:val="single" w:color="C9D1DC" w:sz="4"/>
+              <w:left w:val="single" w:color="C9D1DC" w:sz="4"/>
+              <w:bottom w:val="single" w:color="C9D1DC" w:sz="4"/>
+              <w:right w:val="single" w:color="C9D1DC" w:sz="4"/>
+            </w:tcBorders>
+            <w:tcMar>
+              <w:top w:type="dxa" w:w="80"/>
+              <w:left w:type="dxa" w:w="110"/>
+              <w:bottom w:type="dxa" w:w="80"/>
+              <w:right w:type="dxa" w:w="110"/>
+            </w:tcMar>
+          </w:tcPr>
+          <w:p>
+            <w:pPr>
+              <w:keepNext/>
+            </w:pPr>
+            <w:r>
+              <w:rPr>
+                <w:rFonts w:ascii="Calibri" w:cs="Calibri" w:eastAsia="Calibri" w:hAnsi="Calibri"/>
+                <w:b/>
+                <w:bCs/>
+                <w:sz w:val="19"/>
+                <w:szCs w:val="19"/>
+              </w:rPr>
+              <w:t xml:space="preserve">ADN Serigrafía</w:t>
+            </w:r>
+          </w:p>
+        </w:tc>
+        <w:tc>
+          <w:tcPr>
+            <w:tcW w:type="dxa" w:w="1500"/>
+            <w:tcBorders>
+              <w:top w:val="single" w:color="C9D1DC" w:sz="4"/>
+              <w:left w:val="single" w:color="C9D1DC" w:sz="4"/>
+              <w:bottom w:val="single" w:color="C9D1DC" w:sz="4"/>
+              <w:right w:val="single" w:color="C9D1DC" w:sz="4"/>
+            </w:tcBorders>
+            <w:tcMar>
+              <w:top w:type="dxa" w:w="80"/>
+              <w:left w:type="dxa" w:w="110"/>
+              <w:bottom w:type="dxa" w:w="80"/>
+              <w:right w:type="dxa" w:w="110"/>
+            </w:tcMar>
+          </w:tcPr>
+          <w:p>
+            <w:pPr>
+              <w:keepNext/>
+            </w:pPr>
+            <w:r>
+              <w:rPr>
+                <w:rFonts w:ascii="Calibri" w:cs="Calibri" w:eastAsia="Calibri" w:hAnsi="Calibri"/>
+                <w:b w:val="false"/>
+                <w:bCs w:val="false"/>
+                <w:sz w:val="19"/>
+                <w:szCs w:val="19"/>
+              </w:rPr>
+              <w:t xml:space="preserve">Naucalpan, Edo. Méx.</w:t>
+            </w:r>
+          </w:p>
+        </w:tc>
+        <w:tc>
+          <w:tcPr>
+            <w:tcW w:type="dxa" w:w="3860"/>
+            <w:tcBorders>
+              <w:top w:val="single" w:color="C9D1DC" w:sz="4"/>
+              <w:left w:val="single" w:color="C9D1DC" w:sz="4"/>
+              <w:bottom w:val="single" w:color="C9D1DC" w:sz="4"/>
+              <w:right w:val="single" w:color="C9D1DC" w:sz="4"/>
+            </w:tcBorders>
+            <w:tcMar>
+              <w:top w:type="dxa" w:w="80"/>
+              <w:left w:type="dxa" w:w="110"/>
+              <w:bottom w:type="dxa" w:w="80"/>
+              <w:right w:type="dxa" w:w="110"/>
+            </w:tcMar>
+          </w:tcPr>
+          <w:p>
+            <w:pPr>
+              <w:keepNext/>
+            </w:pPr>
+            <w:r>
+              <w:rPr>
+                <w:rFonts w:ascii="Calibri" w:cs="Calibri" w:eastAsia="Calibri" w:hAnsi="Calibri"/>
+                <w:b w:val="false"/>
+                <w:bCs w:val="false"/>
+                <w:sz w:val="19"/>
+                <w:szCs w:val="19"/>
+              </w:rPr>
+              <w:t xml:space="preserve">Contract screen printing: 130,000+ pcs/week, up to 18 colors, production for the U.S. and Canada</w:t>
+            </w:r>
+          </w:p>
+        </w:tc>
+        <w:tc>
+          <w:tcPr>
+            <w:tcW w:type="dxa" w:w="1800"/>
+            <w:tcBorders>
+              <w:top w:val="single" w:color="C9D1DC" w:sz="4"/>
+              <w:left w:val="single" w:color="C9D1DC" w:sz="4"/>
+              <w:bottom w:val="single" w:color="C9D1DC" w:sz="4"/>
+              <w:right w:val="single" w:color="C9D1DC" w:sz="4"/>
+            </w:tcBorders>
+            <w:tcMar>
+              <w:top w:type="dxa" w:w="80"/>
+              <w:left w:type="dxa" w:w="110"/>
+              <w:bottom w:type="dxa" w:w="80"/>
+              <w:right w:type="dxa" w:w="110"/>
+            </w:tcMar>
+          </w:tcPr>
+          <w:p>
+            <w:pPr>
+              <w:keepNext/>
+            </w:pPr>
+            <w:r>
+              <w:rPr>
+                <w:rFonts w:ascii="Calibri" w:cs="Calibri" w:eastAsia="Calibri" w:hAnsi="Calibri"/>
+                <w:b w:val="false"/>
+                <w:bCs w:val="false"/>
+                <w:sz w:val="19"/>
+                <w:szCs w:val="19"/>
+              </w:rPr>
+              <w:t xml:space="preserve">Printing and screen printing</w:t>
+            </w:r>
+          </w:p>
+        </w:tc>
+      </w:tr>
+      <w:tr>
+        <w:trPr>
+          <w:cantSplit/>
+        </w:trPr>
+        <w:tc>
+          <w:tcPr>
+            <w:tcW w:type="dxa" w:w="2200"/>
+            <w:tcBorders>
+              <w:top w:val="single" w:color="C9D1DC" w:sz="4"/>
+              <w:left w:val="single" w:color="C9D1DC" w:sz="4"/>
+              <w:bottom w:val="single" w:color="C9D1DC" w:sz="4"/>
+              <w:right w:val="single" w:color="C9D1DC" w:sz="4"/>
+            </w:tcBorders>
+            <w:shd w:fill="EEF2F7" w:color="auto" w:val="clear"/>
+            <w:tcMar>
+              <w:top w:type="dxa" w:w="80"/>
+              <w:left w:type="dxa" w:w="110"/>
+              <w:bottom w:type="dxa" w:w="80"/>
+              <w:right w:type="dxa" w:w="110"/>
+            </w:tcMar>
+          </w:tcPr>
+          <w:p>
+            <w:pPr>
+              <w:keepNext/>
+            </w:pPr>
+            <w:r>
+              <w:rPr>
+                <w:rFonts w:ascii="Calibri" w:cs="Calibri" w:eastAsia="Calibri" w:hAnsi="Calibri"/>
+                <w:b/>
+                <w:bCs/>
+                <w:sz w:val="19"/>
+                <w:szCs w:val="19"/>
+              </w:rPr>
+              <w:t xml:space="preserve">Serigrafía Textil Automatizada (KW)</w:t>
+            </w:r>
+          </w:p>
+        </w:tc>
+        <w:tc>
+          <w:tcPr>
+            <w:tcW w:type="dxa" w:w="1500"/>
+            <w:tcBorders>
+              <w:top w:val="single" w:color="C9D1DC" w:sz="4"/>
+              <w:left w:val="single" w:color="C9D1DC" w:sz="4"/>
+              <w:bottom w:val="single" w:color="C9D1DC" w:sz="4"/>
+              <w:right w:val="single" w:color="C9D1DC" w:sz="4"/>
+            </w:tcBorders>
+            <w:shd w:fill="EEF2F7" w:color="auto" w:val="clear"/>
+            <w:tcMar>
+              <w:top w:type="dxa" w:w="80"/>
+              <w:left w:type="dxa" w:w="110"/>
+              <w:bottom w:type="dxa" w:w="80"/>
+              <w:right w:type="dxa" w:w="110"/>
+            </w:tcMar>
+          </w:tcPr>
+          <w:p>
+            <w:pPr>
+              <w:keepNext/>
+            </w:pPr>
+            <w:r>
+              <w:rPr>
+                <w:rFonts w:ascii="Calibri" w:cs="Calibri" w:eastAsia="Calibri" w:hAnsi="Calibri"/>
+                <w:b w:val="false"/>
+                <w:bCs w:val="false"/>
+                <w:sz w:val="19"/>
+                <w:szCs w:val="19"/>
+              </w:rPr>
+              <w:t xml:space="preserve">Puebla, Pue.</w:t>
+            </w:r>
+          </w:p>
+        </w:tc>
+        <w:tc>
+          <w:tcPr>
+            <w:tcW w:type="dxa" w:w="3860"/>
+            <w:tcBorders>
+              <w:top w:val="single" w:color="C9D1DC" w:sz="4"/>
+              <w:left w:val="single" w:color="C9D1DC" w:sz="4"/>
+              <w:bottom w:val="single" w:color="C9D1DC" w:sz="4"/>
+              <w:right w:val="single" w:color="C9D1DC" w:sz="4"/>
+            </w:tcBorders>
+            <w:shd w:fill="EEF2F7" w:color="auto" w:val="clear"/>
+            <w:tcMar>
+              <w:top w:type="dxa" w:w="80"/>
+              <w:left w:type="dxa" w:w="110"/>
+              <w:bottom w:type="dxa" w:w="80"/>
+              <w:right w:type="dxa" w:w="110"/>
+            </w:tcMar>
+          </w:tcPr>
+          <w:p>
+            <w:pPr>
+              <w:keepNext/>
+            </w:pPr>
+            <w:r>
+              <w:rPr>
+                <w:rFonts w:ascii="Calibri" w:cs="Calibri" w:eastAsia="Calibri" w:hAnsi="Calibri"/>
+                <w:b w:val="false"/>
+                <w:bCs w:val="false"/>
+                <w:sz w:val="19"/>
+                <w:szCs w:val="19"/>
+              </w:rPr>
+              <w:t xml:space="preserve">Automated volume screen printing: campaigns, sportswear and promo; 30+ years</w:t>
+            </w:r>
+          </w:p>
+        </w:tc>
+        <w:tc>
+          <w:tcPr>
+            <w:tcW w:type="dxa" w:w="1800"/>
+            <w:tcBorders>
+              <w:top w:val="single" w:color="C9D1DC" w:sz="4"/>
+              <w:left w:val="single" w:color="C9D1DC" w:sz="4"/>
+              <w:bottom w:val="single" w:color="C9D1DC" w:sz="4"/>
+              <w:right w:val="single" w:color="C9D1DC" w:sz="4"/>
+            </w:tcBorders>
+            <w:shd w:fill="EEF2F7" w:color="auto" w:val="clear"/>
+            <w:tcMar>
+              <w:top w:type="dxa" w:w="80"/>
+              <w:left w:type="dxa" w:w="110"/>
+              <w:bottom w:type="dxa" w:w="80"/>
+              <w:right w:type="dxa" w:w="110"/>
+            </w:tcMar>
+          </w:tcPr>
+          <w:p>
+            <w:pPr>
+              <w:keepNext/>
+            </w:pPr>
+            <w:r>
+              <w:rPr>
+                <w:rFonts w:ascii="Calibri" w:cs="Calibri" w:eastAsia="Calibri" w:hAnsi="Calibri"/>
+                <w:b w:val="false"/>
+                <w:bCs w:val="false"/>
+                <w:sz w:val="19"/>
+                <w:szCs w:val="19"/>
+              </w:rPr>
+              <w:t xml:space="preserve">Printing and screen printing</w:t>
+            </w:r>
+          </w:p>
+        </w:tc>
+      </w:tr>
+      <w:tr>
+        <w:trPr>
+          <w:cantSplit/>
+        </w:trPr>
+        <w:tc>
+          <w:tcPr>
+            <w:tcW w:type="dxa" w:w="2200"/>
+            <w:tcBorders>
+              <w:top w:val="single" w:color="C9D1DC" w:sz="4"/>
+              <w:left w:val="single" w:color="C9D1DC" w:sz="4"/>
+              <w:bottom w:val="single" w:color="C9D1DC" w:sz="4"/>
+              <w:right w:val="single" w:color="C9D1DC" w:sz="4"/>
+            </w:tcBorders>
+            <w:tcMar>
+              <w:top w:type="dxa" w:w="80"/>
+              <w:left w:type="dxa" w:w="110"/>
+              <w:bottom w:type="dxa" w:w="80"/>
+              <w:right w:type="dxa" w:w="110"/>
+            </w:tcMar>
+          </w:tcPr>
+          <w:p>
+            <w:pPr>
+              <w:keepNext/>
+            </w:pPr>
+            <w:r>
+              <w:rPr>
+                <w:rFonts w:ascii="Calibri" w:cs="Calibri" w:eastAsia="Calibri" w:hAnsi="Calibri"/>
+                <w:b/>
+                <w:bCs/>
+                <w:sz w:val="19"/>
+                <w:szCs w:val="19"/>
+              </w:rPr>
+              <w:t xml:space="preserve">Manufacturas Textiles RF (Reitex)</w:t>
+            </w:r>
+          </w:p>
+        </w:tc>
+        <w:tc>
+          <w:tcPr>
+            <w:tcW w:type="dxa" w:w="1500"/>
+            <w:tcBorders>
+              <w:top w:val="single" w:color="C9D1DC" w:sz="4"/>
+              <w:left w:val="single" w:color="C9D1DC" w:sz="4"/>
+              <w:bottom w:val="single" w:color="C9D1DC" w:sz="4"/>
+              <w:right w:val="single" w:color="C9D1DC" w:sz="4"/>
+            </w:tcBorders>
+            <w:tcMar>
+              <w:top w:type="dxa" w:w="80"/>
+              <w:left w:type="dxa" w:w="110"/>
+              <w:bottom w:type="dxa" w:w="80"/>
+              <w:right w:type="dxa" w:w="110"/>
+            </w:tcMar>
+          </w:tcPr>
+          <w:p>
+            <w:pPr>
+              <w:keepNext/>
+            </w:pPr>
+            <w:r>
+              <w:rPr>
+                <w:rFonts w:ascii="Calibri" w:cs="Calibri" w:eastAsia="Calibri" w:hAnsi="Calibri"/>
+                <w:b w:val="false"/>
+                <w:bCs w:val="false"/>
+                <w:sz w:val="19"/>
+                <w:szCs w:val="19"/>
+              </w:rPr>
+              <w:t xml:space="preserve">Guadalupe, N.L.</w:t>
+            </w:r>
+          </w:p>
+        </w:tc>
+        <w:tc>
+          <w:tcPr>
+            <w:tcW w:type="dxa" w:w="3860"/>
+            <w:tcBorders>
+              <w:top w:val="single" w:color="C9D1DC" w:sz="4"/>
+              <w:left w:val="single" w:color="C9D1DC" w:sz="4"/>
+              <w:bottom w:val="single" w:color="C9D1DC" w:sz="4"/>
+              <w:right w:val="single" w:color="C9D1DC" w:sz="4"/>
+            </w:tcBorders>
+            <w:tcMar>
+              <w:top w:type="dxa" w:w="80"/>
+              <w:left w:type="dxa" w:w="110"/>
+              <w:bottom w:type="dxa" w:w="80"/>
+              <w:right w:type="dxa" w:w="110"/>
+            </w:tcMar>
+          </w:tcPr>
+          <w:p>
+            <w:pPr>
+              <w:keepNext/>
+            </w:pPr>
+            <w:r>
+              <w:rPr>
+                <w:rFonts w:ascii="Calibri" w:cs="Calibri" w:eastAsia="Calibri" w:hAnsi="Calibri"/>
+                <w:b w:val="false"/>
+                <w:bCs w:val="false"/>
+                <w:sz w:val="19"/>
+                <w:szCs w:val="19"/>
+              </w:rPr>
+              <w:t xml:space="preserve">Integrated yarn-to-garment plant; high-volume campaign and promo T-shirts</w:t>
+            </w:r>
+          </w:p>
+        </w:tc>
+        <w:tc>
+          <w:tcPr>
+            <w:tcW w:type="dxa" w:w="1800"/>
+            <w:tcBorders>
+              <w:top w:val="single" w:color="C9D1DC" w:sz="4"/>
+              <w:left w:val="single" w:color="C9D1DC" w:sz="4"/>
+              <w:bottom w:val="single" w:color="C9D1DC" w:sz="4"/>
+              <w:right w:val="single" w:color="C9D1DC" w:sz="4"/>
+            </w:tcBorders>
+            <w:tcMar>
+              <w:top w:type="dxa" w:w="80"/>
+              <w:left w:type="dxa" w:w="110"/>
+              <w:bottom w:type="dxa" w:w="80"/>
+              <w:right w:type="dxa" w:w="110"/>
+            </w:tcMar>
+          </w:tcPr>
+          <w:p>
+            <w:pPr>
+              <w:keepNext/>
+            </w:pPr>
+            <w:r>
+              <w:rPr>
+                <w:rFonts w:ascii="Calibri" w:cs="Calibri" w:eastAsia="Calibri" w:hAnsi="Calibri"/>
+                <w:b w:val="false"/>
+                <w:bCs w:val="false"/>
+                <w:sz w:val="19"/>
+                <w:szCs w:val="19"/>
+              </w:rPr>
+              <w:t xml:space="preserve">Promotional</w:t>
+            </w:r>
+          </w:p>
+        </w:tc>
+      </w:tr>
+      <w:tr>
+        <w:trPr>
+          <w:cantSplit/>
+        </w:trPr>
+        <w:tc>
+          <w:tcPr>
+            <w:tcW w:type="dxa" w:w="2200"/>
+            <w:tcBorders>
+              <w:top w:val="single" w:color="C9D1DC" w:sz="4"/>
+              <w:left w:val="single" w:color="C9D1DC" w:sz="4"/>
+              <w:bottom w:val="single" w:color="C9D1DC" w:sz="4"/>
+              <w:right w:val="single" w:color="C9D1DC" w:sz="4"/>
+            </w:tcBorders>
+            <w:shd w:fill="EEF2F7" w:color="auto" w:val="clear"/>
+            <w:tcMar>
+              <w:top w:type="dxa" w:w="80"/>
+              <w:left w:type="dxa" w:w="110"/>
+              <w:bottom w:type="dxa" w:w="80"/>
+              <w:right w:type="dxa" w:w="110"/>
+            </w:tcMar>
+          </w:tcPr>
+          <w:p>
+            <w:pPr>
+              <w:keepNext/>
+            </w:pPr>
+            <w:r>
+              <w:rPr>
+                <w:rFonts w:ascii="Calibri" w:cs="Calibri" w:eastAsia="Calibri" w:hAnsi="Calibri"/>
+                <w:b/>
+                <w:bCs/>
+                <w:sz w:val="19"/>
+                <w:szCs w:val="19"/>
+              </w:rPr>
+              <w:t xml:space="preserve">Diermi (Playeras Mindy)</w:t>
+            </w:r>
+          </w:p>
+        </w:tc>
+        <w:tc>
+          <w:tcPr>
+            <w:tcW w:type="dxa" w:w="1500"/>
+            <w:tcBorders>
+              <w:top w:val="single" w:color="C9D1DC" w:sz="4"/>
+              <w:left w:val="single" w:color="C9D1DC" w:sz="4"/>
+              <w:bottom w:val="single" w:color="C9D1DC" w:sz="4"/>
+              <w:right w:val="single" w:color="C9D1DC" w:sz="4"/>
+            </w:tcBorders>
+            <w:shd w:fill="EEF2F7" w:color="auto" w:val="clear"/>
+            <w:tcMar>
+              <w:top w:type="dxa" w:w="80"/>
+              <w:left w:type="dxa" w:w="110"/>
+              <w:bottom w:type="dxa" w:w="80"/>
+              <w:right w:type="dxa" w:w="110"/>
+            </w:tcMar>
+          </w:tcPr>
+          <w:p>
+            <w:pPr>
+              <w:keepNext/>
+            </w:pPr>
+            <w:r>
+              <w:rPr>
+                <w:rFonts w:ascii="Calibri" w:cs="Calibri" w:eastAsia="Calibri" w:hAnsi="Calibri"/>
+                <w:b w:val="false"/>
+                <w:bCs w:val="false"/>
+                <w:sz w:val="19"/>
+                <w:szCs w:val="19"/>
+              </w:rPr>
+              <w:t xml:space="preserve">Zapopan, Jal.</w:t>
+            </w:r>
+          </w:p>
+        </w:tc>
+        <w:tc>
+          <w:tcPr>
+            <w:tcW w:type="dxa" w:w="3860"/>
+            <w:tcBorders>
+              <w:top w:val="single" w:color="C9D1DC" w:sz="4"/>
+              <w:left w:val="single" w:color="C9D1DC" w:sz="4"/>
+              <w:bottom w:val="single" w:color="C9D1DC" w:sz="4"/>
+              <w:right w:val="single" w:color="C9D1DC" w:sz="4"/>
+            </w:tcBorders>
+            <w:shd w:fill="EEF2F7" w:color="auto" w:val="clear"/>
+            <w:tcMar>
+              <w:top w:type="dxa" w:w="80"/>
+              <w:left w:type="dxa" w:w="110"/>
+              <w:bottom w:type="dxa" w:w="80"/>
+              <w:right w:type="dxa" w:w="110"/>
+            </w:tcMar>
+          </w:tcPr>
+          <w:p>
+            <w:pPr>
+              <w:keepNext/>
+            </w:pPr>
+            <w:r>
+              <w:rPr>
+                <w:rFonts w:ascii="Calibri" w:cs="Calibri" w:eastAsia="Calibri" w:hAnsi="Calibri"/>
+                <w:b w:val="false"/>
+                <w:bCs w:val="false"/>
+                <w:sz w:val="19"/>
+                <w:szCs w:val="19"/>
+              </w:rPr>
+              <w:t xml:space="preserve">Sports and promo T-shirts in a 5,000 m² automated plant; exports to the U.S.</w:t>
+            </w:r>
+          </w:p>
+        </w:tc>
+        <w:tc>
+          <w:tcPr>
+            <w:tcW w:type="dxa" w:w="1800"/>
+            <w:tcBorders>
+              <w:top w:val="single" w:color="C9D1DC" w:sz="4"/>
+              <w:left w:val="single" w:color="C9D1DC" w:sz="4"/>
+              <w:bottom w:val="single" w:color="C9D1DC" w:sz="4"/>
+              <w:right w:val="single" w:color="C9D1DC" w:sz="4"/>
+            </w:tcBorders>
+            <w:shd w:fill="EEF2F7" w:color="auto" w:val="clear"/>
+            <w:tcMar>
+              <w:top w:type="dxa" w:w="80"/>
+              <w:left w:type="dxa" w:w="110"/>
+              <w:bottom w:type="dxa" w:w="80"/>
+              <w:right w:type="dxa" w:w="110"/>
+            </w:tcMar>
+          </w:tcPr>
+          <w:p>
+            <w:pPr>
+              <w:keepNext/>
+            </w:pPr>
+            <w:r>
+              <w:rPr>
+                <w:rFonts w:ascii="Calibri" w:cs="Calibri" w:eastAsia="Calibri" w:hAnsi="Calibri"/>
+                <w:b w:val="false"/>
+                <w:bCs w:val="false"/>
+                <w:sz w:val="19"/>
+                <w:szCs w:val="19"/>
+              </w:rPr>
+              <w:t xml:space="preserve">Sportswear</w:t>
+            </w:r>
+          </w:p>
+        </w:tc>
+      </w:tr>
+      <w:tr>
+        <w:trPr>
+          <w:cantSplit/>
+        </w:trPr>
+        <w:tc>
+          <w:tcPr>
+            <w:tcW w:type="dxa" w:w="2200"/>
+            <w:tcBorders>
+              <w:top w:val="single" w:color="C9D1DC" w:sz="4"/>
+              <w:left w:val="single" w:color="C9D1DC" w:sz="4"/>
+              <w:bottom w:val="single" w:color="C9D1DC" w:sz="4"/>
+              <w:right w:val="single" w:color="C9D1DC" w:sz="4"/>
+            </w:tcBorders>
+            <w:tcMar>
+              <w:top w:type="dxa" w:w="80"/>
+              <w:left w:type="dxa" w:w="110"/>
+              <w:bottom w:type="dxa" w:w="80"/>
+              <w:right w:type="dxa" w:w="110"/>
+            </w:tcMar>
+          </w:tcPr>
+          <w:p>
+            <w:pPr>
+              <w:keepNext/>
+            </w:pPr>
+            <w:r>
+              <w:rPr>
+                <w:rFonts w:ascii="Calibri" w:cs="Calibri" w:eastAsia="Calibri" w:hAnsi="Calibri"/>
+                <w:b/>
+                <w:bCs/>
+                <w:sz w:val="19"/>
+                <w:szCs w:val="19"/>
+              </w:rPr>
+              <w:t xml:space="preserve">GOCA'S</w:t>
+            </w:r>
+          </w:p>
+        </w:tc>
+        <w:tc>
+          <w:tcPr>
+            <w:tcW w:type="dxa" w:w="1500"/>
+            <w:tcBorders>
+              <w:top w:val="single" w:color="C9D1DC" w:sz="4"/>
+              <w:left w:val="single" w:color="C9D1DC" w:sz="4"/>
+              <w:bottom w:val="single" w:color="C9D1DC" w:sz="4"/>
+              <w:right w:val="single" w:color="C9D1DC" w:sz="4"/>
+            </w:tcBorders>
+            <w:tcMar>
+              <w:top w:type="dxa" w:w="80"/>
+              <w:left w:type="dxa" w:w="110"/>
+              <w:bottom w:type="dxa" w:w="80"/>
+              <w:right w:type="dxa" w:w="110"/>
+            </w:tcMar>
+          </w:tcPr>
+          <w:p>
+            <w:pPr>
+              <w:keepNext/>
+            </w:pPr>
+            <w:r>
+              <w:rPr>
+                <w:rFonts w:ascii="Calibri" w:cs="Calibri" w:eastAsia="Calibri" w:hAnsi="Calibri"/>
+                <w:b w:val="false"/>
+                <w:bCs w:val="false"/>
+                <w:sz w:val="19"/>
+                <w:szCs w:val="19"/>
+              </w:rPr>
+              <w:t xml:space="preserve">Ciudad de México</w:t>
+            </w:r>
+          </w:p>
+        </w:tc>
+        <w:tc>
+          <w:tcPr>
+            <w:tcW w:type="dxa" w:w="3860"/>
+            <w:tcBorders>
+              <w:top w:val="single" w:color="C9D1DC" w:sz="4"/>
+              <w:left w:val="single" w:color="C9D1DC" w:sz="4"/>
+              <w:bottom w:val="single" w:color="C9D1DC" w:sz="4"/>
+              <w:right w:val="single" w:color="C9D1DC" w:sz="4"/>
+            </w:tcBorders>
+            <w:tcMar>
+              <w:top w:type="dxa" w:w="80"/>
+              <w:left w:type="dxa" w:w="110"/>
+              <w:bottom w:type="dxa" w:w="80"/>
+              <w:right w:type="dxa" w:w="110"/>
+            </w:tcMar>
+          </w:tcPr>
+          <w:p>
+            <w:pPr>
+              <w:keepNext/>
+            </w:pPr>
+            <w:r>
+              <w:rPr>
+                <w:rFonts w:ascii="Calibri" w:cs="Calibri" w:eastAsia="Calibri" w:hAnsi="Calibri"/>
+                <w:b w:val="false"/>
+                <w:bCs w:val="false"/>
+                <w:sz w:val="19"/>
+                <w:szCs w:val="19"/>
+              </w:rPr>
+              <w:t xml:space="preserve">Large-scale T-shirts and hoodies with in-house screen, sublimation and embroidery; 25+ years</w:t>
+            </w:r>
+          </w:p>
+        </w:tc>
+        <w:tc>
+          <w:tcPr>
+            <w:tcW w:type="dxa" w:w="1800"/>
+            <w:tcBorders>
+              <w:top w:val="single" w:color="C9D1DC" w:sz="4"/>
+              <w:left w:val="single" w:color="C9D1DC" w:sz="4"/>
+              <w:bottom w:val="single" w:color="C9D1DC" w:sz="4"/>
+              <w:right w:val="single" w:color="C9D1DC" w:sz="4"/>
+            </w:tcBorders>
+            <w:tcMar>
+              <w:top w:type="dxa" w:w="80"/>
+              <w:left w:type="dxa" w:w="110"/>
+              <w:bottom w:type="dxa" w:w="80"/>
+              <w:right w:type="dxa" w:w="110"/>
+            </w:tcMar>
+          </w:tcPr>
+          <w:p>
+            <w:pPr>
+              <w:keepNext/>
+            </w:pPr>
+            <w:r>
+              <w:rPr>
+                <w:rFonts w:ascii="Calibri" w:cs="Calibri" w:eastAsia="Calibri" w:hAnsi="Calibri"/>
+                <w:b w:val="false"/>
+                <w:bCs w:val="false"/>
+                <w:sz w:val="19"/>
+                <w:szCs w:val="19"/>
+              </w:rPr>
+              <w:t xml:space="preserve">Promotional</w:t>
+            </w:r>
+          </w:p>
+        </w:tc>
+      </w:tr>
+      <w:tr>
+        <w:trPr>
+          <w:cantSplit/>
+        </w:trPr>
+        <w:tc>
+          <w:tcPr>
+            <w:tcW w:type="dxa" w:w="2200"/>
+            <w:tcBorders>
+              <w:top w:val="single" w:color="C9D1DC" w:sz="4"/>
+              <w:left w:val="single" w:color="C9D1DC" w:sz="4"/>
+              <w:bottom w:val="single" w:color="C9D1DC" w:sz="4"/>
+              <w:right w:val="single" w:color="C9D1DC" w:sz="4"/>
+            </w:tcBorders>
+            <w:shd w:fill="EEF2F7" w:color="auto" w:val="clear"/>
+            <w:tcMar>
+              <w:top w:type="dxa" w:w="80"/>
+              <w:left w:type="dxa" w:w="110"/>
+              <w:bottom w:type="dxa" w:w="80"/>
+              <w:right w:type="dxa" w:w="110"/>
+            </w:tcMar>
+          </w:tcPr>
+          <w:p>
+            <w:pPr>
+              <w:keepNext/>
+            </w:pPr>
+            <w:r>
+              <w:rPr>
+                <w:rFonts w:ascii="Calibri" w:cs="Calibri" w:eastAsia="Calibri" w:hAnsi="Calibri"/>
+                <w:b/>
+                <w:bCs/>
+                <w:sz w:val="19"/>
+                <w:szCs w:val="19"/>
+              </w:rPr>
+              <w:t xml:space="preserve">SerigrafiarteSP</w:t>
+            </w:r>
+          </w:p>
+        </w:tc>
+        <w:tc>
+          <w:tcPr>
+            <w:tcW w:type="dxa" w:w="1500"/>
+            <w:tcBorders>
+              <w:top w:val="single" w:color="C9D1DC" w:sz="4"/>
+              <w:left w:val="single" w:color="C9D1DC" w:sz="4"/>
+              <w:bottom w:val="single" w:color="C9D1DC" w:sz="4"/>
+              <w:right w:val="single" w:color="C9D1DC" w:sz="4"/>
+            </w:tcBorders>
+            <w:shd w:fill="EEF2F7" w:color="auto" w:val="clear"/>
+            <w:tcMar>
+              <w:top w:type="dxa" w:w="80"/>
+              <w:left w:type="dxa" w:w="110"/>
+              <w:bottom w:type="dxa" w:w="80"/>
+              <w:right w:type="dxa" w:w="110"/>
+            </w:tcMar>
+          </w:tcPr>
+          <w:p>
+            <w:pPr>
+              <w:keepNext/>
+            </w:pPr>
+            <w:r>
+              <w:rPr>
+                <w:rFonts w:ascii="Calibri" w:cs="Calibri" w:eastAsia="Calibri" w:hAnsi="Calibri"/>
+                <w:b w:val="false"/>
+                <w:bCs w:val="false"/>
+                <w:sz w:val="19"/>
+                <w:szCs w:val="19"/>
+              </w:rPr>
+              <w:t xml:space="preserve">Ciudad de México</w:t>
+            </w:r>
+          </w:p>
+        </w:tc>
+        <w:tc>
+          <w:tcPr>
+            <w:tcW w:type="dxa" w:w="3860"/>
+            <w:tcBorders>
+              <w:top w:val="single" w:color="C9D1DC" w:sz="4"/>
+              <w:left w:val="single" w:color="C9D1DC" w:sz="4"/>
+              <w:bottom w:val="single" w:color="C9D1DC" w:sz="4"/>
+              <w:right w:val="single" w:color="C9D1DC" w:sz="4"/>
+            </w:tcBorders>
+            <w:shd w:fill="EEF2F7" w:color="auto" w:val="clear"/>
+            <w:tcMar>
+              <w:top w:type="dxa" w:w="80"/>
+              <w:left w:type="dxa" w:w="110"/>
+              <w:bottom w:type="dxa" w:w="80"/>
+              <w:right w:type="dxa" w:w="110"/>
+            </w:tcMar>
+          </w:tcPr>
+          <w:p>
+            <w:pPr>
+              <w:keepNext/>
+            </w:pPr>
+            <w:r>
+              <w:rPr>
+                <w:rFonts w:ascii="Calibri" w:cs="Calibri" w:eastAsia="Calibri" w:hAnsi="Calibri"/>
+                <w:b w:val="false"/>
+                <w:bCs w:val="false"/>
+                <w:sz w:val="19"/>
+                <w:szCs w:val="19"/>
+              </w:rPr>
+              <w:t xml:space="preserve">Contract screen printing (plastisol, water-based, discharge), DTF and sublimation for factories and brands</w:t>
+            </w:r>
+          </w:p>
+        </w:tc>
+        <w:tc>
+          <w:tcPr>
+            <w:tcW w:type="dxa" w:w="1800"/>
+            <w:tcBorders>
+              <w:top w:val="single" w:color="C9D1DC" w:sz="4"/>
+              <w:left w:val="single" w:color="C9D1DC" w:sz="4"/>
+              <w:bottom w:val="single" w:color="C9D1DC" w:sz="4"/>
+              <w:right w:val="single" w:color="C9D1DC" w:sz="4"/>
+            </w:tcBorders>
+            <w:shd w:fill="EEF2F7" w:color="auto" w:val="clear"/>
+            <w:tcMar>
+              <w:top w:type="dxa" w:w="80"/>
+              <w:left w:type="dxa" w:w="110"/>
+              <w:bottom w:type="dxa" w:w="80"/>
+              <w:right w:type="dxa" w:w="110"/>
+            </w:tcMar>
+          </w:tcPr>
+          <w:p>
+            <w:pPr>
+              <w:keepNext/>
+            </w:pPr>
+            <w:r>
+              <w:rPr>
+                <w:rFonts w:ascii="Calibri" w:cs="Calibri" w:eastAsia="Calibri" w:hAnsi="Calibri"/>
+                <w:b w:val="false"/>
+                <w:bCs w:val="false"/>
+                <w:sz w:val="19"/>
+                <w:szCs w:val="19"/>
+              </w:rPr>
+              <w:t xml:space="preserve">Printing and screen printing</w:t>
+            </w:r>
+          </w:p>
+        </w:tc>
+      </w:tr>
+      <w:tr>
+        <w:trPr>
+          <w:cantSplit/>
+        </w:trPr>
+        <w:tc>
+          <w:tcPr>
+            <w:tcW w:type="dxa" w:w="2200"/>
+            <w:tcBorders>
+              <w:top w:val="single" w:color="C9D1DC" w:sz="4"/>
+              <w:left w:val="single" w:color="C9D1DC" w:sz="4"/>
+              <w:bottom w:val="single" w:color="C9D1DC" w:sz="4"/>
+              <w:right w:val="single" w:color="C9D1DC" w:sz="4"/>
+            </w:tcBorders>
+            <w:tcMar>
+              <w:top w:type="dxa" w:w="80"/>
+              <w:left w:type="dxa" w:w="110"/>
+              <w:bottom w:type="dxa" w:w="80"/>
+              <w:right w:type="dxa" w:w="110"/>
+            </w:tcMar>
+          </w:tcPr>
+          <w:p>
+            <w:pPr>
+              <w:keepNext/>
+            </w:pPr>
+            <w:r>
+              <w:rPr>
+                <w:rFonts w:ascii="Calibri" w:cs="Calibri" w:eastAsia="Calibri" w:hAnsi="Calibri"/>
+                <w:b/>
+                <w:bCs/>
+                <w:sz w:val="19"/>
+                <w:szCs w:val="19"/>
+              </w:rPr>
+              <w:t xml:space="preserve">Grupo Martex</w:t>
+            </w:r>
+          </w:p>
+        </w:tc>
+        <w:tc>
+          <w:tcPr>
+            <w:tcW w:type="dxa" w:w="1500"/>
+            <w:tcBorders>
+              <w:top w:val="single" w:color="C9D1DC" w:sz="4"/>
+              <w:left w:val="single" w:color="C9D1DC" w:sz="4"/>
+              <w:bottom w:val="single" w:color="C9D1DC" w:sz="4"/>
+              <w:right w:val="single" w:color="C9D1DC" w:sz="4"/>
+            </w:tcBorders>
+            <w:tcMar>
+              <w:top w:type="dxa" w:w="80"/>
+              <w:left w:type="dxa" w:w="110"/>
+              <w:bottom w:type="dxa" w:w="80"/>
+              <w:right w:type="dxa" w:w="110"/>
+            </w:tcMar>
+          </w:tcPr>
+          <w:p>
+            <w:pPr>
+              <w:keepNext/>
+            </w:pPr>
+            <w:r>
+              <w:rPr>
+                <w:rFonts w:ascii="Calibri" w:cs="Calibri" w:eastAsia="Calibri" w:hAnsi="Calibri"/>
+                <w:b w:val="false"/>
+                <w:bCs w:val="false"/>
+                <w:sz w:val="19"/>
+                <w:szCs w:val="19"/>
+              </w:rPr>
+              <w:t xml:space="preserve">Naucalpan, Edo. Méx.</w:t>
+            </w:r>
+          </w:p>
+        </w:tc>
+        <w:tc>
+          <w:tcPr>
+            <w:tcW w:type="dxa" w:w="3860"/>
+            <w:tcBorders>
+              <w:top w:val="single" w:color="C9D1DC" w:sz="4"/>
+              <w:left w:val="single" w:color="C9D1DC" w:sz="4"/>
+              <w:bottom w:val="single" w:color="C9D1DC" w:sz="4"/>
+              <w:right w:val="single" w:color="C9D1DC" w:sz="4"/>
+            </w:tcBorders>
+            <w:tcMar>
+              <w:top w:type="dxa" w:w="80"/>
+              <w:left w:type="dxa" w:w="110"/>
+              <w:bottom w:type="dxa" w:w="80"/>
+              <w:right w:type="dxa" w:w="110"/>
+            </w:tcMar>
+          </w:tcPr>
+          <w:p>
+            <w:pPr>
+              <w:keepNext/>
+            </w:pPr>
+            <w:r>
+              <w:rPr>
+                <w:rFonts w:ascii="Calibri" w:cs="Calibri" w:eastAsia="Calibri" w:hAnsi="Calibri"/>
+                <w:b w:val="false"/>
+                <w:bCs w:val="false"/>
+                <w:sz w:val="19"/>
+                <w:szCs w:val="19"/>
+              </w:rPr>
+              <w:t xml:space="preserve">High-volume textile maker; uniforms (directory cites FIFA uniforms)</w:t>
+            </w:r>
+          </w:p>
+        </w:tc>
+        <w:tc>
+          <w:tcPr>
+            <w:tcW w:type="dxa" w:w="1800"/>
+            <w:tcBorders>
+              <w:top w:val="single" w:color="C9D1DC" w:sz="4"/>
+              <w:left w:val="single" w:color="C9D1DC" w:sz="4"/>
+              <w:bottom w:val="single" w:color="C9D1DC" w:sz="4"/>
+              <w:right w:val="single" w:color="C9D1DC" w:sz="4"/>
+            </w:tcBorders>
+            <w:tcMar>
+              <w:top w:type="dxa" w:w="80"/>
+              <w:left w:type="dxa" w:w="110"/>
+              <w:bottom w:type="dxa" w:w="80"/>
+              <w:right w:type="dxa" w:w="110"/>
+            </w:tcMar>
+          </w:tcPr>
+          <w:p>
+            <w:pPr>
+              <w:keepNext/>
+            </w:pPr>
+            <w:r>
+              <w:rPr>
+                <w:rFonts w:ascii="Calibri" w:cs="Calibri" w:eastAsia="Calibri" w:hAnsi="Calibri"/>
+                <w:b w:val="false"/>
+                <w:bCs w:val="false"/>
+                <w:sz w:val="19"/>
+                <w:szCs w:val="19"/>
+              </w:rPr>
+              <w:t xml:space="preserve">Uniforms and sportswear</w:t>
+            </w:r>
+          </w:p>
+        </w:tc>
+      </w:tr>
+      <w:tr>
+        <w:trPr>
+          <w:cantSplit/>
+        </w:trPr>
+        <w:tc>
+          <w:tcPr>
+            <w:tcW w:type="dxa" w:w="2200"/>
+            <w:tcBorders>
+              <w:top w:val="single" w:color="C9D1DC" w:sz="4"/>
+              <w:left w:val="single" w:color="C9D1DC" w:sz="4"/>
+              <w:bottom w:val="single" w:color="C9D1DC" w:sz="4"/>
+              <w:right w:val="single" w:color="C9D1DC" w:sz="4"/>
+            </w:tcBorders>
+            <w:shd w:fill="EEF2F7" w:color="auto" w:val="clear"/>
+            <w:tcMar>
+              <w:top w:type="dxa" w:w="80"/>
+              <w:left w:type="dxa" w:w="110"/>
+              <w:bottom w:type="dxa" w:w="80"/>
+              <w:right w:type="dxa" w:w="110"/>
+            </w:tcMar>
+          </w:tcPr>
+          <w:p>
+            <w:pPr>
+              <w:keepNext/>
+            </w:pPr>
+            <w:r>
+              <w:rPr>
+                <w:rFonts w:ascii="Calibri" w:cs="Calibri" w:eastAsia="Calibri" w:hAnsi="Calibri"/>
+                <w:b/>
+                <w:bCs/>
+                <w:sz w:val="19"/>
+                <w:szCs w:val="19"/>
+              </w:rPr>
+              <w:t xml:space="preserve">Uniformes Carmen</w:t>
+            </w:r>
+          </w:p>
+        </w:tc>
+        <w:tc>
+          <w:tcPr>
+            <w:tcW w:type="dxa" w:w="1500"/>
+            <w:tcBorders>
+              <w:top w:val="single" w:color="C9D1DC" w:sz="4"/>
+              <w:left w:val="single" w:color="C9D1DC" w:sz="4"/>
+              <w:bottom w:val="single" w:color="C9D1DC" w:sz="4"/>
+              <w:right w:val="single" w:color="C9D1DC" w:sz="4"/>
+            </w:tcBorders>
+            <w:shd w:fill="EEF2F7" w:color="auto" w:val="clear"/>
+            <w:tcMar>
+              <w:top w:type="dxa" w:w="80"/>
+              <w:left w:type="dxa" w:w="110"/>
+              <w:bottom w:type="dxa" w:w="80"/>
+              <w:right w:type="dxa" w:w="110"/>
+            </w:tcMar>
+          </w:tcPr>
+          <w:p>
+            <w:pPr>
+              <w:keepNext/>
+            </w:pPr>
+            <w:r>
+              <w:rPr>
+                <w:rFonts w:ascii="Calibri" w:cs="Calibri" w:eastAsia="Calibri" w:hAnsi="Calibri"/>
+                <w:b w:val="false"/>
+                <w:bCs w:val="false"/>
+                <w:sz w:val="19"/>
+                <w:szCs w:val="19"/>
+              </w:rPr>
+              <w:t xml:space="preserve">Guadalajara, Jal.</w:t>
+            </w:r>
+          </w:p>
+        </w:tc>
+        <w:tc>
+          <w:tcPr>
+            <w:tcW w:type="dxa" w:w="3860"/>
+            <w:tcBorders>
+              <w:top w:val="single" w:color="C9D1DC" w:sz="4"/>
+              <w:left w:val="single" w:color="C9D1DC" w:sz="4"/>
+              <w:bottom w:val="single" w:color="C9D1DC" w:sz="4"/>
+              <w:right w:val="single" w:color="C9D1DC" w:sz="4"/>
+            </w:tcBorders>
+            <w:shd w:fill="EEF2F7" w:color="auto" w:val="clear"/>
+            <w:tcMar>
+              <w:top w:type="dxa" w:w="80"/>
+              <w:left w:type="dxa" w:w="110"/>
+              <w:bottom w:type="dxa" w:w="80"/>
+              <w:right w:type="dxa" w:w="110"/>
+            </w:tcMar>
+          </w:tcPr>
+          <w:p>
+            <w:pPr>
+              <w:keepNext/>
+            </w:pPr>
+            <w:r>
+              <w:rPr>
+                <w:rFonts w:ascii="Calibri" w:cs="Calibri" w:eastAsia="Calibri" w:hAnsi="Calibri"/>
+                <w:b w:val="false"/>
+                <w:bCs w:val="false"/>
+                <w:sz w:val="19"/>
+                <w:szCs w:val="19"/>
+              </w:rPr>
+              <w:t xml:space="preserve">Uniforms with screen, embroidery and transfer; volume print contracting; 30+ years</w:t>
+            </w:r>
+          </w:p>
+        </w:tc>
+        <w:tc>
+          <w:tcPr>
+            <w:tcW w:type="dxa" w:w="1800"/>
+            <w:tcBorders>
+              <w:top w:val="single" w:color="C9D1DC" w:sz="4"/>
+              <w:left w:val="single" w:color="C9D1DC" w:sz="4"/>
+              <w:bottom w:val="single" w:color="C9D1DC" w:sz="4"/>
+              <w:right w:val="single" w:color="C9D1DC" w:sz="4"/>
+            </w:tcBorders>
+            <w:shd w:fill="EEF2F7" w:color="auto" w:val="clear"/>
+            <w:tcMar>
+              <w:top w:type="dxa" w:w="80"/>
+              <w:left w:type="dxa" w:w="110"/>
+              <w:bottom w:type="dxa" w:w="80"/>
+              <w:right w:type="dxa" w:w="110"/>
+            </w:tcMar>
+          </w:tcPr>
+          <w:p>
+            <w:pPr>
+              <w:keepNext/>
+            </w:pPr>
+            <w:r>
+              <w:rPr>
+                <w:rFonts w:ascii="Calibri" w:cs="Calibri" w:eastAsia="Calibri" w:hAnsi="Calibri"/>
+                <w:b w:val="false"/>
+                <w:bCs w:val="false"/>
+                <w:sz w:val="19"/>
+                <w:szCs w:val="19"/>
+              </w:rPr>
+              <w:t xml:space="preserve">Uniforms</w:t>
+            </w:r>
+          </w:p>
+        </w:tc>
+      </w:tr>
+      <w:tr>
+        <w:trPr>
+          <w:cantSplit/>
+        </w:trPr>
+        <w:tc>
+          <w:tcPr>
+            <w:tcW w:type="dxa" w:w="2200"/>
+            <w:tcBorders>
+              <w:top w:val="single" w:color="C9D1DC" w:sz="4"/>
+              <w:left w:val="single" w:color="C9D1DC" w:sz="4"/>
+              <w:bottom w:val="single" w:color="C9D1DC" w:sz="4"/>
+              <w:right w:val="single" w:color="C9D1DC" w:sz="4"/>
+            </w:tcBorders>
+            <w:tcMar>
+              <w:top w:type="dxa" w:w="80"/>
+              <w:left w:type="dxa" w:w="110"/>
+              <w:bottom w:type="dxa" w:w="80"/>
+              <w:right w:type="dxa" w:w="110"/>
+            </w:tcMar>
+          </w:tcPr>
+          <w:p>
+            <w:pPr>
+              <w:keepNext w:val="false"/>
+            </w:pPr>
+            <w:r>
+              <w:rPr>
+                <w:rFonts w:ascii="Calibri" w:cs="Calibri" w:eastAsia="Calibri" w:hAnsi="Calibri"/>
+                <w:b/>
+                <w:bCs/>
+                <w:sz w:val="19"/>
+                <w:szCs w:val="19"/>
+              </w:rPr>
+              <w:t xml:space="preserve">Charly (Grupo Charly)</w:t>
+            </w:r>
+          </w:p>
+        </w:tc>
+        <w:tc>
+          <w:tcPr>
+            <w:tcW w:type="dxa" w:w="1500"/>
+            <w:tcBorders>
+              <w:top w:val="single" w:color="C9D1DC" w:sz="4"/>
+              <w:left w:val="single" w:color="C9D1DC" w:sz="4"/>
+              <w:bottom w:val="single" w:color="C9D1DC" w:sz="4"/>
+              <w:right w:val="single" w:color="C9D1DC" w:sz="4"/>
+            </w:tcBorders>
+            <w:tcMar>
+              <w:top w:type="dxa" w:w="80"/>
+              <w:left w:type="dxa" w:w="110"/>
+              <w:bottom w:type="dxa" w:w="80"/>
+              <w:right w:type="dxa" w:w="110"/>
+            </w:tcMar>
+          </w:tcPr>
+          <w:p>
+            <w:pPr>
+              <w:keepNext w:val="false"/>
+            </w:pPr>
+            <w:r>
+              <w:rPr>
+                <w:rFonts w:ascii="Calibri" w:cs="Calibri" w:eastAsia="Calibri" w:hAnsi="Calibri"/>
+                <w:b w:val="false"/>
+                <w:bCs w:val="false"/>
+                <w:sz w:val="19"/>
+                <w:szCs w:val="19"/>
+              </w:rPr>
+              <w:t xml:space="preserve">León, Gto.</w:t>
+            </w:r>
+          </w:p>
+        </w:tc>
+        <w:tc>
+          <w:tcPr>
+            <w:tcW w:type="dxa" w:w="3860"/>
+            <w:tcBorders>
+              <w:top w:val="single" w:color="C9D1DC" w:sz="4"/>
+              <w:left w:val="single" w:color="C9D1DC" w:sz="4"/>
+              <w:bottom w:val="single" w:color="C9D1DC" w:sz="4"/>
+              <w:right w:val="single" w:color="C9D1DC" w:sz="4"/>
+            </w:tcBorders>
+            <w:tcMar>
+              <w:top w:type="dxa" w:w="80"/>
+              <w:left w:type="dxa" w:w="110"/>
+              <w:bottom w:type="dxa" w:w="80"/>
+              <w:right w:type="dxa" w:w="110"/>
+            </w:tcMar>
+          </w:tcPr>
+          <w:p>
+            <w:pPr>
+              <w:keepNext w:val="false"/>
+            </w:pPr>
+            <w:r>
+              <w:rPr>
+                <w:rFonts w:ascii="Calibri" w:cs="Calibri" w:eastAsia="Calibri" w:hAnsi="Calibri"/>
+                <w:b w:val="false"/>
+                <w:bCs w:val="false"/>
+                <w:sz w:val="19"/>
+                <w:szCs w:val="19"/>
+              </w:rPr>
+              <w:t xml:space="preserve">Sports brand: jerseys and licensed apparel for Liga MX clubs (León, Pachuca, Atlas, Santos)</w:t>
+            </w:r>
+          </w:p>
+        </w:tc>
+        <w:tc>
+          <w:tcPr>
+            <w:tcW w:type="dxa" w:w="1800"/>
+            <w:tcBorders>
+              <w:top w:val="single" w:color="C9D1DC" w:sz="4"/>
+              <w:left w:val="single" w:color="C9D1DC" w:sz="4"/>
+              <w:bottom w:val="single" w:color="C9D1DC" w:sz="4"/>
+              <w:right w:val="single" w:color="C9D1DC" w:sz="4"/>
+            </w:tcBorders>
+            <w:tcMar>
+              <w:top w:type="dxa" w:w="80"/>
+              <w:left w:type="dxa" w:w="110"/>
+              <w:bottom w:type="dxa" w:w="80"/>
+              <w:right w:type="dxa" w:w="110"/>
+            </w:tcMar>
+          </w:tcPr>
+          <w:p>
+            <w:pPr>
+              <w:keepNext w:val="false"/>
+            </w:pPr>
+            <w:r>
+              <w:rPr>
+                <w:rFonts w:ascii="Calibri" w:cs="Calibri" w:eastAsia="Calibri" w:hAnsi="Calibri"/>
+                <w:b w:val="false"/>
+                <w:bCs w:val="false"/>
+                <w:sz w:val="19"/>
+                <w:szCs w:val="19"/>
+              </w:rPr>
+              <w:t xml:space="preserve">Sportswear / licensing</w:t>
+            </w:r>
+          </w:p>
+        </w:tc>
+      </w:tr>
+    </w:tbl>
+    <w:p>
+      <w:pPr>
+        <w:spacing w:after="120"/>
+      </w:pPr>
+    </w:p>
+    <w:p>
+      <w:pPr>
+        <w:pStyle w:val="Heading2"/>
+      </w:pPr>
+      <w:r>
+        <w:t xml:space="preserve">Priority OEMs: export contract manufacturing (8 of 35)</w:t>
+      </w:r>
+    </w:p>
+    <w:tbl>
+      <w:tblPr>
+        <w:tblW w:type="dxa" w:w="9360"/>
+        <w:tblBorders>
+          <w:top w:val="single" w:color="auto" w:sz="4"/>
+          <w:left w:val="single" w:color="auto" w:sz="4"/>
+          <w:bottom w:val="single" w:color="auto" w:sz="4"/>
+          <w:right w:val="single" w:color="auto" w:sz="4"/>
+          <w:insideH w:val="single" w:color="auto" w:sz="4"/>
+          <w:insideV w:val="single" w:color="auto" w:sz="4"/>
+        </w:tblBorders>
+      </w:tblPr>
+      <w:tblGrid>
+        <w:gridCol w:w="2200"/>
+        <w:gridCol w:w="1500"/>
+        <w:gridCol w:w="3860"/>
+        <w:gridCol w:w="1800"/>
+      </w:tblGrid>
+      <w:tr>
+        <w:trPr>
+          <w:cantSplit/>
+          <w:tblHeader/>
+        </w:trPr>
+        <w:tc>
+          <w:tcPr>
+            <w:tcW w:type="dxa" w:w="2200"/>
+            <w:tcBorders>
+              <w:top w:val="single" w:color="C9D1DC" w:sz="4"/>
+              <w:left w:val="single" w:color="C9D1DC" w:sz="4"/>
+              <w:bottom w:val="single" w:color="C9D1DC" w:sz="4"/>
+              <w:right w:val="single" w:color="C9D1DC" w:sz="4"/>
+            </w:tcBorders>
+            <w:shd w:fill="1B1F3B" w:color="auto" w:val="clear"/>
+            <w:tcMar>
+              <w:top w:type="dxa" w:w="80"/>
+              <w:left w:type="dxa" w:w="110"/>
+              <w:bottom w:type="dxa" w:w="80"/>
+              <w:right w:type="dxa" w:w="110"/>
+            </w:tcMar>
+          </w:tcPr>
+          <w:p>
+            <w:pPr>
+              <w:keepNext/>
+            </w:pPr>
+            <w:r>
+              <w:rPr>
+                <w:rFonts w:ascii="Calibri" w:cs="Calibri" w:eastAsia="Calibri" w:hAnsi="Calibri"/>
+                <w:b/>
+                <w:bCs/>
+                <w:color w:val="FFFFFF"/>
+                <w:sz w:val="19"/>
+                <w:szCs w:val="19"/>
+              </w:rPr>
+              <w:t xml:space="preserve">Company</w:t>
+            </w:r>
+          </w:p>
+        </w:tc>
+        <w:tc>
+          <w:tcPr>
+            <w:tcW w:type="dxa" w:w="1500"/>
+            <w:tcBorders>
+              <w:top w:val="single" w:color="C9D1DC" w:sz="4"/>
+              <w:left w:val="single" w:color="C9D1DC" w:sz="4"/>
+              <w:bottom w:val="single" w:color="C9D1DC" w:sz="4"/>
+              <w:right w:val="single" w:color="C9D1DC" w:sz="4"/>
+            </w:tcBorders>
+            <w:shd w:fill="1B1F3B" w:color="auto" w:val="clear"/>
+            <w:tcMar>
+              <w:top w:type="dxa" w:w="80"/>
+              <w:left w:type="dxa" w:w="110"/>
+              <w:bottom w:type="dxa" w:w="80"/>
+              <w:right w:type="dxa" w:w="110"/>
+            </w:tcMar>
+          </w:tcPr>
+          <w:p>
+            <w:pPr>
+              <w:keepNext/>
+            </w:pPr>
+            <w:r>
+              <w:rPr>
+                <w:rFonts w:ascii="Calibri" w:cs="Calibri" w:eastAsia="Calibri" w:hAnsi="Calibri"/>
+                <w:b/>
+                <w:bCs/>
+                <w:color w:val="FFFFFF"/>
+                <w:sz w:val="19"/>
+                <w:szCs w:val="19"/>
+              </w:rPr>
+              <w:t xml:space="preserve">City</w:t>
+            </w:r>
+          </w:p>
+        </w:tc>
+        <w:tc>
+          <w:tcPr>
+            <w:tcW w:type="dxa" w:w="3860"/>
+            <w:tcBorders>
+              <w:top w:val="single" w:color="C9D1DC" w:sz="4"/>
+              <w:left w:val="single" w:color="C9D1DC" w:sz="4"/>
+              <w:bottom w:val="single" w:color="C9D1DC" w:sz="4"/>
+              <w:right w:val="single" w:color="C9D1DC" w:sz="4"/>
+            </w:tcBorders>
+            <w:shd w:fill="1B1F3B" w:color="auto" w:val="clear"/>
+            <w:tcMar>
+              <w:top w:type="dxa" w:w="80"/>
+              <w:left w:type="dxa" w:w="110"/>
+              <w:bottom w:type="dxa" w:w="80"/>
+              <w:right w:type="dxa" w:w="110"/>
+            </w:tcMar>
+          </w:tcPr>
+          <w:p>
+            <w:pPr>
+              <w:keepNext/>
+            </w:pPr>
+            <w:r>
+              <w:rPr>
+                <w:rFonts w:ascii="Calibri" w:cs="Calibri" w:eastAsia="Calibri" w:hAnsi="Calibri"/>
+                <w:b/>
+                <w:bCs/>
+                <w:color w:val="FFFFFF"/>
+                <w:sz w:val="19"/>
+                <w:szCs w:val="19"/>
+              </w:rPr>
+              <w:t xml:space="preserve">What they do</w:t>
+            </w:r>
+          </w:p>
+        </w:tc>
+        <w:tc>
+          <w:tcPr>
+            <w:tcW w:type="dxa" w:w="1800"/>
+            <w:tcBorders>
+              <w:top w:val="single" w:color="C9D1DC" w:sz="4"/>
+              <w:left w:val="single" w:color="C9D1DC" w:sz="4"/>
+              <w:bottom w:val="single" w:color="C9D1DC" w:sz="4"/>
+              <w:right w:val="single" w:color="C9D1DC" w:sz="4"/>
+            </w:tcBorders>
+            <w:shd w:fill="1B1F3B" w:color="auto" w:val="clear"/>
+            <w:tcMar>
+              <w:top w:type="dxa" w:w="80"/>
+              <w:left w:type="dxa" w:w="110"/>
+              <w:bottom w:type="dxa" w:w="80"/>
+              <w:right w:type="dxa" w:w="110"/>
+            </w:tcMar>
+          </w:tcPr>
+          <w:p>
+            <w:pPr>
+              <w:keepNext/>
+            </w:pPr>
+            <w:r>
+              <w:rPr>
+                <w:rFonts w:ascii="Calibri" w:cs="Calibri" w:eastAsia="Calibri" w:hAnsi="Calibri"/>
+                <w:b/>
+                <w:bCs/>
+                <w:color w:val="FFFFFF"/>
+                <w:sz w:val="19"/>
+                <w:szCs w:val="19"/>
+              </w:rPr>
+              <w:t xml:space="preserve">Brands and customers</w:t>
+            </w:r>
+          </w:p>
+        </w:tc>
+      </w:tr>
+      <w:tr>
+        <w:trPr>
+          <w:cantSplit/>
+        </w:trPr>
+        <w:tc>
+          <w:tcPr>
+            <w:tcW w:type="dxa" w:w="2200"/>
+            <w:tcBorders>
+              <w:top w:val="single" w:color="C9D1DC" w:sz="4"/>
+              <w:left w:val="single" w:color="C9D1DC" w:sz="4"/>
+              <w:bottom w:val="single" w:color="C9D1DC" w:sz="4"/>
+              <w:right w:val="single" w:color="C9D1DC" w:sz="4"/>
+            </w:tcBorders>
+            <w:tcMar>
+              <w:top w:type="dxa" w:w="80"/>
+              <w:left w:type="dxa" w:w="110"/>
+              <w:bottom w:type="dxa" w:w="80"/>
+              <w:right w:type="dxa" w:w="110"/>
+            </w:tcMar>
+          </w:tcPr>
+          <w:p>
+            <w:pPr>
+              <w:keepNext/>
+            </w:pPr>
+            <w:r>
+              <w:rPr>
+                <w:rFonts w:ascii="Calibri" w:cs="Calibri" w:eastAsia="Calibri" w:hAnsi="Calibri"/>
+                <w:b/>
+                <w:bCs/>
+                <w:sz w:val="19"/>
+                <w:szCs w:val="19"/>
+              </w:rPr>
+              <w:t xml:space="preserve">Vertical Knits</w:t>
+            </w:r>
+          </w:p>
+        </w:tc>
+        <w:tc>
+          <w:tcPr>
+            <w:tcW w:type="dxa" w:w="1500"/>
+            <w:tcBorders>
+              <w:top w:val="single" w:color="C9D1DC" w:sz="4"/>
+              <w:left w:val="single" w:color="C9D1DC" w:sz="4"/>
+              <w:bottom w:val="single" w:color="C9D1DC" w:sz="4"/>
+              <w:right w:val="single" w:color="C9D1DC" w:sz="4"/>
+            </w:tcBorders>
+            <w:tcMar>
+              <w:top w:type="dxa" w:w="80"/>
+              <w:left w:type="dxa" w:w="110"/>
+              <w:bottom w:type="dxa" w:w="80"/>
+              <w:right w:type="dxa" w:w="110"/>
+            </w:tcMar>
+          </w:tcPr>
+          <w:p>
+            <w:pPr>
+              <w:keepNext/>
+            </w:pPr>
+            <w:r>
+              <w:rPr>
+                <w:rFonts w:ascii="Calibri" w:cs="Calibri" w:eastAsia="Calibri" w:hAnsi="Calibri"/>
+                <w:b w:val="false"/>
+                <w:bCs w:val="false"/>
+                <w:sz w:val="19"/>
+                <w:szCs w:val="19"/>
+              </w:rPr>
+              <w:t xml:space="preserve">Baca, Yuc.</w:t>
+            </w:r>
+          </w:p>
+        </w:tc>
+        <w:tc>
+          <w:tcPr>
+            <w:tcW w:type="dxa" w:w="3860"/>
+            <w:tcBorders>
+              <w:top w:val="single" w:color="C9D1DC" w:sz="4"/>
+              <w:left w:val="single" w:color="C9D1DC" w:sz="4"/>
+              <w:bottom w:val="single" w:color="C9D1DC" w:sz="4"/>
+              <w:right w:val="single" w:color="C9D1DC" w:sz="4"/>
+            </w:tcBorders>
+            <w:tcMar>
+              <w:top w:type="dxa" w:w="80"/>
+              <w:left w:type="dxa" w:w="110"/>
+              <w:bottom w:type="dxa" w:w="80"/>
+              <w:right w:type="dxa" w:w="110"/>
+            </w:tcMar>
+          </w:tcPr>
+          <w:p>
+            <w:pPr>
+              <w:keepNext/>
+            </w:pPr>
+            <w:r>
+              <w:rPr>
+                <w:rFonts w:ascii="Calibri" w:cs="Calibri" w:eastAsia="Calibri" w:hAnsi="Calibri"/>
+                <w:b w:val="false"/>
+                <w:bCs w:val="false"/>
+                <w:sz w:val="19"/>
+                <w:szCs w:val="19"/>
+              </w:rPr>
+              <w:t xml:space="preserve">Knitwear with in-house screen printing and embroidery; 16–25 million garments a year</w:t>
+            </w:r>
+          </w:p>
+        </w:tc>
+        <w:tc>
+          <w:tcPr>
+            <w:tcW w:type="dxa" w:w="1800"/>
+            <w:tcBorders>
+              <w:top w:val="single" w:color="C9D1DC" w:sz="4"/>
+              <w:left w:val="single" w:color="C9D1DC" w:sz="4"/>
+              <w:bottom w:val="single" w:color="C9D1DC" w:sz="4"/>
+              <w:right w:val="single" w:color="C9D1DC" w:sz="4"/>
+            </w:tcBorders>
+            <w:tcMar>
+              <w:top w:type="dxa" w:w="80"/>
+              <w:left w:type="dxa" w:w="110"/>
+              <w:bottom w:type="dxa" w:w="80"/>
+              <w:right w:type="dxa" w:w="110"/>
+            </w:tcMar>
+          </w:tcPr>
+          <w:p>
+            <w:pPr>
+              <w:keepNext/>
+            </w:pPr>
+            <w:r>
+              <w:rPr>
+                <w:rFonts w:ascii="Calibri" w:cs="Calibri" w:eastAsia="Calibri" w:hAnsi="Calibri"/>
+                <w:b w:val="false"/>
+                <w:bCs w:val="false"/>
+                <w:sz w:val="19"/>
+                <w:szCs w:val="19"/>
+              </w:rPr>
+              <w:t xml:space="preserve">Nike, Fanatics, Tommy Hilfiger, Patagonia</w:t>
+            </w:r>
+          </w:p>
+        </w:tc>
+      </w:tr>
+      <w:tr>
+        <w:trPr>
+          <w:cantSplit/>
+        </w:trPr>
+        <w:tc>
+          <w:tcPr>
+            <w:tcW w:type="dxa" w:w="2200"/>
+            <w:tcBorders>
+              <w:top w:val="single" w:color="C9D1DC" w:sz="4"/>
+              <w:left w:val="single" w:color="C9D1DC" w:sz="4"/>
+              <w:bottom w:val="single" w:color="C9D1DC" w:sz="4"/>
+              <w:right w:val="single" w:color="C9D1DC" w:sz="4"/>
+            </w:tcBorders>
+            <w:shd w:fill="EEF2F7" w:color="auto" w:val="clear"/>
+            <w:tcMar>
+              <w:top w:type="dxa" w:w="80"/>
+              <w:left w:type="dxa" w:w="110"/>
+              <w:bottom w:type="dxa" w:w="80"/>
+              <w:right w:type="dxa" w:w="110"/>
+            </w:tcMar>
+          </w:tcPr>
+          <w:p>
+            <w:pPr>
+              <w:keepNext/>
+            </w:pPr>
+            <w:r>
+              <w:rPr>
+                <w:rFonts w:ascii="Calibri" w:cs="Calibri" w:eastAsia="Calibri" w:hAnsi="Calibri"/>
+                <w:b/>
+                <w:bCs/>
+                <w:sz w:val="19"/>
+                <w:szCs w:val="19"/>
+              </w:rPr>
+              <w:t xml:space="preserve">Ink Throwers de México</w:t>
+            </w:r>
+          </w:p>
+        </w:tc>
+        <w:tc>
+          <w:tcPr>
+            <w:tcW w:type="dxa" w:w="1500"/>
+            <w:tcBorders>
+              <w:top w:val="single" w:color="C9D1DC" w:sz="4"/>
+              <w:left w:val="single" w:color="C9D1DC" w:sz="4"/>
+              <w:bottom w:val="single" w:color="C9D1DC" w:sz="4"/>
+              <w:right w:val="single" w:color="C9D1DC" w:sz="4"/>
+            </w:tcBorders>
+            <w:shd w:fill="EEF2F7" w:color="auto" w:val="clear"/>
+            <w:tcMar>
+              <w:top w:type="dxa" w:w="80"/>
+              <w:left w:type="dxa" w:w="110"/>
+              <w:bottom w:type="dxa" w:w="80"/>
+              <w:right w:type="dxa" w:w="110"/>
+            </w:tcMar>
+          </w:tcPr>
+          <w:p>
+            <w:pPr>
+              <w:keepNext/>
+            </w:pPr>
+            <w:r>
+              <w:rPr>
+                <w:rFonts w:ascii="Calibri" w:cs="Calibri" w:eastAsia="Calibri" w:hAnsi="Calibri"/>
+                <w:b w:val="false"/>
+                <w:bCs w:val="false"/>
+                <w:sz w:val="19"/>
+                <w:szCs w:val="19"/>
+              </w:rPr>
+              <w:t xml:space="preserve">Tijuana, B.C.</w:t>
+            </w:r>
+          </w:p>
+        </w:tc>
+        <w:tc>
+          <w:tcPr>
+            <w:tcW w:type="dxa" w:w="3860"/>
+            <w:tcBorders>
+              <w:top w:val="single" w:color="C9D1DC" w:sz="4"/>
+              <w:left w:val="single" w:color="C9D1DC" w:sz="4"/>
+              <w:bottom w:val="single" w:color="C9D1DC" w:sz="4"/>
+              <w:right w:val="single" w:color="C9D1DC" w:sz="4"/>
+            </w:tcBorders>
+            <w:shd w:fill="EEF2F7" w:color="auto" w:val="clear"/>
+            <w:tcMar>
+              <w:top w:type="dxa" w:w="80"/>
+              <w:left w:type="dxa" w:w="110"/>
+              <w:bottom w:type="dxa" w:w="80"/>
+              <w:right w:type="dxa" w:w="110"/>
+            </w:tcMar>
+          </w:tcPr>
+          <w:p>
+            <w:pPr>
+              <w:keepNext/>
+            </w:pPr>
+            <w:r>
+              <w:rPr>
+                <w:rFonts w:ascii="Calibri" w:cs="Calibri" w:eastAsia="Calibri" w:hAnsi="Calibri"/>
+                <w:b w:val="false"/>
+                <w:bCs w:val="false"/>
+                <w:sz w:val="19"/>
+                <w:szCs w:val="19"/>
+              </w:rPr>
+              <w:t xml:space="preserve">Contract screen printing for retail and licensing: ~50,000 prints/day, ~538 workers</w:t>
+            </w:r>
+          </w:p>
+        </w:tc>
+        <w:tc>
+          <w:tcPr>
+            <w:tcW w:type="dxa" w:w="1800"/>
+            <w:tcBorders>
+              <w:top w:val="single" w:color="C9D1DC" w:sz="4"/>
+              <w:left w:val="single" w:color="C9D1DC" w:sz="4"/>
+              <w:bottom w:val="single" w:color="C9D1DC" w:sz="4"/>
+              <w:right w:val="single" w:color="C9D1DC" w:sz="4"/>
+            </w:tcBorders>
+            <w:shd w:fill="EEF2F7" w:color="auto" w:val="clear"/>
+            <w:tcMar>
+              <w:top w:type="dxa" w:w="80"/>
+              <w:left w:type="dxa" w:w="110"/>
+              <w:bottom w:type="dxa" w:w="80"/>
+              <w:right w:type="dxa" w:w="110"/>
+            </w:tcMar>
+          </w:tcPr>
+          <w:p>
+            <w:pPr>
+              <w:keepNext/>
+            </w:pPr>
+            <w:r>
+              <w:rPr>
+                <w:rFonts w:ascii="Calibri" w:cs="Calibri" w:eastAsia="Calibri" w:hAnsi="Calibri"/>
+                <w:b w:val="false"/>
+                <w:bCs w:val="false"/>
+                <w:sz w:val="19"/>
+                <w:szCs w:val="19"/>
+              </w:rPr>
+              <w:t xml:space="preserve">Disney, Levi's, Marvel</w:t>
+            </w:r>
+          </w:p>
+        </w:tc>
+      </w:tr>
+      <w:tr>
+        <w:trPr>
+          <w:cantSplit/>
+        </w:trPr>
+        <w:tc>
+          <w:tcPr>
+            <w:tcW w:type="dxa" w:w="2200"/>
+            <w:tcBorders>
+              <w:top w:val="single" w:color="C9D1DC" w:sz="4"/>
+              <w:left w:val="single" w:color="C9D1DC" w:sz="4"/>
+              <w:bottom w:val="single" w:color="C9D1DC" w:sz="4"/>
+              <w:right w:val="single" w:color="C9D1DC" w:sz="4"/>
+            </w:tcBorders>
+            <w:tcMar>
+              <w:top w:type="dxa" w:w="80"/>
+              <w:left w:type="dxa" w:w="110"/>
+              <w:bottom w:type="dxa" w:w="80"/>
+              <w:right w:type="dxa" w:w="110"/>
+            </w:tcMar>
+          </w:tcPr>
+          <w:p>
+            <w:pPr>
+              <w:keepNext/>
+            </w:pPr>
+            <w:r>
+              <w:rPr>
+                <w:rFonts w:ascii="Calibri" w:cs="Calibri" w:eastAsia="Calibri" w:hAnsi="Calibri"/>
+                <w:b/>
+                <w:bCs/>
+                <w:sz w:val="19"/>
+                <w:szCs w:val="19"/>
+              </w:rPr>
+              <w:t xml:space="preserve">MD International Baja</w:t>
+            </w:r>
+          </w:p>
+        </w:tc>
+        <w:tc>
+          <w:tcPr>
+            <w:tcW w:type="dxa" w:w="1500"/>
+            <w:tcBorders>
+              <w:top w:val="single" w:color="C9D1DC" w:sz="4"/>
+              <w:left w:val="single" w:color="C9D1DC" w:sz="4"/>
+              <w:bottom w:val="single" w:color="C9D1DC" w:sz="4"/>
+              <w:right w:val="single" w:color="C9D1DC" w:sz="4"/>
+            </w:tcBorders>
+            <w:tcMar>
+              <w:top w:type="dxa" w:w="80"/>
+              <w:left w:type="dxa" w:w="110"/>
+              <w:bottom w:type="dxa" w:w="80"/>
+              <w:right w:type="dxa" w:w="110"/>
+            </w:tcMar>
+          </w:tcPr>
+          <w:p>
+            <w:pPr>
+              <w:keepNext/>
+            </w:pPr>
+            <w:r>
+              <w:rPr>
+                <w:rFonts w:ascii="Calibri" w:cs="Calibri" w:eastAsia="Calibri" w:hAnsi="Calibri"/>
+                <w:b w:val="false"/>
+                <w:bCs w:val="false"/>
+                <w:sz w:val="19"/>
+                <w:szCs w:val="19"/>
+              </w:rPr>
+              <w:t xml:space="preserve">Ensenada, B.C.</w:t>
+            </w:r>
+          </w:p>
+        </w:tc>
+        <w:tc>
+          <w:tcPr>
+            <w:tcW w:type="dxa" w:w="3860"/>
+            <w:tcBorders>
+              <w:top w:val="single" w:color="C9D1DC" w:sz="4"/>
+              <w:left w:val="single" w:color="C9D1DC" w:sz="4"/>
+              <w:bottom w:val="single" w:color="C9D1DC" w:sz="4"/>
+              <w:right w:val="single" w:color="C9D1DC" w:sz="4"/>
+            </w:tcBorders>
+            <w:tcMar>
+              <w:top w:type="dxa" w:w="80"/>
+              <w:left w:type="dxa" w:w="110"/>
+              <w:bottom w:type="dxa" w:w="80"/>
+              <w:right w:type="dxa" w:w="110"/>
+            </w:tcMar>
+          </w:tcPr>
+          <w:p>
+            <w:pPr>
+              <w:keepNext/>
+            </w:pPr>
+            <w:r>
+              <w:rPr>
+                <w:rFonts w:ascii="Calibri" w:cs="Calibri" w:eastAsia="Calibri" w:hAnsi="Calibri"/>
+                <w:b w:val="false"/>
+                <w:bCs w:val="false"/>
+                <w:sz w:val="19"/>
+                <w:szCs w:val="19"/>
+              </w:rPr>
+              <w:t xml:space="preserve">Mass printing and sewing; 1,200–1,300 workers</w:t>
+            </w:r>
+          </w:p>
+        </w:tc>
+        <w:tc>
+          <w:tcPr>
+            <w:tcW w:type="dxa" w:w="1800"/>
+            <w:tcBorders>
+              <w:top w:val="single" w:color="C9D1DC" w:sz="4"/>
+              <w:left w:val="single" w:color="C9D1DC" w:sz="4"/>
+              <w:bottom w:val="single" w:color="C9D1DC" w:sz="4"/>
+              <w:right w:val="single" w:color="C9D1DC" w:sz="4"/>
+            </w:tcBorders>
+            <w:tcMar>
+              <w:top w:type="dxa" w:w="80"/>
+              <w:left w:type="dxa" w:w="110"/>
+              <w:bottom w:type="dxa" w:w="80"/>
+              <w:right w:type="dxa" w:w="110"/>
+            </w:tcMar>
+          </w:tcPr>
+          <w:p>
+            <w:pPr>
+              <w:keepNext/>
+            </w:pPr>
+            <w:r>
+              <w:rPr>
+                <w:rFonts w:ascii="Calibri" w:cs="Calibri" w:eastAsia="Calibri" w:hAnsi="Calibri"/>
+                <w:b w:val="false"/>
+                <w:bCs w:val="false"/>
+                <w:sz w:val="19"/>
+                <w:szCs w:val="19"/>
+              </w:rPr>
+              <w:t xml:space="preserve">Fanatics, Hurley, REI</w:t>
+            </w:r>
+          </w:p>
+        </w:tc>
+      </w:tr>
+      <w:tr>
+        <w:trPr>
+          <w:cantSplit/>
+        </w:trPr>
+        <w:tc>
+          <w:tcPr>
+            <w:tcW w:type="dxa" w:w="2200"/>
+            <w:tcBorders>
+              <w:top w:val="single" w:color="C9D1DC" w:sz="4"/>
+              <w:left w:val="single" w:color="C9D1DC" w:sz="4"/>
+              <w:bottom w:val="single" w:color="C9D1DC" w:sz="4"/>
+              <w:right w:val="single" w:color="C9D1DC" w:sz="4"/>
+            </w:tcBorders>
+            <w:shd w:fill="EEF2F7" w:color="auto" w:val="clear"/>
+            <w:tcMar>
+              <w:top w:type="dxa" w:w="80"/>
+              <w:left w:type="dxa" w:w="110"/>
+              <w:bottom w:type="dxa" w:w="80"/>
+              <w:right w:type="dxa" w:w="110"/>
+            </w:tcMar>
+          </w:tcPr>
+          <w:p>
+            <w:pPr>
+              <w:keepNext/>
+            </w:pPr>
+            <w:r>
+              <w:rPr>
+                <w:rFonts w:ascii="Calibri" w:cs="Calibri" w:eastAsia="Calibri" w:hAnsi="Calibri"/>
+                <w:b/>
+                <w:bCs/>
+                <w:sz w:val="19"/>
+                <w:szCs w:val="19"/>
+              </w:rPr>
+              <w:t xml:space="preserve">Fortune Fashions Baja (Mad Engine)</w:t>
+            </w:r>
+          </w:p>
+        </w:tc>
+        <w:tc>
+          <w:tcPr>
+            <w:tcW w:type="dxa" w:w="1500"/>
+            <w:tcBorders>
+              <w:top w:val="single" w:color="C9D1DC" w:sz="4"/>
+              <w:left w:val="single" w:color="C9D1DC" w:sz="4"/>
+              <w:bottom w:val="single" w:color="C9D1DC" w:sz="4"/>
+              <w:right w:val="single" w:color="C9D1DC" w:sz="4"/>
+            </w:tcBorders>
+            <w:shd w:fill="EEF2F7" w:color="auto" w:val="clear"/>
+            <w:tcMar>
+              <w:top w:type="dxa" w:w="80"/>
+              <w:left w:type="dxa" w:w="110"/>
+              <w:bottom w:type="dxa" w:w="80"/>
+              <w:right w:type="dxa" w:w="110"/>
+            </w:tcMar>
+          </w:tcPr>
+          <w:p>
+            <w:pPr>
+              <w:keepNext/>
+            </w:pPr>
+            <w:r>
+              <w:rPr>
+                <w:rFonts w:ascii="Calibri" w:cs="Calibri" w:eastAsia="Calibri" w:hAnsi="Calibri"/>
+                <w:b w:val="false"/>
+                <w:bCs w:val="false"/>
+                <w:sz w:val="19"/>
+                <w:szCs w:val="19"/>
+              </w:rPr>
+              <w:t xml:space="preserve">Ensenada, B.C.</w:t>
+            </w:r>
+          </w:p>
+        </w:tc>
+        <w:tc>
+          <w:tcPr>
+            <w:tcW w:type="dxa" w:w="3860"/>
+            <w:tcBorders>
+              <w:top w:val="single" w:color="C9D1DC" w:sz="4"/>
+              <w:left w:val="single" w:color="C9D1DC" w:sz="4"/>
+              <w:bottom w:val="single" w:color="C9D1DC" w:sz="4"/>
+              <w:right w:val="single" w:color="C9D1DC" w:sz="4"/>
+            </w:tcBorders>
+            <w:shd w:fill="EEF2F7" w:color="auto" w:val="clear"/>
+            <w:tcMar>
+              <w:top w:type="dxa" w:w="80"/>
+              <w:left w:type="dxa" w:w="110"/>
+              <w:bottom w:type="dxa" w:w="80"/>
+              <w:right w:type="dxa" w:w="110"/>
+            </w:tcMar>
+          </w:tcPr>
+          <w:p>
+            <w:pPr>
+              <w:keepNext/>
+            </w:pPr>
+            <w:r>
+              <w:rPr>
+                <w:rFonts w:ascii="Calibri" w:cs="Calibri" w:eastAsia="Calibri" w:hAnsi="Calibri"/>
+                <w:b w:val="false"/>
+                <w:bCs w:val="false"/>
+                <w:sz w:val="19"/>
+                <w:szCs w:val="19"/>
+              </w:rPr>
+              <w:t xml:space="preserve">Screen printing plant for licensed T-shirts for U.S. retail</w:t>
+            </w:r>
+          </w:p>
+        </w:tc>
+        <w:tc>
+          <w:tcPr>
+            <w:tcW w:type="dxa" w:w="1800"/>
+            <w:tcBorders>
+              <w:top w:val="single" w:color="C9D1DC" w:sz="4"/>
+              <w:left w:val="single" w:color="C9D1DC" w:sz="4"/>
+              <w:bottom w:val="single" w:color="C9D1DC" w:sz="4"/>
+              <w:right w:val="single" w:color="C9D1DC" w:sz="4"/>
+            </w:tcBorders>
+            <w:shd w:fill="EEF2F7" w:color="auto" w:val="clear"/>
+            <w:tcMar>
+              <w:top w:type="dxa" w:w="80"/>
+              <w:left w:type="dxa" w:w="110"/>
+              <w:bottom w:type="dxa" w:w="80"/>
+              <w:right w:type="dxa" w:w="110"/>
+            </w:tcMar>
+          </w:tcPr>
+          <w:p>
+            <w:pPr>
+              <w:keepNext/>
+            </w:pPr>
+            <w:r>
+              <w:rPr>
+                <w:rFonts w:ascii="Calibri" w:cs="Calibri" w:eastAsia="Calibri" w:hAnsi="Calibri"/>
+                <w:b w:val="false"/>
+                <w:bCs w:val="false"/>
+                <w:sz w:val="19"/>
+                <w:szCs w:val="19"/>
+              </w:rPr>
+              <w:t xml:space="preserve">Mad Engine Global, Disney</w:t>
+            </w:r>
+          </w:p>
+        </w:tc>
+      </w:tr>
+      <w:tr>
+        <w:trPr>
+          <w:cantSplit/>
+        </w:trPr>
+        <w:tc>
+          <w:tcPr>
+            <w:tcW w:type="dxa" w:w="2200"/>
+            <w:tcBorders>
+              <w:top w:val="single" w:color="C9D1DC" w:sz="4"/>
+              <w:left w:val="single" w:color="C9D1DC" w:sz="4"/>
+              <w:bottom w:val="single" w:color="C9D1DC" w:sz="4"/>
+              <w:right w:val="single" w:color="C9D1DC" w:sz="4"/>
+            </w:tcBorders>
+            <w:tcMar>
+              <w:top w:type="dxa" w:w="80"/>
+              <w:left w:type="dxa" w:w="110"/>
+              <w:bottom w:type="dxa" w:w="80"/>
+              <w:right w:type="dxa" w:w="110"/>
+            </w:tcMar>
+          </w:tcPr>
+          <w:p>
+            <w:pPr>
+              <w:keepNext/>
+            </w:pPr>
+            <w:r>
+              <w:rPr>
+                <w:rFonts w:ascii="Calibri" w:cs="Calibri" w:eastAsia="Calibri" w:hAnsi="Calibri"/>
+                <w:b/>
+                <w:bCs/>
+                <w:sz w:val="19"/>
+                <w:szCs w:val="19"/>
+              </w:rPr>
+              <w:t xml:space="preserve">SOIR Textiles (TJ Factory Clothing)</w:t>
+            </w:r>
+          </w:p>
+        </w:tc>
+        <w:tc>
+          <w:tcPr>
+            <w:tcW w:type="dxa" w:w="1500"/>
+            <w:tcBorders>
+              <w:top w:val="single" w:color="C9D1DC" w:sz="4"/>
+              <w:left w:val="single" w:color="C9D1DC" w:sz="4"/>
+              <w:bottom w:val="single" w:color="C9D1DC" w:sz="4"/>
+              <w:right w:val="single" w:color="C9D1DC" w:sz="4"/>
+            </w:tcBorders>
+            <w:tcMar>
+              <w:top w:type="dxa" w:w="80"/>
+              <w:left w:type="dxa" w:w="110"/>
+              <w:bottom w:type="dxa" w:w="80"/>
+              <w:right w:type="dxa" w:w="110"/>
+            </w:tcMar>
+          </w:tcPr>
+          <w:p>
+            <w:pPr>
+              <w:keepNext/>
+            </w:pPr>
+            <w:r>
+              <w:rPr>
+                <w:rFonts w:ascii="Calibri" w:cs="Calibri" w:eastAsia="Calibri" w:hAnsi="Calibri"/>
+                <w:b w:val="false"/>
+                <w:bCs w:val="false"/>
+                <w:sz w:val="19"/>
+                <w:szCs w:val="19"/>
+              </w:rPr>
+              <w:t xml:space="preserve">Ensenada, B.C.</w:t>
+            </w:r>
+          </w:p>
+        </w:tc>
+        <w:tc>
+          <w:tcPr>
+            <w:tcW w:type="dxa" w:w="3860"/>
+            <w:tcBorders>
+              <w:top w:val="single" w:color="C9D1DC" w:sz="4"/>
+              <w:left w:val="single" w:color="C9D1DC" w:sz="4"/>
+              <w:bottom w:val="single" w:color="C9D1DC" w:sz="4"/>
+              <w:right w:val="single" w:color="C9D1DC" w:sz="4"/>
+            </w:tcBorders>
+            <w:tcMar>
+              <w:top w:type="dxa" w:w="80"/>
+              <w:left w:type="dxa" w:w="110"/>
+              <w:bottom w:type="dxa" w:w="80"/>
+              <w:right w:type="dxa" w:w="110"/>
+            </w:tcMar>
+          </w:tcPr>
+          <w:p>
+            <w:pPr>
+              <w:keepNext/>
+            </w:pPr>
+            <w:r>
+              <w:rPr>
+                <w:rFonts w:ascii="Calibri" w:cs="Calibri" w:eastAsia="Calibri" w:hAnsi="Calibri"/>
+                <w:b w:val="false"/>
+                <w:bCs w:val="false"/>
+                <w:sz w:val="19"/>
+                <w:szCs w:val="19"/>
+              </w:rPr>
+              <w:t xml:space="preserve">Garment printing, flatbed screen printing and dyeing in two plants</w:t>
+            </w:r>
+          </w:p>
+        </w:tc>
+        <w:tc>
+          <w:tcPr>
+            <w:tcW w:type="dxa" w:w="1800"/>
+            <w:tcBorders>
+              <w:top w:val="single" w:color="C9D1DC" w:sz="4"/>
+              <w:left w:val="single" w:color="C9D1DC" w:sz="4"/>
+              <w:bottom w:val="single" w:color="C9D1DC" w:sz="4"/>
+              <w:right w:val="single" w:color="C9D1DC" w:sz="4"/>
+            </w:tcBorders>
+            <w:tcMar>
+              <w:top w:type="dxa" w:w="80"/>
+              <w:left w:type="dxa" w:w="110"/>
+              <w:bottom w:type="dxa" w:w="80"/>
+              <w:right w:type="dxa" w:w="110"/>
+            </w:tcMar>
+          </w:tcPr>
+          <w:p>
+            <w:pPr>
+              <w:keepNext/>
+            </w:pPr>
+            <w:r>
+              <w:rPr>
+                <w:rFonts w:ascii="Calibri" w:cs="Calibri" w:eastAsia="Calibri" w:hAnsi="Calibri"/>
+                <w:b w:val="false"/>
+                <w:bCs w:val="false"/>
+                <w:sz w:val="19"/>
+                <w:szCs w:val="19"/>
+              </w:rPr>
+              <w:t xml:space="preserve">Columbia, Disney</w:t>
+            </w:r>
+          </w:p>
+        </w:tc>
+      </w:tr>
+      <w:tr>
+        <w:trPr>
+          <w:cantSplit/>
+        </w:trPr>
+        <w:tc>
+          <w:tcPr>
+            <w:tcW w:type="dxa" w:w="2200"/>
+            <w:tcBorders>
+              <w:top w:val="single" w:color="C9D1DC" w:sz="4"/>
+              <w:left w:val="single" w:color="C9D1DC" w:sz="4"/>
+              <w:bottom w:val="single" w:color="C9D1DC" w:sz="4"/>
+              <w:right w:val="single" w:color="C9D1DC" w:sz="4"/>
+            </w:tcBorders>
+            <w:shd w:fill="EEF2F7" w:color="auto" w:val="clear"/>
+            <w:tcMar>
+              <w:top w:type="dxa" w:w="80"/>
+              <w:left w:type="dxa" w:w="110"/>
+              <w:bottom w:type="dxa" w:w="80"/>
+              <w:right w:type="dxa" w:w="110"/>
+            </w:tcMar>
+          </w:tcPr>
+          <w:p>
+            <w:pPr>
+              <w:keepNext/>
+            </w:pPr>
+            <w:r>
+              <w:rPr>
+                <w:rFonts w:ascii="Calibri" w:cs="Calibri" w:eastAsia="Calibri" w:hAnsi="Calibri"/>
+                <w:b/>
+                <w:bCs/>
+                <w:sz w:val="19"/>
+                <w:szCs w:val="19"/>
+              </w:rPr>
+              <w:t xml:space="preserve">Factory 1 (Factory1 Group)</w:t>
+            </w:r>
+          </w:p>
+        </w:tc>
+        <w:tc>
+          <w:tcPr>
+            <w:tcW w:type="dxa" w:w="1500"/>
+            <w:tcBorders>
+              <w:top w:val="single" w:color="C9D1DC" w:sz="4"/>
+              <w:left w:val="single" w:color="C9D1DC" w:sz="4"/>
+              <w:bottom w:val="single" w:color="C9D1DC" w:sz="4"/>
+              <w:right w:val="single" w:color="C9D1DC" w:sz="4"/>
+            </w:tcBorders>
+            <w:shd w:fill="EEF2F7" w:color="auto" w:val="clear"/>
+            <w:tcMar>
+              <w:top w:type="dxa" w:w="80"/>
+              <w:left w:type="dxa" w:w="110"/>
+              <w:bottom w:type="dxa" w:w="80"/>
+              <w:right w:type="dxa" w:w="110"/>
+            </w:tcMar>
+          </w:tcPr>
+          <w:p>
+            <w:pPr>
+              <w:keepNext/>
+            </w:pPr>
+            <w:r>
+              <w:rPr>
+                <w:rFonts w:ascii="Calibri" w:cs="Calibri" w:eastAsia="Calibri" w:hAnsi="Calibri"/>
+                <w:b w:val="false"/>
+                <w:bCs w:val="false"/>
+                <w:sz w:val="19"/>
+                <w:szCs w:val="19"/>
+              </w:rPr>
+              <w:t xml:space="preserve">Ensenada, B.C.</w:t>
+            </w:r>
+          </w:p>
+        </w:tc>
+        <w:tc>
+          <w:tcPr>
+            <w:tcW w:type="dxa" w:w="3860"/>
+            <w:tcBorders>
+              <w:top w:val="single" w:color="C9D1DC" w:sz="4"/>
+              <w:left w:val="single" w:color="C9D1DC" w:sz="4"/>
+              <w:bottom w:val="single" w:color="C9D1DC" w:sz="4"/>
+              <w:right w:val="single" w:color="C9D1DC" w:sz="4"/>
+            </w:tcBorders>
+            <w:shd w:fill="EEF2F7" w:color="auto" w:val="clear"/>
+            <w:tcMar>
+              <w:top w:type="dxa" w:w="80"/>
+              <w:left w:type="dxa" w:w="110"/>
+              <w:bottom w:type="dxa" w:w="80"/>
+              <w:right w:type="dxa" w:w="110"/>
+            </w:tcMar>
+          </w:tcPr>
+          <w:p>
+            <w:pPr>
+              <w:keepNext/>
+            </w:pPr>
+            <w:r>
+              <w:rPr>
+                <w:rFonts w:ascii="Calibri" w:cs="Calibri" w:eastAsia="Calibri" w:hAnsi="Calibri"/>
+                <w:b w:val="false"/>
+                <w:bCs w:val="false"/>
+                <w:sz w:val="19"/>
+                <w:szCs w:val="19"/>
+              </w:rPr>
+              <w:t xml:space="preserve">Full package with flatbed screen printing, dyeing and washing; 702 workers</w:t>
+            </w:r>
+          </w:p>
+        </w:tc>
+        <w:tc>
+          <w:tcPr>
+            <w:tcW w:type="dxa" w:w="1800"/>
+            <w:tcBorders>
+              <w:top w:val="single" w:color="C9D1DC" w:sz="4"/>
+              <w:left w:val="single" w:color="C9D1DC" w:sz="4"/>
+              <w:bottom w:val="single" w:color="C9D1DC" w:sz="4"/>
+              <w:right w:val="single" w:color="C9D1DC" w:sz="4"/>
+            </w:tcBorders>
+            <w:shd w:fill="EEF2F7" w:color="auto" w:val="clear"/>
+            <w:tcMar>
+              <w:top w:type="dxa" w:w="80"/>
+              <w:left w:type="dxa" w:w="110"/>
+              <w:bottom w:type="dxa" w:w="80"/>
+              <w:right w:type="dxa" w:w="110"/>
+            </w:tcMar>
+          </w:tcPr>
+          <w:p>
+            <w:pPr>
+              <w:keepNext/>
+            </w:pPr>
+            <w:r>
+              <w:rPr>
+                <w:rFonts w:ascii="Calibri" w:cs="Calibri" w:eastAsia="Calibri" w:hAnsi="Calibri"/>
+                <w:b w:val="false"/>
+                <w:bCs w:val="false"/>
+                <w:sz w:val="19"/>
+                <w:szCs w:val="19"/>
+              </w:rPr>
+              <w:t xml:space="preserve">Columbia, Disney</w:t>
+            </w:r>
+          </w:p>
+        </w:tc>
+      </w:tr>
+      <w:tr>
+        <w:trPr>
+          <w:cantSplit/>
+        </w:trPr>
+        <w:tc>
+          <w:tcPr>
+            <w:tcW w:type="dxa" w:w="2200"/>
+            <w:tcBorders>
+              <w:top w:val="single" w:color="C9D1DC" w:sz="4"/>
+              <w:left w:val="single" w:color="C9D1DC" w:sz="4"/>
+              <w:bottom w:val="single" w:color="C9D1DC" w:sz="4"/>
+              <w:right w:val="single" w:color="C9D1DC" w:sz="4"/>
+            </w:tcBorders>
+            <w:tcMar>
+              <w:top w:type="dxa" w:w="80"/>
+              <w:left w:type="dxa" w:w="110"/>
+              <w:bottom w:type="dxa" w:w="80"/>
+              <w:right w:type="dxa" w:w="110"/>
+            </w:tcMar>
+          </w:tcPr>
+          <w:p>
+            <w:pPr>
+              <w:keepNext/>
+            </w:pPr>
+            <w:r>
+              <w:rPr>
+                <w:rFonts w:ascii="Calibri" w:cs="Calibri" w:eastAsia="Calibri" w:hAnsi="Calibri"/>
+                <w:b/>
+                <w:bCs/>
+                <w:sz w:val="19"/>
+                <w:szCs w:val="19"/>
+              </w:rPr>
+              <w:t xml:space="preserve">Codipsa (San Fernando ScreenPrinting)</w:t>
+            </w:r>
+          </w:p>
+        </w:tc>
+        <w:tc>
+          <w:tcPr>
+            <w:tcW w:type="dxa" w:w="1500"/>
+            <w:tcBorders>
+              <w:top w:val="single" w:color="C9D1DC" w:sz="4"/>
+              <w:left w:val="single" w:color="C9D1DC" w:sz="4"/>
+              <w:bottom w:val="single" w:color="C9D1DC" w:sz="4"/>
+              <w:right w:val="single" w:color="C9D1DC" w:sz="4"/>
+            </w:tcBorders>
+            <w:tcMar>
+              <w:top w:type="dxa" w:w="80"/>
+              <w:left w:type="dxa" w:w="110"/>
+              <w:bottom w:type="dxa" w:w="80"/>
+              <w:right w:type="dxa" w:w="110"/>
+            </w:tcMar>
+          </w:tcPr>
+          <w:p>
+            <w:pPr>
+              <w:keepNext/>
+            </w:pPr>
+            <w:r>
+              <w:rPr>
+                <w:rFonts w:ascii="Calibri" w:cs="Calibri" w:eastAsia="Calibri" w:hAnsi="Calibri"/>
+                <w:b w:val="false"/>
+                <w:bCs w:val="false"/>
+                <w:sz w:val="19"/>
+                <w:szCs w:val="19"/>
+              </w:rPr>
+              <w:t xml:space="preserve">Puebla, Pue.</w:t>
+            </w:r>
+          </w:p>
+        </w:tc>
+        <w:tc>
+          <w:tcPr>
+            <w:tcW w:type="dxa" w:w="3860"/>
+            <w:tcBorders>
+              <w:top w:val="single" w:color="C9D1DC" w:sz="4"/>
+              <w:left w:val="single" w:color="C9D1DC" w:sz="4"/>
+              <w:bottom w:val="single" w:color="C9D1DC" w:sz="4"/>
+              <w:right w:val="single" w:color="C9D1DC" w:sz="4"/>
+            </w:tcBorders>
+            <w:tcMar>
+              <w:top w:type="dxa" w:w="80"/>
+              <w:left w:type="dxa" w:w="110"/>
+              <w:bottom w:type="dxa" w:w="80"/>
+              <w:right w:type="dxa" w:w="110"/>
+            </w:tcMar>
+          </w:tcPr>
+          <w:p>
+            <w:pPr>
+              <w:keepNext/>
+            </w:pPr>
+            <w:r>
+              <w:rPr>
+                <w:rFonts w:ascii="Calibri" w:cs="Calibri" w:eastAsia="Calibri" w:hAnsi="Calibri"/>
+                <w:b w:val="false"/>
+                <w:bCs w:val="false"/>
+                <w:sz w:val="19"/>
+                <w:szCs w:val="19"/>
+              </w:rPr>
+              <w:t xml:space="preserve">Vertical knit (knitting, dyeing, finishing, printing) for fast fashion; 35+ years exporting</w:t>
+            </w:r>
+          </w:p>
+        </w:tc>
+        <w:tc>
+          <w:tcPr>
+            <w:tcW w:type="dxa" w:w="1800"/>
+            <w:tcBorders>
+              <w:top w:val="single" w:color="C9D1DC" w:sz="4"/>
+              <w:left w:val="single" w:color="C9D1DC" w:sz="4"/>
+              <w:bottom w:val="single" w:color="C9D1DC" w:sz="4"/>
+              <w:right w:val="single" w:color="C9D1DC" w:sz="4"/>
+            </w:tcBorders>
+            <w:tcMar>
+              <w:top w:type="dxa" w:w="80"/>
+              <w:left w:type="dxa" w:w="110"/>
+              <w:bottom w:type="dxa" w:w="80"/>
+              <w:right w:type="dxa" w:w="110"/>
+            </w:tcMar>
+          </w:tcPr>
+          <w:p>
+            <w:pPr>
+              <w:keepNext/>
+            </w:pPr>
+            <w:r>
+              <w:rPr>
+                <w:rFonts w:ascii="Calibri" w:cs="Calibri" w:eastAsia="Calibri" w:hAnsi="Calibri"/>
+                <w:b w:val="false"/>
+                <w:bCs w:val="false"/>
+                <w:sz w:val="19"/>
+                <w:szCs w:val="19"/>
+              </w:rPr>
+              <w:t xml:space="preserve">Puma, Gap, Hot Topic, Macy's, Disney</w:t>
+            </w:r>
+          </w:p>
+        </w:tc>
+      </w:tr>
+      <w:tr>
+        <w:trPr>
+          <w:cantSplit/>
+        </w:trPr>
+        <w:tc>
+          <w:tcPr>
+            <w:tcW w:type="dxa" w:w="2200"/>
+            <w:tcBorders>
+              <w:top w:val="single" w:color="C9D1DC" w:sz="4"/>
+              <w:left w:val="single" w:color="C9D1DC" w:sz="4"/>
+              <w:bottom w:val="single" w:color="C9D1DC" w:sz="4"/>
+              <w:right w:val="single" w:color="C9D1DC" w:sz="4"/>
+            </w:tcBorders>
+            <w:shd w:fill="EEF2F7" w:color="auto" w:val="clear"/>
+            <w:tcMar>
+              <w:top w:type="dxa" w:w="80"/>
+              <w:left w:type="dxa" w:w="110"/>
+              <w:bottom w:type="dxa" w:w="80"/>
+              <w:right w:type="dxa" w:w="110"/>
+            </w:tcMar>
+          </w:tcPr>
+          <w:p>
+            <w:pPr>
+              <w:keepNext w:val="false"/>
+            </w:pPr>
+            <w:r>
+              <w:rPr>
+                <w:rFonts w:ascii="Calibri" w:cs="Calibri" w:eastAsia="Calibri" w:hAnsi="Calibri"/>
+                <w:b/>
+                <w:bCs/>
+                <w:sz w:val="19"/>
+                <w:szCs w:val="19"/>
+              </w:rPr>
+              <w:t xml:space="preserve">RMC de México</w:t>
+            </w:r>
+          </w:p>
+        </w:tc>
+        <w:tc>
+          <w:tcPr>
+            <w:tcW w:type="dxa" w:w="1500"/>
+            <w:tcBorders>
+              <w:top w:val="single" w:color="C9D1DC" w:sz="4"/>
+              <w:left w:val="single" w:color="C9D1DC" w:sz="4"/>
+              <w:bottom w:val="single" w:color="C9D1DC" w:sz="4"/>
+              <w:right w:val="single" w:color="C9D1DC" w:sz="4"/>
+            </w:tcBorders>
+            <w:shd w:fill="EEF2F7" w:color="auto" w:val="clear"/>
+            <w:tcMar>
+              <w:top w:type="dxa" w:w="80"/>
+              <w:left w:type="dxa" w:w="110"/>
+              <w:bottom w:type="dxa" w:w="80"/>
+              <w:right w:type="dxa" w:w="110"/>
+            </w:tcMar>
+          </w:tcPr>
+          <w:p>
+            <w:pPr>
+              <w:keepNext w:val="false"/>
+            </w:pPr>
+            <w:r>
+              <w:rPr>
+                <w:rFonts w:ascii="Calibri" w:cs="Calibri" w:eastAsia="Calibri" w:hAnsi="Calibri"/>
+                <w:b w:val="false"/>
+                <w:bCs w:val="false"/>
+                <w:sz w:val="19"/>
+                <w:szCs w:val="19"/>
+              </w:rPr>
+              <w:t xml:space="preserve">Linares, N.L.</w:t>
+            </w:r>
+          </w:p>
+        </w:tc>
+        <w:tc>
+          <w:tcPr>
+            <w:tcW w:type="dxa" w:w="3860"/>
+            <w:tcBorders>
+              <w:top w:val="single" w:color="C9D1DC" w:sz="4"/>
+              <w:left w:val="single" w:color="C9D1DC" w:sz="4"/>
+              <w:bottom w:val="single" w:color="C9D1DC" w:sz="4"/>
+              <w:right w:val="single" w:color="C9D1DC" w:sz="4"/>
+            </w:tcBorders>
+            <w:shd w:fill="EEF2F7" w:color="auto" w:val="clear"/>
+            <w:tcMar>
+              <w:top w:type="dxa" w:w="80"/>
+              <w:left w:type="dxa" w:w="110"/>
+              <w:bottom w:type="dxa" w:w="80"/>
+              <w:right w:type="dxa" w:w="110"/>
+            </w:tcMar>
+          </w:tcPr>
+          <w:p>
+            <w:pPr>
+              <w:keepNext w:val="false"/>
+            </w:pPr>
+            <w:r>
+              <w:rPr>
+                <w:rFonts w:ascii="Calibri" w:cs="Calibri" w:eastAsia="Calibri" w:hAnsi="Calibri"/>
+                <w:b w:val="false"/>
+                <w:bCs w:val="false"/>
+                <w:sz w:val="19"/>
+                <w:szCs w:val="19"/>
+              </w:rPr>
+              <w:t xml:space="preserve">Vertical plant with printing, sublimation, embroidery, cut and sew; 336 workers</w:t>
+            </w:r>
+          </w:p>
+        </w:tc>
+        <w:tc>
+          <w:tcPr>
+            <w:tcW w:type="dxa" w:w="1800"/>
+            <w:tcBorders>
+              <w:top w:val="single" w:color="C9D1DC" w:sz="4"/>
+              <w:left w:val="single" w:color="C9D1DC" w:sz="4"/>
+              <w:bottom w:val="single" w:color="C9D1DC" w:sz="4"/>
+              <w:right w:val="single" w:color="C9D1DC" w:sz="4"/>
+            </w:tcBorders>
+            <w:shd w:fill="EEF2F7" w:color="auto" w:val="clear"/>
+            <w:tcMar>
+              <w:top w:type="dxa" w:w="80"/>
+              <w:left w:type="dxa" w:w="110"/>
+              <w:bottom w:type="dxa" w:w="80"/>
+              <w:right w:type="dxa" w:w="110"/>
+            </w:tcMar>
+          </w:tcPr>
+          <w:p>
+            <w:pPr>
+              <w:keepNext w:val="false"/>
+            </w:pPr>
+            <w:r>
+              <w:rPr>
+                <w:rFonts w:ascii="Calibri" w:cs="Calibri" w:eastAsia="Calibri" w:hAnsi="Calibri"/>
+                <w:b w:val="false"/>
+                <w:bCs w:val="false"/>
+                <w:sz w:val="19"/>
+                <w:szCs w:val="19"/>
+              </w:rPr>
+              <w:t xml:space="preserve">Under Armour, Nordstrom</w:t>
+            </w:r>
+          </w:p>
+        </w:tc>
+      </w:tr>
+    </w:tbl>
+    <w:p>
+      <w:pPr>
+        <w:spacing w:after="120"/>
+      </w:pPr>
+    </w:p>
+    <w:p>
+      <w:pPr>
+        <w:spacing w:after="160"/>
+      </w:pPr>
+      <w:r>
+        <w:t xml:space="preserve">Next tier (OEM): Grumax / BEX Bordados y Estampados (Xalapa), California Cutting &amp; Sewing (Puebla), Confecciones Clabeck / JHK (Tlalnepantla; audited by Inditex and C&amp;A), Private Label Tehuacán (PVH, J.Crew, L.L.Bean), Industrias Manufactureras MYR (adidas, Puma; Mexico national team jerseys), Augusta Sportswear de México (Fanatics), Zentrix (Nike, Lululemon) and Baja Skiva Screen Printing (Disney).</w:t>
+      </w:r>
+    </w:p>
+    <w:p>
+      <w:pPr>
+        <w:spacing w:after="200" w:before="80"/>
+      </w:pPr>
+      <w:r>
+        <w:rPr>
+          <w:i/>
+          <w:iCs/>
+          <w:color w:val="555555"/>
+          <w:sz w:val="18"/>
+          <w:szCs w:val="18"/>
+        </w:rPr>
+        <w:t xml:space="preserve">Sources: company websites, Open Supply Hub and industry directories. Brands and customers per public sources; to be confirmed at the first visit.</w:t>
       </w:r>
     </w:p>
     <w:p>
@@ -11490,7 +14274,7 @@
         <w:spacing w:after="160"/>
       </w:pPr>
       <w:r>
-        <w:t xml:space="preserve">Photos taken by the TID / VSP team at CLT’s PRINTING United 2026 booth (Las Vegas) and of CLT production samples.</w:t>
+        <w:t xml:space="preserve">Photos of CLT’s PRINTING United 2026 booth (Las Vegas), taken by VSP Printing during its meeting with CLT, and of CLT production samples.</w:t>
       </w:r>
     </w:p>
     <w:tbl>

</xml_diff>

<commit_message>
Agrega FODA de la competencia en tintas y consumibles
- Tabla de competidores en tintas (Avient, Grupo Sánchez/ScreenTec, Matsui, International Coatings, Marabu, RUCO, Tampoprint, marcas económicas y proveedores chinos) con precios públicos de referencia
- FODA por competidor y FODA de nuestra posición en Word/PDF y PowerPoint ES/EN

Co-Authored-By: Claude Opus 5.5 <noreply@anthropic.com>
Claude-Session: https://claude.ai/code/session_012axCVDM5kAgj1VFnxhpsuM
</commit_message>
<xml_diff>
--- a/propuesta-clt/CLT_Distribution_Proposal_Mexico_EN.docx
+++ b/propuesta-clt/CLT_Distribution_Proposal_Mexico_EN.docx
@@ -7925,7 +7925,7 @@
                 <w:sz w:val="19"/>
                 <w:szCs w:val="19"/>
               </w:rPr>
-              <w:t xml:space="preserve">ScreenTec (Siltex) and local distributors</w:t>
+              <w:t xml:space="preserve">ScreenTec (Siltex), Avient (Wilflex, Rutland), Matsui and budget brands</w:t>
             </w:r>
           </w:p>
         </w:tc>
@@ -8069,6 +8069,3116 @@
       <w:pPr>
         <w:spacing w:after="120"/>
       </w:pPr>
+    </w:p>
+    <w:p>
+      <w:pPr>
+        <w:pStyle w:val="Heading2"/>
+      </w:pPr>
+      <w:r>
+        <w:t xml:space="preserve">Competitors in inks, pastes and silicones</w:t>
+      </w:r>
+    </w:p>
+    <w:tbl>
+      <w:tblPr>
+        <w:tblW w:type="dxa" w:w="9360"/>
+        <w:tblBorders>
+          <w:top w:val="single" w:color="auto" w:sz="4"/>
+          <w:left w:val="single" w:color="auto" w:sz="4"/>
+          <w:bottom w:val="single" w:color="auto" w:sz="4"/>
+          <w:right w:val="single" w:color="auto" w:sz="4"/>
+          <w:insideH w:val="single" w:color="auto" w:sz="4"/>
+          <w:insideV w:val="single" w:color="auto" w:sz="4"/>
+        </w:tblBorders>
+      </w:tblPr>
+      <w:tblGrid>
+        <w:gridCol w:w="2500"/>
+        <w:gridCol w:w="2500"/>
+        <w:gridCol w:w="2700"/>
+        <w:gridCol w:w="1660"/>
+      </w:tblGrid>
+      <w:tr>
+        <w:trPr>
+          <w:cantSplit/>
+          <w:tblHeader/>
+        </w:trPr>
+        <w:tc>
+          <w:tcPr>
+            <w:tcW w:type="dxa" w:w="2500"/>
+            <w:tcBorders>
+              <w:top w:val="single" w:color="C9D1DC" w:sz="4"/>
+              <w:left w:val="single" w:color="C9D1DC" w:sz="4"/>
+              <w:bottom w:val="single" w:color="C9D1DC" w:sz="4"/>
+              <w:right w:val="single" w:color="C9D1DC" w:sz="4"/>
+            </w:tcBorders>
+            <w:shd w:fill="1B1F3B" w:color="auto" w:val="clear"/>
+            <w:tcMar>
+              <w:top w:type="dxa" w:w="80"/>
+              <w:left w:type="dxa" w:w="110"/>
+              <w:bottom w:type="dxa" w:w="80"/>
+              <w:right w:type="dxa" w:w="110"/>
+            </w:tcMar>
+          </w:tcPr>
+          <w:p>
+            <w:pPr>
+              <w:keepNext/>
+            </w:pPr>
+            <w:r>
+              <w:rPr>
+                <w:rFonts w:ascii="Calibri" w:cs="Calibri" w:eastAsia="Calibri" w:hAnsi="Calibri"/>
+                <w:b/>
+                <w:bCs/>
+                <w:color w:val="FFFFFF"/>
+                <w:sz w:val="19"/>
+                <w:szCs w:val="19"/>
+              </w:rPr>
+              <w:t xml:space="preserve">Brand (origin)</w:t>
+            </w:r>
+          </w:p>
+        </w:tc>
+        <w:tc>
+          <w:tcPr>
+            <w:tcW w:type="dxa" w:w="2500"/>
+            <w:tcBorders>
+              <w:top w:val="single" w:color="C9D1DC" w:sz="4"/>
+              <w:left w:val="single" w:color="C9D1DC" w:sz="4"/>
+              <w:bottom w:val="single" w:color="C9D1DC" w:sz="4"/>
+              <w:right w:val="single" w:color="C9D1DC" w:sz="4"/>
+            </w:tcBorders>
+            <w:shd w:fill="1B1F3B" w:color="auto" w:val="clear"/>
+            <w:tcMar>
+              <w:top w:type="dxa" w:w="80"/>
+              <w:left w:type="dxa" w:w="110"/>
+              <w:bottom w:type="dxa" w:w="80"/>
+              <w:right w:type="dxa" w:w="110"/>
+            </w:tcMar>
+          </w:tcPr>
+          <w:p>
+            <w:pPr>
+              <w:keepNext/>
+            </w:pPr>
+            <w:r>
+              <w:rPr>
+                <w:rFonts w:ascii="Calibri" w:cs="Calibri" w:eastAsia="Calibri" w:hAnsi="Calibri"/>
+                <w:b/>
+                <w:bCs/>
+                <w:color w:val="FFFFFF"/>
+                <w:sz w:val="19"/>
+                <w:szCs w:val="19"/>
+              </w:rPr>
+              <w:t xml:space="preserve">Presence in Mexico</w:t>
+            </w:r>
+          </w:p>
+        </w:tc>
+        <w:tc>
+          <w:tcPr>
+            <w:tcW w:type="dxa" w:w="2700"/>
+            <w:tcBorders>
+              <w:top w:val="single" w:color="C9D1DC" w:sz="4"/>
+              <w:left w:val="single" w:color="C9D1DC" w:sz="4"/>
+              <w:bottom w:val="single" w:color="C9D1DC" w:sz="4"/>
+              <w:right w:val="single" w:color="C9D1DC" w:sz="4"/>
+            </w:tcBorders>
+            <w:shd w:fill="1B1F3B" w:color="auto" w:val="clear"/>
+            <w:tcMar>
+              <w:top w:type="dxa" w:w="80"/>
+              <w:left w:type="dxa" w:w="110"/>
+              <w:bottom w:type="dxa" w:w="80"/>
+              <w:right w:type="dxa" w:w="110"/>
+            </w:tcMar>
+          </w:tcPr>
+          <w:p>
+            <w:pPr>
+              <w:keepNext/>
+            </w:pPr>
+            <w:r>
+              <w:rPr>
+                <w:rFonts w:ascii="Calibri" w:cs="Calibri" w:eastAsia="Calibri" w:hAnsi="Calibri"/>
+                <w:b/>
+                <w:bCs/>
+                <w:color w:val="FFFFFF"/>
+                <w:sz w:val="19"/>
+                <w:szCs w:val="19"/>
+              </w:rPr>
+              <w:t xml:space="preserve">Reference price</w:t>
+            </w:r>
+          </w:p>
+        </w:tc>
+        <w:tc>
+          <w:tcPr>
+            <w:tcW w:type="dxa" w:w="1660"/>
+            <w:tcBorders>
+              <w:top w:val="single" w:color="C9D1DC" w:sz="4"/>
+              <w:left w:val="single" w:color="C9D1DC" w:sz="4"/>
+              <w:bottom w:val="single" w:color="C9D1DC" w:sz="4"/>
+              <w:right w:val="single" w:color="C9D1DC" w:sz="4"/>
+            </w:tcBorders>
+            <w:shd w:fill="1B1F3B" w:color="auto" w:val="clear"/>
+            <w:tcMar>
+              <w:top w:type="dxa" w:w="80"/>
+              <w:left w:type="dxa" w:w="110"/>
+              <w:bottom w:type="dxa" w:w="80"/>
+              <w:right w:type="dxa" w:w="110"/>
+            </w:tcMar>
+          </w:tcPr>
+          <w:p>
+            <w:pPr>
+              <w:keepNext/>
+            </w:pPr>
+            <w:r>
+              <w:rPr>
+                <w:rFonts w:ascii="Calibri" w:cs="Calibri" w:eastAsia="Calibri" w:hAnsi="Calibri"/>
+                <w:b/>
+                <w:bCs/>
+                <w:color w:val="FFFFFF"/>
+                <w:sz w:val="19"/>
+                <w:szCs w:val="19"/>
+              </w:rPr>
+              <w:t xml:space="preserve">Threat</w:t>
+            </w:r>
+          </w:p>
+        </w:tc>
+      </w:tr>
+      <w:tr>
+        <w:trPr>
+          <w:cantSplit/>
+        </w:trPr>
+        <w:tc>
+          <w:tcPr>
+            <w:tcW w:type="dxa" w:w="2500"/>
+            <w:tcBorders>
+              <w:top w:val="single" w:color="C9D1DC" w:sz="4"/>
+              <w:left w:val="single" w:color="C9D1DC" w:sz="4"/>
+              <w:bottom w:val="single" w:color="C9D1DC" w:sz="4"/>
+              <w:right w:val="single" w:color="C9D1DC" w:sz="4"/>
+            </w:tcBorders>
+            <w:tcMar>
+              <w:top w:type="dxa" w:w="80"/>
+              <w:left w:type="dxa" w:w="110"/>
+              <w:bottom w:type="dxa" w:w="80"/>
+              <w:right w:type="dxa" w:w="110"/>
+            </w:tcMar>
+          </w:tcPr>
+          <w:p>
+            <w:pPr>
+              <w:keepNext/>
+            </w:pPr>
+            <w:r>
+              <w:rPr>
+                <w:rFonts w:ascii="Calibri" w:cs="Calibri" w:eastAsia="Calibri" w:hAnsi="Calibri"/>
+                <w:b/>
+                <w:bCs/>
+                <w:sz w:val="19"/>
+                <w:szCs w:val="19"/>
+              </w:rPr>
+              <w:t xml:space="preserve">Avient: Wilflex, Rutland, Union Ink, Printop (U.S.)</w:t>
+            </w:r>
+          </w:p>
+        </w:tc>
+        <w:tc>
+          <w:tcPr>
+            <w:tcW w:type="dxa" w:w="2500"/>
+            <w:tcBorders>
+              <w:top w:val="single" w:color="C9D1DC" w:sz="4"/>
+              <w:left w:val="single" w:color="C9D1DC" w:sz="4"/>
+              <w:bottom w:val="single" w:color="C9D1DC" w:sz="4"/>
+              <w:right w:val="single" w:color="C9D1DC" w:sz="4"/>
+            </w:tcBorders>
+            <w:tcMar>
+              <w:top w:type="dxa" w:w="80"/>
+              <w:left w:type="dxa" w:w="110"/>
+              <w:bottom w:type="dxa" w:w="80"/>
+              <w:right w:type="dxa" w:w="110"/>
+            </w:tcMar>
+          </w:tcPr>
+          <w:p>
+            <w:pPr>
+              <w:keepNext/>
+            </w:pPr>
+            <w:r>
+              <w:rPr>
+                <w:rFonts w:ascii="Calibri" w:cs="Calibri" w:eastAsia="Calibri" w:hAnsi="Calibri"/>
+                <w:b w:val="false"/>
+                <w:bCs w:val="false"/>
+                <w:sz w:val="19"/>
+                <w:szCs w:val="19"/>
+              </w:rPr>
+              <w:t xml:space="preserve">Casa Díaz and dealers; standard in export contract manufacturing</w:t>
+            </w:r>
+          </w:p>
+        </w:tc>
+        <w:tc>
+          <w:tcPr>
+            <w:tcW w:type="dxa" w:w="2700"/>
+            <w:tcBorders>
+              <w:top w:val="single" w:color="C9D1DC" w:sz="4"/>
+              <w:left w:val="single" w:color="C9D1DC" w:sz="4"/>
+              <w:bottom w:val="single" w:color="C9D1DC" w:sz="4"/>
+              <w:right w:val="single" w:color="C9D1DC" w:sz="4"/>
+            </w:tcBorders>
+            <w:tcMar>
+              <w:top w:type="dxa" w:w="80"/>
+              <w:left w:type="dxa" w:w="110"/>
+              <w:bottom w:type="dxa" w:w="80"/>
+              <w:right w:type="dxa" w:w="110"/>
+            </w:tcMar>
+          </w:tcPr>
+          <w:p>
+            <w:pPr>
+              <w:keepNext/>
+            </w:pPr>
+            <w:r>
+              <w:rPr>
+                <w:rFonts w:ascii="Calibri" w:cs="Calibri" w:eastAsia="Calibri" w:hAnsi="Calibri"/>
+                <w:b w:val="false"/>
+                <w:bCs w:val="false"/>
+                <w:sz w:val="19"/>
+                <w:szCs w:val="19"/>
+              </w:rPr>
+              <w:t xml:space="preserve">High: ~US$40–60/gallon for mixing colors; specialties US$90–310/gallon (U.S. stores)</w:t>
+            </w:r>
+          </w:p>
+        </w:tc>
+        <w:tc>
+          <w:tcPr>
+            <w:tcW w:type="dxa" w:w="1660"/>
+            <w:tcBorders>
+              <w:top w:val="single" w:color="C9D1DC" w:sz="4"/>
+              <w:left w:val="single" w:color="C9D1DC" w:sz="4"/>
+              <w:bottom w:val="single" w:color="C9D1DC" w:sz="4"/>
+              <w:right w:val="single" w:color="C9D1DC" w:sz="4"/>
+            </w:tcBorders>
+            <w:tcMar>
+              <w:top w:type="dxa" w:w="80"/>
+              <w:left w:type="dxa" w:w="110"/>
+              <w:bottom w:type="dxa" w:w="80"/>
+              <w:right w:type="dxa" w:w="110"/>
+            </w:tcMar>
+          </w:tcPr>
+          <w:p>
+            <w:pPr>
+              <w:keepNext/>
+            </w:pPr>
+            <w:r>
+              <w:rPr>
+                <w:rFonts w:ascii="Calibri" w:cs="Calibri" w:eastAsia="Calibri" w:hAnsi="Calibri"/>
+                <w:b w:val="false"/>
+                <w:bCs w:val="false"/>
+                <w:sz w:val="19"/>
+                <w:szCs w:val="19"/>
+              </w:rPr>
+              <w:t xml:space="preserve">High with OEMs</w:t>
+            </w:r>
+          </w:p>
+        </w:tc>
+      </w:tr>
+      <w:tr>
+        <w:trPr>
+          <w:cantSplit/>
+        </w:trPr>
+        <w:tc>
+          <w:tcPr>
+            <w:tcW w:type="dxa" w:w="2500"/>
+            <w:tcBorders>
+              <w:top w:val="single" w:color="C9D1DC" w:sz="4"/>
+              <w:left w:val="single" w:color="C9D1DC" w:sz="4"/>
+              <w:bottom w:val="single" w:color="C9D1DC" w:sz="4"/>
+              <w:right w:val="single" w:color="C9D1DC" w:sz="4"/>
+            </w:tcBorders>
+            <w:shd w:fill="EEF2F7" w:color="auto" w:val="clear"/>
+            <w:tcMar>
+              <w:top w:type="dxa" w:w="80"/>
+              <w:left w:type="dxa" w:w="110"/>
+              <w:bottom w:type="dxa" w:w="80"/>
+              <w:right w:type="dxa" w:w="110"/>
+            </w:tcMar>
+          </w:tcPr>
+          <w:p>
+            <w:pPr>
+              <w:keepNext/>
+            </w:pPr>
+            <w:r>
+              <w:rPr>
+                <w:rFonts w:ascii="Calibri" w:cs="Calibri" w:eastAsia="Calibri" w:hAnsi="Calibri"/>
+                <w:b/>
+                <w:bCs/>
+                <w:sz w:val="19"/>
+                <w:szCs w:val="19"/>
+              </w:rPr>
+              <w:t xml:space="preserve">Grupo Sánchez / ScreenTec: Seritex, Aquatex, Siltex (Mexico)</w:t>
+            </w:r>
+          </w:p>
+        </w:tc>
+        <w:tc>
+          <w:tcPr>
+            <w:tcW w:type="dxa" w:w="2500"/>
+            <w:tcBorders>
+              <w:top w:val="single" w:color="C9D1DC" w:sz="4"/>
+              <w:left w:val="single" w:color="C9D1DC" w:sz="4"/>
+              <w:bottom w:val="single" w:color="C9D1DC" w:sz="4"/>
+              <w:right w:val="single" w:color="C9D1DC" w:sz="4"/>
+            </w:tcBorders>
+            <w:shd w:fill="EEF2F7" w:color="auto" w:val="clear"/>
+            <w:tcMar>
+              <w:top w:type="dxa" w:w="80"/>
+              <w:left w:type="dxa" w:w="110"/>
+              <w:bottom w:type="dxa" w:w="80"/>
+              <w:right w:type="dxa" w:w="110"/>
+            </w:tcMar>
+          </w:tcPr>
+          <w:p>
+            <w:pPr>
+              <w:keepNext/>
+            </w:pPr>
+            <w:r>
+              <w:rPr>
+                <w:rFonts w:ascii="Calibri" w:cs="Calibri" w:eastAsia="Calibri" w:hAnsi="Calibri"/>
+                <w:b w:val="false"/>
+                <w:bCs w:val="false"/>
+                <w:sz w:val="19"/>
+                <w:szCs w:val="19"/>
+              </w:rPr>
+              <w:t xml:space="preserve">Domestic manufacturer with a dealer network</w:t>
+            </w:r>
+          </w:p>
+        </w:tc>
+        <w:tc>
+          <w:tcPr>
+            <w:tcW w:type="dxa" w:w="2700"/>
+            <w:tcBorders>
+              <w:top w:val="single" w:color="C9D1DC" w:sz="4"/>
+              <w:left w:val="single" w:color="C9D1DC" w:sz="4"/>
+              <w:bottom w:val="single" w:color="C9D1DC" w:sz="4"/>
+              <w:right w:val="single" w:color="C9D1DC" w:sz="4"/>
+            </w:tcBorders>
+            <w:shd w:fill="EEF2F7" w:color="auto" w:val="clear"/>
+            <w:tcMar>
+              <w:top w:type="dxa" w:w="80"/>
+              <w:left w:type="dxa" w:w="110"/>
+              <w:bottom w:type="dxa" w:w="80"/>
+              <w:right w:type="dxa" w:w="110"/>
+            </w:tcMar>
+          </w:tcPr>
+          <w:p>
+            <w:pPr>
+              <w:keepNext/>
+            </w:pPr>
+            <w:r>
+              <w:rPr>
+                <w:rFonts w:ascii="Calibri" w:cs="Calibri" w:eastAsia="Calibri" w:hAnsi="Calibri"/>
+                <w:b w:val="false"/>
+                <w:bCs w:val="false"/>
+                <w:sz w:val="19"/>
+                <w:szCs w:val="19"/>
+              </w:rPr>
+              <w:t xml:space="preserve">Low: MXN 159–217/kg retail (Seritex)</w:t>
+            </w:r>
+          </w:p>
+        </w:tc>
+        <w:tc>
+          <w:tcPr>
+            <w:tcW w:type="dxa" w:w="1660"/>
+            <w:tcBorders>
+              <w:top w:val="single" w:color="C9D1DC" w:sz="4"/>
+              <w:left w:val="single" w:color="C9D1DC" w:sz="4"/>
+              <w:bottom w:val="single" w:color="C9D1DC" w:sz="4"/>
+              <w:right w:val="single" w:color="C9D1DC" w:sz="4"/>
+            </w:tcBorders>
+            <w:shd w:fill="EEF2F7" w:color="auto" w:val="clear"/>
+            <w:tcMar>
+              <w:top w:type="dxa" w:w="80"/>
+              <w:left w:type="dxa" w:w="110"/>
+              <w:bottom w:type="dxa" w:w="80"/>
+              <w:right w:type="dxa" w:w="110"/>
+            </w:tcMar>
+          </w:tcPr>
+          <w:p>
+            <w:pPr>
+              <w:keepNext/>
+            </w:pPr>
+            <w:r>
+              <w:rPr>
+                <w:rFonts w:ascii="Calibri" w:cs="Calibri" w:eastAsia="Calibri" w:hAnsi="Calibri"/>
+                <w:b w:val="false"/>
+                <w:bCs w:val="false"/>
+                <w:sz w:val="19"/>
+                <w:szCs w:val="19"/>
+              </w:rPr>
+              <w:t xml:space="preserve">High with shops</w:t>
+            </w:r>
+          </w:p>
+        </w:tc>
+      </w:tr>
+      <w:tr>
+        <w:trPr>
+          <w:cantSplit/>
+        </w:trPr>
+        <w:tc>
+          <w:tcPr>
+            <w:tcW w:type="dxa" w:w="2500"/>
+            <w:tcBorders>
+              <w:top w:val="single" w:color="C9D1DC" w:sz="4"/>
+              <w:left w:val="single" w:color="C9D1DC" w:sz="4"/>
+              <w:bottom w:val="single" w:color="C9D1DC" w:sz="4"/>
+              <w:right w:val="single" w:color="C9D1DC" w:sz="4"/>
+            </w:tcBorders>
+            <w:tcMar>
+              <w:top w:type="dxa" w:w="80"/>
+              <w:left w:type="dxa" w:w="110"/>
+              <w:bottom w:type="dxa" w:w="80"/>
+              <w:right w:type="dxa" w:w="110"/>
+            </w:tcMar>
+          </w:tcPr>
+          <w:p>
+            <w:pPr>
+              <w:keepNext/>
+            </w:pPr>
+            <w:r>
+              <w:rPr>
+                <w:rFonts w:ascii="Calibri" w:cs="Calibri" w:eastAsia="Calibri" w:hAnsi="Calibri"/>
+                <w:b/>
+                <w:bCs/>
+                <w:sz w:val="19"/>
+                <w:szCs w:val="19"/>
+              </w:rPr>
+              <w:t xml:space="preserve">Matsui (Japan)</w:t>
+            </w:r>
+          </w:p>
+        </w:tc>
+        <w:tc>
+          <w:tcPr>
+            <w:tcW w:type="dxa" w:w="2500"/>
+            <w:tcBorders>
+              <w:top w:val="single" w:color="C9D1DC" w:sz="4"/>
+              <w:left w:val="single" w:color="C9D1DC" w:sz="4"/>
+              <w:bottom w:val="single" w:color="C9D1DC" w:sz="4"/>
+              <w:right w:val="single" w:color="C9D1DC" w:sz="4"/>
+            </w:tcBorders>
+            <w:tcMar>
+              <w:top w:type="dxa" w:w="80"/>
+              <w:left w:type="dxa" w:w="110"/>
+              <w:bottom w:type="dxa" w:w="80"/>
+              <w:right w:type="dxa" w:w="110"/>
+            </w:tcMar>
+          </w:tcPr>
+          <w:p>
+            <w:pPr>
+              <w:keepNext/>
+            </w:pPr>
+            <w:r>
+              <w:rPr>
+                <w:rFonts w:ascii="Calibri" w:cs="Calibri" w:eastAsia="Calibri" w:hAnsi="Calibri"/>
+                <w:b w:val="false"/>
+                <w:bCs w:val="false"/>
+                <w:sz w:val="19"/>
+                <w:szCs w:val="19"/>
+              </w:rPr>
+              <w:t xml:space="preserve">Casa Díaz; benchmark for water-based and discharge</w:t>
+            </w:r>
+          </w:p>
+        </w:tc>
+        <w:tc>
+          <w:tcPr>
+            <w:tcW w:type="dxa" w:w="2700"/>
+            <w:tcBorders>
+              <w:top w:val="single" w:color="C9D1DC" w:sz="4"/>
+              <w:left w:val="single" w:color="C9D1DC" w:sz="4"/>
+              <w:bottom w:val="single" w:color="C9D1DC" w:sz="4"/>
+              <w:right w:val="single" w:color="C9D1DC" w:sz="4"/>
+            </w:tcBorders>
+            <w:tcMar>
+              <w:top w:type="dxa" w:w="80"/>
+              <w:left w:type="dxa" w:w="110"/>
+              <w:bottom w:type="dxa" w:w="80"/>
+              <w:right w:type="dxa" w:w="110"/>
+            </w:tcMar>
+          </w:tcPr>
+          <w:p>
+            <w:pPr>
+              <w:keepNext/>
+            </w:pPr>
+            <w:r>
+              <w:rPr>
+                <w:rFonts w:ascii="Calibri" w:cs="Calibri" w:eastAsia="Calibri" w:hAnsi="Calibri"/>
+                <w:b w:val="false"/>
+                <w:bCs w:val="false"/>
+                <w:sz w:val="19"/>
+                <w:szCs w:val="19"/>
+              </w:rPr>
+              <w:t xml:space="preserve">Mid-high; bases from ~US$8–9/kg in Central America</w:t>
+            </w:r>
+          </w:p>
+        </w:tc>
+        <w:tc>
+          <w:tcPr>
+            <w:tcW w:type="dxa" w:w="1660"/>
+            <w:tcBorders>
+              <w:top w:val="single" w:color="C9D1DC" w:sz="4"/>
+              <w:left w:val="single" w:color="C9D1DC" w:sz="4"/>
+              <w:bottom w:val="single" w:color="C9D1DC" w:sz="4"/>
+              <w:right w:val="single" w:color="C9D1DC" w:sz="4"/>
+            </w:tcBorders>
+            <w:tcMar>
+              <w:top w:type="dxa" w:w="80"/>
+              <w:left w:type="dxa" w:w="110"/>
+              <w:bottom w:type="dxa" w:w="80"/>
+              <w:right w:type="dxa" w:w="110"/>
+            </w:tcMar>
+          </w:tcPr>
+          <w:p>
+            <w:pPr>
+              <w:keepNext/>
+            </w:pPr>
+            <w:r>
+              <w:rPr>
+                <w:rFonts w:ascii="Calibri" w:cs="Calibri" w:eastAsia="Calibri" w:hAnsi="Calibri"/>
+                <w:b w:val="false"/>
+                <w:bCs w:val="false"/>
+                <w:sz w:val="19"/>
+                <w:szCs w:val="19"/>
+              </w:rPr>
+              <w:t xml:space="preserve">Mid-high</w:t>
+            </w:r>
+          </w:p>
+        </w:tc>
+      </w:tr>
+      <w:tr>
+        <w:trPr>
+          <w:cantSplit/>
+        </w:trPr>
+        <w:tc>
+          <w:tcPr>
+            <w:tcW w:type="dxa" w:w="2500"/>
+            <w:tcBorders>
+              <w:top w:val="single" w:color="C9D1DC" w:sz="4"/>
+              <w:left w:val="single" w:color="C9D1DC" w:sz="4"/>
+              <w:bottom w:val="single" w:color="C9D1DC" w:sz="4"/>
+              <w:right w:val="single" w:color="C9D1DC" w:sz="4"/>
+            </w:tcBorders>
+            <w:shd w:fill="EEF2F7" w:color="auto" w:val="clear"/>
+            <w:tcMar>
+              <w:top w:type="dxa" w:w="80"/>
+              <w:left w:type="dxa" w:w="110"/>
+              <w:bottom w:type="dxa" w:w="80"/>
+              <w:right w:type="dxa" w:w="110"/>
+            </w:tcMar>
+          </w:tcPr>
+          <w:p>
+            <w:pPr>
+              <w:keepNext/>
+            </w:pPr>
+            <w:r>
+              <w:rPr>
+                <w:rFonts w:ascii="Calibri" w:cs="Calibri" w:eastAsia="Calibri" w:hAnsi="Calibri"/>
+                <w:b/>
+                <w:bCs/>
+                <w:sz w:val="19"/>
+                <w:szCs w:val="19"/>
+              </w:rPr>
+              <w:t xml:space="preserve">International Coatings (U.S.)</w:t>
+            </w:r>
+          </w:p>
+        </w:tc>
+        <w:tc>
+          <w:tcPr>
+            <w:tcW w:type="dxa" w:w="2500"/>
+            <w:tcBorders>
+              <w:top w:val="single" w:color="C9D1DC" w:sz="4"/>
+              <w:left w:val="single" w:color="C9D1DC" w:sz="4"/>
+              <w:bottom w:val="single" w:color="C9D1DC" w:sz="4"/>
+              <w:right w:val="single" w:color="C9D1DC" w:sz="4"/>
+            </w:tcBorders>
+            <w:shd w:fill="EEF2F7" w:color="auto" w:val="clear"/>
+            <w:tcMar>
+              <w:top w:type="dxa" w:w="80"/>
+              <w:left w:type="dxa" w:w="110"/>
+              <w:bottom w:type="dxa" w:w="80"/>
+              <w:right w:type="dxa" w:w="110"/>
+            </w:tcMar>
+          </w:tcPr>
+          <w:p>
+            <w:pPr>
+              <w:keepNext/>
+            </w:pPr>
+            <w:r>
+              <w:rPr>
+                <w:rFonts w:ascii="Calibri" w:cs="Calibri" w:eastAsia="Calibri" w:hAnsi="Calibri"/>
+                <w:b w:val="false"/>
+                <w:bCs w:val="false"/>
+                <w:sz w:val="19"/>
+                <w:szCs w:val="19"/>
+              </w:rPr>
+              <w:t xml:space="preserve">Imported through U.S. dealers</w:t>
+            </w:r>
+          </w:p>
+        </w:tc>
+        <w:tc>
+          <w:tcPr>
+            <w:tcW w:type="dxa" w:w="2700"/>
+            <w:tcBorders>
+              <w:top w:val="single" w:color="C9D1DC" w:sz="4"/>
+              <w:left w:val="single" w:color="C9D1DC" w:sz="4"/>
+              <w:bottom w:val="single" w:color="C9D1DC" w:sz="4"/>
+              <w:right w:val="single" w:color="C9D1DC" w:sz="4"/>
+            </w:tcBorders>
+            <w:shd w:fill="EEF2F7" w:color="auto" w:val="clear"/>
+            <w:tcMar>
+              <w:top w:type="dxa" w:w="80"/>
+              <w:left w:type="dxa" w:w="110"/>
+              <w:bottom w:type="dxa" w:w="80"/>
+              <w:right w:type="dxa" w:w="110"/>
+            </w:tcMar>
+          </w:tcPr>
+          <w:p>
+            <w:pPr>
+              <w:keepNext/>
+            </w:pPr>
+            <w:r>
+              <w:rPr>
+                <w:rFonts w:ascii="Calibri" w:cs="Calibri" w:eastAsia="Calibri" w:hAnsi="Calibri"/>
+                <w:b w:val="false"/>
+                <w:bCs w:val="false"/>
+                <w:sz w:val="19"/>
+                <w:szCs w:val="19"/>
+              </w:rPr>
+              <w:t xml:space="preserve">Mid</w:t>
+            </w:r>
+          </w:p>
+        </w:tc>
+        <w:tc>
+          <w:tcPr>
+            <w:tcW w:type="dxa" w:w="1660"/>
+            <w:tcBorders>
+              <w:top w:val="single" w:color="C9D1DC" w:sz="4"/>
+              <w:left w:val="single" w:color="C9D1DC" w:sz="4"/>
+              <w:bottom w:val="single" w:color="C9D1DC" w:sz="4"/>
+              <w:right w:val="single" w:color="C9D1DC" w:sz="4"/>
+            </w:tcBorders>
+            <w:shd w:fill="EEF2F7" w:color="auto" w:val="clear"/>
+            <w:tcMar>
+              <w:top w:type="dxa" w:w="80"/>
+              <w:left w:type="dxa" w:w="110"/>
+              <w:bottom w:type="dxa" w:w="80"/>
+              <w:right w:type="dxa" w:w="110"/>
+            </w:tcMar>
+          </w:tcPr>
+          <w:p>
+            <w:pPr>
+              <w:keepNext/>
+            </w:pPr>
+            <w:r>
+              <w:rPr>
+                <w:rFonts w:ascii="Calibri" w:cs="Calibri" w:eastAsia="Calibri" w:hAnsi="Calibri"/>
+                <w:b w:val="false"/>
+                <w:bCs w:val="false"/>
+                <w:sz w:val="19"/>
+                <w:szCs w:val="19"/>
+              </w:rPr>
+              <w:t xml:space="preserve">Mid</w:t>
+            </w:r>
+          </w:p>
+        </w:tc>
+      </w:tr>
+      <w:tr>
+        <w:trPr>
+          <w:cantSplit/>
+        </w:trPr>
+        <w:tc>
+          <w:tcPr>
+            <w:tcW w:type="dxa" w:w="2500"/>
+            <w:tcBorders>
+              <w:top w:val="single" w:color="C9D1DC" w:sz="4"/>
+              <w:left w:val="single" w:color="C9D1DC" w:sz="4"/>
+              <w:bottom w:val="single" w:color="C9D1DC" w:sz="4"/>
+              <w:right w:val="single" w:color="C9D1DC" w:sz="4"/>
+            </w:tcBorders>
+            <w:tcMar>
+              <w:top w:type="dxa" w:w="80"/>
+              <w:left w:type="dxa" w:w="110"/>
+              <w:bottom w:type="dxa" w:w="80"/>
+              <w:right w:type="dxa" w:w="110"/>
+            </w:tcMar>
+          </w:tcPr>
+          <w:p>
+            <w:pPr>
+              <w:keepNext/>
+            </w:pPr>
+            <w:r>
+              <w:rPr>
+                <w:rFonts w:ascii="Calibri" w:cs="Calibri" w:eastAsia="Calibri" w:hAnsi="Calibri"/>
+                <w:b/>
+                <w:bCs/>
+                <w:sz w:val="19"/>
+                <w:szCs w:val="19"/>
+              </w:rPr>
+              <w:t xml:space="preserve">Marabu (Germany)</w:t>
+            </w:r>
+          </w:p>
+        </w:tc>
+        <w:tc>
+          <w:tcPr>
+            <w:tcW w:type="dxa" w:w="2500"/>
+            <w:tcBorders>
+              <w:top w:val="single" w:color="C9D1DC" w:sz="4"/>
+              <w:left w:val="single" w:color="C9D1DC" w:sz="4"/>
+              <w:bottom w:val="single" w:color="C9D1DC" w:sz="4"/>
+              <w:right w:val="single" w:color="C9D1DC" w:sz="4"/>
+            </w:tcBorders>
+            <w:tcMar>
+              <w:top w:type="dxa" w:w="80"/>
+              <w:left w:type="dxa" w:w="110"/>
+              <w:bottom w:type="dxa" w:w="80"/>
+              <w:right w:type="dxa" w:w="110"/>
+            </w:tcMar>
+          </w:tcPr>
+          <w:p>
+            <w:pPr>
+              <w:keepNext/>
+            </w:pPr>
+            <w:r>
+              <w:rPr>
+                <w:rFonts w:ascii="Calibri" w:cs="Calibri" w:eastAsia="Calibri" w:hAnsi="Calibri"/>
+                <w:b w:val="false"/>
+                <w:bCs w:val="false"/>
+                <w:sz w:val="19"/>
+                <w:szCs w:val="19"/>
+              </w:rPr>
+              <w:t xml:space="preserve">Graficolor and others; strong in graphics, pad and digital printing</w:t>
+            </w:r>
+          </w:p>
+        </w:tc>
+        <w:tc>
+          <w:tcPr>
+            <w:tcW w:type="dxa" w:w="2700"/>
+            <w:tcBorders>
+              <w:top w:val="single" w:color="C9D1DC" w:sz="4"/>
+              <w:left w:val="single" w:color="C9D1DC" w:sz="4"/>
+              <w:bottom w:val="single" w:color="C9D1DC" w:sz="4"/>
+              <w:right w:val="single" w:color="C9D1DC" w:sz="4"/>
+            </w:tcBorders>
+            <w:tcMar>
+              <w:top w:type="dxa" w:w="80"/>
+              <w:left w:type="dxa" w:w="110"/>
+              <w:bottom w:type="dxa" w:w="80"/>
+              <w:right w:type="dxa" w:w="110"/>
+            </w:tcMar>
+          </w:tcPr>
+          <w:p>
+            <w:pPr>
+              <w:keepNext/>
+            </w:pPr>
+            <w:r>
+              <w:rPr>
+                <w:rFonts w:ascii="Calibri" w:cs="Calibri" w:eastAsia="Calibri" w:hAnsi="Calibri"/>
+                <w:b w:val="false"/>
+                <w:bCs w:val="false"/>
+                <w:sz w:val="19"/>
+                <w:szCs w:val="19"/>
+              </w:rPr>
+              <w:t xml:space="preserve">High</w:t>
+            </w:r>
+          </w:p>
+        </w:tc>
+        <w:tc>
+          <w:tcPr>
+            <w:tcW w:type="dxa" w:w="1660"/>
+            <w:tcBorders>
+              <w:top w:val="single" w:color="C9D1DC" w:sz="4"/>
+              <w:left w:val="single" w:color="C9D1DC" w:sz="4"/>
+              <w:bottom w:val="single" w:color="C9D1DC" w:sz="4"/>
+              <w:right w:val="single" w:color="C9D1DC" w:sz="4"/>
+            </w:tcBorders>
+            <w:tcMar>
+              <w:top w:type="dxa" w:w="80"/>
+              <w:left w:type="dxa" w:w="110"/>
+              <w:bottom w:type="dxa" w:w="80"/>
+              <w:right w:type="dxa" w:w="110"/>
+            </w:tcMar>
+          </w:tcPr>
+          <w:p>
+            <w:pPr>
+              <w:keepNext/>
+            </w:pPr>
+            <w:r>
+              <w:rPr>
+                <w:rFonts w:ascii="Calibri" w:cs="Calibri" w:eastAsia="Calibri" w:hAnsi="Calibri"/>
+                <w:b w:val="false"/>
+                <w:bCs w:val="false"/>
+                <w:sz w:val="19"/>
+                <w:szCs w:val="19"/>
+              </w:rPr>
+              <w:t xml:space="preserve">Low: limited textile range (nylon, synthetics)</w:t>
+            </w:r>
+          </w:p>
+        </w:tc>
+      </w:tr>
+      <w:tr>
+        <w:trPr>
+          <w:cantSplit/>
+        </w:trPr>
+        <w:tc>
+          <w:tcPr>
+            <w:tcW w:type="dxa" w:w="2500"/>
+            <w:tcBorders>
+              <w:top w:val="single" w:color="C9D1DC" w:sz="4"/>
+              <w:left w:val="single" w:color="C9D1DC" w:sz="4"/>
+              <w:bottom w:val="single" w:color="C9D1DC" w:sz="4"/>
+              <w:right w:val="single" w:color="C9D1DC" w:sz="4"/>
+            </w:tcBorders>
+            <w:shd w:fill="EEF2F7" w:color="auto" w:val="clear"/>
+            <w:tcMar>
+              <w:top w:type="dxa" w:w="80"/>
+              <w:left w:type="dxa" w:w="110"/>
+              <w:bottom w:type="dxa" w:w="80"/>
+              <w:right w:type="dxa" w:w="110"/>
+            </w:tcMar>
+          </w:tcPr>
+          <w:p>
+            <w:pPr>
+              <w:keepNext/>
+            </w:pPr>
+            <w:r>
+              <w:rPr>
+                <w:rFonts w:ascii="Calibri" w:cs="Calibri" w:eastAsia="Calibri" w:hAnsi="Calibri"/>
+                <w:b/>
+                <w:bCs/>
+                <w:sz w:val="19"/>
+                <w:szCs w:val="19"/>
+              </w:rPr>
+              <w:t xml:space="preserve">RUCO / RUCOINX (Germany)</w:t>
+            </w:r>
+          </w:p>
+        </w:tc>
+        <w:tc>
+          <w:tcPr>
+            <w:tcW w:type="dxa" w:w="2500"/>
+            <w:tcBorders>
+              <w:top w:val="single" w:color="C9D1DC" w:sz="4"/>
+              <w:left w:val="single" w:color="C9D1DC" w:sz="4"/>
+              <w:bottom w:val="single" w:color="C9D1DC" w:sz="4"/>
+              <w:right w:val="single" w:color="C9D1DC" w:sz="4"/>
+            </w:tcBorders>
+            <w:shd w:fill="EEF2F7" w:color="auto" w:val="clear"/>
+            <w:tcMar>
+              <w:top w:type="dxa" w:w="80"/>
+              <w:left w:type="dxa" w:w="110"/>
+              <w:bottom w:type="dxa" w:w="80"/>
+              <w:right w:type="dxa" w:w="110"/>
+            </w:tcMar>
+          </w:tcPr>
+          <w:p>
+            <w:pPr>
+              <w:keepNext/>
+            </w:pPr>
+            <w:r>
+              <w:rPr>
+                <w:rFonts w:ascii="Calibri" w:cs="Calibri" w:eastAsia="Calibri" w:hAnsi="Calibri"/>
+                <w:b w:val="false"/>
+                <w:bCs w:val="false"/>
+                <w:sz w:val="19"/>
+                <w:szCs w:val="19"/>
+              </w:rPr>
+              <w:t xml:space="preserve">Tampomex (dealer)</w:t>
+            </w:r>
+          </w:p>
+        </w:tc>
+        <w:tc>
+          <w:tcPr>
+            <w:tcW w:type="dxa" w:w="2700"/>
+            <w:tcBorders>
+              <w:top w:val="single" w:color="C9D1DC" w:sz="4"/>
+              <w:left w:val="single" w:color="C9D1DC" w:sz="4"/>
+              <w:bottom w:val="single" w:color="C9D1DC" w:sz="4"/>
+              <w:right w:val="single" w:color="C9D1DC" w:sz="4"/>
+            </w:tcBorders>
+            <w:shd w:fill="EEF2F7" w:color="auto" w:val="clear"/>
+            <w:tcMar>
+              <w:top w:type="dxa" w:w="80"/>
+              <w:left w:type="dxa" w:w="110"/>
+              <w:bottom w:type="dxa" w:w="80"/>
+              <w:right w:type="dxa" w:w="110"/>
+            </w:tcMar>
+          </w:tcPr>
+          <w:p>
+            <w:pPr>
+              <w:keepNext/>
+            </w:pPr>
+            <w:r>
+              <w:rPr>
+                <w:rFonts w:ascii="Calibri" w:cs="Calibri" w:eastAsia="Calibri" w:hAnsi="Calibri"/>
+                <w:b w:val="false"/>
+                <w:bCs w:val="false"/>
+                <w:sz w:val="19"/>
+                <w:szCs w:val="19"/>
+              </w:rPr>
+              <w:t xml:space="preserve">High</w:t>
+            </w:r>
+          </w:p>
+        </w:tc>
+        <w:tc>
+          <w:tcPr>
+            <w:tcW w:type="dxa" w:w="1660"/>
+            <w:tcBorders>
+              <w:top w:val="single" w:color="C9D1DC" w:sz="4"/>
+              <w:left w:val="single" w:color="C9D1DC" w:sz="4"/>
+              <w:bottom w:val="single" w:color="C9D1DC" w:sz="4"/>
+              <w:right w:val="single" w:color="C9D1DC" w:sz="4"/>
+            </w:tcBorders>
+            <w:shd w:fill="EEF2F7" w:color="auto" w:val="clear"/>
+            <w:tcMar>
+              <w:top w:type="dxa" w:w="80"/>
+              <w:left w:type="dxa" w:w="110"/>
+              <w:bottom w:type="dxa" w:w="80"/>
+              <w:right w:type="dxa" w:w="110"/>
+            </w:tcMar>
+          </w:tcPr>
+          <w:p>
+            <w:pPr>
+              <w:keepNext/>
+            </w:pPr>
+            <w:r>
+              <w:rPr>
+                <w:rFonts w:ascii="Calibri" w:cs="Calibri" w:eastAsia="Calibri" w:hAnsi="Calibri"/>
+                <w:b w:val="false"/>
+                <w:bCs w:val="false"/>
+                <w:sz w:val="19"/>
+                <w:szCs w:val="19"/>
+              </w:rPr>
+              <w:t xml:space="preserve">Low: industrial inks for plastic, glass and metal</w:t>
+            </w:r>
+          </w:p>
+        </w:tc>
+      </w:tr>
+      <w:tr>
+        <w:trPr>
+          <w:cantSplit/>
+        </w:trPr>
+        <w:tc>
+          <w:tcPr>
+            <w:tcW w:type="dxa" w:w="2500"/>
+            <w:tcBorders>
+              <w:top w:val="single" w:color="C9D1DC" w:sz="4"/>
+              <w:left w:val="single" w:color="C9D1DC" w:sz="4"/>
+              <w:bottom w:val="single" w:color="C9D1DC" w:sz="4"/>
+              <w:right w:val="single" w:color="C9D1DC" w:sz="4"/>
+            </w:tcBorders>
+            <w:tcMar>
+              <w:top w:type="dxa" w:w="80"/>
+              <w:left w:type="dxa" w:w="110"/>
+              <w:bottom w:type="dxa" w:w="80"/>
+              <w:right w:type="dxa" w:w="110"/>
+            </w:tcMar>
+          </w:tcPr>
+          <w:p>
+            <w:pPr>
+              <w:keepNext/>
+            </w:pPr>
+            <w:r>
+              <w:rPr>
+                <w:rFonts w:ascii="Calibri" w:cs="Calibri" w:eastAsia="Calibri" w:hAnsi="Calibri"/>
+                <w:b/>
+                <w:bCs/>
+                <w:sz w:val="19"/>
+                <w:szCs w:val="19"/>
+              </w:rPr>
+              <w:t xml:space="preserve">Tampoprint (Germany)</w:t>
+            </w:r>
+          </w:p>
+        </w:tc>
+        <w:tc>
+          <w:tcPr>
+            <w:tcW w:type="dxa" w:w="2500"/>
+            <w:tcBorders>
+              <w:top w:val="single" w:color="C9D1DC" w:sz="4"/>
+              <w:left w:val="single" w:color="C9D1DC" w:sz="4"/>
+              <w:bottom w:val="single" w:color="C9D1DC" w:sz="4"/>
+              <w:right w:val="single" w:color="C9D1DC" w:sz="4"/>
+            </w:tcBorders>
+            <w:tcMar>
+              <w:top w:type="dxa" w:w="80"/>
+              <w:left w:type="dxa" w:w="110"/>
+              <w:bottom w:type="dxa" w:w="80"/>
+              <w:right w:type="dxa" w:w="110"/>
+            </w:tcMar>
+          </w:tcPr>
+          <w:p>
+            <w:pPr>
+              <w:keepNext/>
+            </w:pPr>
+            <w:r>
+              <w:rPr>
+                <w:rFonts w:ascii="Calibri" w:cs="Calibri" w:eastAsia="Calibri" w:hAnsi="Calibri"/>
+                <w:b w:val="false"/>
+                <w:bCs w:val="false"/>
+                <w:sz w:val="19"/>
+                <w:szCs w:val="19"/>
+              </w:rPr>
+              <w:t xml:space="preserve">Mexican subsidiary; pad printing machines and inks</w:t>
+            </w:r>
+          </w:p>
+        </w:tc>
+        <w:tc>
+          <w:tcPr>
+            <w:tcW w:type="dxa" w:w="2700"/>
+            <w:tcBorders>
+              <w:top w:val="single" w:color="C9D1DC" w:sz="4"/>
+              <w:left w:val="single" w:color="C9D1DC" w:sz="4"/>
+              <w:bottom w:val="single" w:color="C9D1DC" w:sz="4"/>
+              <w:right w:val="single" w:color="C9D1DC" w:sz="4"/>
+            </w:tcBorders>
+            <w:tcMar>
+              <w:top w:type="dxa" w:w="80"/>
+              <w:left w:type="dxa" w:w="110"/>
+              <w:bottom w:type="dxa" w:w="80"/>
+              <w:right w:type="dxa" w:w="110"/>
+            </w:tcMar>
+          </w:tcPr>
+          <w:p>
+            <w:pPr>
+              <w:keepNext/>
+            </w:pPr>
+            <w:r>
+              <w:rPr>
+                <w:rFonts w:ascii="Calibri" w:cs="Calibri" w:eastAsia="Calibri" w:hAnsi="Calibri"/>
+                <w:b w:val="false"/>
+                <w:bCs w:val="false"/>
+                <w:sz w:val="19"/>
+                <w:szCs w:val="19"/>
+              </w:rPr>
+              <w:t xml:space="preserve">High</w:t>
+            </w:r>
+          </w:p>
+        </w:tc>
+        <w:tc>
+          <w:tcPr>
+            <w:tcW w:type="dxa" w:w="1660"/>
+            <w:tcBorders>
+              <w:top w:val="single" w:color="C9D1DC" w:sz="4"/>
+              <w:left w:val="single" w:color="C9D1DC" w:sz="4"/>
+              <w:bottom w:val="single" w:color="C9D1DC" w:sz="4"/>
+              <w:right w:val="single" w:color="C9D1DC" w:sz="4"/>
+            </w:tcBorders>
+            <w:tcMar>
+              <w:top w:type="dxa" w:w="80"/>
+              <w:left w:type="dxa" w:w="110"/>
+              <w:bottom w:type="dxa" w:w="80"/>
+              <w:right w:type="dxa" w:w="110"/>
+            </w:tcMar>
+          </w:tcPr>
+          <w:p>
+            <w:pPr>
+              <w:keepNext/>
+            </w:pPr>
+            <w:r>
+              <w:rPr>
+                <w:rFonts w:ascii="Calibri" w:cs="Calibri" w:eastAsia="Calibri" w:hAnsi="Calibri"/>
+                <w:b w:val="false"/>
+                <w:bCs w:val="false"/>
+                <w:sz w:val="19"/>
+                <w:szCs w:val="19"/>
+              </w:rPr>
+              <w:t xml:space="preserve">Low: tagless labels only</w:t>
+            </w:r>
+          </w:p>
+        </w:tc>
+      </w:tr>
+      <w:tr>
+        <w:trPr>
+          <w:cantSplit/>
+        </w:trPr>
+        <w:tc>
+          <w:tcPr>
+            <w:tcW w:type="dxa" w:w="2500"/>
+            <w:tcBorders>
+              <w:top w:val="single" w:color="C9D1DC" w:sz="4"/>
+              <w:left w:val="single" w:color="C9D1DC" w:sz="4"/>
+              <w:bottom w:val="single" w:color="C9D1DC" w:sz="4"/>
+              <w:right w:val="single" w:color="C9D1DC" w:sz="4"/>
+            </w:tcBorders>
+            <w:shd w:fill="EEF2F7" w:color="auto" w:val="clear"/>
+            <w:tcMar>
+              <w:top w:type="dxa" w:w="80"/>
+              <w:left w:type="dxa" w:w="110"/>
+              <w:bottom w:type="dxa" w:w="80"/>
+              <w:right w:type="dxa" w:w="110"/>
+            </w:tcMar>
+          </w:tcPr>
+          <w:p>
+            <w:pPr>
+              <w:keepNext/>
+            </w:pPr>
+            <w:r>
+              <w:rPr>
+                <w:rFonts w:ascii="Calibri" w:cs="Calibri" w:eastAsia="Calibri" w:hAnsi="Calibri"/>
+                <w:b/>
+                <w:bCs/>
+                <w:sz w:val="19"/>
+                <w:szCs w:val="19"/>
+              </w:rPr>
+              <w:t xml:space="preserve">Low-cost Mexican brands: Dyssa, Celi Colors, Quitexa, De la Rana</w:t>
+            </w:r>
+          </w:p>
+        </w:tc>
+        <w:tc>
+          <w:tcPr>
+            <w:tcW w:type="dxa" w:w="2500"/>
+            <w:tcBorders>
+              <w:top w:val="single" w:color="C9D1DC" w:sz="4"/>
+              <w:left w:val="single" w:color="C9D1DC" w:sz="4"/>
+              <w:bottom w:val="single" w:color="C9D1DC" w:sz="4"/>
+              <w:right w:val="single" w:color="C9D1DC" w:sz="4"/>
+            </w:tcBorders>
+            <w:shd w:fill="EEF2F7" w:color="auto" w:val="clear"/>
+            <w:tcMar>
+              <w:top w:type="dxa" w:w="80"/>
+              <w:left w:type="dxa" w:w="110"/>
+              <w:bottom w:type="dxa" w:w="80"/>
+              <w:right w:type="dxa" w:w="110"/>
+            </w:tcMar>
+          </w:tcPr>
+          <w:p>
+            <w:pPr>
+              <w:keepNext/>
+            </w:pPr>
+            <w:r>
+              <w:rPr>
+                <w:rFonts w:ascii="Calibri" w:cs="Calibri" w:eastAsia="Calibri" w:hAnsi="Calibri"/>
+                <w:b w:val="false"/>
+                <w:bCs w:val="false"/>
+                <w:sz w:val="19"/>
+                <w:szCs w:val="19"/>
+              </w:rPr>
+              <w:t xml:space="preserve">Retail, Mercado Libre, screen printing stores</w:t>
+            </w:r>
+          </w:p>
+        </w:tc>
+        <w:tc>
+          <w:tcPr>
+            <w:tcW w:type="dxa" w:w="2700"/>
+            <w:tcBorders>
+              <w:top w:val="single" w:color="C9D1DC" w:sz="4"/>
+              <w:left w:val="single" w:color="C9D1DC" w:sz="4"/>
+              <w:bottom w:val="single" w:color="C9D1DC" w:sz="4"/>
+              <w:right w:val="single" w:color="C9D1DC" w:sz="4"/>
+            </w:tcBorders>
+            <w:shd w:fill="EEF2F7" w:color="auto" w:val="clear"/>
+            <w:tcMar>
+              <w:top w:type="dxa" w:w="80"/>
+              <w:left w:type="dxa" w:w="110"/>
+              <w:bottom w:type="dxa" w:w="80"/>
+              <w:right w:type="dxa" w:w="110"/>
+            </w:tcMar>
+          </w:tcPr>
+          <w:p>
+            <w:pPr>
+              <w:keepNext/>
+            </w:pPr>
+            <w:r>
+              <w:rPr>
+                <w:rFonts w:ascii="Calibri" w:cs="Calibri" w:eastAsia="Calibri" w:hAnsi="Calibri"/>
+                <w:b w:val="false"/>
+                <w:bCs w:val="false"/>
+                <w:sz w:val="19"/>
+                <w:szCs w:val="19"/>
+              </w:rPr>
+              <w:t xml:space="preserve">Very low: plastisol white ~MXN 790/gallon</w:t>
+            </w:r>
+          </w:p>
+        </w:tc>
+        <w:tc>
+          <w:tcPr>
+            <w:tcW w:type="dxa" w:w="1660"/>
+            <w:tcBorders>
+              <w:top w:val="single" w:color="C9D1DC" w:sz="4"/>
+              <w:left w:val="single" w:color="C9D1DC" w:sz="4"/>
+              <w:bottom w:val="single" w:color="C9D1DC" w:sz="4"/>
+              <w:right w:val="single" w:color="C9D1DC" w:sz="4"/>
+            </w:tcBorders>
+            <w:shd w:fill="EEF2F7" w:color="auto" w:val="clear"/>
+            <w:tcMar>
+              <w:top w:type="dxa" w:w="80"/>
+              <w:left w:type="dxa" w:w="110"/>
+              <w:bottom w:type="dxa" w:w="80"/>
+              <w:right w:type="dxa" w:w="110"/>
+            </w:tcMar>
+          </w:tcPr>
+          <w:p>
+            <w:pPr>
+              <w:keepNext/>
+            </w:pPr>
+            <w:r>
+              <w:rPr>
+                <w:rFonts w:ascii="Calibri" w:cs="Calibri" w:eastAsia="Calibri" w:hAnsi="Calibri"/>
+                <w:b w:val="false"/>
+                <w:bCs w:val="false"/>
+                <w:sz w:val="19"/>
+                <w:szCs w:val="19"/>
+              </w:rPr>
+              <w:t xml:space="preserve">Mid with small shops</w:t>
+            </w:r>
+          </w:p>
+        </w:tc>
+      </w:tr>
+      <w:tr>
+        <w:trPr>
+          <w:cantSplit/>
+        </w:trPr>
+        <w:tc>
+          <w:tcPr>
+            <w:tcW w:type="dxa" w:w="2500"/>
+            <w:tcBorders>
+              <w:top w:val="single" w:color="C9D1DC" w:sz="4"/>
+              <w:left w:val="single" w:color="C9D1DC" w:sz="4"/>
+              <w:bottom w:val="single" w:color="C9D1DC" w:sz="4"/>
+              <w:right w:val="single" w:color="C9D1DC" w:sz="4"/>
+            </w:tcBorders>
+            <w:tcMar>
+              <w:top w:type="dxa" w:w="80"/>
+              <w:left w:type="dxa" w:w="110"/>
+              <w:bottom w:type="dxa" w:w="80"/>
+              <w:right w:type="dxa" w:w="110"/>
+            </w:tcMar>
+          </w:tcPr>
+          <w:p>
+            <w:pPr>
+              <w:keepNext w:val="false"/>
+            </w:pPr>
+            <w:r>
+              <w:rPr>
+                <w:rFonts w:ascii="Calibri" w:cs="Calibri" w:eastAsia="Calibri" w:hAnsi="Calibri"/>
+                <w:b/>
+                <w:bCs/>
+                <w:sz w:val="19"/>
+                <w:szCs w:val="19"/>
+              </w:rPr>
+              <w:t xml:space="preserve">Direct Chinese suppliers (Alibaba)</w:t>
+            </w:r>
+          </w:p>
+        </w:tc>
+        <w:tc>
+          <w:tcPr>
+            <w:tcW w:type="dxa" w:w="2500"/>
+            <w:tcBorders>
+              <w:top w:val="single" w:color="C9D1DC" w:sz="4"/>
+              <w:left w:val="single" w:color="C9D1DC" w:sz="4"/>
+              <w:bottom w:val="single" w:color="C9D1DC" w:sz="4"/>
+              <w:right w:val="single" w:color="C9D1DC" w:sz="4"/>
+            </w:tcBorders>
+            <w:tcMar>
+              <w:top w:type="dxa" w:w="80"/>
+              <w:left w:type="dxa" w:w="110"/>
+              <w:bottom w:type="dxa" w:w="80"/>
+              <w:right w:type="dxa" w:w="110"/>
+            </w:tcMar>
+          </w:tcPr>
+          <w:p>
+            <w:pPr>
+              <w:keepNext w:val="false"/>
+            </w:pPr>
+            <w:r>
+              <w:rPr>
+                <w:rFonts w:ascii="Calibri" w:cs="Calibri" w:eastAsia="Calibri" w:hAnsi="Calibri"/>
+                <w:b w:val="false"/>
+                <w:bCs w:val="false"/>
+                <w:sz w:val="19"/>
+                <w:szCs w:val="19"/>
+              </w:rPr>
+              <w:t xml:space="preserve">Online sales with no local service</w:t>
+            </w:r>
+          </w:p>
+        </w:tc>
+        <w:tc>
+          <w:tcPr>
+            <w:tcW w:type="dxa" w:w="2700"/>
+            <w:tcBorders>
+              <w:top w:val="single" w:color="C9D1DC" w:sz="4"/>
+              <w:left w:val="single" w:color="C9D1DC" w:sz="4"/>
+              <w:bottom w:val="single" w:color="C9D1DC" w:sz="4"/>
+              <w:right w:val="single" w:color="C9D1DC" w:sz="4"/>
+            </w:tcBorders>
+            <w:tcMar>
+              <w:top w:type="dxa" w:w="80"/>
+              <w:left w:type="dxa" w:w="110"/>
+              <w:bottom w:type="dxa" w:w="80"/>
+              <w:right w:type="dxa" w:w="110"/>
+            </w:tcMar>
+          </w:tcPr>
+          <w:p>
+            <w:pPr>
+              <w:keepNext w:val="false"/>
+            </w:pPr>
+            <w:r>
+              <w:rPr>
+                <w:rFonts w:ascii="Calibri" w:cs="Calibri" w:eastAsia="Calibri" w:hAnsi="Calibri"/>
+                <w:b w:val="false"/>
+                <w:bCs w:val="false"/>
+                <w:sz w:val="19"/>
+                <w:szCs w:val="19"/>
+              </w:rPr>
+              <w:t xml:space="preserve">Very low: silicone ~€3.5–5.2/kg</w:t>
+            </w:r>
+          </w:p>
+        </w:tc>
+        <w:tc>
+          <w:tcPr>
+            <w:tcW w:type="dxa" w:w="1660"/>
+            <w:tcBorders>
+              <w:top w:val="single" w:color="C9D1DC" w:sz="4"/>
+              <w:left w:val="single" w:color="C9D1DC" w:sz="4"/>
+              <w:bottom w:val="single" w:color="C9D1DC" w:sz="4"/>
+              <w:right w:val="single" w:color="C9D1DC" w:sz="4"/>
+            </w:tcBorders>
+            <w:tcMar>
+              <w:top w:type="dxa" w:w="80"/>
+              <w:left w:type="dxa" w:w="110"/>
+              <w:bottom w:type="dxa" w:w="80"/>
+              <w:right w:type="dxa" w:w="110"/>
+            </w:tcMar>
+          </w:tcPr>
+          <w:p>
+            <w:pPr>
+              <w:keepNext w:val="false"/>
+            </w:pPr>
+            <w:r>
+              <w:rPr>
+                <w:rFonts w:ascii="Calibri" w:cs="Calibri" w:eastAsia="Calibri" w:hAnsi="Calibri"/>
+                <w:b w:val="false"/>
+                <w:bCs w:val="false"/>
+                <w:sz w:val="19"/>
+                <w:szCs w:val="19"/>
+              </w:rPr>
+              <w:t xml:space="preserve">Mid: same origin as CLT</w:t>
+            </w:r>
+          </w:p>
+        </w:tc>
+      </w:tr>
+    </w:tbl>
+    <w:p>
+      <w:pPr>
+        <w:spacing w:after="120"/>
+      </w:pPr>
+    </w:p>
+    <w:p>
+      <w:pPr>
+        <w:spacing w:after="200" w:before="80"/>
+      </w:pPr>
+      <w:r>
+        <w:rPr>
+          <w:i/>
+          <w:iCs/>
+          <w:color w:val="555555"/>
+          <w:sz w:val="18"/>
+          <w:szCs w:val="18"/>
+        </w:rPr>
+        <w:t xml:space="preserve">Comex does not make textile screen printing inks: it is an architectural paint brand. Public prices as of October 2026, for reference only; CLT’s price for Mexico is to be confirmed.</w:t>
+      </w:r>
+    </w:p>
+    <w:p>
+      <w:pPr>
+        <w:pStyle w:val="Heading2"/>
+      </w:pPr>
+      <w:r>
+        <w:t xml:space="preserve">SWOT by competitor</w:t>
+      </w:r>
+    </w:p>
+    <w:tbl>
+      <w:tblPr>
+        <w:tblW w:type="dxa" w:w="9360"/>
+        <w:tblBorders>
+          <w:top w:val="single" w:color="auto" w:sz="4"/>
+          <w:left w:val="single" w:color="auto" w:sz="4"/>
+          <w:bottom w:val="single" w:color="auto" w:sz="4"/>
+          <w:right w:val="single" w:color="auto" w:sz="4"/>
+          <w:insideH w:val="single" w:color="auto" w:sz="4"/>
+          <w:insideV w:val="single" w:color="auto" w:sz="4"/>
+        </w:tblBorders>
+      </w:tblPr>
+      <w:tblGrid>
+        <w:gridCol w:w="1560"/>
+        <w:gridCol w:w="1950"/>
+        <w:gridCol w:w="1950"/>
+        <w:gridCol w:w="1950"/>
+        <w:gridCol w:w="1950"/>
+      </w:tblGrid>
+      <w:tr>
+        <w:trPr>
+          <w:cantSplit/>
+          <w:tblHeader/>
+        </w:trPr>
+        <w:tc>
+          <w:tcPr>
+            <w:tcW w:type="dxa" w:w="1560"/>
+            <w:tcBorders>
+              <w:top w:val="single" w:color="C9D1DC" w:sz="4"/>
+              <w:left w:val="single" w:color="C9D1DC" w:sz="4"/>
+              <w:bottom w:val="single" w:color="C9D1DC" w:sz="4"/>
+              <w:right w:val="single" w:color="C9D1DC" w:sz="4"/>
+            </w:tcBorders>
+            <w:shd w:fill="1B1F3B" w:color="auto" w:val="clear"/>
+            <w:tcMar>
+              <w:top w:type="dxa" w:w="80"/>
+              <w:left w:type="dxa" w:w="110"/>
+              <w:bottom w:type="dxa" w:w="80"/>
+              <w:right w:type="dxa" w:w="110"/>
+            </w:tcMar>
+          </w:tcPr>
+          <w:p>
+            <w:pPr>
+              <w:keepNext/>
+            </w:pPr>
+            <w:r>
+              <w:rPr>
+                <w:rFonts w:ascii="Calibri" w:cs="Calibri" w:eastAsia="Calibri" w:hAnsi="Calibri"/>
+                <w:b/>
+                <w:bCs/>
+                <w:color w:val="FFFFFF"/>
+                <w:sz w:val="19"/>
+                <w:szCs w:val="19"/>
+              </w:rPr>
+              <w:t xml:space="preserve">Competitor</w:t>
+            </w:r>
+          </w:p>
+        </w:tc>
+        <w:tc>
+          <w:tcPr>
+            <w:tcW w:type="dxa" w:w="1950"/>
+            <w:tcBorders>
+              <w:top w:val="single" w:color="C9D1DC" w:sz="4"/>
+              <w:left w:val="single" w:color="C9D1DC" w:sz="4"/>
+              <w:bottom w:val="single" w:color="C9D1DC" w:sz="4"/>
+              <w:right w:val="single" w:color="C9D1DC" w:sz="4"/>
+            </w:tcBorders>
+            <w:shd w:fill="1B1F3B" w:color="auto" w:val="clear"/>
+            <w:tcMar>
+              <w:top w:type="dxa" w:w="80"/>
+              <w:left w:type="dxa" w:w="110"/>
+              <w:bottom w:type="dxa" w:w="80"/>
+              <w:right w:type="dxa" w:w="110"/>
+            </w:tcMar>
+          </w:tcPr>
+          <w:p>
+            <w:pPr>
+              <w:keepNext/>
+            </w:pPr>
+            <w:r>
+              <w:rPr>
+                <w:rFonts w:ascii="Calibri" w:cs="Calibri" w:eastAsia="Calibri" w:hAnsi="Calibri"/>
+                <w:b/>
+                <w:bCs/>
+                <w:color w:val="FFFFFF"/>
+                <w:sz w:val="19"/>
+                <w:szCs w:val="19"/>
+              </w:rPr>
+              <w:t xml:space="preserve">Strengths</w:t>
+            </w:r>
+          </w:p>
+        </w:tc>
+        <w:tc>
+          <w:tcPr>
+            <w:tcW w:type="dxa" w:w="1950"/>
+            <w:tcBorders>
+              <w:top w:val="single" w:color="C9D1DC" w:sz="4"/>
+              <w:left w:val="single" w:color="C9D1DC" w:sz="4"/>
+              <w:bottom w:val="single" w:color="C9D1DC" w:sz="4"/>
+              <w:right w:val="single" w:color="C9D1DC" w:sz="4"/>
+            </w:tcBorders>
+            <w:shd w:fill="1B1F3B" w:color="auto" w:val="clear"/>
+            <w:tcMar>
+              <w:top w:type="dxa" w:w="80"/>
+              <w:left w:type="dxa" w:w="110"/>
+              <w:bottom w:type="dxa" w:w="80"/>
+              <w:right w:type="dxa" w:w="110"/>
+            </w:tcMar>
+          </w:tcPr>
+          <w:p>
+            <w:pPr>
+              <w:keepNext/>
+            </w:pPr>
+            <w:r>
+              <w:rPr>
+                <w:rFonts w:ascii="Calibri" w:cs="Calibri" w:eastAsia="Calibri" w:hAnsi="Calibri"/>
+                <w:b/>
+                <w:bCs/>
+                <w:color w:val="FFFFFF"/>
+                <w:sz w:val="19"/>
+                <w:szCs w:val="19"/>
+              </w:rPr>
+              <w:t xml:space="preserve">Weaknesses</w:t>
+            </w:r>
+          </w:p>
+        </w:tc>
+        <w:tc>
+          <w:tcPr>
+            <w:tcW w:type="dxa" w:w="1950"/>
+            <w:tcBorders>
+              <w:top w:val="single" w:color="C9D1DC" w:sz="4"/>
+              <w:left w:val="single" w:color="C9D1DC" w:sz="4"/>
+              <w:bottom w:val="single" w:color="C9D1DC" w:sz="4"/>
+              <w:right w:val="single" w:color="C9D1DC" w:sz="4"/>
+            </w:tcBorders>
+            <w:shd w:fill="1B1F3B" w:color="auto" w:val="clear"/>
+            <w:tcMar>
+              <w:top w:type="dxa" w:w="80"/>
+              <w:left w:type="dxa" w:w="110"/>
+              <w:bottom w:type="dxa" w:w="80"/>
+              <w:right w:type="dxa" w:w="110"/>
+            </w:tcMar>
+          </w:tcPr>
+          <w:p>
+            <w:pPr>
+              <w:keepNext/>
+            </w:pPr>
+            <w:r>
+              <w:rPr>
+                <w:rFonts w:ascii="Calibri" w:cs="Calibri" w:eastAsia="Calibri" w:hAnsi="Calibri"/>
+                <w:b/>
+                <w:bCs/>
+                <w:color w:val="FFFFFF"/>
+                <w:sz w:val="19"/>
+                <w:szCs w:val="19"/>
+              </w:rPr>
+              <w:t xml:space="preserve">Opportunity for CLT</w:t>
+            </w:r>
+          </w:p>
+        </w:tc>
+        <w:tc>
+          <w:tcPr>
+            <w:tcW w:type="dxa" w:w="1950"/>
+            <w:tcBorders>
+              <w:top w:val="single" w:color="C9D1DC" w:sz="4"/>
+              <w:left w:val="single" w:color="C9D1DC" w:sz="4"/>
+              <w:bottom w:val="single" w:color="C9D1DC" w:sz="4"/>
+              <w:right w:val="single" w:color="C9D1DC" w:sz="4"/>
+            </w:tcBorders>
+            <w:shd w:fill="1B1F3B" w:color="auto" w:val="clear"/>
+            <w:tcMar>
+              <w:top w:type="dxa" w:w="80"/>
+              <w:left w:type="dxa" w:w="110"/>
+              <w:bottom w:type="dxa" w:w="80"/>
+              <w:right w:type="dxa" w:w="110"/>
+            </w:tcMar>
+          </w:tcPr>
+          <w:p>
+            <w:pPr>
+              <w:keepNext/>
+            </w:pPr>
+            <w:r>
+              <w:rPr>
+                <w:rFonts w:ascii="Calibri" w:cs="Calibri" w:eastAsia="Calibri" w:hAnsi="Calibri"/>
+                <w:b/>
+                <w:bCs/>
+                <w:color w:val="FFFFFF"/>
+                <w:sz w:val="19"/>
+                <w:szCs w:val="19"/>
+              </w:rPr>
+              <w:t xml:space="preserve">Threat to CLT</w:t>
+            </w:r>
+          </w:p>
+        </w:tc>
+      </w:tr>
+      <w:tr>
+        <w:trPr>
+          <w:cantSplit/>
+        </w:trPr>
+        <w:tc>
+          <w:tcPr>
+            <w:tcW w:type="dxa" w:w="1560"/>
+            <w:tcBorders>
+              <w:top w:val="single" w:color="C9D1DC" w:sz="4"/>
+              <w:left w:val="single" w:color="C9D1DC" w:sz="4"/>
+              <w:bottom w:val="single" w:color="C9D1DC" w:sz="4"/>
+              <w:right w:val="single" w:color="C9D1DC" w:sz="4"/>
+            </w:tcBorders>
+            <w:tcMar>
+              <w:top w:type="dxa" w:w="80"/>
+              <w:left w:type="dxa" w:w="110"/>
+              <w:bottom w:type="dxa" w:w="80"/>
+              <w:right w:type="dxa" w:w="110"/>
+            </w:tcMar>
+          </w:tcPr>
+          <w:p>
+            <w:pPr>
+              <w:keepNext/>
+            </w:pPr>
+            <w:r>
+              <w:rPr>
+                <w:rFonts w:ascii="Calibri" w:cs="Calibri" w:eastAsia="Calibri" w:hAnsi="Calibri"/>
+                <w:b/>
+                <w:bCs/>
+                <w:sz w:val="19"/>
+                <w:szCs w:val="19"/>
+              </w:rPr>
+              <w:t xml:space="preserve">Avient (Wilflex, Rutland)</w:t>
+            </w:r>
+          </w:p>
+        </w:tc>
+        <w:tc>
+          <w:tcPr>
+            <w:tcW w:type="dxa" w:w="1950"/>
+            <w:tcBorders>
+              <w:top w:val="single" w:color="C9D1DC" w:sz="4"/>
+              <w:left w:val="single" w:color="C9D1DC" w:sz="4"/>
+              <w:bottom w:val="single" w:color="C9D1DC" w:sz="4"/>
+              <w:right w:val="single" w:color="C9D1DC" w:sz="4"/>
+            </w:tcBorders>
+            <w:tcMar>
+              <w:top w:type="dxa" w:w="80"/>
+              <w:left w:type="dxa" w:w="110"/>
+              <w:bottom w:type="dxa" w:w="80"/>
+              <w:right w:type="dxa" w:w="110"/>
+            </w:tcMar>
+          </w:tcPr>
+          <w:p>
+            <w:pPr>
+              <w:keepNext/>
+            </w:pPr>
+            <w:r>
+              <w:rPr>
+                <w:rFonts w:ascii="Calibri" w:cs="Calibri" w:eastAsia="Calibri" w:hAnsi="Calibri"/>
+                <w:b w:val="false"/>
+                <w:bCs w:val="false"/>
+                <w:sz w:val="19"/>
+                <w:szCs w:val="19"/>
+              </w:rPr>
+              <w:t xml:space="preserve">Global brand; certified inks approved by brands; full range</w:t>
+            </w:r>
+          </w:p>
+        </w:tc>
+        <w:tc>
+          <w:tcPr>
+            <w:tcW w:type="dxa" w:w="1950"/>
+            <w:tcBorders>
+              <w:top w:val="single" w:color="C9D1DC" w:sz="4"/>
+              <w:left w:val="single" w:color="C9D1DC" w:sz="4"/>
+              <w:bottom w:val="single" w:color="C9D1DC" w:sz="4"/>
+              <w:right w:val="single" w:color="C9D1DC" w:sz="4"/>
+            </w:tcBorders>
+            <w:tcMar>
+              <w:top w:type="dxa" w:w="80"/>
+              <w:left w:type="dxa" w:w="110"/>
+              <w:bottom w:type="dxa" w:w="80"/>
+              <w:right w:type="dxa" w:w="110"/>
+            </w:tcMar>
+          </w:tcPr>
+          <w:p>
+            <w:pPr>
+              <w:keepNext/>
+            </w:pPr>
+            <w:r>
+              <w:rPr>
+                <w:rFonts w:ascii="Calibri" w:cs="Calibri" w:eastAsia="Calibri" w:hAnsi="Calibri"/>
+                <w:b w:val="false"/>
+                <w:bCs w:val="false"/>
+                <w:sz w:val="19"/>
+                <w:szCs w:val="19"/>
+              </w:rPr>
+              <w:t xml:space="preserve">High price; imported; very expensive specialties</w:t>
+            </w:r>
+          </w:p>
+        </w:tc>
+        <w:tc>
+          <w:tcPr>
+            <w:tcW w:type="dxa" w:w="1950"/>
+            <w:tcBorders>
+              <w:top w:val="single" w:color="C9D1DC" w:sz="4"/>
+              <w:left w:val="single" w:color="C9D1DC" w:sz="4"/>
+              <w:bottom w:val="single" w:color="C9D1DC" w:sz="4"/>
+              <w:right w:val="single" w:color="C9D1DC" w:sz="4"/>
+            </w:tcBorders>
+            <w:tcMar>
+              <w:top w:type="dxa" w:w="80"/>
+              <w:left w:type="dxa" w:w="110"/>
+              <w:bottom w:type="dxa" w:w="80"/>
+              <w:right w:type="dxa" w:w="110"/>
+            </w:tcMar>
+          </w:tcPr>
+          <w:p>
+            <w:pPr>
+              <w:keepNext/>
+            </w:pPr>
+            <w:r>
+              <w:rPr>
+                <w:rFonts w:ascii="Calibri" w:cs="Calibri" w:eastAsia="Calibri" w:hAnsi="Calibri"/>
+                <w:b w:val="false"/>
+                <w:bCs w:val="false"/>
+                <w:sz w:val="19"/>
+                <w:szCs w:val="19"/>
+              </w:rPr>
+              <w:t xml:space="preserve">Silicones and special effects at a lower price; water-based</w:t>
+            </w:r>
+          </w:p>
+        </w:tc>
+        <w:tc>
+          <w:tcPr>
+            <w:tcW w:type="dxa" w:w="1950"/>
+            <w:tcBorders>
+              <w:top w:val="single" w:color="C9D1DC" w:sz="4"/>
+              <w:left w:val="single" w:color="C9D1DC" w:sz="4"/>
+              <w:bottom w:val="single" w:color="C9D1DC" w:sz="4"/>
+              <w:right w:val="single" w:color="C9D1DC" w:sz="4"/>
+            </w:tcBorders>
+            <w:tcMar>
+              <w:top w:type="dxa" w:w="80"/>
+              <w:left w:type="dxa" w:w="110"/>
+              <w:bottom w:type="dxa" w:w="80"/>
+              <w:right w:type="dxa" w:w="110"/>
+            </w:tcMar>
+          </w:tcPr>
+          <w:p>
+            <w:pPr>
+              <w:keepNext/>
+            </w:pPr>
+            <w:r>
+              <w:rPr>
+                <w:rFonts w:ascii="Calibri" w:cs="Calibri" w:eastAsia="Calibri" w:hAnsi="Calibri"/>
+                <w:b w:val="false"/>
+                <w:bCs w:val="false"/>
+                <w:sz w:val="19"/>
+                <w:szCs w:val="19"/>
+              </w:rPr>
+              <w:t xml:space="preserve">Export brands already have approved inks: switching is slow</w:t>
+            </w:r>
+          </w:p>
+        </w:tc>
+      </w:tr>
+      <w:tr>
+        <w:trPr>
+          <w:cantSplit/>
+        </w:trPr>
+        <w:tc>
+          <w:tcPr>
+            <w:tcW w:type="dxa" w:w="1560"/>
+            <w:tcBorders>
+              <w:top w:val="single" w:color="C9D1DC" w:sz="4"/>
+              <w:left w:val="single" w:color="C9D1DC" w:sz="4"/>
+              <w:bottom w:val="single" w:color="C9D1DC" w:sz="4"/>
+              <w:right w:val="single" w:color="C9D1DC" w:sz="4"/>
+            </w:tcBorders>
+            <w:shd w:fill="EEF2F7" w:color="auto" w:val="clear"/>
+            <w:tcMar>
+              <w:top w:type="dxa" w:w="80"/>
+              <w:left w:type="dxa" w:w="110"/>
+              <w:bottom w:type="dxa" w:w="80"/>
+              <w:right w:type="dxa" w:w="110"/>
+            </w:tcMar>
+          </w:tcPr>
+          <w:p>
+            <w:pPr>
+              <w:keepNext/>
+            </w:pPr>
+            <w:r>
+              <w:rPr>
+                <w:rFonts w:ascii="Calibri" w:cs="Calibri" w:eastAsia="Calibri" w:hAnsi="Calibri"/>
+                <w:b/>
+                <w:bCs/>
+                <w:sz w:val="19"/>
+                <w:szCs w:val="19"/>
+              </w:rPr>
+              <w:t xml:space="preserve">Grupo Sánchez / ScreenTec</w:t>
+            </w:r>
+          </w:p>
+        </w:tc>
+        <w:tc>
+          <w:tcPr>
+            <w:tcW w:type="dxa" w:w="1950"/>
+            <w:tcBorders>
+              <w:top w:val="single" w:color="C9D1DC" w:sz="4"/>
+              <w:left w:val="single" w:color="C9D1DC" w:sz="4"/>
+              <w:bottom w:val="single" w:color="C9D1DC" w:sz="4"/>
+              <w:right w:val="single" w:color="C9D1DC" w:sz="4"/>
+            </w:tcBorders>
+            <w:shd w:fill="EEF2F7" w:color="auto" w:val="clear"/>
+            <w:tcMar>
+              <w:top w:type="dxa" w:w="80"/>
+              <w:left w:type="dxa" w:w="110"/>
+              <w:bottom w:type="dxa" w:w="80"/>
+              <w:right w:type="dxa" w:w="110"/>
+            </w:tcMar>
+          </w:tcPr>
+          <w:p>
+            <w:pPr>
+              <w:keepNext/>
+            </w:pPr>
+            <w:r>
+              <w:rPr>
+                <w:rFonts w:ascii="Calibri" w:cs="Calibri" w:eastAsia="Calibri" w:hAnsi="Calibri"/>
+                <w:b w:val="false"/>
+                <w:bCs w:val="false"/>
+                <w:sz w:val="19"/>
+                <w:szCs w:val="19"/>
+              </w:rPr>
+              <w:t xml:space="preserve">Domestic maker; low price; dealer network; Siltex silicones</w:t>
+            </w:r>
+          </w:p>
+        </w:tc>
+        <w:tc>
+          <w:tcPr>
+            <w:tcW w:type="dxa" w:w="1950"/>
+            <w:tcBorders>
+              <w:top w:val="single" w:color="C9D1DC" w:sz="4"/>
+              <w:left w:val="single" w:color="C9D1DC" w:sz="4"/>
+              <w:bottom w:val="single" w:color="C9D1DC" w:sz="4"/>
+              <w:right w:val="single" w:color="C9D1DC" w:sz="4"/>
+            </w:tcBorders>
+            <w:shd w:fill="EEF2F7" w:color="auto" w:val="clear"/>
+            <w:tcMar>
+              <w:top w:type="dxa" w:w="80"/>
+              <w:left w:type="dxa" w:w="110"/>
+              <w:bottom w:type="dxa" w:w="80"/>
+              <w:right w:type="dxa" w:w="110"/>
+            </w:tcMar>
+          </w:tcPr>
+          <w:p>
+            <w:pPr>
+              <w:keepNext/>
+            </w:pPr>
+            <w:r>
+              <w:rPr>
+                <w:rFonts w:ascii="Calibri" w:cs="Calibri" w:eastAsia="Calibri" w:hAnsi="Calibri"/>
+                <w:b w:val="false"/>
+                <w:bCs w:val="false"/>
+                <w:sz w:val="19"/>
+                <w:szCs w:val="19"/>
+              </w:rPr>
+              <w:t xml:space="preserve">No machines or hybrid line; focus on the domestic market</w:t>
+            </w:r>
+          </w:p>
+        </w:tc>
+        <w:tc>
+          <w:tcPr>
+            <w:tcW w:type="dxa" w:w="1950"/>
+            <w:tcBorders>
+              <w:top w:val="single" w:color="C9D1DC" w:sz="4"/>
+              <w:left w:val="single" w:color="C9D1DC" w:sz="4"/>
+              <w:bottom w:val="single" w:color="C9D1DC" w:sz="4"/>
+              <w:right w:val="single" w:color="C9D1DC" w:sz="4"/>
+            </w:tcBorders>
+            <w:shd w:fill="EEF2F7" w:color="auto" w:val="clear"/>
+            <w:tcMar>
+              <w:top w:type="dxa" w:w="80"/>
+              <w:left w:type="dxa" w:w="110"/>
+              <w:bottom w:type="dxa" w:w="80"/>
+              <w:right w:type="dxa" w:w="110"/>
+            </w:tcMar>
+          </w:tcPr>
+          <w:p>
+            <w:pPr>
+              <w:keepNext/>
+            </w:pPr>
+            <w:r>
+              <w:rPr>
+                <w:rFonts w:ascii="Calibri" w:cs="Calibri" w:eastAsia="Calibri" w:hAnsi="Calibri"/>
+                <w:b w:val="false"/>
+                <w:bCs w:val="false"/>
+                <w:sz w:val="19"/>
+                <w:szCs w:val="19"/>
+              </w:rPr>
+              <w:t xml:space="preserve">Turnkey package: machine + chemistry + service</w:t>
+            </w:r>
+          </w:p>
+        </w:tc>
+        <w:tc>
+          <w:tcPr>
+            <w:tcW w:type="dxa" w:w="1950"/>
+            <w:tcBorders>
+              <w:top w:val="single" w:color="C9D1DC" w:sz="4"/>
+              <w:left w:val="single" w:color="C9D1DC" w:sz="4"/>
+              <w:bottom w:val="single" w:color="C9D1DC" w:sz="4"/>
+              <w:right w:val="single" w:color="C9D1DC" w:sz="4"/>
+            </w:tcBorders>
+            <w:shd w:fill="EEF2F7" w:color="auto" w:val="clear"/>
+            <w:tcMar>
+              <w:top w:type="dxa" w:w="80"/>
+              <w:left w:type="dxa" w:w="110"/>
+              <w:bottom w:type="dxa" w:w="80"/>
+              <w:right w:type="dxa" w:w="110"/>
+            </w:tcMar>
+          </w:tcPr>
+          <w:p>
+            <w:pPr>
+              <w:keepNext/>
+            </w:pPr>
+            <w:r>
+              <w:rPr>
+                <w:rFonts w:ascii="Calibri" w:cs="Calibri" w:eastAsia="Calibri" w:hAnsi="Calibri"/>
+                <w:b w:val="false"/>
+                <w:bCs w:val="false"/>
+                <w:sz w:val="19"/>
+                <w:szCs w:val="19"/>
+              </w:rPr>
+              <w:t xml:space="preserve">Price war in consumables</w:t>
+            </w:r>
+          </w:p>
+        </w:tc>
+      </w:tr>
+      <w:tr>
+        <w:trPr>
+          <w:cantSplit/>
+        </w:trPr>
+        <w:tc>
+          <w:tcPr>
+            <w:tcW w:type="dxa" w:w="1560"/>
+            <w:tcBorders>
+              <w:top w:val="single" w:color="C9D1DC" w:sz="4"/>
+              <w:left w:val="single" w:color="C9D1DC" w:sz="4"/>
+              <w:bottom w:val="single" w:color="C9D1DC" w:sz="4"/>
+              <w:right w:val="single" w:color="C9D1DC" w:sz="4"/>
+            </w:tcBorders>
+            <w:tcMar>
+              <w:top w:type="dxa" w:w="80"/>
+              <w:left w:type="dxa" w:w="110"/>
+              <w:bottom w:type="dxa" w:w="80"/>
+              <w:right w:type="dxa" w:w="110"/>
+            </w:tcMar>
+          </w:tcPr>
+          <w:p>
+            <w:pPr>
+              <w:keepNext/>
+            </w:pPr>
+            <w:r>
+              <w:rPr>
+                <w:rFonts w:ascii="Calibri" w:cs="Calibri" w:eastAsia="Calibri" w:hAnsi="Calibri"/>
+                <w:b/>
+                <w:bCs/>
+                <w:sz w:val="19"/>
+                <w:szCs w:val="19"/>
+              </w:rPr>
+              <w:t xml:space="preserve">Matsui</w:t>
+            </w:r>
+          </w:p>
+        </w:tc>
+        <w:tc>
+          <w:tcPr>
+            <w:tcW w:type="dxa" w:w="1950"/>
+            <w:tcBorders>
+              <w:top w:val="single" w:color="C9D1DC" w:sz="4"/>
+              <w:left w:val="single" w:color="C9D1DC" w:sz="4"/>
+              <w:bottom w:val="single" w:color="C9D1DC" w:sz="4"/>
+              <w:right w:val="single" w:color="C9D1DC" w:sz="4"/>
+            </w:tcBorders>
+            <w:tcMar>
+              <w:top w:type="dxa" w:w="80"/>
+              <w:left w:type="dxa" w:w="110"/>
+              <w:bottom w:type="dxa" w:w="80"/>
+              <w:right w:type="dxa" w:w="110"/>
+            </w:tcMar>
+          </w:tcPr>
+          <w:p>
+            <w:pPr>
+              <w:keepNext/>
+            </w:pPr>
+            <w:r>
+              <w:rPr>
+                <w:rFonts w:ascii="Calibri" w:cs="Calibri" w:eastAsia="Calibri" w:hAnsi="Calibri"/>
+                <w:b w:val="false"/>
+                <w:bCs w:val="false"/>
+                <w:sz w:val="19"/>
+                <w:szCs w:val="19"/>
+              </w:rPr>
+              <w:t xml:space="preserve">Benchmark in water-based, discharge and specialties</w:t>
+            </w:r>
+          </w:p>
+        </w:tc>
+        <w:tc>
+          <w:tcPr>
+            <w:tcW w:type="dxa" w:w="1950"/>
+            <w:tcBorders>
+              <w:top w:val="single" w:color="C9D1DC" w:sz="4"/>
+              <w:left w:val="single" w:color="C9D1DC" w:sz="4"/>
+              <w:bottom w:val="single" w:color="C9D1DC" w:sz="4"/>
+              <w:right w:val="single" w:color="C9D1DC" w:sz="4"/>
+            </w:tcBorders>
+            <w:tcMar>
+              <w:top w:type="dxa" w:w="80"/>
+              <w:left w:type="dxa" w:w="110"/>
+              <w:bottom w:type="dxa" w:w="80"/>
+              <w:right w:type="dxa" w:w="110"/>
+            </w:tcMar>
+          </w:tcPr>
+          <w:p>
+            <w:pPr>
+              <w:keepNext/>
+            </w:pPr>
+            <w:r>
+              <w:rPr>
+                <w:rFonts w:ascii="Calibri" w:cs="Calibri" w:eastAsia="Calibri" w:hAnsi="Calibri"/>
+                <w:b w:val="false"/>
+                <w:bCs w:val="false"/>
+                <w:sz w:val="19"/>
+                <w:szCs w:val="19"/>
+              </w:rPr>
+              <w:t xml:space="preserve">Imported; mid-high price</w:t>
+            </w:r>
+          </w:p>
+        </w:tc>
+        <w:tc>
+          <w:tcPr>
+            <w:tcW w:type="dxa" w:w="1950"/>
+            <w:tcBorders>
+              <w:top w:val="single" w:color="C9D1DC" w:sz="4"/>
+              <w:left w:val="single" w:color="C9D1DC" w:sz="4"/>
+              <w:bottom w:val="single" w:color="C9D1DC" w:sz="4"/>
+              <w:right w:val="single" w:color="C9D1DC" w:sz="4"/>
+            </w:tcBorders>
+            <w:tcMar>
+              <w:top w:type="dxa" w:w="80"/>
+              <w:left w:type="dxa" w:w="110"/>
+              <w:bottom w:type="dxa" w:w="80"/>
+              <w:right w:type="dxa" w:w="110"/>
+            </w:tcMar>
+          </w:tcPr>
+          <w:p>
+            <w:pPr>
+              <w:keepNext/>
+            </w:pPr>
+            <w:r>
+              <w:rPr>
+                <w:rFonts w:ascii="Calibri" w:cs="Calibri" w:eastAsia="Calibri" w:hAnsi="Calibri"/>
+                <w:b w:val="false"/>
+                <w:bCs w:val="false"/>
+                <w:sz w:val="19"/>
+                <w:szCs w:val="19"/>
+              </w:rPr>
+              <w:t xml:space="preserve">Water-based pastes are 54% of CLT’s sales</w:t>
+            </w:r>
+          </w:p>
+        </w:tc>
+        <w:tc>
+          <w:tcPr>
+            <w:tcW w:type="dxa" w:w="1950"/>
+            <w:tcBorders>
+              <w:top w:val="single" w:color="C9D1DC" w:sz="4"/>
+              <w:left w:val="single" w:color="C9D1DC" w:sz="4"/>
+              <w:bottom w:val="single" w:color="C9D1DC" w:sz="4"/>
+              <w:right w:val="single" w:color="C9D1DC" w:sz="4"/>
+            </w:tcBorders>
+            <w:tcMar>
+              <w:top w:type="dxa" w:w="80"/>
+              <w:left w:type="dxa" w:w="110"/>
+              <w:bottom w:type="dxa" w:w="80"/>
+              <w:right w:type="dxa" w:w="110"/>
+            </w:tcMar>
+          </w:tcPr>
+          <w:p>
+            <w:pPr>
+              <w:keepNext/>
+            </w:pPr>
+            <w:r>
+              <w:rPr>
+                <w:rFonts w:ascii="Calibri" w:cs="Calibri" w:eastAsia="Calibri" w:hAnsi="Calibri"/>
+                <w:b w:val="false"/>
+                <w:bCs w:val="false"/>
+                <w:sz w:val="19"/>
+                <w:szCs w:val="19"/>
+              </w:rPr>
+              <w:t xml:space="preserve">Already inside large contractors and shops</w:t>
+            </w:r>
+          </w:p>
+        </w:tc>
+      </w:tr>
+      <w:tr>
+        <w:trPr>
+          <w:cantSplit/>
+        </w:trPr>
+        <w:tc>
+          <w:tcPr>
+            <w:tcW w:type="dxa" w:w="1560"/>
+            <w:tcBorders>
+              <w:top w:val="single" w:color="C9D1DC" w:sz="4"/>
+              <w:left w:val="single" w:color="C9D1DC" w:sz="4"/>
+              <w:bottom w:val="single" w:color="C9D1DC" w:sz="4"/>
+              <w:right w:val="single" w:color="C9D1DC" w:sz="4"/>
+            </w:tcBorders>
+            <w:shd w:fill="EEF2F7" w:color="auto" w:val="clear"/>
+            <w:tcMar>
+              <w:top w:type="dxa" w:w="80"/>
+              <w:left w:type="dxa" w:w="110"/>
+              <w:bottom w:type="dxa" w:w="80"/>
+              <w:right w:type="dxa" w:w="110"/>
+            </w:tcMar>
+          </w:tcPr>
+          <w:p>
+            <w:pPr>
+              <w:keepNext/>
+            </w:pPr>
+            <w:r>
+              <w:rPr>
+                <w:rFonts w:ascii="Calibri" w:cs="Calibri" w:eastAsia="Calibri" w:hAnsi="Calibri"/>
+                <w:b/>
+                <w:bCs/>
+                <w:sz w:val="19"/>
+                <w:szCs w:val="19"/>
+              </w:rPr>
+              <w:t xml:space="preserve">Marabu, RUCO, Tampoprint</w:t>
+            </w:r>
+          </w:p>
+        </w:tc>
+        <w:tc>
+          <w:tcPr>
+            <w:tcW w:type="dxa" w:w="1950"/>
+            <w:tcBorders>
+              <w:top w:val="single" w:color="C9D1DC" w:sz="4"/>
+              <w:left w:val="single" w:color="C9D1DC" w:sz="4"/>
+              <w:bottom w:val="single" w:color="C9D1DC" w:sz="4"/>
+              <w:right w:val="single" w:color="C9D1DC" w:sz="4"/>
+            </w:tcBorders>
+            <w:shd w:fill="EEF2F7" w:color="auto" w:val="clear"/>
+            <w:tcMar>
+              <w:top w:type="dxa" w:w="80"/>
+              <w:left w:type="dxa" w:w="110"/>
+              <w:bottom w:type="dxa" w:w="80"/>
+              <w:right w:type="dxa" w:w="110"/>
+            </w:tcMar>
+          </w:tcPr>
+          <w:p>
+            <w:pPr>
+              <w:keepNext/>
+            </w:pPr>
+            <w:r>
+              <w:rPr>
+                <w:rFonts w:ascii="Calibri" w:cs="Calibri" w:eastAsia="Calibri" w:hAnsi="Calibri"/>
+                <w:b w:val="false"/>
+                <w:bCs w:val="false"/>
+                <w:sz w:val="19"/>
+                <w:szCs w:val="19"/>
+              </w:rPr>
+              <w:t xml:space="preserve">German quality; strong in graphics, pad printing and industry</w:t>
+            </w:r>
+          </w:p>
+        </w:tc>
+        <w:tc>
+          <w:tcPr>
+            <w:tcW w:type="dxa" w:w="1950"/>
+            <w:tcBorders>
+              <w:top w:val="single" w:color="C9D1DC" w:sz="4"/>
+              <w:left w:val="single" w:color="C9D1DC" w:sz="4"/>
+              <w:bottom w:val="single" w:color="C9D1DC" w:sz="4"/>
+              <w:right w:val="single" w:color="C9D1DC" w:sz="4"/>
+            </w:tcBorders>
+            <w:shd w:fill="EEF2F7" w:color="auto" w:val="clear"/>
+            <w:tcMar>
+              <w:top w:type="dxa" w:w="80"/>
+              <w:left w:type="dxa" w:w="110"/>
+              <w:bottom w:type="dxa" w:w="80"/>
+              <w:right w:type="dxa" w:w="110"/>
+            </w:tcMar>
+          </w:tcPr>
+          <w:p>
+            <w:pPr>
+              <w:keepNext/>
+            </w:pPr>
+            <w:r>
+              <w:rPr>
+                <w:rFonts w:ascii="Calibri" w:cs="Calibri" w:eastAsia="Calibri" w:hAnsi="Calibri"/>
+                <w:b w:val="false"/>
+                <w:bCs w:val="false"/>
+                <w:sz w:val="19"/>
+                <w:szCs w:val="19"/>
+              </w:rPr>
+              <w:t xml:space="preserve">Little offer for garment printing</w:t>
+            </w:r>
+          </w:p>
+        </w:tc>
+        <w:tc>
+          <w:tcPr>
+            <w:tcW w:type="dxa" w:w="1950"/>
+            <w:tcBorders>
+              <w:top w:val="single" w:color="C9D1DC" w:sz="4"/>
+              <w:left w:val="single" w:color="C9D1DC" w:sz="4"/>
+              <w:bottom w:val="single" w:color="C9D1DC" w:sz="4"/>
+              <w:right w:val="single" w:color="C9D1DC" w:sz="4"/>
+            </w:tcBorders>
+            <w:shd w:fill="EEF2F7" w:color="auto" w:val="clear"/>
+            <w:tcMar>
+              <w:top w:type="dxa" w:w="80"/>
+              <w:left w:type="dxa" w:w="110"/>
+              <w:bottom w:type="dxa" w:w="80"/>
+              <w:right w:type="dxa" w:w="110"/>
+            </w:tcMar>
+          </w:tcPr>
+          <w:p>
+            <w:pPr>
+              <w:keepNext/>
+            </w:pPr>
+            <w:r>
+              <w:rPr>
+                <w:rFonts w:ascii="Calibri" w:cs="Calibri" w:eastAsia="Calibri" w:hAnsi="Calibri"/>
+                <w:b w:val="false"/>
+                <w:bCs w:val="false"/>
+                <w:sz w:val="19"/>
+                <w:szCs w:val="19"/>
+              </w:rPr>
+              <w:t xml:space="preserve">Not head-on competitors in apparel</w:t>
+            </w:r>
+          </w:p>
+        </w:tc>
+        <w:tc>
+          <w:tcPr>
+            <w:tcW w:type="dxa" w:w="1950"/>
+            <w:tcBorders>
+              <w:top w:val="single" w:color="C9D1DC" w:sz="4"/>
+              <w:left w:val="single" w:color="C9D1DC" w:sz="4"/>
+              <w:bottom w:val="single" w:color="C9D1DC" w:sz="4"/>
+              <w:right w:val="single" w:color="C9D1DC" w:sz="4"/>
+            </w:tcBorders>
+            <w:shd w:fill="EEF2F7" w:color="auto" w:val="clear"/>
+            <w:tcMar>
+              <w:top w:type="dxa" w:w="80"/>
+              <w:left w:type="dxa" w:w="110"/>
+              <w:bottom w:type="dxa" w:w="80"/>
+              <w:right w:type="dxa" w:w="110"/>
+            </w:tcMar>
+          </w:tcPr>
+          <w:p>
+            <w:pPr>
+              <w:keepNext/>
+            </w:pPr>
+            <w:r>
+              <w:rPr>
+                <w:rFonts w:ascii="Calibri" w:cs="Calibri" w:eastAsia="Calibri" w:hAnsi="Calibri"/>
+                <w:b w:val="false"/>
+                <w:bCs w:val="false"/>
+                <w:sz w:val="19"/>
+                <w:szCs w:val="19"/>
+              </w:rPr>
+              <w:t xml:space="preserve">Tagless label and synthetics niche</w:t>
+            </w:r>
+          </w:p>
+        </w:tc>
+      </w:tr>
+      <w:tr>
+        <w:trPr>
+          <w:cantSplit/>
+        </w:trPr>
+        <w:tc>
+          <w:tcPr>
+            <w:tcW w:type="dxa" w:w="1560"/>
+            <w:tcBorders>
+              <w:top w:val="single" w:color="C9D1DC" w:sz="4"/>
+              <w:left w:val="single" w:color="C9D1DC" w:sz="4"/>
+              <w:bottom w:val="single" w:color="C9D1DC" w:sz="4"/>
+              <w:right w:val="single" w:color="C9D1DC" w:sz="4"/>
+            </w:tcBorders>
+            <w:tcMar>
+              <w:top w:type="dxa" w:w="80"/>
+              <w:left w:type="dxa" w:w="110"/>
+              <w:bottom w:type="dxa" w:w="80"/>
+              <w:right w:type="dxa" w:w="110"/>
+            </w:tcMar>
+          </w:tcPr>
+          <w:p>
+            <w:pPr>
+              <w:keepNext/>
+            </w:pPr>
+            <w:r>
+              <w:rPr>
+                <w:rFonts w:ascii="Calibri" w:cs="Calibri" w:eastAsia="Calibri" w:hAnsi="Calibri"/>
+                <w:b/>
+                <w:bCs/>
+                <w:sz w:val="19"/>
+                <w:szCs w:val="19"/>
+              </w:rPr>
+              <w:t xml:space="preserve">Low-cost Mexican brands</w:t>
+            </w:r>
+          </w:p>
+        </w:tc>
+        <w:tc>
+          <w:tcPr>
+            <w:tcW w:type="dxa" w:w="1950"/>
+            <w:tcBorders>
+              <w:top w:val="single" w:color="C9D1DC" w:sz="4"/>
+              <w:left w:val="single" w:color="C9D1DC" w:sz="4"/>
+              <w:bottom w:val="single" w:color="C9D1DC" w:sz="4"/>
+              <w:right w:val="single" w:color="C9D1DC" w:sz="4"/>
+            </w:tcBorders>
+            <w:tcMar>
+              <w:top w:type="dxa" w:w="80"/>
+              <w:left w:type="dxa" w:w="110"/>
+              <w:bottom w:type="dxa" w:w="80"/>
+              <w:right w:type="dxa" w:w="110"/>
+            </w:tcMar>
+          </w:tcPr>
+          <w:p>
+            <w:pPr>
+              <w:keepNext/>
+            </w:pPr>
+            <w:r>
+              <w:rPr>
+                <w:rFonts w:ascii="Calibri" w:cs="Calibri" w:eastAsia="Calibri" w:hAnsi="Calibri"/>
+                <w:b w:val="false"/>
+                <w:bCs w:val="false"/>
+                <w:sz w:val="19"/>
+                <w:szCs w:val="19"/>
+              </w:rPr>
+              <w:t xml:space="preserve">Very low price; sold in every store</w:t>
+            </w:r>
+          </w:p>
+        </w:tc>
+        <w:tc>
+          <w:tcPr>
+            <w:tcW w:type="dxa" w:w="1950"/>
+            <w:tcBorders>
+              <w:top w:val="single" w:color="C9D1DC" w:sz="4"/>
+              <w:left w:val="single" w:color="C9D1DC" w:sz="4"/>
+              <w:bottom w:val="single" w:color="C9D1DC" w:sz="4"/>
+              <w:right w:val="single" w:color="C9D1DC" w:sz="4"/>
+            </w:tcBorders>
+            <w:tcMar>
+              <w:top w:type="dxa" w:w="80"/>
+              <w:left w:type="dxa" w:w="110"/>
+              <w:bottom w:type="dxa" w:w="80"/>
+              <w:right w:type="dxa" w:w="110"/>
+            </w:tcMar>
+          </w:tcPr>
+          <w:p>
+            <w:pPr>
+              <w:keepNext/>
+            </w:pPr>
+            <w:r>
+              <w:rPr>
+                <w:rFonts w:ascii="Calibri" w:cs="Calibri" w:eastAsia="Calibri" w:hAnsi="Calibri"/>
+                <w:b w:val="false"/>
+                <w:bCs w:val="false"/>
+                <w:sz w:val="19"/>
+                <w:szCs w:val="19"/>
+              </w:rPr>
+              <w:t xml:space="preserve">Uneven quality; no certifications or technical support</w:t>
+            </w:r>
+          </w:p>
+        </w:tc>
+        <w:tc>
+          <w:tcPr>
+            <w:tcW w:type="dxa" w:w="1950"/>
+            <w:tcBorders>
+              <w:top w:val="single" w:color="C9D1DC" w:sz="4"/>
+              <w:left w:val="single" w:color="C9D1DC" w:sz="4"/>
+              <w:bottom w:val="single" w:color="C9D1DC" w:sz="4"/>
+              <w:right w:val="single" w:color="C9D1DC" w:sz="4"/>
+            </w:tcBorders>
+            <w:tcMar>
+              <w:top w:type="dxa" w:w="80"/>
+              <w:left w:type="dxa" w:w="110"/>
+              <w:bottom w:type="dxa" w:w="80"/>
+              <w:right w:type="dxa" w:w="110"/>
+            </w:tcMar>
+          </w:tcPr>
+          <w:p>
+            <w:pPr>
+              <w:keepNext/>
+            </w:pPr>
+            <w:r>
+              <w:rPr>
+                <w:rFonts w:ascii="Calibri" w:cs="Calibri" w:eastAsia="Calibri" w:hAnsi="Calibri"/>
+                <w:b w:val="false"/>
+                <w:bCs w:val="false"/>
+                <w:sz w:val="19"/>
+                <w:szCs w:val="19"/>
+              </w:rPr>
+              <w:t xml:space="preserve">Growing shops that need consistent quality</w:t>
+            </w:r>
+          </w:p>
+        </w:tc>
+        <w:tc>
+          <w:tcPr>
+            <w:tcW w:type="dxa" w:w="1950"/>
+            <w:tcBorders>
+              <w:top w:val="single" w:color="C9D1DC" w:sz="4"/>
+              <w:left w:val="single" w:color="C9D1DC" w:sz="4"/>
+              <w:bottom w:val="single" w:color="C9D1DC" w:sz="4"/>
+              <w:right w:val="single" w:color="C9D1DC" w:sz="4"/>
+            </w:tcBorders>
+            <w:tcMar>
+              <w:top w:type="dxa" w:w="80"/>
+              <w:left w:type="dxa" w:w="110"/>
+              <w:bottom w:type="dxa" w:w="80"/>
+              <w:right w:type="dxa" w:w="110"/>
+            </w:tcMar>
+          </w:tcPr>
+          <w:p>
+            <w:pPr>
+              <w:keepNext/>
+            </w:pPr>
+            <w:r>
+              <w:rPr>
+                <w:rFonts w:ascii="Calibri" w:cs="Calibri" w:eastAsia="Calibri" w:hAnsi="Calibri"/>
+                <w:b w:val="false"/>
+                <w:bCs w:val="false"/>
+                <w:sz w:val="19"/>
+                <w:szCs w:val="19"/>
+              </w:rPr>
+              <w:t xml:space="preserve">Price war in small shops</w:t>
+            </w:r>
+          </w:p>
+        </w:tc>
+      </w:tr>
+      <w:tr>
+        <w:trPr>
+          <w:cantSplit/>
+        </w:trPr>
+        <w:tc>
+          <w:tcPr>
+            <w:tcW w:type="dxa" w:w="1560"/>
+            <w:tcBorders>
+              <w:top w:val="single" w:color="C9D1DC" w:sz="4"/>
+              <w:left w:val="single" w:color="C9D1DC" w:sz="4"/>
+              <w:bottom w:val="single" w:color="C9D1DC" w:sz="4"/>
+              <w:right w:val="single" w:color="C9D1DC" w:sz="4"/>
+            </w:tcBorders>
+            <w:shd w:fill="EEF2F7" w:color="auto" w:val="clear"/>
+            <w:tcMar>
+              <w:top w:type="dxa" w:w="80"/>
+              <w:left w:type="dxa" w:w="110"/>
+              <w:bottom w:type="dxa" w:w="80"/>
+              <w:right w:type="dxa" w:w="110"/>
+            </w:tcMar>
+          </w:tcPr>
+          <w:p>
+            <w:pPr>
+              <w:keepNext w:val="false"/>
+            </w:pPr>
+            <w:r>
+              <w:rPr>
+                <w:rFonts w:ascii="Calibri" w:cs="Calibri" w:eastAsia="Calibri" w:hAnsi="Calibri"/>
+                <w:b/>
+                <w:bCs/>
+                <w:sz w:val="19"/>
+                <w:szCs w:val="19"/>
+              </w:rPr>
+              <w:t xml:space="preserve">Direct Chinese suppliers</w:t>
+            </w:r>
+          </w:p>
+        </w:tc>
+        <w:tc>
+          <w:tcPr>
+            <w:tcW w:type="dxa" w:w="1950"/>
+            <w:tcBorders>
+              <w:top w:val="single" w:color="C9D1DC" w:sz="4"/>
+              <w:left w:val="single" w:color="C9D1DC" w:sz="4"/>
+              <w:bottom w:val="single" w:color="C9D1DC" w:sz="4"/>
+              <w:right w:val="single" w:color="C9D1DC" w:sz="4"/>
+            </w:tcBorders>
+            <w:shd w:fill="EEF2F7" w:color="auto" w:val="clear"/>
+            <w:tcMar>
+              <w:top w:type="dxa" w:w="80"/>
+              <w:left w:type="dxa" w:w="110"/>
+              <w:bottom w:type="dxa" w:w="80"/>
+              <w:right w:type="dxa" w:w="110"/>
+            </w:tcMar>
+          </w:tcPr>
+          <w:p>
+            <w:pPr>
+              <w:keepNext w:val="false"/>
+            </w:pPr>
+            <w:r>
+              <w:rPr>
+                <w:rFonts w:ascii="Calibri" w:cs="Calibri" w:eastAsia="Calibri" w:hAnsi="Calibri"/>
+                <w:b w:val="false"/>
+                <w:bCs w:val="false"/>
+                <w:sz w:val="19"/>
+                <w:szCs w:val="19"/>
+              </w:rPr>
+              <w:t xml:space="preserve">Lowest price</w:t>
+            </w:r>
+          </w:p>
+        </w:tc>
+        <w:tc>
+          <w:tcPr>
+            <w:tcW w:type="dxa" w:w="1950"/>
+            <w:tcBorders>
+              <w:top w:val="single" w:color="C9D1DC" w:sz="4"/>
+              <w:left w:val="single" w:color="C9D1DC" w:sz="4"/>
+              <w:bottom w:val="single" w:color="C9D1DC" w:sz="4"/>
+              <w:right w:val="single" w:color="C9D1DC" w:sz="4"/>
+            </w:tcBorders>
+            <w:shd w:fill="EEF2F7" w:color="auto" w:val="clear"/>
+            <w:tcMar>
+              <w:top w:type="dxa" w:w="80"/>
+              <w:left w:type="dxa" w:w="110"/>
+              <w:bottom w:type="dxa" w:w="80"/>
+              <w:right w:type="dxa" w:w="110"/>
+            </w:tcMar>
+          </w:tcPr>
+          <w:p>
+            <w:pPr>
+              <w:keepNext w:val="false"/>
+            </w:pPr>
+            <w:r>
+              <w:rPr>
+                <w:rFonts w:ascii="Calibri" w:cs="Calibri" w:eastAsia="Calibri" w:hAnsi="Calibri"/>
+                <w:b w:val="false"/>
+                <w:bCs w:val="false"/>
+                <w:sz w:val="19"/>
+                <w:szCs w:val="19"/>
+              </w:rPr>
+              <w:t xml:space="preserve">No service, no local stock, no warranty</w:t>
+            </w:r>
+          </w:p>
+        </w:tc>
+        <w:tc>
+          <w:tcPr>
+            <w:tcW w:type="dxa" w:w="1950"/>
+            <w:tcBorders>
+              <w:top w:val="single" w:color="C9D1DC" w:sz="4"/>
+              <w:left w:val="single" w:color="C9D1DC" w:sz="4"/>
+              <w:bottom w:val="single" w:color="C9D1DC" w:sz="4"/>
+              <w:right w:val="single" w:color="C9D1DC" w:sz="4"/>
+            </w:tcBorders>
+            <w:shd w:fill="EEF2F7" w:color="auto" w:val="clear"/>
+            <w:tcMar>
+              <w:top w:type="dxa" w:w="80"/>
+              <w:left w:type="dxa" w:w="110"/>
+              <w:bottom w:type="dxa" w:w="80"/>
+              <w:right w:type="dxa" w:w="110"/>
+            </w:tcMar>
+          </w:tcPr>
+          <w:p>
+            <w:pPr>
+              <w:keepNext w:val="false"/>
+            </w:pPr>
+            <w:r>
+              <w:rPr>
+                <w:rFonts w:ascii="Calibri" w:cs="Calibri" w:eastAsia="Calibri" w:hAnsi="Calibri"/>
+                <w:b w:val="false"/>
+                <w:bCs w:val="false"/>
+                <w:sz w:val="19"/>
+                <w:szCs w:val="19"/>
+              </w:rPr>
+              <w:t xml:space="preserve">Local service, stock and Spanish-speaking technicians</w:t>
+            </w:r>
+          </w:p>
+        </w:tc>
+        <w:tc>
+          <w:tcPr>
+            <w:tcW w:type="dxa" w:w="1950"/>
+            <w:tcBorders>
+              <w:top w:val="single" w:color="C9D1DC" w:sz="4"/>
+              <w:left w:val="single" w:color="C9D1DC" w:sz="4"/>
+              <w:bottom w:val="single" w:color="C9D1DC" w:sz="4"/>
+              <w:right w:val="single" w:color="C9D1DC" w:sz="4"/>
+            </w:tcBorders>
+            <w:shd w:fill="EEF2F7" w:color="auto" w:val="clear"/>
+            <w:tcMar>
+              <w:top w:type="dxa" w:w="80"/>
+              <w:left w:type="dxa" w:w="110"/>
+              <w:bottom w:type="dxa" w:w="80"/>
+              <w:right w:type="dxa" w:w="110"/>
+            </w:tcMar>
+          </w:tcPr>
+          <w:p>
+            <w:pPr>
+              <w:keepNext w:val="false"/>
+            </w:pPr>
+            <w:r>
+              <w:rPr>
+                <w:rFonts w:ascii="Calibri" w:cs="Calibri" w:eastAsia="Calibri" w:hAnsi="Calibri"/>
+                <w:b w:val="false"/>
+                <w:bCs w:val="false"/>
+                <w:sz w:val="19"/>
+                <w:szCs w:val="19"/>
+              </w:rPr>
+              <w:t xml:space="preserve">Same origin: customers compare price against CLT</w:t>
+            </w:r>
+          </w:p>
+        </w:tc>
+      </w:tr>
+    </w:tbl>
+    <w:p>
+      <w:pPr>
+        <w:spacing w:after="120"/>
+      </w:pPr>
+    </w:p>
+    <w:p>
+      <w:pPr>
+        <w:pStyle w:val="Heading2"/>
+      </w:pPr>
+      <w:r>
+        <w:t xml:space="preserve">SWOT of our position against the competition (CLT + TID · VSP · CEB)</w:t>
+      </w:r>
+    </w:p>
+    <w:tbl>
+      <w:tblPr>
+        <w:tblW w:type="dxa" w:w="9360"/>
+        <w:tblBorders>
+          <w:top w:val="single" w:color="auto" w:sz="4"/>
+          <w:left w:val="single" w:color="auto" w:sz="4"/>
+          <w:bottom w:val="single" w:color="auto" w:sz="4"/>
+          <w:right w:val="single" w:color="auto" w:sz="4"/>
+          <w:insideH w:val="single" w:color="auto" w:sz="4"/>
+          <w:insideV w:val="single" w:color="auto" w:sz="4"/>
+        </w:tblBorders>
+      </w:tblPr>
+      <w:tblGrid>
+        <w:gridCol w:w="4680"/>
+        <w:gridCol w:w="4680"/>
+      </w:tblGrid>
+      <w:tr>
+        <w:trPr>
+          <w:cantSplit/>
+          <w:tblHeader/>
+        </w:trPr>
+        <w:tc>
+          <w:tcPr>
+            <w:tcW w:type="dxa" w:w="4680"/>
+            <w:tcBorders>
+              <w:top w:val="single" w:color="C9D1DC" w:sz="4"/>
+              <w:left w:val="single" w:color="C9D1DC" w:sz="4"/>
+              <w:bottom w:val="single" w:color="C9D1DC" w:sz="4"/>
+              <w:right w:val="single" w:color="C9D1DC" w:sz="4"/>
+            </w:tcBorders>
+            <w:shd w:fill="1B1F3B" w:color="auto" w:val="clear"/>
+            <w:tcMar>
+              <w:top w:type="dxa" w:w="80"/>
+              <w:left w:type="dxa" w:w="110"/>
+              <w:bottom w:type="dxa" w:w="80"/>
+              <w:right w:type="dxa" w:w="110"/>
+            </w:tcMar>
+          </w:tcPr>
+          <w:p>
+            <w:pPr>
+              <w:keepNext/>
+            </w:pPr>
+            <w:r>
+              <w:rPr>
+                <w:rFonts w:ascii="Calibri" w:cs="Calibri" w:eastAsia="Calibri" w:hAnsi="Calibri"/>
+                <w:b/>
+                <w:bCs/>
+                <w:color w:val="FFFFFF"/>
+                <w:sz w:val="19"/>
+                <w:szCs w:val="19"/>
+              </w:rPr>
+              <w:t xml:space="preserve">Strengths</w:t>
+            </w:r>
+          </w:p>
+        </w:tc>
+        <w:tc>
+          <w:tcPr>
+            <w:tcW w:type="dxa" w:w="4680"/>
+            <w:tcBorders>
+              <w:top w:val="single" w:color="C9D1DC" w:sz="4"/>
+              <w:left w:val="single" w:color="C9D1DC" w:sz="4"/>
+              <w:bottom w:val="single" w:color="C9D1DC" w:sz="4"/>
+              <w:right w:val="single" w:color="C9D1DC" w:sz="4"/>
+            </w:tcBorders>
+            <w:shd w:fill="1B1F3B" w:color="auto" w:val="clear"/>
+            <w:tcMar>
+              <w:top w:type="dxa" w:w="80"/>
+              <w:left w:type="dxa" w:w="110"/>
+              <w:bottom w:type="dxa" w:w="80"/>
+              <w:right w:type="dxa" w:w="110"/>
+            </w:tcMar>
+          </w:tcPr>
+          <w:p>
+            <w:pPr>
+              <w:keepNext/>
+            </w:pPr>
+            <w:r>
+              <w:rPr>
+                <w:rFonts w:ascii="Calibri" w:cs="Calibri" w:eastAsia="Calibri" w:hAnsi="Calibri"/>
+                <w:b/>
+                <w:bCs/>
+                <w:color w:val="FFFFFF"/>
+                <w:sz w:val="19"/>
+                <w:szCs w:val="19"/>
+              </w:rPr>
+              <w:t xml:space="preserve">Weaknesses</w:t>
+            </w:r>
+          </w:p>
+        </w:tc>
+      </w:tr>
+      <w:tr>
+        <w:trPr>
+          <w:cantSplit/>
+        </w:trPr>
+        <w:tc>
+          <w:tcPr>
+            <w:tcW w:type="dxa" w:w="4680"/>
+            <w:tcBorders>
+              <w:top w:val="single" w:color="C9D1DC" w:sz="4"/>
+              <w:left w:val="single" w:color="C9D1DC" w:sz="4"/>
+              <w:bottom w:val="single" w:color="C9D1DC" w:sz="4"/>
+              <w:right w:val="single" w:color="C9D1DC" w:sz="4"/>
+            </w:tcBorders>
+            <w:tcMar>
+              <w:top w:type="dxa" w:w="80"/>
+              <w:left w:type="dxa" w:w="110"/>
+              <w:bottom w:type="dxa" w:w="80"/>
+              <w:right w:type="dxa" w:w="110"/>
+            </w:tcMar>
+          </w:tcPr>
+          <w:p>
+            <w:pPr>
+              <w:keepNext w:val="false"/>
+              <w:spacing w:after="60"/>
+            </w:pPr>
+            <w:r>
+              <w:rPr>
+                <w:rFonts w:ascii="Calibri" w:cs="Calibri" w:eastAsia="Calibri" w:hAnsi="Calibri"/>
+                <w:b/>
+                <w:bCs/>
+                <w:sz w:val="19"/>
+                <w:szCs w:val="19"/>
+              </w:rPr>
+              <w:t xml:space="preserve">• Only turnkey offer: hybrid machine + chemistry + service</w:t>
+            </w:r>
+          </w:p>
+          <w:p>
+            <w:pPr>
+              <w:keepNext w:val="false"/>
+              <w:spacing w:after="60"/>
+            </w:pPr>
+            <w:r>
+              <w:rPr>
+                <w:rFonts w:ascii="Calibri" w:cs="Calibri" w:eastAsia="Calibri" w:hAnsi="Calibri"/>
+                <w:b/>
+                <w:bCs/>
+                <w:sz w:val="19"/>
+                <w:szCs w:val="19"/>
+              </w:rPr>
+              <w:t xml:space="preserve">• CLT chemistry priced below premium brands</w:t>
+            </w:r>
+          </w:p>
+          <w:p>
+            <w:pPr>
+              <w:keepNext w:val="false"/>
+              <w:spacing w:after="60"/>
+            </w:pPr>
+            <w:r>
+              <w:rPr>
+                <w:rFonts w:ascii="Calibri" w:cs="Calibri" w:eastAsia="Calibri" w:hAnsi="Calibri"/>
+                <w:b/>
+                <w:bCs/>
+                <w:sz w:val="19"/>
+                <w:szCs w:val="19"/>
+              </w:rPr>
+              <w:t xml:space="preserve">• Service in Mexico and the U.S.; own importer (CEB)</w:t>
+            </w:r>
+          </w:p>
+        </w:tc>
+        <w:tc>
+          <w:tcPr>
+            <w:tcW w:type="dxa" w:w="4680"/>
+            <w:tcBorders>
+              <w:top w:val="single" w:color="C9D1DC" w:sz="4"/>
+              <w:left w:val="single" w:color="C9D1DC" w:sz="4"/>
+              <w:bottom w:val="single" w:color="C9D1DC" w:sz="4"/>
+              <w:right w:val="single" w:color="C9D1DC" w:sz="4"/>
+            </w:tcBorders>
+            <w:tcMar>
+              <w:top w:type="dxa" w:w="80"/>
+              <w:left w:type="dxa" w:w="110"/>
+              <w:bottom w:type="dxa" w:w="80"/>
+              <w:right w:type="dxa" w:w="110"/>
+            </w:tcMar>
+          </w:tcPr>
+          <w:p>
+            <w:pPr>
+              <w:keepNext w:val="false"/>
+              <w:spacing w:after="60"/>
+            </w:pPr>
+            <w:r>
+              <w:rPr>
+                <w:rFonts w:ascii="Calibri" w:cs="Calibri" w:eastAsia="Calibri" w:hAnsi="Calibri"/>
+                <w:b w:val="false"/>
+                <w:bCs w:val="false"/>
+                <w:sz w:val="19"/>
+                <w:szCs w:val="19"/>
+              </w:rPr>
+              <w:t xml:space="preserve">• CLT brand little known in Mexico</w:t>
+            </w:r>
+          </w:p>
+          <w:p>
+            <w:pPr>
+              <w:keepNext w:val="false"/>
+              <w:spacing w:after="60"/>
+            </w:pPr>
+            <w:r>
+              <w:rPr>
+                <w:rFonts w:ascii="Calibri" w:cs="Calibri" w:eastAsia="Calibri" w:hAnsi="Calibri"/>
+                <w:b w:val="false"/>
+                <w:bCs w:val="false"/>
+                <w:sz w:val="19"/>
+                <w:szCs w:val="19"/>
+              </w:rPr>
+              <w:t xml:space="preserve">• No export-brand ink approvals yet</w:t>
+            </w:r>
+          </w:p>
+          <w:p>
+            <w:pPr>
+              <w:keepNext w:val="false"/>
+              <w:spacing w:after="60"/>
+            </w:pPr>
+            <w:r>
+              <w:rPr>
+                <w:rFonts w:ascii="Calibri" w:cs="Calibri" w:eastAsia="Calibri" w:hAnsi="Calibri"/>
+                <w:b w:val="false"/>
+                <w:bCs w:val="false"/>
+                <w:sz w:val="19"/>
+                <w:szCs w:val="19"/>
+              </w:rPr>
+              <w:t xml:space="preserve">• Textile team still to be built</w:t>
+            </w:r>
+          </w:p>
+        </w:tc>
+      </w:tr>
+    </w:tbl>
+    <w:p>
+      <w:pPr>
+        <w:spacing w:after="120"/>
+      </w:pPr>
+    </w:p>
+    <w:tbl>
+      <w:tblPr>
+        <w:tblW w:type="dxa" w:w="9360"/>
+        <w:tblBorders>
+          <w:top w:val="single" w:color="auto" w:sz="4"/>
+          <w:left w:val="single" w:color="auto" w:sz="4"/>
+          <w:bottom w:val="single" w:color="auto" w:sz="4"/>
+          <w:right w:val="single" w:color="auto" w:sz="4"/>
+          <w:insideH w:val="single" w:color="auto" w:sz="4"/>
+          <w:insideV w:val="single" w:color="auto" w:sz="4"/>
+        </w:tblBorders>
+      </w:tblPr>
+      <w:tblGrid>
+        <w:gridCol w:w="4680"/>
+        <w:gridCol w:w="4680"/>
+      </w:tblGrid>
+      <w:tr>
+        <w:trPr>
+          <w:cantSplit/>
+          <w:tblHeader/>
+        </w:trPr>
+        <w:tc>
+          <w:tcPr>
+            <w:tcW w:type="dxa" w:w="4680"/>
+            <w:tcBorders>
+              <w:top w:val="single" w:color="C9D1DC" w:sz="4"/>
+              <w:left w:val="single" w:color="C9D1DC" w:sz="4"/>
+              <w:bottom w:val="single" w:color="C9D1DC" w:sz="4"/>
+              <w:right w:val="single" w:color="C9D1DC" w:sz="4"/>
+            </w:tcBorders>
+            <w:shd w:fill="1B1F3B" w:color="auto" w:val="clear"/>
+            <w:tcMar>
+              <w:top w:type="dxa" w:w="80"/>
+              <w:left w:type="dxa" w:w="110"/>
+              <w:bottom w:type="dxa" w:w="80"/>
+              <w:right w:type="dxa" w:w="110"/>
+            </w:tcMar>
+          </w:tcPr>
+          <w:p>
+            <w:pPr>
+              <w:keepNext/>
+            </w:pPr>
+            <w:r>
+              <w:rPr>
+                <w:rFonts w:ascii="Calibri" w:cs="Calibri" w:eastAsia="Calibri" w:hAnsi="Calibri"/>
+                <w:b/>
+                <w:bCs/>
+                <w:color w:val="FFFFFF"/>
+                <w:sz w:val="19"/>
+                <w:szCs w:val="19"/>
+              </w:rPr>
+              <w:t xml:space="preserve">Opportunities</w:t>
+            </w:r>
+          </w:p>
+        </w:tc>
+        <w:tc>
+          <w:tcPr>
+            <w:tcW w:type="dxa" w:w="4680"/>
+            <w:tcBorders>
+              <w:top w:val="single" w:color="C9D1DC" w:sz="4"/>
+              <w:left w:val="single" w:color="C9D1DC" w:sz="4"/>
+              <w:bottom w:val="single" w:color="C9D1DC" w:sz="4"/>
+              <w:right w:val="single" w:color="C9D1DC" w:sz="4"/>
+            </w:tcBorders>
+            <w:shd w:fill="1B1F3B" w:color="auto" w:val="clear"/>
+            <w:tcMar>
+              <w:top w:type="dxa" w:w="80"/>
+              <w:left w:type="dxa" w:w="110"/>
+              <w:bottom w:type="dxa" w:w="80"/>
+              <w:right w:type="dxa" w:w="110"/>
+            </w:tcMar>
+          </w:tcPr>
+          <w:p>
+            <w:pPr>
+              <w:keepNext/>
+            </w:pPr>
+            <w:r>
+              <w:rPr>
+                <w:rFonts w:ascii="Calibri" w:cs="Calibri" w:eastAsia="Calibri" w:hAnsi="Calibri"/>
+                <w:b/>
+                <w:bCs/>
+                <w:color w:val="FFFFFF"/>
+                <w:sz w:val="19"/>
+                <w:szCs w:val="19"/>
+              </w:rPr>
+              <w:t xml:space="preserve">Threats</w:t>
+            </w:r>
+          </w:p>
+        </w:tc>
+      </w:tr>
+      <w:tr>
+        <w:trPr>
+          <w:cantSplit/>
+        </w:trPr>
+        <w:tc>
+          <w:tcPr>
+            <w:tcW w:type="dxa" w:w="4680"/>
+            <w:tcBorders>
+              <w:top w:val="single" w:color="C9D1DC" w:sz="4"/>
+              <w:left w:val="single" w:color="C9D1DC" w:sz="4"/>
+              <w:bottom w:val="single" w:color="C9D1DC" w:sz="4"/>
+              <w:right w:val="single" w:color="C9D1DC" w:sz="4"/>
+            </w:tcBorders>
+            <w:tcMar>
+              <w:top w:type="dxa" w:w="80"/>
+              <w:left w:type="dxa" w:w="110"/>
+              <w:bottom w:type="dxa" w:w="80"/>
+              <w:right w:type="dxa" w:w="110"/>
+            </w:tcMar>
+          </w:tcPr>
+          <w:p>
+            <w:pPr>
+              <w:keepNext w:val="false"/>
+              <w:spacing w:after="60"/>
+            </w:pPr>
+            <w:r>
+              <w:rPr>
+                <w:rFonts w:ascii="Calibri" w:cs="Calibri" w:eastAsia="Calibri" w:hAnsi="Calibri"/>
+                <w:b/>
+                <w:bCs/>
+                <w:sz w:val="19"/>
+                <w:szCs w:val="19"/>
+              </w:rPr>
+              <w:t xml:space="preserve">• 2026 tariffs on Chinese apparel: more local production</w:t>
+            </w:r>
+          </w:p>
+          <w:p>
+            <w:pPr>
+              <w:keepNext w:val="false"/>
+              <w:spacing w:after="60"/>
+            </w:pPr>
+            <w:r>
+              <w:rPr>
+                <w:rFonts w:ascii="Calibri" w:cs="Calibri" w:eastAsia="Calibri" w:hAnsi="Calibri"/>
+                <w:b/>
+                <w:bCs/>
+                <w:sz w:val="19"/>
+                <w:szCs w:val="19"/>
+              </w:rPr>
+              <w:t xml:space="preserve">• Export OEMs want high-value effects</w:t>
+            </w:r>
+          </w:p>
+          <w:p>
+            <w:pPr>
+              <w:keepNext w:val="false"/>
+              <w:spacing w:after="60"/>
+            </w:pPr>
+            <w:r>
+              <w:rPr>
+                <w:rFonts w:ascii="Calibri" w:cs="Calibri" w:eastAsia="Calibri" w:hAnsi="Calibri"/>
+                <w:b/>
+                <w:bCs/>
+                <w:sz w:val="19"/>
+                <w:szCs w:val="19"/>
+              </w:rPr>
+              <w:t xml:space="preserve">• Few local suppliers of silicones and special effects</w:t>
+            </w:r>
+          </w:p>
+        </w:tc>
+        <w:tc>
+          <w:tcPr>
+            <w:tcW w:type="dxa" w:w="4680"/>
+            <w:tcBorders>
+              <w:top w:val="single" w:color="C9D1DC" w:sz="4"/>
+              <w:left w:val="single" w:color="C9D1DC" w:sz="4"/>
+              <w:bottom w:val="single" w:color="C9D1DC" w:sz="4"/>
+              <w:right w:val="single" w:color="C9D1DC" w:sz="4"/>
+            </w:tcBorders>
+            <w:tcMar>
+              <w:top w:type="dxa" w:w="80"/>
+              <w:left w:type="dxa" w:w="110"/>
+              <w:bottom w:type="dxa" w:w="80"/>
+              <w:right w:type="dxa" w:w="110"/>
+            </w:tcMar>
+          </w:tcPr>
+          <w:p>
+            <w:pPr>
+              <w:keepNext w:val="false"/>
+              <w:spacing w:after="60"/>
+            </w:pPr>
+            <w:r>
+              <w:rPr>
+                <w:rFonts w:ascii="Calibri" w:cs="Calibri" w:eastAsia="Calibri" w:hAnsi="Calibri"/>
+                <w:b w:val="false"/>
+                <w:bCs w:val="false"/>
+                <w:sz w:val="19"/>
+                <w:szCs w:val="19"/>
+              </w:rPr>
+              <w:t xml:space="preserve">• Avient tied to brands’ approved-ink lists</w:t>
+            </w:r>
+          </w:p>
+          <w:p>
+            <w:pPr>
+              <w:keepNext w:val="false"/>
+              <w:spacing w:after="60"/>
+            </w:pPr>
+            <w:r>
+              <w:rPr>
+                <w:rFonts w:ascii="Calibri" w:cs="Calibri" w:eastAsia="Calibri" w:hAnsi="Calibri"/>
+                <w:b w:val="false"/>
+                <w:bCs w:val="false"/>
+                <w:sz w:val="19"/>
+                <w:szCs w:val="19"/>
+              </w:rPr>
+              <w:t xml:space="preserve">• Low prices from ScreenTec and Mexican budget brands</w:t>
+            </w:r>
+          </w:p>
+          <w:p>
+            <w:pPr>
+              <w:keepNext w:val="false"/>
+              <w:spacing w:after="60"/>
+            </w:pPr>
+            <w:r>
+              <w:rPr>
+                <w:rFonts w:ascii="Calibri" w:cs="Calibri" w:eastAsia="Calibri" w:hAnsi="Calibri"/>
+                <w:b w:val="false"/>
+                <w:bCs w:val="false"/>
+                <w:sz w:val="19"/>
+                <w:szCs w:val="19"/>
+              </w:rPr>
+              <w:t xml:space="preserve">• DTF in short runs</w:t>
+            </w:r>
+          </w:p>
+          <w:p>
+            <w:pPr>
+              <w:keepNext w:val="false"/>
+              <w:spacing w:after="60"/>
+            </w:pPr>
+            <w:r>
+              <w:rPr>
+                <w:rFonts w:ascii="Calibri" w:cs="Calibri" w:eastAsia="Calibri" w:hAnsi="Calibri"/>
+                <w:b w:val="false"/>
+                <w:bCs w:val="false"/>
+                <w:sz w:val="19"/>
+                <w:szCs w:val="19"/>
+              </w:rPr>
+              <w:t xml:space="preserve">• Tariffs on Chinese inputs</w:t>
+            </w:r>
+          </w:p>
+        </w:tc>
+      </w:tr>
+    </w:tbl>
+    <w:p>
+      <w:pPr>
+        <w:spacing w:after="120"/>
+      </w:pPr>
+    </w:p>
+    <w:p>
+      <w:pPr>
+        <w:spacing w:after="160"/>
+      </w:pPr>
+      <w:r>
+        <w:t xml:space="preserve">Are they too expensive to compete? Premium brands (Avient, Matsui, Marabu, RUCO) cost more than Chinese chemistry: there CLT competes on price, but it must win brand approvals to get into contract manufacturing. The real price competition is Grupo Sánchez / ScreenTec, Mexican budget brands and direct Chinese suppliers; against them the argument is the package of machine, service and technical support.</w:t>
+      </w:r>
     </w:p>
     <w:p>
       <w:pPr>
@@ -15191,6 +18301,19 @@
       </w:pPr>
       <w:r>
         <w:t xml:space="preserve">Equipment price references: public U.S. distributors (Texsource / M&amp;R).</w:t>
+      </w:r>
+    </w:p>
+    <w:p>
+      <w:pPr>
+        <w:pStyle w:val="ListParagraph"/>
+        <w:numPr>
+          <w:ilvl w:val="0"/>
+          <w:numId w:val="2"/>
+        </w:numPr>
+        <w:spacing w:after="80"/>
+      </w:pPr>
+      <w:r>
+        <w:t xml:space="preserve">Inks: avientspecialtyinks.com, screentec.com.mx, sanchez.com.mx, casadiaz.com.mx (Matsui), marabu-tintas.es, ruco-druckfarben.de (distributors), tampoprint.com; prices from screenprinting.com, spsi.com, graficosleo.com.mx, Mercado Libre and Alibaba (October 2026).</w:t>
       </w:r>
     </w:p>
     <w:sectPr>

</xml_diff>

<commit_message>
Agrega plan de marketing: resumen en la propuesta y plan completo en Excel
- Subsección «Plan de marketing (resumen)» en la sección 11 y diapositiva nueva (ES/EN)
- Plan_Marketing_CLT_Mexico_Latam.xlsx con 19 hojas: objetivos, segmentos, compradores, posicionamiento, 4P, fases, rastreador ABM de las 17 cuentas, canales, contenido, eventos, embudo y presupuesto con fórmulas, tablero mensual de KPIs, Gantt de 36 meses, Latinoamérica y riesgos

Co-Authored-By: Claude Opus 5.5 <noreply@anthropic.com>
Claude-Session: https://claude.ai/code/session_012axCVDM5kAgj1VFnxhpsuM
</commit_message>
<xml_diff>
--- a/propuesta-clt/CLT_Distribution_Proposal_Mexico_EN.docx
+++ b/propuesta-clt/CLT_Distribution_Proposal_Mexico_EN.docx
@@ -12960,6 +12960,1196 @@
       </w:pPr>
       <w:r>
         <w:t xml:space="preserve">Recurring revenue: consumables, spare parts and preventive-maintenance contracts.</w:t>
+      </w:r>
+    </w:p>
+    <w:p>
+      <w:pPr>
+        <w:pStyle w:val="Heading2"/>
+      </w:pPr>
+      <w:r>
+        <w:t xml:space="preserve">Marketing plan (summary)</w:t>
+      </w:r>
+    </w:p>
+    <w:p>
+      <w:pPr>
+        <w:spacing w:after="160"/>
+      </w:pPr>
+      <w:r>
+        <w:t xml:space="preserve">Goal: within 24 months, make CLT the reference brand for hybrid textile printing in Mexico and replicate the model in Latin America in year 3. Positioning: “Screen + digital in one pass, with chemistry and service in Mexico.” We do not sell a machine: we sell unlimited color at screen printing cost, effects DTF cannot achieve and a local technical partner.</w:t>
+      </w:r>
+    </w:p>
+    <w:tbl>
+      <w:tblPr>
+        <w:tblW w:type="dxa" w:w="9360"/>
+        <w:tblBorders>
+          <w:top w:val="single" w:color="auto" w:sz="4"/>
+          <w:left w:val="single" w:color="auto" w:sz="4"/>
+          <w:bottom w:val="single" w:color="auto" w:sz="4"/>
+          <w:right w:val="single" w:color="auto" w:sz="4"/>
+          <w:insideH w:val="single" w:color="auto" w:sz="4"/>
+          <w:insideV w:val="single" w:color="auto" w:sz="4"/>
+        </w:tblBorders>
+      </w:tblPr>
+      <w:tblGrid>
+        <w:gridCol w:w="2300"/>
+        <w:gridCol w:w="7060"/>
+      </w:tblGrid>
+      <w:tr>
+        <w:trPr>
+          <w:cantSplit/>
+          <w:tblHeader/>
+        </w:trPr>
+        <w:tc>
+          <w:tcPr>
+            <w:tcW w:type="dxa" w:w="2300"/>
+            <w:tcBorders>
+              <w:top w:val="single" w:color="C9D1DC" w:sz="4"/>
+              <w:left w:val="single" w:color="C9D1DC" w:sz="4"/>
+              <w:bottom w:val="single" w:color="C9D1DC" w:sz="4"/>
+              <w:right w:val="single" w:color="C9D1DC" w:sz="4"/>
+            </w:tcBorders>
+            <w:shd w:fill="1B1F3B" w:color="auto" w:val="clear"/>
+            <w:tcMar>
+              <w:top w:type="dxa" w:w="80"/>
+              <w:left w:type="dxa" w:w="110"/>
+              <w:bottom w:type="dxa" w:w="80"/>
+              <w:right w:type="dxa" w:w="110"/>
+            </w:tcMar>
+          </w:tcPr>
+          <w:p>
+            <w:pPr>
+              <w:keepNext/>
+            </w:pPr>
+            <w:r>
+              <w:rPr>
+                <w:rFonts w:ascii="Calibri" w:cs="Calibri" w:eastAsia="Calibri" w:hAnsi="Calibri"/>
+                <w:b/>
+                <w:bCs/>
+                <w:color w:val="FFFFFF"/>
+                <w:sz w:val="19"/>
+                <w:szCs w:val="19"/>
+              </w:rPr>
+              <w:t xml:space="preserve">Lever</w:t>
+            </w:r>
+          </w:p>
+        </w:tc>
+        <w:tc>
+          <w:tcPr>
+            <w:tcW w:type="dxa" w:w="7060"/>
+            <w:tcBorders>
+              <w:top w:val="single" w:color="C9D1DC" w:sz="4"/>
+              <w:left w:val="single" w:color="C9D1DC" w:sz="4"/>
+              <w:bottom w:val="single" w:color="C9D1DC" w:sz="4"/>
+              <w:right w:val="single" w:color="C9D1DC" w:sz="4"/>
+            </w:tcBorders>
+            <w:shd w:fill="1B1F3B" w:color="auto" w:val="clear"/>
+            <w:tcMar>
+              <w:top w:type="dxa" w:w="80"/>
+              <w:left w:type="dxa" w:w="110"/>
+              <w:bottom w:type="dxa" w:w="80"/>
+              <w:right w:type="dxa" w:w="110"/>
+            </w:tcMar>
+          </w:tcPr>
+          <w:p>
+            <w:pPr>
+              <w:keepNext/>
+            </w:pPr>
+            <w:r>
+              <w:rPr>
+                <w:rFonts w:ascii="Calibri" w:cs="Calibri" w:eastAsia="Calibri" w:hAnsi="Calibri"/>
+                <w:b/>
+                <w:bCs/>
+                <w:color w:val="FFFFFF"/>
+                <w:sz w:val="19"/>
+                <w:szCs w:val="19"/>
+              </w:rPr>
+              <w:t xml:space="preserve">What we will do</w:t>
+            </w:r>
+          </w:p>
+        </w:tc>
+      </w:tr>
+      <w:tr>
+        <w:trPr>
+          <w:cantSplit/>
+        </w:trPr>
+        <w:tc>
+          <w:tcPr>
+            <w:tcW w:type="dxa" w:w="2300"/>
+            <w:tcBorders>
+              <w:top w:val="single" w:color="C9D1DC" w:sz="4"/>
+              <w:left w:val="single" w:color="C9D1DC" w:sz="4"/>
+              <w:bottom w:val="single" w:color="C9D1DC" w:sz="4"/>
+              <w:right w:val="single" w:color="C9D1DC" w:sz="4"/>
+            </w:tcBorders>
+            <w:tcMar>
+              <w:top w:type="dxa" w:w="80"/>
+              <w:left w:type="dxa" w:w="110"/>
+              <w:bottom w:type="dxa" w:w="80"/>
+              <w:right w:type="dxa" w:w="110"/>
+            </w:tcMar>
+          </w:tcPr>
+          <w:p>
+            <w:pPr>
+              <w:keepNext/>
+            </w:pPr>
+            <w:r>
+              <w:rPr>
+                <w:rFonts w:ascii="Calibri" w:cs="Calibri" w:eastAsia="Calibri" w:hAnsi="Calibri"/>
+                <w:b/>
+                <w:bCs/>
+                <w:sz w:val="19"/>
+                <w:szCs w:val="19"/>
+              </w:rPr>
+              <w:t xml:space="preserve">Account-based marketing</w:t>
+            </w:r>
+          </w:p>
+        </w:tc>
+        <w:tc>
+          <w:tcPr>
+            <w:tcW w:type="dxa" w:w="7060"/>
+            <w:tcBorders>
+              <w:top w:val="single" w:color="C9D1DC" w:sz="4"/>
+              <w:left w:val="single" w:color="C9D1DC" w:sz="4"/>
+              <w:bottom w:val="single" w:color="C9D1DC" w:sz="4"/>
+              <w:right w:val="single" w:color="C9D1DC" w:sz="4"/>
+            </w:tcBorders>
+            <w:tcMar>
+              <w:top w:type="dxa" w:w="80"/>
+              <w:left w:type="dxa" w:w="110"/>
+              <w:bottom w:type="dxa" w:w="80"/>
+              <w:right w:type="dxa" w:w="110"/>
+            </w:tcMar>
+          </w:tcPr>
+          <w:p>
+            <w:pPr>
+              <w:keepNext/>
+            </w:pPr>
+            <w:r>
+              <w:rPr>
+                <w:rFonts w:ascii="Calibri" w:cs="Calibri" w:eastAsia="Calibri" w:hAnsi="Calibri"/>
+                <w:b w:val="false"/>
+                <w:bCs w:val="false"/>
+                <w:sz w:val="19"/>
+                <w:szCs w:val="19"/>
+              </w:rPr>
+              <w:t xml:space="preserve">Sample with each of the 17 80/20 accounts’ own design, ROI calculator, demo and pilot on their fabric</w:t>
+            </w:r>
+          </w:p>
+        </w:tc>
+      </w:tr>
+      <w:tr>
+        <w:trPr>
+          <w:cantSplit/>
+        </w:trPr>
+        <w:tc>
+          <w:tcPr>
+            <w:tcW w:type="dxa" w:w="2300"/>
+            <w:tcBorders>
+              <w:top w:val="single" w:color="C9D1DC" w:sz="4"/>
+              <w:left w:val="single" w:color="C9D1DC" w:sz="4"/>
+              <w:bottom w:val="single" w:color="C9D1DC" w:sz="4"/>
+              <w:right w:val="single" w:color="C9D1DC" w:sz="4"/>
+            </w:tcBorders>
+            <w:shd w:fill="EEF2F7" w:color="auto" w:val="clear"/>
+            <w:tcMar>
+              <w:top w:type="dxa" w:w="80"/>
+              <w:left w:type="dxa" w:w="110"/>
+              <w:bottom w:type="dxa" w:w="80"/>
+              <w:right w:type="dxa" w:w="110"/>
+            </w:tcMar>
+          </w:tcPr>
+          <w:p>
+            <w:pPr>
+              <w:keepNext/>
+            </w:pPr>
+            <w:r>
+              <w:rPr>
+                <w:rFonts w:ascii="Calibri" w:cs="Calibri" w:eastAsia="Calibri" w:hAnsi="Calibri"/>
+                <w:b/>
+                <w:bCs/>
+                <w:sz w:val="19"/>
+                <w:szCs w:val="19"/>
+              </w:rPr>
+              <w:t xml:space="preserve">Demo room</w:t>
+            </w:r>
+          </w:p>
+        </w:tc>
+        <w:tc>
+          <w:tcPr>
+            <w:tcW w:type="dxa" w:w="7060"/>
+            <w:tcBorders>
+              <w:top w:val="single" w:color="C9D1DC" w:sz="4"/>
+              <w:left w:val="single" w:color="C9D1DC" w:sz="4"/>
+              <w:bottom w:val="single" w:color="C9D1DC" w:sz="4"/>
+              <w:right w:val="single" w:color="C9D1DC" w:sz="4"/>
+            </w:tcBorders>
+            <w:shd w:fill="EEF2F7" w:color="auto" w:val="clear"/>
+            <w:tcMar>
+              <w:top w:type="dxa" w:w="80"/>
+              <w:left w:type="dxa" w:w="110"/>
+              <w:bottom w:type="dxa" w:w="80"/>
+              <w:right w:type="dxa" w:w="110"/>
+            </w:tcMar>
+          </w:tcPr>
+          <w:p>
+            <w:pPr>
+              <w:keepNext/>
+            </w:pPr>
+            <w:r>
+              <w:rPr>
+                <w:rFonts w:ascii="Calibri" w:cs="Calibri" w:eastAsia="Calibri" w:hAnsi="Calibri"/>
+                <w:b w:val="false"/>
+                <w:bCs w:val="false"/>
+                <w:sz w:val="19"/>
+                <w:szCs w:val="19"/>
+              </w:rPr>
+              <w:t xml:space="preserve">Querétaro as the sales engine: demos, effect workshops and the CLT Hybrid Academy (operator certification)</w:t>
+            </w:r>
+          </w:p>
+        </w:tc>
+      </w:tr>
+      <w:tr>
+        <w:trPr>
+          <w:cantSplit/>
+        </w:trPr>
+        <w:tc>
+          <w:tcPr>
+            <w:tcW w:type="dxa" w:w="2300"/>
+            <w:tcBorders>
+              <w:top w:val="single" w:color="C9D1DC" w:sz="4"/>
+              <w:left w:val="single" w:color="C9D1DC" w:sz="4"/>
+              <w:bottom w:val="single" w:color="C9D1DC" w:sz="4"/>
+              <w:right w:val="single" w:color="C9D1DC" w:sz="4"/>
+            </w:tcBorders>
+            <w:tcMar>
+              <w:top w:type="dxa" w:w="80"/>
+              <w:left w:type="dxa" w:w="110"/>
+              <w:bottom w:type="dxa" w:w="80"/>
+              <w:right w:type="dxa" w:w="110"/>
+            </w:tcMar>
+          </w:tcPr>
+          <w:p>
+            <w:pPr>
+              <w:keepNext/>
+            </w:pPr>
+            <w:r>
+              <w:rPr>
+                <w:rFonts w:ascii="Calibri" w:cs="Calibri" w:eastAsia="Calibri" w:hAnsi="Calibri"/>
+                <w:b/>
+                <w:bCs/>
+                <w:sz w:val="19"/>
+                <w:szCs w:val="19"/>
+              </w:rPr>
+              <w:t xml:space="preserve">Content and digital</w:t>
+            </w:r>
+          </w:p>
+        </w:tc>
+        <w:tc>
+          <w:tcPr>
+            <w:tcW w:type="dxa" w:w="7060"/>
+            <w:tcBorders>
+              <w:top w:val="single" w:color="C9D1DC" w:sz="4"/>
+              <w:left w:val="single" w:color="C9D1DC" w:sz="4"/>
+              <w:bottom w:val="single" w:color="C9D1DC" w:sz="4"/>
+              <w:right w:val="single" w:color="C9D1DC" w:sz="4"/>
+            </w:tcBorders>
+            <w:tcMar>
+              <w:top w:type="dxa" w:w="80"/>
+              <w:left w:type="dxa" w:w="110"/>
+              <w:bottom w:type="dxa" w:w="80"/>
+              <w:right w:type="dxa" w:w="110"/>
+            </w:tcMar>
+          </w:tcPr>
+          <w:p>
+            <w:pPr>
+              <w:keepNext/>
+            </w:pPr>
+            <w:r>
+              <w:rPr>
+                <w:rFonts w:ascii="Calibri" w:cs="Calibri" w:eastAsia="Calibri" w:hAnsi="Calibri"/>
+                <w:b w:val="false"/>
+                <w:bCs w:val="false"/>
+                <w:sz w:val="19"/>
+                <w:szCs w:val="19"/>
+              </w:rPr>
+              <w:t xml:space="preserve">Effect reels (glass, embroidery, 3D), customer cases, LinkedIn for OEMs, WhatsApp for consumables</w:t>
+            </w:r>
+          </w:p>
+        </w:tc>
+      </w:tr>
+      <w:tr>
+        <w:trPr>
+          <w:cantSplit/>
+        </w:trPr>
+        <w:tc>
+          <w:tcPr>
+            <w:tcW w:type="dxa" w:w="2300"/>
+            <w:tcBorders>
+              <w:top w:val="single" w:color="C9D1DC" w:sz="4"/>
+              <w:left w:val="single" w:color="C9D1DC" w:sz="4"/>
+              <w:bottom w:val="single" w:color="C9D1DC" w:sz="4"/>
+              <w:right w:val="single" w:color="C9D1DC" w:sz="4"/>
+            </w:tcBorders>
+            <w:shd w:fill="EEF2F7" w:color="auto" w:val="clear"/>
+            <w:tcMar>
+              <w:top w:type="dxa" w:w="80"/>
+              <w:left w:type="dxa" w:w="110"/>
+              <w:bottom w:type="dxa" w:w="80"/>
+              <w:right w:type="dxa" w:w="110"/>
+            </w:tcMar>
+          </w:tcPr>
+          <w:p>
+            <w:pPr>
+              <w:keepNext/>
+            </w:pPr>
+            <w:r>
+              <w:rPr>
+                <w:rFonts w:ascii="Calibri" w:cs="Calibri" w:eastAsia="Calibri" w:hAnsi="Calibri"/>
+                <w:b/>
+                <w:bCs/>
+                <w:sz w:val="19"/>
+                <w:szCs w:val="19"/>
+              </w:rPr>
+              <w:t xml:space="preserve">Events</w:t>
+            </w:r>
+          </w:p>
+        </w:tc>
+        <w:tc>
+          <w:tcPr>
+            <w:tcW w:type="dxa" w:w="7060"/>
+            <w:tcBorders>
+              <w:top w:val="single" w:color="C9D1DC" w:sz="4"/>
+              <w:left w:val="single" w:color="C9D1DC" w:sz="4"/>
+              <w:bottom w:val="single" w:color="C9D1DC" w:sz="4"/>
+              <w:right w:val="single" w:color="C9D1DC" w:sz="4"/>
+            </w:tcBorders>
+            <w:shd w:fill="EEF2F7" w:color="auto" w:val="clear"/>
+            <w:tcMar>
+              <w:top w:type="dxa" w:w="80"/>
+              <w:left w:type="dxa" w:w="110"/>
+              <w:bottom w:type="dxa" w:w="80"/>
+              <w:right w:type="dxa" w:w="110"/>
+            </w:tcMar>
+          </w:tcPr>
+          <w:p>
+            <w:pPr>
+              <w:keepNext/>
+            </w:pPr>
+            <w:r>
+              <w:rPr>
+                <w:rFonts w:ascii="Calibri" w:cs="Calibri" w:eastAsia="Calibri" w:hAnsi="Calibri"/>
+                <w:b w:val="false"/>
+                <w:bCs w:val="false"/>
+                <w:sz w:val="19"/>
+                <w:szCs w:val="19"/>
+              </w:rPr>
+              <w:t xml:space="preserve">FESPA México, demo room opening, “Hybrid Days” in 6 cities and PRINTING United with VSP</w:t>
+            </w:r>
+          </w:p>
+        </w:tc>
+      </w:tr>
+      <w:tr>
+        <w:trPr>
+          <w:cantSplit/>
+        </w:trPr>
+        <w:tc>
+          <w:tcPr>
+            <w:tcW w:type="dxa" w:w="2300"/>
+            <w:tcBorders>
+              <w:top w:val="single" w:color="C9D1DC" w:sz="4"/>
+              <w:left w:val="single" w:color="C9D1DC" w:sz="4"/>
+              <w:bottom w:val="single" w:color="C9D1DC" w:sz="4"/>
+              <w:right w:val="single" w:color="C9D1DC" w:sz="4"/>
+            </w:tcBorders>
+            <w:tcMar>
+              <w:top w:type="dxa" w:w="80"/>
+              <w:left w:type="dxa" w:w="110"/>
+              <w:bottom w:type="dxa" w:w="80"/>
+              <w:right w:type="dxa" w:w="110"/>
+            </w:tcMar>
+          </w:tcPr>
+          <w:p>
+            <w:pPr>
+              <w:keepNext w:val="false"/>
+            </w:pPr>
+            <w:r>
+              <w:rPr>
+                <w:rFonts w:ascii="Calibri" w:cs="Calibri" w:eastAsia="Calibri" w:hAnsi="Calibri"/>
+                <w:b/>
+                <w:bCs/>
+                <w:sz w:val="19"/>
+                <w:szCs w:val="19"/>
+              </w:rPr>
+              <w:t xml:space="preserve">Offer</w:t>
+            </w:r>
+          </w:p>
+        </w:tc>
+        <w:tc>
+          <w:tcPr>
+            <w:tcW w:type="dxa" w:w="7060"/>
+            <w:tcBorders>
+              <w:top w:val="single" w:color="C9D1DC" w:sz="4"/>
+              <w:left w:val="single" w:color="C9D1DC" w:sz="4"/>
+              <w:bottom w:val="single" w:color="C9D1DC" w:sz="4"/>
+              <w:right w:val="single" w:color="C9D1DC" w:sz="4"/>
+            </w:tcBorders>
+            <w:tcMar>
+              <w:top w:type="dxa" w:w="80"/>
+              <w:left w:type="dxa" w:w="110"/>
+              <w:bottom w:type="dxa" w:w="80"/>
+              <w:right w:type="dxa" w:w="110"/>
+            </w:tcMar>
+          </w:tcPr>
+          <w:p>
+            <w:pPr>
+              <w:keepNext w:val="false"/>
+            </w:pPr>
+            <w:r>
+              <w:rPr>
+                <w:rFonts w:ascii="Calibri" w:cs="Calibri" w:eastAsia="Calibri" w:hAnsi="Calibri"/>
+                <w:b w:val="false"/>
+                <w:bCs w:val="false"/>
+                <w:sz w:val="19"/>
+                <w:szCs w:val="19"/>
+              </w:rPr>
+              <w:t xml:space="preserve">Starter, Pro and Full packages; “founding customers” program for the first 5 buyers; consumables as the entry point</w:t>
+            </w:r>
+          </w:p>
+        </w:tc>
+      </w:tr>
+    </w:tbl>
+    <w:p>
+      <w:pPr>
+        <w:spacing w:after="120"/>
+      </w:pPr>
+    </w:p>
+    <w:tbl>
+      <w:tblPr>
+        <w:tblW w:type="dxa" w:w="9360"/>
+        <w:tblBorders>
+          <w:top w:val="single" w:color="auto" w:sz="4"/>
+          <w:left w:val="single" w:color="auto" w:sz="4"/>
+          <w:bottom w:val="single" w:color="auto" w:sz="4"/>
+          <w:right w:val="single" w:color="auto" w:sz="4"/>
+          <w:insideH w:val="single" w:color="auto" w:sz="4"/>
+          <w:insideV w:val="single" w:color="auto" w:sz="4"/>
+        </w:tblBorders>
+      </w:tblPr>
+      <w:tblGrid>
+        <w:gridCol w:w="3960"/>
+        <w:gridCol w:w="1800"/>
+        <w:gridCol w:w="1800"/>
+        <w:gridCol w:w="1800"/>
+      </w:tblGrid>
+      <w:tr>
+        <w:trPr>
+          <w:cantSplit/>
+          <w:tblHeader/>
+        </w:trPr>
+        <w:tc>
+          <w:tcPr>
+            <w:tcW w:type="dxa" w:w="3960"/>
+            <w:tcBorders>
+              <w:top w:val="single" w:color="C9D1DC" w:sz="4"/>
+              <w:left w:val="single" w:color="C9D1DC" w:sz="4"/>
+              <w:bottom w:val="single" w:color="C9D1DC" w:sz="4"/>
+              <w:right w:val="single" w:color="C9D1DC" w:sz="4"/>
+            </w:tcBorders>
+            <w:shd w:fill="1B1F3B" w:color="auto" w:val="clear"/>
+            <w:tcMar>
+              <w:top w:type="dxa" w:w="80"/>
+              <w:left w:type="dxa" w:w="110"/>
+              <w:bottom w:type="dxa" w:w="80"/>
+              <w:right w:type="dxa" w:w="110"/>
+            </w:tcMar>
+          </w:tcPr>
+          <w:p>
+            <w:pPr>
+              <w:keepNext/>
+            </w:pPr>
+            <w:r>
+              <w:rPr>
+                <w:rFonts w:ascii="Calibri" w:cs="Calibri" w:eastAsia="Calibri" w:hAnsi="Calibri"/>
+                <w:b/>
+                <w:bCs/>
+                <w:color w:val="FFFFFF"/>
+                <w:sz w:val="19"/>
+                <w:szCs w:val="19"/>
+              </w:rPr>
+              <w:t xml:space="preserve">Targets and budget</w:t>
+            </w:r>
+          </w:p>
+        </w:tc>
+        <w:tc>
+          <w:tcPr>
+            <w:tcW w:type="dxa" w:w="1800"/>
+            <w:tcBorders>
+              <w:top w:val="single" w:color="C9D1DC" w:sz="4"/>
+              <w:left w:val="single" w:color="C9D1DC" w:sz="4"/>
+              <w:bottom w:val="single" w:color="C9D1DC" w:sz="4"/>
+              <w:right w:val="single" w:color="C9D1DC" w:sz="4"/>
+            </w:tcBorders>
+            <w:shd w:fill="1B1F3B" w:color="auto" w:val="clear"/>
+            <w:tcMar>
+              <w:top w:type="dxa" w:w="80"/>
+              <w:left w:type="dxa" w:w="110"/>
+              <w:bottom w:type="dxa" w:w="80"/>
+              <w:right w:type="dxa" w:w="110"/>
+            </w:tcMar>
+          </w:tcPr>
+          <w:p>
+            <w:pPr>
+              <w:keepNext/>
+            </w:pPr>
+            <w:r>
+              <w:rPr>
+                <w:rFonts w:ascii="Calibri" w:cs="Calibri" w:eastAsia="Calibri" w:hAnsi="Calibri"/>
+                <w:b/>
+                <w:bCs/>
+                <w:color w:val="FFFFFF"/>
+                <w:sz w:val="19"/>
+                <w:szCs w:val="19"/>
+              </w:rPr>
+              <w:t xml:space="preserve">Year 1</w:t>
+            </w:r>
+          </w:p>
+        </w:tc>
+        <w:tc>
+          <w:tcPr>
+            <w:tcW w:type="dxa" w:w="1800"/>
+            <w:tcBorders>
+              <w:top w:val="single" w:color="C9D1DC" w:sz="4"/>
+              <w:left w:val="single" w:color="C9D1DC" w:sz="4"/>
+              <w:bottom w:val="single" w:color="C9D1DC" w:sz="4"/>
+              <w:right w:val="single" w:color="C9D1DC" w:sz="4"/>
+            </w:tcBorders>
+            <w:shd w:fill="1B1F3B" w:color="auto" w:val="clear"/>
+            <w:tcMar>
+              <w:top w:type="dxa" w:w="80"/>
+              <w:left w:type="dxa" w:w="110"/>
+              <w:bottom w:type="dxa" w:w="80"/>
+              <w:right w:type="dxa" w:w="110"/>
+            </w:tcMar>
+          </w:tcPr>
+          <w:p>
+            <w:pPr>
+              <w:keepNext/>
+            </w:pPr>
+            <w:r>
+              <w:rPr>
+                <w:rFonts w:ascii="Calibri" w:cs="Calibri" w:eastAsia="Calibri" w:hAnsi="Calibri"/>
+                <w:b/>
+                <w:bCs/>
+                <w:color w:val="FFFFFF"/>
+                <w:sz w:val="19"/>
+                <w:szCs w:val="19"/>
+              </w:rPr>
+              <w:t xml:space="preserve">Year 2</w:t>
+            </w:r>
+          </w:p>
+        </w:tc>
+        <w:tc>
+          <w:tcPr>
+            <w:tcW w:type="dxa" w:w="1800"/>
+            <w:tcBorders>
+              <w:top w:val="single" w:color="C9D1DC" w:sz="4"/>
+              <w:left w:val="single" w:color="C9D1DC" w:sz="4"/>
+              <w:bottom w:val="single" w:color="C9D1DC" w:sz="4"/>
+              <w:right w:val="single" w:color="C9D1DC" w:sz="4"/>
+            </w:tcBorders>
+            <w:shd w:fill="1B1F3B" w:color="auto" w:val="clear"/>
+            <w:tcMar>
+              <w:top w:type="dxa" w:w="80"/>
+              <w:left w:type="dxa" w:w="110"/>
+              <w:bottom w:type="dxa" w:w="80"/>
+              <w:right w:type="dxa" w:w="110"/>
+            </w:tcMar>
+          </w:tcPr>
+          <w:p>
+            <w:pPr>
+              <w:keepNext/>
+            </w:pPr>
+            <w:r>
+              <w:rPr>
+                <w:rFonts w:ascii="Calibri" w:cs="Calibri" w:eastAsia="Calibri" w:hAnsi="Calibri"/>
+                <w:b/>
+                <w:bCs/>
+                <w:color w:val="FFFFFF"/>
+                <w:sz w:val="19"/>
+                <w:szCs w:val="19"/>
+              </w:rPr>
+              <w:t xml:space="preserve">Year 3</w:t>
+            </w:r>
+          </w:p>
+        </w:tc>
+      </w:tr>
+      <w:tr>
+        <w:trPr>
+          <w:cantSplit/>
+        </w:trPr>
+        <w:tc>
+          <w:tcPr>
+            <w:tcW w:type="dxa" w:w="3960"/>
+            <w:tcBorders>
+              <w:top w:val="single" w:color="C9D1DC" w:sz="4"/>
+              <w:left w:val="single" w:color="C9D1DC" w:sz="4"/>
+              <w:bottom w:val="single" w:color="C9D1DC" w:sz="4"/>
+              <w:right w:val="single" w:color="C9D1DC" w:sz="4"/>
+            </w:tcBorders>
+            <w:tcMar>
+              <w:top w:type="dxa" w:w="80"/>
+              <w:left w:type="dxa" w:w="110"/>
+              <w:bottom w:type="dxa" w:w="80"/>
+              <w:right w:type="dxa" w:w="110"/>
+            </w:tcMar>
+          </w:tcPr>
+          <w:p>
+            <w:pPr>
+              <w:keepNext/>
+            </w:pPr>
+            <w:r>
+              <w:rPr>
+                <w:rFonts w:ascii="Calibri" w:cs="Calibri" w:eastAsia="Calibri" w:hAnsi="Calibri"/>
+                <w:b/>
+                <w:bCs/>
+                <w:sz w:val="19"/>
+                <w:szCs w:val="19"/>
+              </w:rPr>
+              <w:t xml:space="preserve">Qualified leads</w:t>
+            </w:r>
+          </w:p>
+        </w:tc>
+        <w:tc>
+          <w:tcPr>
+            <w:tcW w:type="dxa" w:w="1800"/>
+            <w:tcBorders>
+              <w:top w:val="single" w:color="C9D1DC" w:sz="4"/>
+              <w:left w:val="single" w:color="C9D1DC" w:sz="4"/>
+              <w:bottom w:val="single" w:color="C9D1DC" w:sz="4"/>
+              <w:right w:val="single" w:color="C9D1DC" w:sz="4"/>
+            </w:tcBorders>
+            <w:tcMar>
+              <w:top w:type="dxa" w:w="80"/>
+              <w:left w:type="dxa" w:w="110"/>
+              <w:bottom w:type="dxa" w:w="80"/>
+              <w:right w:type="dxa" w:w="110"/>
+            </w:tcMar>
+          </w:tcPr>
+          <w:p>
+            <w:pPr>
+              <w:keepNext/>
+            </w:pPr>
+            <w:r>
+              <w:rPr>
+                <w:rFonts w:ascii="Calibri" w:cs="Calibri" w:eastAsia="Calibri" w:hAnsi="Calibri"/>
+                <w:b w:val="false"/>
+                <w:bCs w:val="false"/>
+                <w:sz w:val="19"/>
+                <w:szCs w:val="19"/>
+              </w:rPr>
+              <w:t xml:space="preserve">300</w:t>
+            </w:r>
+          </w:p>
+        </w:tc>
+        <w:tc>
+          <w:tcPr>
+            <w:tcW w:type="dxa" w:w="1800"/>
+            <w:tcBorders>
+              <w:top w:val="single" w:color="C9D1DC" w:sz="4"/>
+              <w:left w:val="single" w:color="C9D1DC" w:sz="4"/>
+              <w:bottom w:val="single" w:color="C9D1DC" w:sz="4"/>
+              <w:right w:val="single" w:color="C9D1DC" w:sz="4"/>
+            </w:tcBorders>
+            <w:tcMar>
+              <w:top w:type="dxa" w:w="80"/>
+              <w:left w:type="dxa" w:w="110"/>
+              <w:bottom w:type="dxa" w:w="80"/>
+              <w:right w:type="dxa" w:w="110"/>
+            </w:tcMar>
+          </w:tcPr>
+          <w:p>
+            <w:pPr>
+              <w:keepNext/>
+            </w:pPr>
+            <w:r>
+              <w:rPr>
+                <w:rFonts w:ascii="Calibri" w:cs="Calibri" w:eastAsia="Calibri" w:hAnsi="Calibri"/>
+                <w:b w:val="false"/>
+                <w:bCs w:val="false"/>
+                <w:sz w:val="19"/>
+                <w:szCs w:val="19"/>
+              </w:rPr>
+              <w:t xml:space="preserve">600</w:t>
+            </w:r>
+          </w:p>
+        </w:tc>
+        <w:tc>
+          <w:tcPr>
+            <w:tcW w:type="dxa" w:w="1800"/>
+            <w:tcBorders>
+              <w:top w:val="single" w:color="C9D1DC" w:sz="4"/>
+              <w:left w:val="single" w:color="C9D1DC" w:sz="4"/>
+              <w:bottom w:val="single" w:color="C9D1DC" w:sz="4"/>
+              <w:right w:val="single" w:color="C9D1DC" w:sz="4"/>
+            </w:tcBorders>
+            <w:tcMar>
+              <w:top w:type="dxa" w:w="80"/>
+              <w:left w:type="dxa" w:w="110"/>
+              <w:bottom w:type="dxa" w:w="80"/>
+              <w:right w:type="dxa" w:w="110"/>
+            </w:tcMar>
+          </w:tcPr>
+          <w:p>
+            <w:pPr>
+              <w:keepNext/>
+            </w:pPr>
+            <w:r>
+              <w:rPr>
+                <w:rFonts w:ascii="Calibri" w:cs="Calibri" w:eastAsia="Calibri" w:hAnsi="Calibri"/>
+                <w:b w:val="false"/>
+                <w:bCs w:val="false"/>
+                <w:sz w:val="19"/>
+                <w:szCs w:val="19"/>
+              </w:rPr>
+              <w:t xml:space="preserve">900</w:t>
+            </w:r>
+          </w:p>
+        </w:tc>
+      </w:tr>
+      <w:tr>
+        <w:trPr>
+          <w:cantSplit/>
+        </w:trPr>
+        <w:tc>
+          <w:tcPr>
+            <w:tcW w:type="dxa" w:w="3960"/>
+            <w:tcBorders>
+              <w:top w:val="single" w:color="C9D1DC" w:sz="4"/>
+              <w:left w:val="single" w:color="C9D1DC" w:sz="4"/>
+              <w:bottom w:val="single" w:color="C9D1DC" w:sz="4"/>
+              <w:right w:val="single" w:color="C9D1DC" w:sz="4"/>
+            </w:tcBorders>
+            <w:shd w:fill="EEF2F7" w:color="auto" w:val="clear"/>
+            <w:tcMar>
+              <w:top w:type="dxa" w:w="80"/>
+              <w:left w:type="dxa" w:w="110"/>
+              <w:bottom w:type="dxa" w:w="80"/>
+              <w:right w:type="dxa" w:w="110"/>
+            </w:tcMar>
+          </w:tcPr>
+          <w:p>
+            <w:pPr>
+              <w:keepNext/>
+            </w:pPr>
+            <w:r>
+              <w:rPr>
+                <w:rFonts w:ascii="Calibri" w:cs="Calibri" w:eastAsia="Calibri" w:hAnsi="Calibri"/>
+                <w:b/>
+                <w:bCs/>
+                <w:sz w:val="19"/>
+                <w:szCs w:val="19"/>
+              </w:rPr>
+              <w:t xml:space="preserve">Demos</w:t>
+            </w:r>
+          </w:p>
+        </w:tc>
+        <w:tc>
+          <w:tcPr>
+            <w:tcW w:type="dxa" w:w="1800"/>
+            <w:tcBorders>
+              <w:top w:val="single" w:color="C9D1DC" w:sz="4"/>
+              <w:left w:val="single" w:color="C9D1DC" w:sz="4"/>
+              <w:bottom w:val="single" w:color="C9D1DC" w:sz="4"/>
+              <w:right w:val="single" w:color="C9D1DC" w:sz="4"/>
+            </w:tcBorders>
+            <w:shd w:fill="EEF2F7" w:color="auto" w:val="clear"/>
+            <w:tcMar>
+              <w:top w:type="dxa" w:w="80"/>
+              <w:left w:type="dxa" w:w="110"/>
+              <w:bottom w:type="dxa" w:w="80"/>
+              <w:right w:type="dxa" w:w="110"/>
+            </w:tcMar>
+          </w:tcPr>
+          <w:p>
+            <w:pPr>
+              <w:keepNext/>
+            </w:pPr>
+            <w:r>
+              <w:rPr>
+                <w:rFonts w:ascii="Calibri" w:cs="Calibri" w:eastAsia="Calibri" w:hAnsi="Calibri"/>
+                <w:b w:val="false"/>
+                <w:bCs w:val="false"/>
+                <w:sz w:val="19"/>
+                <w:szCs w:val="19"/>
+              </w:rPr>
+              <w:t xml:space="preserve">40</w:t>
+            </w:r>
+          </w:p>
+        </w:tc>
+        <w:tc>
+          <w:tcPr>
+            <w:tcW w:type="dxa" w:w="1800"/>
+            <w:tcBorders>
+              <w:top w:val="single" w:color="C9D1DC" w:sz="4"/>
+              <w:left w:val="single" w:color="C9D1DC" w:sz="4"/>
+              <w:bottom w:val="single" w:color="C9D1DC" w:sz="4"/>
+              <w:right w:val="single" w:color="C9D1DC" w:sz="4"/>
+            </w:tcBorders>
+            <w:shd w:fill="EEF2F7" w:color="auto" w:val="clear"/>
+            <w:tcMar>
+              <w:top w:type="dxa" w:w="80"/>
+              <w:left w:type="dxa" w:w="110"/>
+              <w:bottom w:type="dxa" w:w="80"/>
+              <w:right w:type="dxa" w:w="110"/>
+            </w:tcMar>
+          </w:tcPr>
+          <w:p>
+            <w:pPr>
+              <w:keepNext/>
+            </w:pPr>
+            <w:r>
+              <w:rPr>
+                <w:rFonts w:ascii="Calibri" w:cs="Calibri" w:eastAsia="Calibri" w:hAnsi="Calibri"/>
+                <w:b w:val="false"/>
+                <w:bCs w:val="false"/>
+                <w:sz w:val="19"/>
+                <w:szCs w:val="19"/>
+              </w:rPr>
+              <w:t xml:space="preserve">80</w:t>
+            </w:r>
+          </w:p>
+        </w:tc>
+        <w:tc>
+          <w:tcPr>
+            <w:tcW w:type="dxa" w:w="1800"/>
+            <w:tcBorders>
+              <w:top w:val="single" w:color="C9D1DC" w:sz="4"/>
+              <w:left w:val="single" w:color="C9D1DC" w:sz="4"/>
+              <w:bottom w:val="single" w:color="C9D1DC" w:sz="4"/>
+              <w:right w:val="single" w:color="C9D1DC" w:sz="4"/>
+            </w:tcBorders>
+            <w:shd w:fill="EEF2F7" w:color="auto" w:val="clear"/>
+            <w:tcMar>
+              <w:top w:type="dxa" w:w="80"/>
+              <w:left w:type="dxa" w:w="110"/>
+              <w:bottom w:type="dxa" w:w="80"/>
+              <w:right w:type="dxa" w:w="110"/>
+            </w:tcMar>
+          </w:tcPr>
+          <w:p>
+            <w:pPr>
+              <w:keepNext/>
+            </w:pPr>
+            <w:r>
+              <w:rPr>
+                <w:rFonts w:ascii="Calibri" w:cs="Calibri" w:eastAsia="Calibri" w:hAnsi="Calibri"/>
+                <w:b w:val="false"/>
+                <w:bCs w:val="false"/>
+                <w:sz w:val="19"/>
+                <w:szCs w:val="19"/>
+              </w:rPr>
+              <w:t xml:space="preserve">120</w:t>
+            </w:r>
+          </w:p>
+        </w:tc>
+      </w:tr>
+      <w:tr>
+        <w:trPr>
+          <w:cantSplit/>
+        </w:trPr>
+        <w:tc>
+          <w:tcPr>
+            <w:tcW w:type="dxa" w:w="3960"/>
+            <w:tcBorders>
+              <w:top w:val="single" w:color="C9D1DC" w:sz="4"/>
+              <w:left w:val="single" w:color="C9D1DC" w:sz="4"/>
+              <w:bottom w:val="single" w:color="C9D1DC" w:sz="4"/>
+              <w:right w:val="single" w:color="C9D1DC" w:sz="4"/>
+            </w:tcBorders>
+            <w:tcMar>
+              <w:top w:type="dxa" w:w="80"/>
+              <w:left w:type="dxa" w:w="110"/>
+              <w:bottom w:type="dxa" w:w="80"/>
+              <w:right w:type="dxa" w:w="110"/>
+            </w:tcMar>
+          </w:tcPr>
+          <w:p>
+            <w:pPr>
+              <w:keepNext/>
+            </w:pPr>
+            <w:r>
+              <w:rPr>
+                <w:rFonts w:ascii="Calibri" w:cs="Calibri" w:eastAsia="Calibri" w:hAnsi="Calibri"/>
+                <w:b/>
+                <w:bCs/>
+                <w:sz w:val="19"/>
+                <w:szCs w:val="19"/>
+              </w:rPr>
+              <w:t xml:space="preserve">Shops buying CLT consumables</w:t>
+            </w:r>
+          </w:p>
+        </w:tc>
+        <w:tc>
+          <w:tcPr>
+            <w:tcW w:type="dxa" w:w="1800"/>
+            <w:tcBorders>
+              <w:top w:val="single" w:color="C9D1DC" w:sz="4"/>
+              <w:left w:val="single" w:color="C9D1DC" w:sz="4"/>
+              <w:bottom w:val="single" w:color="C9D1DC" w:sz="4"/>
+              <w:right w:val="single" w:color="C9D1DC" w:sz="4"/>
+            </w:tcBorders>
+            <w:tcMar>
+              <w:top w:type="dxa" w:w="80"/>
+              <w:left w:type="dxa" w:w="110"/>
+              <w:bottom w:type="dxa" w:w="80"/>
+              <w:right w:type="dxa" w:w="110"/>
+            </w:tcMar>
+          </w:tcPr>
+          <w:p>
+            <w:pPr>
+              <w:keepNext/>
+            </w:pPr>
+            <w:r>
+              <w:rPr>
+                <w:rFonts w:ascii="Calibri" w:cs="Calibri" w:eastAsia="Calibri" w:hAnsi="Calibri"/>
+                <w:b w:val="false"/>
+                <w:bCs w:val="false"/>
+                <w:sz w:val="19"/>
+                <w:szCs w:val="19"/>
+              </w:rPr>
+              <w:t xml:space="preserve">30</w:t>
+            </w:r>
+          </w:p>
+        </w:tc>
+        <w:tc>
+          <w:tcPr>
+            <w:tcW w:type="dxa" w:w="1800"/>
+            <w:tcBorders>
+              <w:top w:val="single" w:color="C9D1DC" w:sz="4"/>
+              <w:left w:val="single" w:color="C9D1DC" w:sz="4"/>
+              <w:bottom w:val="single" w:color="C9D1DC" w:sz="4"/>
+              <w:right w:val="single" w:color="C9D1DC" w:sz="4"/>
+            </w:tcBorders>
+            <w:tcMar>
+              <w:top w:type="dxa" w:w="80"/>
+              <w:left w:type="dxa" w:w="110"/>
+              <w:bottom w:type="dxa" w:w="80"/>
+              <w:right w:type="dxa" w:w="110"/>
+            </w:tcMar>
+          </w:tcPr>
+          <w:p>
+            <w:pPr>
+              <w:keepNext/>
+            </w:pPr>
+            <w:r>
+              <w:rPr>
+                <w:rFonts w:ascii="Calibri" w:cs="Calibri" w:eastAsia="Calibri" w:hAnsi="Calibri"/>
+                <w:b w:val="false"/>
+                <w:bCs w:val="false"/>
+                <w:sz w:val="19"/>
+                <w:szCs w:val="19"/>
+              </w:rPr>
+              <w:t xml:space="preserve">70</w:t>
+            </w:r>
+          </w:p>
+        </w:tc>
+        <w:tc>
+          <w:tcPr>
+            <w:tcW w:type="dxa" w:w="1800"/>
+            <w:tcBorders>
+              <w:top w:val="single" w:color="C9D1DC" w:sz="4"/>
+              <w:left w:val="single" w:color="C9D1DC" w:sz="4"/>
+              <w:bottom w:val="single" w:color="C9D1DC" w:sz="4"/>
+              <w:right w:val="single" w:color="C9D1DC" w:sz="4"/>
+            </w:tcBorders>
+            <w:tcMar>
+              <w:top w:type="dxa" w:w="80"/>
+              <w:left w:type="dxa" w:w="110"/>
+              <w:bottom w:type="dxa" w:w="80"/>
+              <w:right w:type="dxa" w:w="110"/>
+            </w:tcMar>
+          </w:tcPr>
+          <w:p>
+            <w:pPr>
+              <w:keepNext/>
+            </w:pPr>
+            <w:r>
+              <w:rPr>
+                <w:rFonts w:ascii="Calibri" w:cs="Calibri" w:eastAsia="Calibri" w:hAnsi="Calibri"/>
+                <w:b w:val="false"/>
+                <w:bCs w:val="false"/>
+                <w:sz w:val="19"/>
+                <w:szCs w:val="19"/>
+              </w:rPr>
+              <w:t xml:space="preserve">120</w:t>
+            </w:r>
+          </w:p>
+        </w:tc>
+      </w:tr>
+      <w:tr>
+        <w:trPr>
+          <w:cantSplit/>
+        </w:trPr>
+        <w:tc>
+          <w:tcPr>
+            <w:tcW w:type="dxa" w:w="3960"/>
+            <w:tcBorders>
+              <w:top w:val="single" w:color="C9D1DC" w:sz="4"/>
+              <w:left w:val="single" w:color="C9D1DC" w:sz="4"/>
+              <w:bottom w:val="single" w:color="C9D1DC" w:sz="4"/>
+              <w:right w:val="single" w:color="C9D1DC" w:sz="4"/>
+            </w:tcBorders>
+            <w:shd w:fill="EEF2F7" w:color="auto" w:val="clear"/>
+            <w:tcMar>
+              <w:top w:type="dxa" w:w="80"/>
+              <w:left w:type="dxa" w:w="110"/>
+              <w:bottom w:type="dxa" w:w="80"/>
+              <w:right w:type="dxa" w:w="110"/>
+            </w:tcMar>
+          </w:tcPr>
+          <w:p>
+            <w:pPr>
+              <w:keepNext w:val="false"/>
+            </w:pPr>
+            <w:r>
+              <w:rPr>
+                <w:rFonts w:ascii="Calibri" w:cs="Calibri" w:eastAsia="Calibri" w:hAnsi="Calibri"/>
+                <w:b/>
+                <w:bCs/>
+                <w:sz w:val="19"/>
+                <w:szCs w:val="19"/>
+              </w:rPr>
+              <w:t xml:space="preserve">Marketing budget</w:t>
+            </w:r>
+          </w:p>
+        </w:tc>
+        <w:tc>
+          <w:tcPr>
+            <w:tcW w:type="dxa" w:w="1800"/>
+            <w:tcBorders>
+              <w:top w:val="single" w:color="C9D1DC" w:sz="4"/>
+              <w:left w:val="single" w:color="C9D1DC" w:sz="4"/>
+              <w:bottom w:val="single" w:color="C9D1DC" w:sz="4"/>
+              <w:right w:val="single" w:color="C9D1DC" w:sz="4"/>
+            </w:tcBorders>
+            <w:shd w:fill="EEF2F7" w:color="auto" w:val="clear"/>
+            <w:tcMar>
+              <w:top w:type="dxa" w:w="80"/>
+              <w:left w:type="dxa" w:w="110"/>
+              <w:bottom w:type="dxa" w:w="80"/>
+              <w:right w:type="dxa" w:w="110"/>
+            </w:tcMar>
+          </w:tcPr>
+          <w:p>
+            <w:pPr>
+              <w:keepNext w:val="false"/>
+            </w:pPr>
+            <w:r>
+              <w:rPr>
+                <w:rFonts w:ascii="Calibri" w:cs="Calibri" w:eastAsia="Calibri" w:hAnsi="Calibri"/>
+                <w:b w:val="false"/>
+                <w:bCs w:val="false"/>
+                <w:sz w:val="19"/>
+                <w:szCs w:val="19"/>
+              </w:rPr>
+              <w:t xml:space="preserve">US$50k</w:t>
+            </w:r>
+          </w:p>
+        </w:tc>
+        <w:tc>
+          <w:tcPr>
+            <w:tcW w:type="dxa" w:w="1800"/>
+            <w:tcBorders>
+              <w:top w:val="single" w:color="C9D1DC" w:sz="4"/>
+              <w:left w:val="single" w:color="C9D1DC" w:sz="4"/>
+              <w:bottom w:val="single" w:color="C9D1DC" w:sz="4"/>
+              <w:right w:val="single" w:color="C9D1DC" w:sz="4"/>
+            </w:tcBorders>
+            <w:shd w:fill="EEF2F7" w:color="auto" w:val="clear"/>
+            <w:tcMar>
+              <w:top w:type="dxa" w:w="80"/>
+              <w:left w:type="dxa" w:w="110"/>
+              <w:bottom w:type="dxa" w:w="80"/>
+              <w:right w:type="dxa" w:w="110"/>
+            </w:tcMar>
+          </w:tcPr>
+          <w:p>
+            <w:pPr>
+              <w:keepNext w:val="false"/>
+            </w:pPr>
+            <w:r>
+              <w:rPr>
+                <w:rFonts w:ascii="Calibri" w:cs="Calibri" w:eastAsia="Calibri" w:hAnsi="Calibri"/>
+                <w:b w:val="false"/>
+                <w:bCs w:val="false"/>
+                <w:sz w:val="19"/>
+                <w:szCs w:val="19"/>
+              </w:rPr>
+              <w:t xml:space="preserve">US$65k</w:t>
+            </w:r>
+          </w:p>
+        </w:tc>
+        <w:tc>
+          <w:tcPr>
+            <w:tcW w:type="dxa" w:w="1800"/>
+            <w:tcBorders>
+              <w:top w:val="single" w:color="C9D1DC" w:sz="4"/>
+              <w:left w:val="single" w:color="C9D1DC" w:sz="4"/>
+              <w:bottom w:val="single" w:color="C9D1DC" w:sz="4"/>
+              <w:right w:val="single" w:color="C9D1DC" w:sz="4"/>
+            </w:tcBorders>
+            <w:shd w:fill="EEF2F7" w:color="auto" w:val="clear"/>
+            <w:tcMar>
+              <w:top w:type="dxa" w:w="80"/>
+              <w:left w:type="dxa" w:w="110"/>
+              <w:bottom w:type="dxa" w:w="80"/>
+              <w:right w:type="dxa" w:w="110"/>
+            </w:tcMar>
+          </w:tcPr>
+          <w:p>
+            <w:pPr>
+              <w:keepNext w:val="false"/>
+            </w:pPr>
+            <w:r>
+              <w:rPr>
+                <w:rFonts w:ascii="Calibri" w:cs="Calibri" w:eastAsia="Calibri" w:hAnsi="Calibri"/>
+                <w:b w:val="false"/>
+                <w:bCs w:val="false"/>
+                <w:sz w:val="19"/>
+                <w:szCs w:val="19"/>
+              </w:rPr>
+              <w:t xml:space="preserve">US$80k</w:t>
+            </w:r>
+          </w:p>
+        </w:tc>
+      </w:tr>
+    </w:tbl>
+    <w:p>
+      <w:pPr>
+        <w:spacing w:after="120"/>
+      </w:pPr>
+    </w:p>
+    <w:p>
+      <w:pPr>
+        <w:spacing w:after="160"/>
+      </w:pPr>
+      <w:r>
+        <w:t xml:space="preserve">Latin America: wave 1 in El Salvador, Honduras and Guatemala (years 2–3), wave 2 in Peru and Colombia (year 3), conditional on Mexico (5 lines and documented cases). We ask CLT for a co-op marketing fund of 3–5% of purchases, Spanish brand material and an engineer at the launch. Full plan with calendar, budget and KPI dashboard in the attached Excel workbook.</w:t>
+      </w:r>
+    </w:p>
+    <w:p>
+      <w:pPr>
+        <w:spacing w:after="200" w:before="80"/>
+      </w:pPr>
+      <w:r>
+        <w:rPr>
+          <w:i/>
+          <w:iCs/>
+          <w:color w:val="555555"/>
+          <w:sz w:val="18"/>
+          <w:szCs w:val="18"/>
+        </w:rPr>
+        <w:t xml:space="preserve">Targets and budget: estimate to be validated with CLT.</w:t>
       </w:r>
     </w:p>
     <w:p>

</xml_diff>

<commit_message>
Aplica cambios de prioridad con base en la investigación de comercio exterior
- 80/20 OEM: sale RMC de México (ropa interior, sin serigrafía visible) y entra
  Industrias Manufactureras MYR (Irapuato; adidas y Puma)
- Grupo Martex y MYR pasan a prioridad A
- Latinoamérica: bajas de Hanes Ink Honduras, Palm y Everfit (cerradas o en
  liquidación); Southern Apparel, Gildan RD y CMT del Sur bajan a B
- 8 cuentas foco en Latinoamérica: Techno Screen, ACSA Colors, Cygnus, grupo
  Willbes (TCPL, Willbes Haitian, Willbes Dominicana), Topy Top y Nettalco
- Excel de prospectos: hoja Comercio exterior y columnas Cuenta foco / Notas
- Estudio de mercado: cifras de Latinoamérica calculadas desde los datos
- Propuesta, presentaciones, mapas y plan de marketing regenerados

Co-Authored-By: Claude Opus 5.5 <noreply@anthropic.com>
Claude-Session: https://claude.ai/code/session_012axCVDM5kAgj1VFnxhpsuM
</commit_message>
<xml_diff>
--- a/propuesta-clt/CLT_Distribution_Proposal_Mexico_EN.docx
+++ b/propuesta-clt/CLT_Distribution_Proposal_Mexico_EN.docx
@@ -7287,7 +7287,7 @@
                 <w:sz w:val="19"/>
                 <w:szCs w:val="19"/>
               </w:rPr>
-              <w:t xml:space="preserve">RMC de México</w:t>
+              <w:t xml:space="preserve">Industrias Manufactureras MYR</w:t>
             </w:r>
           </w:p>
         </w:tc>
@@ -7320,7 +7320,7 @@
                 <w:sz w:val="19"/>
                 <w:szCs w:val="19"/>
               </w:rPr>
-              <w:t xml:space="preserve">Linares, N.L.</w:t>
+              <w:t xml:space="preserve">Irapuato, Gto.</w:t>
             </w:r>
           </w:p>
         </w:tc>
@@ -7353,7 +7353,7 @@
                 <w:sz w:val="19"/>
                 <w:szCs w:val="19"/>
               </w:rPr>
-              <w:t xml:space="preserve">Vertical plant with printing, sublimation, embroidery, cut and sew; 336 workers</w:t>
+              <w:t xml:space="preserve">Mexico national team, Liga MX and MLS jerseys; 1,658 workers; exports to the U.S. and South America</w:t>
             </w:r>
           </w:p>
         </w:tc>
@@ -7386,7 +7386,7 @@
                 <w:sz w:val="19"/>
                 <w:szCs w:val="19"/>
               </w:rPr>
-              <w:t xml:space="preserve">Under Armour, Nordstrom</w:t>
+              <w:t xml:space="preserve">adidas, Puma</w:t>
             </w:r>
           </w:p>
         </w:tc>
@@ -7402,7 +7402,7 @@
         <w:spacing w:after="160"/>
       </w:pPr>
       <w:r>
-        <w:t xml:space="preserve">Next tier (OEM): Grumax / BEX Bordados y Estampados (Xalapa), California Cutting &amp; Sewing (Puebla), Confecciones Clabeck / JHK (Tlalnepantla; audited by Inditex and C&amp;A), Private Label Tehuacán (PVH, J.Crew, L.L.Bean), Industrias Manufactureras MYR (adidas, Puma; Mexico national team jerseys), Augusta Sportswear de México (Fanatics), Zentrix (Nike, Lululemon) and Baja Skiva Screen Printing (Disney).</w:t>
+        <w:t xml:space="preserve">Next tier (OEM): Grumax / BEX Bordados y Estampados (Xalapa), California Cutting &amp; Sewing (Puebla), Confecciones Clabeck / JHK (Tlalnepantla; audited by Inditex and C&amp;A), Private Label Tehuacán (PVH, J.Crew, L.L.Bean), Augusta Sportswear de México (Fanatics), Zentrix (Nike, Lululemon) and Baja Skiva Screen Printing (Disney).</w:t>
       </w:r>
     </w:p>
     <w:p>

</xml_diff>

<commit_message>
Agrega mercado en valor de impresión textil digital en México (Grand View Research) a propuesta y estudio
Co-Authored-By: Claude Opus 5.5 <noreply@anthropic.com>
Claude-Session: https://claude.ai/code/session_012axCVDM5kAgj1VFnxhpsuM
</commit_message>
<xml_diff>
--- a/propuesta-clt/CLT_Distribution_Proposal_Mexico_EN.docx
+++ b/propuesta-clt/CLT_Distribution_Proposal_Mexico_EN.docx
@@ -3969,6 +3969,812 @@
       </w:pPr>
       <w:r>
         <w:t xml:space="preserve">Competitor price reference: M&amp;R Cobra automatic press, 10 stations / 8 colors, ~US$88k in the U.S.</w:t>
+      </w:r>
+    </w:p>
+    <w:p>
+      <w:pPr>
+        <w:pStyle w:val="Heading2"/>
+      </w:pPr>
+      <w:r>
+        <w:t xml:space="preserve">Market value: digital textile printing in Mexico</w:t>
+      </w:r>
+    </w:p>
+    <w:tbl>
+      <w:tblPr>
+        <w:tblW w:type="dxa" w:w="9360"/>
+        <w:tblBorders>
+          <w:top w:val="single" w:color="auto" w:sz="4"/>
+          <w:left w:val="single" w:color="auto" w:sz="4"/>
+          <w:bottom w:val="single" w:color="auto" w:sz="4"/>
+          <w:right w:val="single" w:color="auto" w:sz="4"/>
+          <w:insideH w:val="single" w:color="auto" w:sz="4"/>
+          <w:insideV w:val="single" w:color="auto" w:sz="4"/>
+        </w:tblBorders>
+      </w:tblPr>
+      <w:tblGrid>
+        <w:gridCol w:w="3000"/>
+        <w:gridCol w:w="3960"/>
+        <w:gridCol w:w="2400"/>
+      </w:tblGrid>
+      <w:tr>
+        <w:trPr>
+          <w:cantSplit/>
+          <w:tblHeader/>
+        </w:trPr>
+        <w:tc>
+          <w:tcPr>
+            <w:tcW w:type="dxa" w:w="3000"/>
+            <w:tcBorders>
+              <w:top w:val="single" w:color="C9D1DC" w:sz="4"/>
+              <w:left w:val="single" w:color="C9D1DC" w:sz="4"/>
+              <w:bottom w:val="single" w:color="C9D1DC" w:sz="4"/>
+              <w:right w:val="single" w:color="C9D1DC" w:sz="4"/>
+            </w:tcBorders>
+            <w:shd w:fill="1B1F3B" w:color="auto" w:val="clear"/>
+            <w:tcMar>
+              <w:top w:type="dxa" w:w="80"/>
+              <w:left w:type="dxa" w:w="110"/>
+              <w:bottom w:type="dxa" w:w="80"/>
+              <w:right w:type="dxa" w:w="110"/>
+            </w:tcMar>
+          </w:tcPr>
+          <w:p>
+            <w:pPr>
+              <w:keepNext/>
+            </w:pPr>
+            <w:r>
+              <w:rPr>
+                <w:rFonts w:ascii="Calibri" w:cs="Calibri" w:eastAsia="Calibri" w:hAnsi="Calibri"/>
+                <w:b/>
+                <w:bCs/>
+                <w:color w:val="FFFFFF"/>
+                <w:sz w:val="19"/>
+                <w:szCs w:val="19"/>
+              </w:rPr>
+              <w:t xml:space="preserve">Indicator</w:t>
+            </w:r>
+          </w:p>
+        </w:tc>
+        <w:tc>
+          <w:tcPr>
+            <w:tcW w:type="dxa" w:w="3960"/>
+            <w:tcBorders>
+              <w:top w:val="single" w:color="C9D1DC" w:sz="4"/>
+              <w:left w:val="single" w:color="C9D1DC" w:sz="4"/>
+              <w:bottom w:val="single" w:color="C9D1DC" w:sz="4"/>
+              <w:right w:val="single" w:color="C9D1DC" w:sz="4"/>
+            </w:tcBorders>
+            <w:shd w:fill="1B1F3B" w:color="auto" w:val="clear"/>
+            <w:tcMar>
+              <w:top w:type="dxa" w:w="80"/>
+              <w:left w:type="dxa" w:w="110"/>
+              <w:bottom w:type="dxa" w:w="80"/>
+              <w:right w:type="dxa" w:w="110"/>
+            </w:tcMar>
+          </w:tcPr>
+          <w:p>
+            <w:pPr>
+              <w:keepNext/>
+            </w:pPr>
+            <w:r>
+              <w:rPr>
+                <w:rFonts w:ascii="Calibri" w:cs="Calibri" w:eastAsia="Calibri" w:hAnsi="Calibri"/>
+                <w:b/>
+                <w:bCs/>
+                <w:color w:val="FFFFFF"/>
+                <w:sz w:val="19"/>
+                <w:szCs w:val="19"/>
+              </w:rPr>
+              <w:t xml:space="preserve">Figure</w:t>
+            </w:r>
+          </w:p>
+        </w:tc>
+        <w:tc>
+          <w:tcPr>
+            <w:tcW w:type="dxa" w:w="2400"/>
+            <w:tcBorders>
+              <w:top w:val="single" w:color="C9D1DC" w:sz="4"/>
+              <w:left w:val="single" w:color="C9D1DC" w:sz="4"/>
+              <w:bottom w:val="single" w:color="C9D1DC" w:sz="4"/>
+              <w:right w:val="single" w:color="C9D1DC" w:sz="4"/>
+            </w:tcBorders>
+            <w:shd w:fill="1B1F3B" w:color="auto" w:val="clear"/>
+            <w:tcMar>
+              <w:top w:type="dxa" w:w="80"/>
+              <w:left w:type="dxa" w:w="110"/>
+              <w:bottom w:type="dxa" w:w="80"/>
+              <w:right w:type="dxa" w:w="110"/>
+            </w:tcMar>
+          </w:tcPr>
+          <w:p>
+            <w:pPr>
+              <w:keepNext/>
+            </w:pPr>
+            <w:r>
+              <w:rPr>
+                <w:rFonts w:ascii="Calibri" w:cs="Calibri" w:eastAsia="Calibri" w:hAnsi="Calibri"/>
+                <w:b/>
+                <w:bCs/>
+                <w:color w:val="FFFFFF"/>
+                <w:sz w:val="19"/>
+                <w:szCs w:val="19"/>
+              </w:rPr>
+              <w:t xml:space="preserve">Source</w:t>
+            </w:r>
+          </w:p>
+        </w:tc>
+      </w:tr>
+      <w:tr>
+        <w:trPr>
+          <w:cantSplit/>
+        </w:trPr>
+        <w:tc>
+          <w:tcPr>
+            <w:tcW w:type="dxa" w:w="3000"/>
+            <w:tcBorders>
+              <w:top w:val="single" w:color="C9D1DC" w:sz="4"/>
+              <w:left w:val="single" w:color="C9D1DC" w:sz="4"/>
+              <w:bottom w:val="single" w:color="C9D1DC" w:sz="4"/>
+              <w:right w:val="single" w:color="C9D1DC" w:sz="4"/>
+            </w:tcBorders>
+            <w:tcMar>
+              <w:top w:type="dxa" w:w="80"/>
+              <w:left w:type="dxa" w:w="110"/>
+              <w:bottom w:type="dxa" w:w="80"/>
+              <w:right w:type="dxa" w:w="110"/>
+            </w:tcMar>
+          </w:tcPr>
+          <w:p>
+            <w:pPr>
+              <w:keepNext/>
+            </w:pPr>
+            <w:r>
+              <w:rPr>
+                <w:rFonts w:ascii="Calibri" w:cs="Calibri" w:eastAsia="Calibri" w:hAnsi="Calibri"/>
+                <w:b/>
+                <w:bCs/>
+                <w:sz w:val="19"/>
+                <w:szCs w:val="19"/>
+              </w:rPr>
+              <w:t xml:space="preserve">2024 size</w:t>
+            </w:r>
+          </w:p>
+        </w:tc>
+        <w:tc>
+          <w:tcPr>
+            <w:tcW w:type="dxa" w:w="3960"/>
+            <w:tcBorders>
+              <w:top w:val="single" w:color="C9D1DC" w:sz="4"/>
+              <w:left w:val="single" w:color="C9D1DC" w:sz="4"/>
+              <w:bottom w:val="single" w:color="C9D1DC" w:sz="4"/>
+              <w:right w:val="single" w:color="C9D1DC" w:sz="4"/>
+            </w:tcBorders>
+            <w:tcMar>
+              <w:top w:type="dxa" w:w="80"/>
+              <w:left w:type="dxa" w:w="110"/>
+              <w:bottom w:type="dxa" w:w="80"/>
+              <w:right w:type="dxa" w:w="110"/>
+            </w:tcMar>
+          </w:tcPr>
+          <w:p>
+            <w:pPr>
+              <w:keepNext/>
+            </w:pPr>
+            <w:r>
+              <w:rPr>
+                <w:rFonts w:ascii="Calibri" w:cs="Calibri" w:eastAsia="Calibri" w:hAnsi="Calibri"/>
+                <w:b w:val="false"/>
+                <w:bCs w:val="false"/>
+                <w:sz w:val="19"/>
+                <w:szCs w:val="19"/>
+              </w:rPr>
+              <w:t xml:space="preserve">US$116.5 million (2.0% of the global market)</w:t>
+            </w:r>
+          </w:p>
+        </w:tc>
+        <w:tc>
+          <w:tcPr>
+            <w:tcW w:type="dxa" w:w="2400"/>
+            <w:tcBorders>
+              <w:top w:val="single" w:color="C9D1DC" w:sz="4"/>
+              <w:left w:val="single" w:color="C9D1DC" w:sz="4"/>
+              <w:bottom w:val="single" w:color="C9D1DC" w:sz="4"/>
+              <w:right w:val="single" w:color="C9D1DC" w:sz="4"/>
+            </w:tcBorders>
+            <w:tcMar>
+              <w:top w:type="dxa" w:w="80"/>
+              <w:left w:type="dxa" w:w="110"/>
+              <w:bottom w:type="dxa" w:w="80"/>
+              <w:right w:type="dxa" w:w="110"/>
+            </w:tcMar>
+          </w:tcPr>
+          <w:p>
+            <w:pPr>
+              <w:keepNext/>
+            </w:pPr>
+            <w:r>
+              <w:rPr>
+                <w:rFonts w:ascii="Calibri" w:cs="Calibri" w:eastAsia="Calibri" w:hAnsi="Calibri"/>
+                <w:b w:val="false"/>
+                <w:bCs w:val="false"/>
+                <w:sz w:val="19"/>
+                <w:szCs w:val="19"/>
+              </w:rPr>
+              <w:t xml:space="preserve">Grand View Research</w:t>
+            </w:r>
+          </w:p>
+        </w:tc>
+      </w:tr>
+      <w:tr>
+        <w:trPr>
+          <w:cantSplit/>
+        </w:trPr>
+        <w:tc>
+          <w:tcPr>
+            <w:tcW w:type="dxa" w:w="3000"/>
+            <w:tcBorders>
+              <w:top w:val="single" w:color="C9D1DC" w:sz="4"/>
+              <w:left w:val="single" w:color="C9D1DC" w:sz="4"/>
+              <w:bottom w:val="single" w:color="C9D1DC" w:sz="4"/>
+              <w:right w:val="single" w:color="C9D1DC" w:sz="4"/>
+            </w:tcBorders>
+            <w:shd w:fill="EEF2F7" w:color="auto" w:val="clear"/>
+            <w:tcMar>
+              <w:top w:type="dxa" w:w="80"/>
+              <w:left w:type="dxa" w:w="110"/>
+              <w:bottom w:type="dxa" w:w="80"/>
+              <w:right w:type="dxa" w:w="110"/>
+            </w:tcMar>
+          </w:tcPr>
+          <w:p>
+            <w:pPr>
+              <w:keepNext/>
+            </w:pPr>
+            <w:r>
+              <w:rPr>
+                <w:rFonts w:ascii="Calibri" w:cs="Calibri" w:eastAsia="Calibri" w:hAnsi="Calibri"/>
+                <w:b/>
+                <w:bCs/>
+                <w:sz w:val="19"/>
+                <w:szCs w:val="19"/>
+              </w:rPr>
+              <w:t xml:space="preserve">2030 forecast</w:t>
+            </w:r>
+          </w:p>
+        </w:tc>
+        <w:tc>
+          <w:tcPr>
+            <w:tcW w:type="dxa" w:w="3960"/>
+            <w:tcBorders>
+              <w:top w:val="single" w:color="C9D1DC" w:sz="4"/>
+              <w:left w:val="single" w:color="C9D1DC" w:sz="4"/>
+              <w:bottom w:val="single" w:color="C9D1DC" w:sz="4"/>
+              <w:right w:val="single" w:color="C9D1DC" w:sz="4"/>
+            </w:tcBorders>
+            <w:shd w:fill="EEF2F7" w:color="auto" w:val="clear"/>
+            <w:tcMar>
+              <w:top w:type="dxa" w:w="80"/>
+              <w:left w:type="dxa" w:w="110"/>
+              <w:bottom w:type="dxa" w:w="80"/>
+              <w:right w:type="dxa" w:w="110"/>
+            </w:tcMar>
+          </w:tcPr>
+          <w:p>
+            <w:pPr>
+              <w:keepNext/>
+            </w:pPr>
+            <w:r>
+              <w:rPr>
+                <w:rFonts w:ascii="Calibri" w:cs="Calibri" w:eastAsia="Calibri" w:hAnsi="Calibri"/>
+                <w:b w:val="false"/>
+                <w:bCs w:val="false"/>
+                <w:sz w:val="19"/>
+                <w:szCs w:val="19"/>
+              </w:rPr>
+              <w:t xml:space="preserve">US$217.6 million; 11.5% annual growth (2025–2030)</w:t>
+            </w:r>
+          </w:p>
+        </w:tc>
+        <w:tc>
+          <w:tcPr>
+            <w:tcW w:type="dxa" w:w="2400"/>
+            <w:tcBorders>
+              <w:top w:val="single" w:color="C9D1DC" w:sz="4"/>
+              <w:left w:val="single" w:color="C9D1DC" w:sz="4"/>
+              <w:bottom w:val="single" w:color="C9D1DC" w:sz="4"/>
+              <w:right w:val="single" w:color="C9D1DC" w:sz="4"/>
+            </w:tcBorders>
+            <w:shd w:fill="EEF2F7" w:color="auto" w:val="clear"/>
+            <w:tcMar>
+              <w:top w:type="dxa" w:w="80"/>
+              <w:left w:type="dxa" w:w="110"/>
+              <w:bottom w:type="dxa" w:w="80"/>
+              <w:right w:type="dxa" w:w="110"/>
+            </w:tcMar>
+          </w:tcPr>
+          <w:p>
+            <w:pPr>
+              <w:keepNext/>
+            </w:pPr>
+            <w:r>
+              <w:rPr>
+                <w:rFonts w:ascii="Calibri" w:cs="Calibri" w:eastAsia="Calibri" w:hAnsi="Calibri"/>
+                <w:b w:val="false"/>
+                <w:bCs w:val="false"/>
+                <w:sz w:val="19"/>
+                <w:szCs w:val="19"/>
+              </w:rPr>
+              <w:t xml:space="preserve">Grand View Research</w:t>
+            </w:r>
+          </w:p>
+        </w:tc>
+      </w:tr>
+      <w:tr>
+        <w:trPr>
+          <w:cantSplit/>
+        </w:trPr>
+        <w:tc>
+          <w:tcPr>
+            <w:tcW w:type="dxa" w:w="3000"/>
+            <w:tcBorders>
+              <w:top w:val="single" w:color="C9D1DC" w:sz="4"/>
+              <w:left w:val="single" w:color="C9D1DC" w:sz="4"/>
+              <w:bottom w:val="single" w:color="C9D1DC" w:sz="4"/>
+              <w:right w:val="single" w:color="C9D1DC" w:sz="4"/>
+            </w:tcBorders>
+            <w:tcMar>
+              <w:top w:type="dxa" w:w="80"/>
+              <w:left w:type="dxa" w:w="110"/>
+              <w:bottom w:type="dxa" w:w="80"/>
+              <w:right w:type="dxa" w:w="110"/>
+            </w:tcMar>
+          </w:tcPr>
+          <w:p>
+            <w:pPr>
+              <w:keepNext/>
+            </w:pPr>
+            <w:r>
+              <w:rPr>
+                <w:rFonts w:ascii="Calibri" w:cs="Calibri" w:eastAsia="Calibri" w:hAnsi="Calibri"/>
+                <w:b/>
+                <w:bCs/>
+                <w:sz w:val="19"/>
+                <w:szCs w:val="19"/>
+              </w:rPr>
+              <w:t xml:space="preserve">Leading process</w:t>
+            </w:r>
+          </w:p>
+        </w:tc>
+        <w:tc>
+          <w:tcPr>
+            <w:tcW w:type="dxa" w:w="3960"/>
+            <w:tcBorders>
+              <w:top w:val="single" w:color="C9D1DC" w:sz="4"/>
+              <w:left w:val="single" w:color="C9D1DC" w:sz="4"/>
+              <w:bottom w:val="single" w:color="C9D1DC" w:sz="4"/>
+              <w:right w:val="single" w:color="C9D1DC" w:sz="4"/>
+            </w:tcBorders>
+            <w:tcMar>
+              <w:top w:type="dxa" w:w="80"/>
+              <w:left w:type="dxa" w:w="110"/>
+              <w:bottom w:type="dxa" w:w="80"/>
+              <w:right w:type="dxa" w:w="110"/>
+            </w:tcMar>
+          </w:tcPr>
+          <w:p>
+            <w:pPr>
+              <w:keepNext/>
+            </w:pPr>
+            <w:r>
+              <w:rPr>
+                <w:rFonts w:ascii="Calibri" w:cs="Calibri" w:eastAsia="Calibri" w:hAnsi="Calibri"/>
+                <w:b w:val="false"/>
+                <w:bCs w:val="false"/>
+                <w:sz w:val="19"/>
+                <w:szCs w:val="19"/>
+              </w:rPr>
+              <w:t xml:space="preserve">Direct to fabric (roll): 74% of 2024 revenue</w:t>
+            </w:r>
+          </w:p>
+        </w:tc>
+        <w:tc>
+          <w:tcPr>
+            <w:tcW w:type="dxa" w:w="2400"/>
+            <w:tcBorders>
+              <w:top w:val="single" w:color="C9D1DC" w:sz="4"/>
+              <w:left w:val="single" w:color="C9D1DC" w:sz="4"/>
+              <w:bottom w:val="single" w:color="C9D1DC" w:sz="4"/>
+              <w:right w:val="single" w:color="C9D1DC" w:sz="4"/>
+            </w:tcBorders>
+            <w:tcMar>
+              <w:top w:type="dxa" w:w="80"/>
+              <w:left w:type="dxa" w:w="110"/>
+              <w:bottom w:type="dxa" w:w="80"/>
+              <w:right w:type="dxa" w:w="110"/>
+            </w:tcMar>
+          </w:tcPr>
+          <w:p>
+            <w:pPr>
+              <w:keepNext/>
+            </w:pPr>
+            <w:r>
+              <w:rPr>
+                <w:rFonts w:ascii="Calibri" w:cs="Calibri" w:eastAsia="Calibri" w:hAnsi="Calibri"/>
+                <w:b w:val="false"/>
+                <w:bCs w:val="false"/>
+                <w:sz w:val="19"/>
+                <w:szCs w:val="19"/>
+              </w:rPr>
+              <w:t xml:space="preserve">Grand View Research</w:t>
+            </w:r>
+          </w:p>
+        </w:tc>
+      </w:tr>
+      <w:tr>
+        <w:trPr>
+          <w:cantSplit/>
+        </w:trPr>
+        <w:tc>
+          <w:tcPr>
+            <w:tcW w:type="dxa" w:w="3000"/>
+            <w:tcBorders>
+              <w:top w:val="single" w:color="C9D1DC" w:sz="4"/>
+              <w:left w:val="single" w:color="C9D1DC" w:sz="4"/>
+              <w:bottom w:val="single" w:color="C9D1DC" w:sz="4"/>
+              <w:right w:val="single" w:color="C9D1DC" w:sz="4"/>
+            </w:tcBorders>
+            <w:shd w:fill="EEF2F7" w:color="auto" w:val="clear"/>
+            <w:tcMar>
+              <w:top w:type="dxa" w:w="80"/>
+              <w:left w:type="dxa" w:w="110"/>
+              <w:bottom w:type="dxa" w:w="80"/>
+              <w:right w:type="dxa" w:w="110"/>
+            </w:tcMar>
+          </w:tcPr>
+          <w:p>
+            <w:pPr>
+              <w:keepNext/>
+            </w:pPr>
+            <w:r>
+              <w:rPr>
+                <w:rFonts w:ascii="Calibri" w:cs="Calibri" w:eastAsia="Calibri" w:hAnsi="Calibri"/>
+                <w:b/>
+                <w:bCs/>
+                <w:sz w:val="19"/>
+                <w:szCs w:val="19"/>
+              </w:rPr>
+              <w:t xml:space="preserve">Fastest-growing segment</w:t>
+            </w:r>
+          </w:p>
+        </w:tc>
+        <w:tc>
+          <w:tcPr>
+            <w:tcW w:type="dxa" w:w="3960"/>
+            <w:tcBorders>
+              <w:top w:val="single" w:color="C9D1DC" w:sz="4"/>
+              <w:left w:val="single" w:color="C9D1DC" w:sz="4"/>
+              <w:bottom w:val="single" w:color="C9D1DC" w:sz="4"/>
+              <w:right w:val="single" w:color="C9D1DC" w:sz="4"/>
+            </w:tcBorders>
+            <w:shd w:fill="EEF2F7" w:color="auto" w:val="clear"/>
+            <w:tcMar>
+              <w:top w:type="dxa" w:w="80"/>
+              <w:left w:type="dxa" w:w="110"/>
+              <w:bottom w:type="dxa" w:w="80"/>
+              <w:right w:type="dxa" w:w="110"/>
+            </w:tcMar>
+          </w:tcPr>
+          <w:p>
+            <w:pPr>
+              <w:keepNext/>
+            </w:pPr>
+            <w:r>
+              <w:rPr>
+                <w:rFonts w:ascii="Calibri" w:cs="Calibri" w:eastAsia="Calibri" w:hAnsi="Calibri"/>
+                <w:b w:val="false"/>
+                <w:bCs w:val="false"/>
+                <w:sz w:val="19"/>
+                <w:szCs w:val="19"/>
+              </w:rPr>
+              <w:t xml:space="preserve">Direct to garment (DTG): the most dynamic and profitable</w:t>
+            </w:r>
+          </w:p>
+        </w:tc>
+        <w:tc>
+          <w:tcPr>
+            <w:tcW w:type="dxa" w:w="2400"/>
+            <w:tcBorders>
+              <w:top w:val="single" w:color="C9D1DC" w:sz="4"/>
+              <w:left w:val="single" w:color="C9D1DC" w:sz="4"/>
+              <w:bottom w:val="single" w:color="C9D1DC" w:sz="4"/>
+              <w:right w:val="single" w:color="C9D1DC" w:sz="4"/>
+            </w:tcBorders>
+            <w:shd w:fill="EEF2F7" w:color="auto" w:val="clear"/>
+            <w:tcMar>
+              <w:top w:type="dxa" w:w="80"/>
+              <w:left w:type="dxa" w:w="110"/>
+              <w:bottom w:type="dxa" w:w="80"/>
+              <w:right w:type="dxa" w:w="110"/>
+            </w:tcMar>
+          </w:tcPr>
+          <w:p>
+            <w:pPr>
+              <w:keepNext/>
+            </w:pPr>
+            <w:r>
+              <w:rPr>
+                <w:rFonts w:ascii="Calibri" w:cs="Calibri" w:eastAsia="Calibri" w:hAnsi="Calibri"/>
+                <w:b w:val="false"/>
+                <w:bCs w:val="false"/>
+                <w:sz w:val="19"/>
+                <w:szCs w:val="19"/>
+              </w:rPr>
+              <w:t xml:space="preserve">Grand View Research</w:t>
+            </w:r>
+          </w:p>
+        </w:tc>
+      </w:tr>
+      <w:tr>
+        <w:trPr>
+          <w:cantSplit/>
+        </w:trPr>
+        <w:tc>
+          <w:tcPr>
+            <w:tcW w:type="dxa" w:w="3000"/>
+            <w:tcBorders>
+              <w:top w:val="single" w:color="C9D1DC" w:sz="4"/>
+              <w:left w:val="single" w:color="C9D1DC" w:sz="4"/>
+              <w:bottom w:val="single" w:color="C9D1DC" w:sz="4"/>
+              <w:right w:val="single" w:color="C9D1DC" w:sz="4"/>
+            </w:tcBorders>
+            <w:tcMar>
+              <w:top w:type="dxa" w:w="80"/>
+              <w:left w:type="dxa" w:w="110"/>
+              <w:bottom w:type="dxa" w:w="80"/>
+              <w:right w:type="dxa" w:w="110"/>
+            </w:tcMar>
+          </w:tcPr>
+          <w:p>
+            <w:pPr>
+              <w:keepNext/>
+            </w:pPr>
+            <w:r>
+              <w:rPr>
+                <w:rFonts w:ascii="Calibri" w:cs="Calibri" w:eastAsia="Calibri" w:hAnsi="Calibri"/>
+                <w:b/>
+                <w:bCs/>
+                <w:sz w:val="19"/>
+                <w:szCs w:val="19"/>
+              </w:rPr>
+              <w:t xml:space="preserve">Latin America</w:t>
+            </w:r>
+          </w:p>
+        </w:tc>
+        <w:tc>
+          <w:tcPr>
+            <w:tcW w:type="dxa" w:w="3960"/>
+            <w:tcBorders>
+              <w:top w:val="single" w:color="C9D1DC" w:sz="4"/>
+              <w:left w:val="single" w:color="C9D1DC" w:sz="4"/>
+              <w:bottom w:val="single" w:color="C9D1DC" w:sz="4"/>
+              <w:right w:val="single" w:color="C9D1DC" w:sz="4"/>
+            </w:tcBorders>
+            <w:tcMar>
+              <w:top w:type="dxa" w:w="80"/>
+              <w:left w:type="dxa" w:w="110"/>
+              <w:bottom w:type="dxa" w:w="80"/>
+              <w:right w:type="dxa" w:w="110"/>
+            </w:tcMar>
+          </w:tcPr>
+          <w:p>
+            <w:pPr>
+              <w:keepNext/>
+            </w:pPr>
+            <w:r>
+              <w:rPr>
+                <w:rFonts w:ascii="Calibri" w:cs="Calibri" w:eastAsia="Calibri" w:hAnsi="Calibri"/>
+                <w:b w:val="false"/>
+                <w:bCs w:val="false"/>
+                <w:sz w:val="19"/>
+                <w:szCs w:val="19"/>
+              </w:rPr>
+              <w:t xml:space="preserve">~11.8% annual growth to 2034; Brazil and Mexico lead</w:t>
+            </w:r>
+          </w:p>
+        </w:tc>
+        <w:tc>
+          <w:tcPr>
+            <w:tcW w:type="dxa" w:w="2400"/>
+            <w:tcBorders>
+              <w:top w:val="single" w:color="C9D1DC" w:sz="4"/>
+              <w:left w:val="single" w:color="C9D1DC" w:sz="4"/>
+              <w:bottom w:val="single" w:color="C9D1DC" w:sz="4"/>
+              <w:right w:val="single" w:color="C9D1DC" w:sz="4"/>
+            </w:tcBorders>
+            <w:tcMar>
+              <w:top w:type="dxa" w:w="80"/>
+              <w:left w:type="dxa" w:w="110"/>
+              <w:bottom w:type="dxa" w:w="80"/>
+              <w:right w:type="dxa" w:w="110"/>
+            </w:tcMar>
+          </w:tcPr>
+          <w:p>
+            <w:pPr>
+              <w:keepNext/>
+            </w:pPr>
+            <w:r>
+              <w:rPr>
+                <w:rFonts w:ascii="Calibri" w:cs="Calibri" w:eastAsia="Calibri" w:hAnsi="Calibri"/>
+                <w:b w:val="false"/>
+                <w:bCs w:val="false"/>
+                <w:sz w:val="19"/>
+                <w:szCs w:val="19"/>
+              </w:rPr>
+              <w:t xml:space="preserve">Cannata Report</w:t>
+            </w:r>
+          </w:p>
+        </w:tc>
+      </w:tr>
+      <w:tr>
+        <w:trPr>
+          <w:cantSplit/>
+        </w:trPr>
+        <w:tc>
+          <w:tcPr>
+            <w:tcW w:type="dxa" w:w="3000"/>
+            <w:tcBorders>
+              <w:top w:val="single" w:color="C9D1DC" w:sz="4"/>
+              <w:left w:val="single" w:color="C9D1DC" w:sz="4"/>
+              <w:bottom w:val="single" w:color="C9D1DC" w:sz="4"/>
+              <w:right w:val="single" w:color="C9D1DC" w:sz="4"/>
+            </w:tcBorders>
+            <w:shd w:fill="EEF2F7" w:color="auto" w:val="clear"/>
+            <w:tcMar>
+              <w:top w:type="dxa" w:w="80"/>
+              <w:left w:type="dxa" w:w="110"/>
+              <w:bottom w:type="dxa" w:w="80"/>
+              <w:right w:type="dxa" w:w="110"/>
+            </w:tcMar>
+          </w:tcPr>
+          <w:p>
+            <w:pPr>
+              <w:keepNext w:val="false"/>
+            </w:pPr>
+            <w:r>
+              <w:rPr>
+                <w:rFonts w:ascii="Calibri" w:cs="Calibri" w:eastAsia="Calibri" w:hAnsi="Calibri"/>
+                <w:b/>
+                <w:bCs/>
+                <w:sz w:val="19"/>
+                <w:szCs w:val="19"/>
+              </w:rPr>
+              <w:t xml:space="preserve">Main digital competitor</w:t>
+            </w:r>
+          </w:p>
+        </w:tc>
+        <w:tc>
+          <w:tcPr>
+            <w:tcW w:type="dxa" w:w="3960"/>
+            <w:tcBorders>
+              <w:top w:val="single" w:color="C9D1DC" w:sz="4"/>
+              <w:left w:val="single" w:color="C9D1DC" w:sz="4"/>
+              <w:bottom w:val="single" w:color="C9D1DC" w:sz="4"/>
+              <w:right w:val="single" w:color="C9D1DC" w:sz="4"/>
+            </w:tcBorders>
+            <w:shd w:fill="EEF2F7" w:color="auto" w:val="clear"/>
+            <w:tcMar>
+              <w:top w:type="dxa" w:w="80"/>
+              <w:left w:type="dxa" w:w="110"/>
+              <w:bottom w:type="dxa" w:w="80"/>
+              <w:right w:type="dxa" w:w="110"/>
+            </w:tcMar>
+          </w:tcPr>
+          <w:p>
+            <w:pPr>
+              <w:keepNext w:val="false"/>
+            </w:pPr>
+            <w:r>
+              <w:rPr>
+                <w:rFonts w:ascii="Calibri" w:cs="Calibri" w:eastAsia="Calibri" w:hAnsi="Calibri"/>
+                <w:b w:val="false"/>
+                <w:bCs w:val="false"/>
+                <w:sz w:val="19"/>
+                <w:szCs w:val="19"/>
+              </w:rPr>
+              <w:t xml:space="preserve">Epson claims ~60% of digital textile printing in Mexico (no independent study)</w:t>
+            </w:r>
+          </w:p>
+        </w:tc>
+        <w:tc>
+          <w:tcPr>
+            <w:tcW w:type="dxa" w:w="2400"/>
+            <w:tcBorders>
+              <w:top w:val="single" w:color="C9D1DC" w:sz="4"/>
+              <w:left w:val="single" w:color="C9D1DC" w:sz="4"/>
+              <w:bottom w:val="single" w:color="C9D1DC" w:sz="4"/>
+              <w:right w:val="single" w:color="C9D1DC" w:sz="4"/>
+            </w:tcBorders>
+            <w:shd w:fill="EEF2F7" w:color="auto" w:val="clear"/>
+            <w:tcMar>
+              <w:top w:type="dxa" w:w="80"/>
+              <w:left w:type="dxa" w:w="110"/>
+              <w:bottom w:type="dxa" w:w="80"/>
+              <w:right w:type="dxa" w:w="110"/>
+            </w:tcMar>
+          </w:tcPr>
+          <w:p>
+            <w:pPr>
+              <w:keepNext w:val="false"/>
+            </w:pPr>
+            <w:r>
+              <w:rPr>
+                <w:rFonts w:ascii="Calibri" w:cs="Calibri" w:eastAsia="Calibri" w:hAnsi="Calibri"/>
+                <w:b w:val="false"/>
+                <w:bCs w:val="false"/>
+                <w:sz w:val="19"/>
+                <w:szCs w:val="19"/>
+              </w:rPr>
+              <w:t xml:space="preserve">Epson at FESPA, Sept. 2026</w:t>
+            </w:r>
+          </w:p>
+        </w:tc>
+      </w:tr>
+    </w:tbl>
+    <w:p>
+      <w:pPr>
+        <w:spacing w:after="120"/>
+      </w:pPr>
+    </w:p>
+    <w:p>
+      <w:pPr>
+        <w:pStyle w:val="ListParagraph"/>
+        <w:numPr>
+          <w:ilvl w:val="0"/>
+          <w:numId w:val="2"/>
+        </w:numPr>
+        <w:spacing w:after="80"/>
+      </w:pPr>
+      <w:r>
+        <w:t xml:space="preserve">What it means for CLT: the digital market is small (US$116.5 million) but grows 11.5% a year, and the fastest-growing segment is direct-to-garment printing, where the hybrid printer competes.</w:t>
+      </w:r>
+    </w:p>
+    <w:p>
+      <w:pPr>
+        <w:pStyle w:val="ListParagraph"/>
+        <w:numPr>
+          <w:ilvl w:val="0"/>
+          <w:numId w:val="2"/>
+        </w:numPr>
+        <w:spacing w:after="80"/>
+      </w:pPr>
+      <w:r>
+        <w:t xml:space="preserve">This figure covers digital printing only. CLT’s opportunity is larger because the hybrid also replaces screen-printing stations and sells chemistry (silicones and pastes) to the screen-printing market, which this figure leaves out.</w:t>
+      </w:r>
+    </w:p>
+    <w:p>
+      <w:pPr>
+        <w:pStyle w:val="ListParagraph"/>
+        <w:numPr>
+          <w:ilvl w:val="0"/>
+          <w:numId w:val="2"/>
+        </w:numPr>
+        <w:spacing w:after="80"/>
+      </w:pPr>
+      <w:r>
+        <w:t xml:space="preserve">Scenario: if CLT captures 5–10% of the digital market by 2030, that is US$11–22 million a year, in line with the equipment and consumables range above.</w:t>
+      </w:r>
+    </w:p>
+    <w:p>
+      <w:pPr>
+        <w:pStyle w:val="ListParagraph"/>
+        <w:numPr>
+          <w:ilvl w:val="0"/>
+          <w:numId w:val="2"/>
+        </w:numPr>
+        <w:spacing w:after="80"/>
+      </w:pPr>
+      <w:r>
+        <w:t xml:space="preserve">The sublimation market (US$468 million in 2025) includes paper, heat presses, signage and promotional products; it is not comparable to this figure.</w:t>
       </w:r>
     </w:p>
     <w:p>

</xml_diff>